<commit_message>
Explain mail settings (CreateMailDb, PreserveMailSystem) in plain language
- bulkreg.ini: rewritten comments for the mail section
- Guide v2.2: new D3a with decision tables, before/after example, and B11 pointer
</commit_message>
<xml_diff>
--- a/docs/BulkReg_Admin_Guide.docx
+++ b/docs/BulkReg_Admin_Guide.docx
@@ -170,7 +170,7 @@
                 <w:sz w:val="20"/>
                 <w:szCs w:val="20"/>
               </w:rPr>
-              <w:t xml:space="preserve">Version 2.1  |  October 2026  |  Draft for review</w:t>
+              <w:t xml:space="preserve">Version 2.2  |  October 2026  |  Draft for review</w:t>
             </w:r>
           </w:p>
           <w:p>
@@ -482,7 +482,7 @@
                 <w:sz w:val="19"/>
                 <w:szCs w:val="19"/>
               </w:rPr>
-              <w:t xml:space="preserve">2.1 (Draft for review)</w:t>
+              <w:t xml:space="preserve">2.2 (Draft for review)</w:t>
             </w:r>
           </w:p>
         </w:tc>
@@ -972,7 +972,7 @@
                 <w:sz w:val="19"/>
                 <w:szCs w:val="19"/>
               </w:rPr>
-              <w:t xml:space="preserve">2.1</w:t>
+              <w:t xml:space="preserve">2.2</w:t>
             </w:r>
           </w:p>
         </w:tc>
@@ -1003,39 +1003,7 @@
                 <w:sz w:val="19"/>
                 <w:szCs w:val="19"/>
               </w:rPr>
-              <w:t xml:space="preserve">Name formats: servers in canonical (CN=DominoADMail/O=Demo) or abbreviated (DominoADMail/Demo) form, both accepted by the code. </w:t>
-            </w:r>
-            <w:r>
-              <w:rPr>
-                <w:b/>
-                <w:bCs/>
-                <w:sz w:val="19"/>
-                <w:szCs w:val="19"/>
-              </w:rPr>
-              <w:t xml:space="preserve">Organizational policies</w:t>
-            </w:r>
-            <w:r>
-              <w:rPr>
-                <w:sz w:val="19"/>
-                <w:szCs w:val="19"/>
-              </w:rPr>
-              <w:t xml:space="preserve"> (</w:t>
-            </w:r>
-            <w:r>
-              <w:rPr>
-                <w:i/>
-                <w:iCs/>
-                <w:sz w:val="19"/>
-                <w:szCs w:val="19"/>
-              </w:rPr>
-              <w:t xml:space="preserve">/Demo, </w:t>
-            </w:r>
-            <w:r>
-              <w:rPr>
-                <w:sz w:val="19"/>
-                <w:szCs w:val="19"/>
-              </w:rPr>
-              <w:t xml:space="preserve">/Sales/Demo) supported alongside explicit policies (B8 Option B, OrgPolicyAssignsVault, '-' in the mapping). Consistent 'Demo' examples.</w:t>
+              <w:t xml:space="preserve">Mail settings (CreateMailDb, PreserveMailSystem) explained in plain language with a decision table and a before/after example (D3a).</w:t>
             </w:r>
           </w:p>
         </w:tc>
@@ -1071,6 +1039,105 @@
                 <w:sz w:val="19"/>
                 <w:szCs w:val="19"/>
               </w:rPr>
+              <w:t xml:space="preserve">2.1</w:t>
+            </w:r>
+          </w:p>
+        </w:tc>
+        <w:tc>
+          <w:tcPr>
+            <w:tcW w:type="dxa" w:w="8403"/>
+            <w:tcBorders>
+              <w:top w:val="single" w:color="DCE6F0" w:sz="4"/>
+              <w:left w:val="single" w:color="DCE6F0" w:sz="4"/>
+              <w:bottom w:val="single" w:color="DCE6F0" w:sz="4"/>
+              <w:right w:val="single" w:color="DCE6F0" w:sz="4"/>
+            </w:tcBorders>
+            <w:shd w:fill="FFFFFF" w:color="auto" w:val="clear"/>
+            <w:tcMar>
+              <w:top w:type="dxa" w:w="60"/>
+              <w:left w:type="dxa" w:w="100"/>
+              <w:bottom w:type="dxa" w:w="60"/>
+              <w:right w:type="dxa" w:w="100"/>
+            </w:tcMar>
+            <w:vAlign w:val="top"/>
+          </w:tcPr>
+          <w:p>
+            <w:pPr>
+              <w:spacing w:after="0" w:before="0"/>
+            </w:pPr>
+            <w:r>
+              <w:rPr>
+                <w:sz w:val="19"/>
+                <w:szCs w:val="19"/>
+              </w:rPr>
+              <w:t xml:space="preserve">Name formats: servers in canonical (CN=DominoADMail/O=Demo) or abbreviated (DominoADMail/Demo) form, both accepted by the code. </w:t>
+            </w:r>
+            <w:r>
+              <w:rPr>
+                <w:b/>
+                <w:bCs/>
+                <w:sz w:val="19"/>
+                <w:szCs w:val="19"/>
+              </w:rPr>
+              <w:t xml:space="preserve">Organizational policies</w:t>
+            </w:r>
+            <w:r>
+              <w:rPr>
+                <w:sz w:val="19"/>
+                <w:szCs w:val="19"/>
+              </w:rPr>
+              <w:t xml:space="preserve"> (</w:t>
+            </w:r>
+            <w:r>
+              <w:rPr>
+                <w:i/>
+                <w:iCs/>
+                <w:sz w:val="19"/>
+                <w:szCs w:val="19"/>
+              </w:rPr>
+              <w:t xml:space="preserve">/Demo, </w:t>
+            </w:r>
+            <w:r>
+              <w:rPr>
+                <w:sz w:val="19"/>
+                <w:szCs w:val="19"/>
+              </w:rPr>
+              <w:t xml:space="preserve">/Sales/Demo) supported alongside explicit policies (B8 Option B, OrgPolicyAssignsVault, '-' in the mapping). Consistent 'Demo' examples.</w:t>
+            </w:r>
+          </w:p>
+        </w:tc>
+      </w:tr>
+      <w:tr>
+        <w:trPr>
+          <w:cantSplit/>
+        </w:trPr>
+        <w:tc>
+          <w:tcPr>
+            <w:tcW w:type="dxa" w:w="1235"/>
+            <w:tcBorders>
+              <w:top w:val="single" w:color="DCE6F0" w:sz="4"/>
+              <w:left w:val="single" w:color="DCE6F0" w:sz="4"/>
+              <w:bottom w:val="single" w:color="DCE6F0" w:sz="4"/>
+              <w:right w:val="single" w:color="DCE6F0" w:sz="4"/>
+            </w:tcBorders>
+            <w:shd w:fill="F7F7FC" w:color="auto" w:val="clear"/>
+            <w:tcMar>
+              <w:top w:type="dxa" w:w="60"/>
+              <w:left w:type="dxa" w:w="100"/>
+              <w:bottom w:type="dxa" w:w="60"/>
+              <w:right w:type="dxa" w:w="100"/>
+            </w:tcMar>
+            <w:vAlign w:val="top"/>
+          </w:tcPr>
+          <w:p>
+            <w:pPr>
+              <w:spacing w:after="0" w:before="0"/>
+            </w:pPr>
+            <w:r>
+              <w:rPr>
+                <w:sz w:val="19"/>
+                <w:szCs w:val="19"/>
+              </w:rPr>
               <w:t xml:space="preserve">2.0</w:t>
             </w:r>
           </w:p>
@@ -1084,7 +1151,7 @@
               <w:bottom w:val="single" w:color="DCE6F0" w:sz="4"/>
               <w:right w:val="single" w:color="DCE6F0" w:sz="4"/>
             </w:tcBorders>
-            <w:shd w:fill="FFFFFF" w:color="auto" w:val="clear"/>
+            <w:shd w:fill="F7F7FC" w:color="auto" w:val="clear"/>
             <w:tcMar>
               <w:top w:type="dxa" w:w="60"/>
               <w:left w:type="dxa" w:w="100"/>
@@ -15503,7 +15570,7 @@
                 <w:sz w:val="19"/>
                 <w:szCs w:val="19"/>
               </w:rPr>
-              <w:t xml:space="preserve">LogServer / LogDb</w:t>
+              <w:t xml:space="preserve">CreateMailDb / PreserveMailSystem</w:t>
             </w:r>
           </w:p>
         </w:tc>
@@ -15534,7 +15601,39 @@
                 <w:sz w:val="19"/>
                 <w:szCs w:val="19"/>
               </w:rPr>
-              <w:t xml:space="preserve">Leave empty unless you create the log database in B15</w:t>
+              <w:t xml:space="preserve">Leave </w:t>
+            </w:r>
+            <w:r>
+              <w:rPr>
+                <w:rFonts w:ascii="Consolas" w:cs="Consolas" w:eastAsia="Consolas" w:hAnsi="Consolas"/>
+                <w:color w:val="0F5FDC"/>
+                <w:sz w:val="18"/>
+                <w:szCs w:val="18"/>
+              </w:rPr>
+              <w:t xml:space="preserve">0</w:t>
+            </w:r>
+            <w:r>
+              <w:rPr>
+                <w:sz w:val="19"/>
+                <w:szCs w:val="19"/>
+              </w:rPr>
+              <w:t xml:space="preserve"> / </w:t>
+            </w:r>
+            <w:r>
+              <w:rPr>
+                <w:rFonts w:ascii="Consolas" w:cs="Consolas" w:eastAsia="Consolas" w:hAnsi="Consolas"/>
+                <w:color w:val="0F5FDC"/>
+                <w:sz w:val="18"/>
+                <w:szCs w:val="18"/>
+              </w:rPr>
+              <w:t xml:space="preserve">1</w:t>
+            </w:r>
+            <w:r>
+              <w:rPr>
+                <w:sz w:val="19"/>
+                <w:szCs w:val="19"/>
+              </w:rPr>
+              <w:t xml:space="preserve"> if users keep their mailbox outside Domino (the usual case). See D3a before changing.</w:t>
             </w:r>
           </w:p>
         </w:tc>
@@ -15565,7 +15664,7 @@
                 <w:sz w:val="19"/>
                 <w:szCs w:val="19"/>
               </w:rPr>
-              <w:t xml:space="preserve">B15</w:t>
+              <w:t xml:space="preserve">D3a</w:t>
             </w:r>
           </w:p>
         </w:tc>
@@ -15601,6 +15700,104 @@
                 <w:sz w:val="19"/>
                 <w:szCs w:val="19"/>
               </w:rPr>
+              <w:t xml:space="preserve">LogServer / LogDb</w:t>
+            </w:r>
+          </w:p>
+        </w:tc>
+        <w:tc>
+          <w:tcPr>
+            <w:tcW w:type="dxa" w:w="5251"/>
+            <w:tcBorders>
+              <w:top w:val="single" w:color="DCE6F0" w:sz="4"/>
+              <w:left w:val="single" w:color="DCE6F0" w:sz="4"/>
+              <w:bottom w:val="single" w:color="DCE6F0" w:sz="4"/>
+              <w:right w:val="single" w:color="DCE6F0" w:sz="4"/>
+            </w:tcBorders>
+            <w:shd w:fill="F7F7FC" w:color="auto" w:val="clear"/>
+            <w:tcMar>
+              <w:top w:type="dxa" w:w="60"/>
+              <w:left w:type="dxa" w:w="100"/>
+              <w:bottom w:type="dxa" w:w="60"/>
+              <w:right w:type="dxa" w:w="100"/>
+            </w:tcMar>
+            <w:vAlign w:val="top"/>
+          </w:tcPr>
+          <w:p>
+            <w:pPr>
+              <w:spacing w:after="0" w:before="0"/>
+            </w:pPr>
+            <w:r>
+              <w:rPr>
+                <w:sz w:val="19"/>
+                <w:szCs w:val="19"/>
+              </w:rPr>
+              <w:t xml:space="preserve">Leave empty unless you create the log database in B15</w:t>
+            </w:r>
+          </w:p>
+        </w:tc>
+        <w:tc>
+          <w:tcPr>
+            <w:tcW w:type="dxa" w:w="2019"/>
+            <w:tcBorders>
+              <w:top w:val="single" w:color="DCE6F0" w:sz="4"/>
+              <w:left w:val="single" w:color="DCE6F0" w:sz="4"/>
+              <w:bottom w:val="single" w:color="DCE6F0" w:sz="4"/>
+              <w:right w:val="single" w:color="DCE6F0" w:sz="4"/>
+            </w:tcBorders>
+            <w:shd w:fill="F7F7FC" w:color="auto" w:val="clear"/>
+            <w:tcMar>
+              <w:top w:type="dxa" w:w="60"/>
+              <w:left w:type="dxa" w:w="100"/>
+              <w:bottom w:type="dxa" w:w="60"/>
+              <w:right w:type="dxa" w:w="100"/>
+            </w:tcMar>
+            <w:vAlign w:val="top"/>
+          </w:tcPr>
+          <w:p>
+            <w:pPr>
+              <w:spacing w:after="0" w:before="0"/>
+            </w:pPr>
+            <w:r>
+              <w:rPr>
+                <w:sz w:val="19"/>
+                <w:szCs w:val="19"/>
+              </w:rPr>
+              <w:t xml:space="preserve">B15</w:t>
+            </w:r>
+          </w:p>
+        </w:tc>
+      </w:tr>
+      <w:tr>
+        <w:trPr>
+          <w:cantSplit/>
+        </w:trPr>
+        <w:tc>
+          <w:tcPr>
+            <w:tcW w:type="dxa" w:w="2368"/>
+            <w:tcBorders>
+              <w:top w:val="single" w:color="DCE6F0" w:sz="4"/>
+              <w:left w:val="single" w:color="DCE6F0" w:sz="4"/>
+              <w:bottom w:val="single" w:color="DCE6F0" w:sz="4"/>
+              <w:right w:val="single" w:color="DCE6F0" w:sz="4"/>
+            </w:tcBorders>
+            <w:shd w:fill="FFFFFF" w:color="auto" w:val="clear"/>
+            <w:tcMar>
+              <w:top w:type="dxa" w:w="60"/>
+              <w:left w:type="dxa" w:w="100"/>
+              <w:bottom w:type="dxa" w:w="60"/>
+              <w:right w:type="dxa" w:w="100"/>
+            </w:tcMar>
+            <w:vAlign w:val="top"/>
+          </w:tcPr>
+          <w:p>
+            <w:pPr>
+              <w:spacing w:after="0" w:before="0"/>
+            </w:pPr>
+            <w:r>
+              <w:rPr>
+                <w:sz w:val="19"/>
+                <w:szCs w:val="19"/>
+              </w:rPr>
               <w:t xml:space="preserve">DryRun</w:t>
             </w:r>
           </w:p>
@@ -15614,7 +15811,7 @@
               <w:bottom w:val="single" w:color="DCE6F0" w:sz="4"/>
               <w:right w:val="single" w:color="DCE6F0" w:sz="4"/>
             </w:tcBorders>
-            <w:shd w:fill="F7F7FC" w:color="auto" w:val="clear"/>
+            <w:shd w:fill="FFFFFF" w:color="auto" w:val="clear"/>
             <w:tcMar>
               <w:top w:type="dxa" w:w="60"/>
               <w:left w:type="dxa" w:w="100"/>
@@ -15654,7 +15851,7 @@
               <w:bottom w:val="single" w:color="DCE6F0" w:sz="4"/>
               <w:right w:val="single" w:color="DCE6F0" w:sz="4"/>
             </w:tcBorders>
-            <w:shd w:fill="F7F7FC" w:color="auto" w:val="clear"/>
+            <w:shd w:fill="FFFFFF" w:color="auto" w:val="clear"/>
             <w:tcMar>
               <w:top w:type="dxa" w:w="60"/>
               <w:left w:type="dxa" w:w="100"/>
@@ -29485,6 +29682,2136 @@
         <w:pStyle w:val="Heading2"/>
       </w:pPr>
       <w:r>
+        <w:t xml:space="preserve">D3a Mail settings explained: CreateMailDb and PreserveMailSystem</w:t>
+      </w:r>
+    </w:p>
+    <w:p>
+      <w:r>
+        <w:rPr>
+          <w:b/>
+          <w:bCs/>
+        </w:rPr>
+        <w:t xml:space="preserve">Background.</w:t>
+      </w:r>
+      <w:r>
+        <w:t xml:space="preserve"> DirSync users usually keep their mailbox </w:t>
+      </w:r>
+      <w:r>
+        <w:rPr>
+          <w:b/>
+          <w:bCs/>
+        </w:rPr>
+        <w:t xml:space="preserve">outside Domino</w:t>
+      </w:r>
+      <w:r>
+        <w:t xml:space="preserve"> (Exchange, Microsoft 365, Gmail…). Their Person document says </w:t>
+      </w:r>
+      <w:r>
+        <w:rPr>
+          <w:i/>
+          <w:iCs/>
+        </w:rPr>
+        <w:t xml:space="preserve">Mail system = Other Internet Mail</w:t>
+      </w:r>
+      <w:r>
+        <w:t xml:space="preserve">, </w:t>
+      </w:r>
+      <w:r>
+        <w:rPr>
+          <w:i/>
+          <w:iCs/>
+        </w:rPr>
+        <w:t xml:space="preserve">Mail file</w:t>
+      </w:r>
+      <w:r>
+        <w:t xml:space="preserve"> is empty, and Domino delivers mail for them to their Internet address. They only need a </w:t>
+      </w:r>
+      <w:r>
+        <w:rPr>
+          <w:b/>
+          <w:bCs/>
+        </w:rPr>
+        <w:t xml:space="preserve">Notes ID</w:t>
+      </w:r>
+      <w:r>
+        <w:t xml:space="preserve">, for applications and the ID vault, not a Domino mailbox.</w:t>
+      </w:r>
+    </w:p>
+    <w:p>
+      <w:pPr>
+        <w:pStyle w:val="Heading3"/>
+      </w:pPr>
+      <w:r>
+        <w:t xml:space="preserve">CreateMailDb: should registration create a Domino mailbox?</w:t>
+      </w:r>
+    </w:p>
+    <w:tbl>
+      <w:tblPr>
+        <w:tblW w:type="dxa" w:w="9638"/>
+        <w:tblBorders>
+          <w:top w:val="single" w:color="auto" w:sz="4"/>
+          <w:left w:val="single" w:color="auto" w:sz="4"/>
+          <w:bottom w:val="single" w:color="auto" w:sz="4"/>
+          <w:right w:val="single" w:color="auto" w:sz="4"/>
+          <w:insideH w:val="single" w:color="auto" w:sz="4"/>
+          <w:insideV w:val="single" w:color="auto" w:sz="4"/>
+        </w:tblBorders>
+      </w:tblPr>
+      <w:tblGrid>
+        <w:gridCol w:w="1544"/>
+        <w:gridCol w:w="4942"/>
+        <w:gridCol w:w="3152"/>
+      </w:tblGrid>
+      <w:tr>
+        <w:trPr>
+          <w:tblHeader/>
+        </w:trPr>
+        <w:tc>
+          <w:tcPr>
+            <w:tcW w:type="dxa" w:w="1544"/>
+            <w:tcBorders>
+              <w:top w:val="single" w:color="DCE6F0" w:sz="4"/>
+              <w:left w:val="single" w:color="DCE6F0" w:sz="4"/>
+              <w:bottom w:val="single" w:color="DCE6F0" w:sz="4"/>
+              <w:right w:val="single" w:color="DCE6F0" w:sz="4"/>
+            </w:tcBorders>
+            <w:shd w:fill="17707F" w:color="auto" w:val="clear"/>
+            <w:tcMar>
+              <w:top w:type="dxa" w:w="60"/>
+              <w:left w:type="dxa" w:w="100"/>
+              <w:bottom w:type="dxa" w:w="60"/>
+              <w:right w:type="dxa" w:w="100"/>
+            </w:tcMar>
+            <w:vAlign w:val="top"/>
+          </w:tcPr>
+          <w:p>
+            <w:pPr>
+              <w:spacing w:after="0" w:before="0"/>
+            </w:pPr>
+            <w:r>
+              <w:rPr>
+                <w:b/>
+                <w:bCs/>
+                <w:color w:val="FFFFFF"/>
+                <w:sz w:val="19"/>
+                <w:szCs w:val="19"/>
+              </w:rPr>
+              <w:t xml:space="preserve">Value</w:t>
+            </w:r>
+          </w:p>
+        </w:tc>
+        <w:tc>
+          <w:tcPr>
+            <w:tcW w:type="dxa" w:w="4942"/>
+            <w:tcBorders>
+              <w:top w:val="single" w:color="DCE6F0" w:sz="4"/>
+              <w:left w:val="single" w:color="DCE6F0" w:sz="4"/>
+              <w:bottom w:val="single" w:color="DCE6F0" w:sz="4"/>
+              <w:right w:val="single" w:color="DCE6F0" w:sz="4"/>
+            </w:tcBorders>
+            <w:shd w:fill="17707F" w:color="auto" w:val="clear"/>
+            <w:tcMar>
+              <w:top w:type="dxa" w:w="60"/>
+              <w:left w:type="dxa" w:w="100"/>
+              <w:bottom w:type="dxa" w:w="60"/>
+              <w:right w:type="dxa" w:w="100"/>
+            </w:tcMar>
+            <w:vAlign w:val="top"/>
+          </w:tcPr>
+          <w:p>
+            <w:pPr>
+              <w:spacing w:after="0" w:before="0"/>
+            </w:pPr>
+            <w:r>
+              <w:rPr>
+                <w:b/>
+                <w:bCs/>
+                <w:color w:val="FFFFFF"/>
+                <w:sz w:val="19"/>
+                <w:szCs w:val="19"/>
+              </w:rPr>
+              <w:t xml:space="preserve">What happens</w:t>
+            </w:r>
+          </w:p>
+        </w:tc>
+        <w:tc>
+          <w:tcPr>
+            <w:tcW w:type="dxa" w:w="3152"/>
+            <w:tcBorders>
+              <w:top w:val="single" w:color="DCE6F0" w:sz="4"/>
+              <w:left w:val="single" w:color="DCE6F0" w:sz="4"/>
+              <w:bottom w:val="single" w:color="DCE6F0" w:sz="4"/>
+              <w:right w:val="single" w:color="DCE6F0" w:sz="4"/>
+            </w:tcBorders>
+            <w:shd w:fill="17707F" w:color="auto" w:val="clear"/>
+            <w:tcMar>
+              <w:top w:type="dxa" w:w="60"/>
+              <w:left w:type="dxa" w:w="100"/>
+              <w:bottom w:type="dxa" w:w="60"/>
+              <w:right w:type="dxa" w:w="100"/>
+            </w:tcMar>
+            <w:vAlign w:val="top"/>
+          </w:tcPr>
+          <w:p>
+            <w:pPr>
+              <w:spacing w:after="0" w:before="0"/>
+            </w:pPr>
+            <w:r>
+              <w:rPr>
+                <w:b/>
+                <w:bCs/>
+                <w:color w:val="FFFFFF"/>
+                <w:sz w:val="19"/>
+                <w:szCs w:val="19"/>
+              </w:rPr>
+              <w:t xml:space="preserve">Choose it when</w:t>
+            </w:r>
+          </w:p>
+        </w:tc>
+      </w:tr>
+      <w:tr>
+        <w:trPr>
+          <w:cantSplit/>
+        </w:trPr>
+        <w:tc>
+          <w:tcPr>
+            <w:tcW w:type="dxa" w:w="1544"/>
+            <w:tcBorders>
+              <w:top w:val="single" w:color="DCE6F0" w:sz="4"/>
+              <w:left w:val="single" w:color="DCE6F0" w:sz="4"/>
+              <w:bottom w:val="single" w:color="DCE6F0" w:sz="4"/>
+              <w:right w:val="single" w:color="DCE6F0" w:sz="4"/>
+            </w:tcBorders>
+            <w:shd w:fill="FFFFFF" w:color="auto" w:val="clear"/>
+            <w:tcMar>
+              <w:top w:type="dxa" w:w="60"/>
+              <w:left w:type="dxa" w:w="100"/>
+              <w:bottom w:type="dxa" w:w="60"/>
+              <w:right w:type="dxa" w:w="100"/>
+            </w:tcMar>
+            <w:vAlign w:val="top"/>
+          </w:tcPr>
+          <w:p>
+            <w:pPr>
+              <w:spacing w:after="0" w:before="0"/>
+            </w:pPr>
+            <w:r>
+              <w:rPr>
+                <w:rFonts w:ascii="Consolas" w:cs="Consolas" w:eastAsia="Consolas" w:hAnsi="Consolas"/>
+                <w:color w:val="0F5FDC"/>
+                <w:sz w:val="18"/>
+                <w:szCs w:val="18"/>
+              </w:rPr>
+              <w:t xml:space="preserve">0</w:t>
+            </w:r>
+            <w:r>
+              <w:rPr>
+                <w:sz w:val="19"/>
+                <w:szCs w:val="19"/>
+              </w:rPr>
+              <w:t xml:space="preserve"> (default)</w:t>
+            </w:r>
+          </w:p>
+        </w:tc>
+        <w:tc>
+          <w:tcPr>
+            <w:tcW w:type="dxa" w:w="4942"/>
+            <w:tcBorders>
+              <w:top w:val="single" w:color="DCE6F0" w:sz="4"/>
+              <w:left w:val="single" w:color="DCE6F0" w:sz="4"/>
+              <w:bottom w:val="single" w:color="DCE6F0" w:sz="4"/>
+              <w:right w:val="single" w:color="DCE6F0" w:sz="4"/>
+            </w:tcBorders>
+            <w:shd w:fill="FFFFFF" w:color="auto" w:val="clear"/>
+            <w:tcMar>
+              <w:top w:type="dxa" w:w="60"/>
+              <w:left w:type="dxa" w:w="100"/>
+              <w:bottom w:type="dxa" w:w="60"/>
+              <w:right w:type="dxa" w:w="100"/>
+            </w:tcMar>
+            <w:vAlign w:val="top"/>
+          </w:tcPr>
+          <w:p>
+            <w:pPr>
+              <w:spacing w:after="0" w:before="0"/>
+            </w:pPr>
+            <w:r>
+              <w:rPr>
+                <w:sz w:val="19"/>
+                <w:szCs w:val="19"/>
+              </w:rPr>
+              <w:t xml:space="preserve">No mail file is created. Only the Notes ID is created and stored in the vault.</w:t>
+            </w:r>
+          </w:p>
+        </w:tc>
+        <w:tc>
+          <w:tcPr>
+            <w:tcW w:type="dxa" w:w="3152"/>
+            <w:tcBorders>
+              <w:top w:val="single" w:color="DCE6F0" w:sz="4"/>
+              <w:left w:val="single" w:color="DCE6F0" w:sz="4"/>
+              <w:bottom w:val="single" w:color="DCE6F0" w:sz="4"/>
+              <w:right w:val="single" w:color="DCE6F0" w:sz="4"/>
+            </w:tcBorders>
+            <w:shd w:fill="FFFFFF" w:color="auto" w:val="clear"/>
+            <w:tcMar>
+              <w:top w:type="dxa" w:w="60"/>
+              <w:left w:type="dxa" w:w="100"/>
+              <w:bottom w:type="dxa" w:w="60"/>
+              <w:right w:type="dxa" w:w="100"/>
+            </w:tcMar>
+            <w:vAlign w:val="top"/>
+          </w:tcPr>
+          <w:p>
+            <w:pPr>
+              <w:spacing w:after="0" w:before="0"/>
+            </w:pPr>
+            <w:r>
+              <w:rPr>
+                <w:sz w:val="19"/>
+                <w:szCs w:val="19"/>
+              </w:rPr>
+              <w:t xml:space="preserve">Users keep their mailbox where it is today</w:t>
+            </w:r>
+          </w:p>
+        </w:tc>
+      </w:tr>
+      <w:tr>
+        <w:trPr>
+          <w:cantSplit/>
+        </w:trPr>
+        <w:tc>
+          <w:tcPr>
+            <w:tcW w:type="dxa" w:w="1544"/>
+            <w:tcBorders>
+              <w:top w:val="single" w:color="DCE6F0" w:sz="4"/>
+              <w:left w:val="single" w:color="DCE6F0" w:sz="4"/>
+              <w:bottom w:val="single" w:color="DCE6F0" w:sz="4"/>
+              <w:right w:val="single" w:color="DCE6F0" w:sz="4"/>
+            </w:tcBorders>
+            <w:shd w:fill="F7F7FC" w:color="auto" w:val="clear"/>
+            <w:tcMar>
+              <w:top w:type="dxa" w:w="60"/>
+              <w:left w:type="dxa" w:w="100"/>
+              <w:bottom w:type="dxa" w:w="60"/>
+              <w:right w:type="dxa" w:w="100"/>
+            </w:tcMar>
+            <w:vAlign w:val="top"/>
+          </w:tcPr>
+          <w:p>
+            <w:pPr>
+              <w:spacing w:after="0" w:before="0"/>
+            </w:pPr>
+            <w:r>
+              <w:rPr>
+                <w:rFonts w:ascii="Consolas" w:cs="Consolas" w:eastAsia="Consolas" w:hAnsi="Consolas"/>
+                <w:color w:val="0F5FDC"/>
+                <w:sz w:val="18"/>
+                <w:szCs w:val="18"/>
+              </w:rPr>
+              <w:t xml:space="preserve">1</w:t>
+            </w:r>
+          </w:p>
+        </w:tc>
+        <w:tc>
+          <w:tcPr>
+            <w:tcW w:type="dxa" w:w="4942"/>
+            <w:tcBorders>
+              <w:top w:val="single" w:color="DCE6F0" w:sz="4"/>
+              <w:left w:val="single" w:color="DCE6F0" w:sz="4"/>
+              <w:bottom w:val="single" w:color="DCE6F0" w:sz="4"/>
+              <w:right w:val="single" w:color="DCE6F0" w:sz="4"/>
+            </w:tcBorders>
+            <w:shd w:fill="F7F7FC" w:color="auto" w:val="clear"/>
+            <w:tcMar>
+              <w:top w:type="dxa" w:w="60"/>
+              <w:left w:type="dxa" w:w="100"/>
+              <w:bottom w:type="dxa" w:w="60"/>
+              <w:right w:type="dxa" w:w="100"/>
+            </w:tcMar>
+            <w:vAlign w:val="top"/>
+          </w:tcPr>
+          <w:p>
+            <w:pPr>
+              <w:spacing w:after="0" w:before="0"/>
+            </w:pPr>
+            <w:r>
+              <w:rPr>
+                <w:sz w:val="19"/>
+                <w:szCs w:val="19"/>
+              </w:rPr>
+              <w:t xml:space="preserve">A Domino mail file </w:t>
+            </w:r>
+            <w:r>
+              <w:rPr>
+                <w:rFonts w:ascii="Consolas" w:cs="Consolas" w:eastAsia="Consolas" w:hAnsi="Consolas"/>
+                <w:color w:val="0F5FDC"/>
+                <w:sz w:val="18"/>
+                <w:szCs w:val="18"/>
+              </w:rPr>
+              <w:t xml:space="preserve">mail\&lt;shortname&gt;_&lt;noteid&gt;.nsf</w:t>
+            </w:r>
+            <w:r>
+              <w:rPr>
+                <w:sz w:val="19"/>
+                <w:szCs w:val="19"/>
+              </w:rPr>
+              <w:t xml:space="preserve"> is created on the user's home server, and the user becomes a Domino (Notes) mail user</w:t>
+            </w:r>
+          </w:p>
+        </w:tc>
+        <w:tc>
+          <w:tcPr>
+            <w:tcW w:type="dxa" w:w="3152"/>
+            <w:tcBorders>
+              <w:top w:val="single" w:color="DCE6F0" w:sz="4"/>
+              <w:left w:val="single" w:color="DCE6F0" w:sz="4"/>
+              <w:bottom w:val="single" w:color="DCE6F0" w:sz="4"/>
+              <w:right w:val="single" w:color="DCE6F0" w:sz="4"/>
+            </w:tcBorders>
+            <w:shd w:fill="F7F7FC" w:color="auto" w:val="clear"/>
+            <w:tcMar>
+              <w:top w:type="dxa" w:w="60"/>
+              <w:left w:type="dxa" w:w="100"/>
+              <w:bottom w:type="dxa" w:w="60"/>
+              <w:right w:type="dxa" w:w="100"/>
+            </w:tcMar>
+            <w:vAlign w:val="top"/>
+          </w:tcPr>
+          <w:p>
+            <w:pPr>
+              <w:spacing w:after="0" w:before="0"/>
+            </w:pPr>
+            <w:r>
+              <w:rPr>
+                <w:sz w:val="19"/>
+                <w:szCs w:val="19"/>
+              </w:rPr>
+              <w:t xml:space="preserve">You are moving these users' mail to Domino. Needs </w:t>
+            </w:r>
+            <w:r>
+              <w:rPr>
+                <w:i/>
+                <w:iCs/>
+                <w:sz w:val="19"/>
+                <w:szCs w:val="19"/>
+              </w:rPr>
+              <w:t xml:space="preserve">Create databases</w:t>
+            </w:r>
+            <w:r>
+              <w:rPr>
+                <w:sz w:val="19"/>
+                <w:szCs w:val="19"/>
+              </w:rPr>
+              <w:t xml:space="preserve"> rights on the home servers.</w:t>
+            </w:r>
+          </w:p>
+        </w:tc>
+      </w:tr>
+    </w:tbl>
+    <w:p>
+      <w:pPr>
+        <w:spacing w:after="80" w:before="0"/>
+      </w:pPr>
+    </w:p>
+    <w:p>
+      <w:pPr>
+        <w:pStyle w:val="Heading3"/>
+      </w:pPr>
+      <w:r>
+        <w:t xml:space="preserve">PreserveMailSystem: keep the user's mail routing as it was (only when CreateMailDb=0)</w:t>
+      </w:r>
+    </w:p>
+    <w:p>
+      <w:r>
+        <w:t xml:space="preserve">Registration can switch the Person document to </w:t>
+      </w:r>
+      <w:r>
+        <w:rPr>
+          <w:b/>
+          <w:bCs/>
+        </w:rPr>
+        <w:t xml:space="preserve">Notes</w:t>
+      </w:r>
+      <w:r>
+        <w:t xml:space="preserve"> mail with a mail file path, even though no mail file was created. Domino would then try to deliver the user's mail to a mailbox that does not exist. With </w:t>
+      </w:r>
+      <w:r>
+        <w:rPr>
+          <w:rFonts w:ascii="Consolas" w:cs="Consolas" w:eastAsia="Consolas" w:hAnsi="Consolas"/>
+          <w:color w:val="0F5FDC"/>
+          <w:sz w:val="20"/>
+          <w:szCs w:val="20"/>
+        </w:rPr>
+        <w:t xml:space="preserve">PreserveMailSystem=1</w:t>
+      </w:r>
+      <w:r>
+        <w:t xml:space="preserve">, BulkReg checks the Person document straight after registration and </w:t>
+      </w:r>
+      <w:r>
+        <w:rPr>
+          <w:b/>
+          <w:bCs/>
+        </w:rPr>
+        <w:t xml:space="preserve">puts back the values it had before</w:t>
+      </w:r>
+      <w:r>
+        <w:t xml:space="preserve">.</w:t>
+      </w:r>
+    </w:p>
+    <w:tbl>
+      <w:tblPr>
+        <w:tblW w:type="dxa" w:w="9638"/>
+        <w:tblBorders>
+          <w:top w:val="single" w:color="auto" w:sz="4"/>
+          <w:left w:val="single" w:color="auto" w:sz="4"/>
+          <w:bottom w:val="single" w:color="auto" w:sz="4"/>
+          <w:right w:val="single" w:color="auto" w:sz="4"/>
+          <w:insideH w:val="single" w:color="auto" w:sz="4"/>
+          <w:insideV w:val="single" w:color="auto" w:sz="4"/>
+        </w:tblBorders>
+      </w:tblPr>
+      <w:tblGrid>
+        <w:gridCol w:w="2265"/>
+        <w:gridCol w:w="4839"/>
+        <w:gridCol w:w="2534"/>
+      </w:tblGrid>
+      <w:tr>
+        <w:trPr>
+          <w:tblHeader/>
+        </w:trPr>
+        <w:tc>
+          <w:tcPr>
+            <w:tcW w:type="dxa" w:w="2265"/>
+            <w:tcBorders>
+              <w:top w:val="single" w:color="DCE6F0" w:sz="4"/>
+              <w:left w:val="single" w:color="DCE6F0" w:sz="4"/>
+              <w:bottom w:val="single" w:color="DCE6F0" w:sz="4"/>
+              <w:right w:val="single" w:color="DCE6F0" w:sz="4"/>
+            </w:tcBorders>
+            <w:shd w:fill="17707F" w:color="auto" w:val="clear"/>
+            <w:tcMar>
+              <w:top w:type="dxa" w:w="60"/>
+              <w:left w:type="dxa" w:w="100"/>
+              <w:bottom w:type="dxa" w:w="60"/>
+              <w:right w:type="dxa" w:w="100"/>
+            </w:tcMar>
+            <w:vAlign w:val="top"/>
+          </w:tcPr>
+          <w:p>
+            <w:pPr>
+              <w:spacing w:after="0" w:before="0"/>
+            </w:pPr>
+            <w:r>
+              <w:rPr>
+                <w:b/>
+                <w:bCs/>
+                <w:color w:val="FFFFFF"/>
+                <w:sz w:val="19"/>
+                <w:szCs w:val="19"/>
+              </w:rPr>
+              <w:t xml:space="preserve">Value</w:t>
+            </w:r>
+          </w:p>
+        </w:tc>
+        <w:tc>
+          <w:tcPr>
+            <w:tcW w:type="dxa" w:w="4839"/>
+            <w:tcBorders>
+              <w:top w:val="single" w:color="DCE6F0" w:sz="4"/>
+              <w:left w:val="single" w:color="DCE6F0" w:sz="4"/>
+              <w:bottom w:val="single" w:color="DCE6F0" w:sz="4"/>
+              <w:right w:val="single" w:color="DCE6F0" w:sz="4"/>
+            </w:tcBorders>
+            <w:shd w:fill="17707F" w:color="auto" w:val="clear"/>
+            <w:tcMar>
+              <w:top w:type="dxa" w:w="60"/>
+              <w:left w:type="dxa" w:w="100"/>
+              <w:bottom w:type="dxa" w:w="60"/>
+              <w:right w:type="dxa" w:w="100"/>
+            </w:tcMar>
+            <w:vAlign w:val="top"/>
+          </w:tcPr>
+          <w:p>
+            <w:pPr>
+              <w:spacing w:after="0" w:before="0"/>
+            </w:pPr>
+            <w:r>
+              <w:rPr>
+                <w:b/>
+                <w:bCs/>
+                <w:color w:val="FFFFFF"/>
+                <w:sz w:val="19"/>
+                <w:szCs w:val="19"/>
+              </w:rPr>
+              <w:t xml:space="preserve">What happens</w:t>
+            </w:r>
+          </w:p>
+        </w:tc>
+        <w:tc>
+          <w:tcPr>
+            <w:tcW w:type="dxa" w:w="2534"/>
+            <w:tcBorders>
+              <w:top w:val="single" w:color="DCE6F0" w:sz="4"/>
+              <w:left w:val="single" w:color="DCE6F0" w:sz="4"/>
+              <w:bottom w:val="single" w:color="DCE6F0" w:sz="4"/>
+              <w:right w:val="single" w:color="DCE6F0" w:sz="4"/>
+            </w:tcBorders>
+            <w:shd w:fill="17707F" w:color="auto" w:val="clear"/>
+            <w:tcMar>
+              <w:top w:type="dxa" w:w="60"/>
+              <w:left w:type="dxa" w:w="100"/>
+              <w:bottom w:type="dxa" w:w="60"/>
+              <w:right w:type="dxa" w:w="100"/>
+            </w:tcMar>
+            <w:vAlign w:val="top"/>
+          </w:tcPr>
+          <w:p>
+            <w:pPr>
+              <w:spacing w:after="0" w:before="0"/>
+            </w:pPr>
+            <w:r>
+              <w:rPr>
+                <w:b/>
+                <w:bCs/>
+                <w:color w:val="FFFFFF"/>
+                <w:sz w:val="19"/>
+                <w:szCs w:val="19"/>
+              </w:rPr>
+              <w:t xml:space="preserve">Choose it when</w:t>
+            </w:r>
+          </w:p>
+        </w:tc>
+      </w:tr>
+      <w:tr>
+        <w:trPr>
+          <w:cantSplit/>
+        </w:trPr>
+        <w:tc>
+          <w:tcPr>
+            <w:tcW w:type="dxa" w:w="2265"/>
+            <w:tcBorders>
+              <w:top w:val="single" w:color="DCE6F0" w:sz="4"/>
+              <w:left w:val="single" w:color="DCE6F0" w:sz="4"/>
+              <w:bottom w:val="single" w:color="DCE6F0" w:sz="4"/>
+              <w:right w:val="single" w:color="DCE6F0" w:sz="4"/>
+            </w:tcBorders>
+            <w:shd w:fill="FFFFFF" w:color="auto" w:val="clear"/>
+            <w:tcMar>
+              <w:top w:type="dxa" w:w="60"/>
+              <w:left w:type="dxa" w:w="100"/>
+              <w:bottom w:type="dxa" w:w="60"/>
+              <w:right w:type="dxa" w:w="100"/>
+            </w:tcMar>
+            <w:vAlign w:val="top"/>
+          </w:tcPr>
+          <w:p>
+            <w:pPr>
+              <w:spacing w:after="0" w:before="0"/>
+            </w:pPr>
+            <w:r>
+              <w:rPr>
+                <w:rFonts w:ascii="Consolas" w:cs="Consolas" w:eastAsia="Consolas" w:hAnsi="Consolas"/>
+                <w:color w:val="0F5FDC"/>
+                <w:sz w:val="18"/>
+                <w:szCs w:val="18"/>
+              </w:rPr>
+              <w:t xml:space="preserve">1</w:t>
+            </w:r>
+            <w:r>
+              <w:rPr>
+                <w:sz w:val="19"/>
+                <w:szCs w:val="19"/>
+              </w:rPr>
+              <w:t xml:space="preserve"> (default, recommended)</w:t>
+            </w:r>
+          </w:p>
+        </w:tc>
+        <w:tc>
+          <w:tcPr>
+            <w:tcW w:type="dxa" w:w="4839"/>
+            <w:tcBorders>
+              <w:top w:val="single" w:color="DCE6F0" w:sz="4"/>
+              <w:left w:val="single" w:color="DCE6F0" w:sz="4"/>
+              <w:bottom w:val="single" w:color="DCE6F0" w:sz="4"/>
+              <w:right w:val="single" w:color="DCE6F0" w:sz="4"/>
+            </w:tcBorders>
+            <w:shd w:fill="FFFFFF" w:color="auto" w:val="clear"/>
+            <w:tcMar>
+              <w:top w:type="dxa" w:w="60"/>
+              <w:left w:type="dxa" w:w="100"/>
+              <w:bottom w:type="dxa" w:w="60"/>
+              <w:right w:type="dxa" w:w="100"/>
+            </w:tcMar>
+            <w:vAlign w:val="top"/>
+          </w:tcPr>
+          <w:p>
+            <w:pPr>
+              <w:spacing w:after="0" w:before="0"/>
+            </w:pPr>
+            <w:r>
+              <w:rPr>
+                <w:sz w:val="19"/>
+                <w:szCs w:val="19"/>
+              </w:rPr>
+              <w:t xml:space="preserve">Mail system and Mail file are restored to their pre-registration values. Mail keeps flowing to the external mailbox exactly as before.</w:t>
+            </w:r>
+          </w:p>
+        </w:tc>
+        <w:tc>
+          <w:tcPr>
+            <w:tcW w:type="dxa" w:w="2534"/>
+            <w:tcBorders>
+              <w:top w:val="single" w:color="DCE6F0" w:sz="4"/>
+              <w:left w:val="single" w:color="DCE6F0" w:sz="4"/>
+              <w:bottom w:val="single" w:color="DCE6F0" w:sz="4"/>
+              <w:right w:val="single" w:color="DCE6F0" w:sz="4"/>
+            </w:tcBorders>
+            <w:shd w:fill="FFFFFF" w:color="auto" w:val="clear"/>
+            <w:tcMar>
+              <w:top w:type="dxa" w:w="60"/>
+              <w:left w:type="dxa" w:w="100"/>
+              <w:bottom w:type="dxa" w:w="60"/>
+              <w:right w:type="dxa" w:w="100"/>
+            </w:tcMar>
+            <w:vAlign w:val="top"/>
+          </w:tcPr>
+          <w:p>
+            <w:pPr>
+              <w:spacing w:after="0" w:before="0"/>
+            </w:pPr>
+            <w:r>
+              <w:rPr>
+                <w:sz w:val="19"/>
+                <w:szCs w:val="19"/>
+              </w:rPr>
+              <w:t xml:space="preserve">Users keep their external mailbox</w:t>
+            </w:r>
+          </w:p>
+        </w:tc>
+      </w:tr>
+      <w:tr>
+        <w:trPr>
+          <w:cantSplit/>
+        </w:trPr>
+        <w:tc>
+          <w:tcPr>
+            <w:tcW w:type="dxa" w:w="2265"/>
+            <w:tcBorders>
+              <w:top w:val="single" w:color="DCE6F0" w:sz="4"/>
+              <w:left w:val="single" w:color="DCE6F0" w:sz="4"/>
+              <w:bottom w:val="single" w:color="DCE6F0" w:sz="4"/>
+              <w:right w:val="single" w:color="DCE6F0" w:sz="4"/>
+            </w:tcBorders>
+            <w:shd w:fill="F7F7FC" w:color="auto" w:val="clear"/>
+            <w:tcMar>
+              <w:top w:type="dxa" w:w="60"/>
+              <w:left w:type="dxa" w:w="100"/>
+              <w:bottom w:type="dxa" w:w="60"/>
+              <w:right w:type="dxa" w:w="100"/>
+            </w:tcMar>
+            <w:vAlign w:val="top"/>
+          </w:tcPr>
+          <w:p>
+            <w:pPr>
+              <w:spacing w:after="0" w:before="0"/>
+            </w:pPr>
+            <w:r>
+              <w:rPr>
+                <w:rFonts w:ascii="Consolas" w:cs="Consolas" w:eastAsia="Consolas" w:hAnsi="Consolas"/>
+                <w:color w:val="0F5FDC"/>
+                <w:sz w:val="18"/>
+                <w:szCs w:val="18"/>
+              </w:rPr>
+              <w:t xml:space="preserve">0</w:t>
+            </w:r>
+          </w:p>
+        </w:tc>
+        <w:tc>
+          <w:tcPr>
+            <w:tcW w:type="dxa" w:w="4839"/>
+            <w:tcBorders>
+              <w:top w:val="single" w:color="DCE6F0" w:sz="4"/>
+              <w:left w:val="single" w:color="DCE6F0" w:sz="4"/>
+              <w:bottom w:val="single" w:color="DCE6F0" w:sz="4"/>
+              <w:right w:val="single" w:color="DCE6F0" w:sz="4"/>
+            </w:tcBorders>
+            <w:shd w:fill="F7F7FC" w:color="auto" w:val="clear"/>
+            <w:tcMar>
+              <w:top w:type="dxa" w:w="60"/>
+              <w:left w:type="dxa" w:w="100"/>
+              <w:bottom w:type="dxa" w:w="60"/>
+              <w:right w:type="dxa" w:w="100"/>
+            </w:tcMar>
+            <w:vAlign w:val="top"/>
+          </w:tcPr>
+          <w:p>
+            <w:pPr>
+              <w:spacing w:after="0" w:before="0"/>
+            </w:pPr>
+            <w:r>
+              <w:rPr>
+                <w:sz w:val="19"/>
+                <w:szCs w:val="19"/>
+              </w:rPr>
+              <w:t xml:space="preserve">BulkReg leaves whatever registration wrote</w:t>
+            </w:r>
+          </w:p>
+        </w:tc>
+        <w:tc>
+          <w:tcPr>
+            <w:tcW w:type="dxa" w:w="2534"/>
+            <w:tcBorders>
+              <w:top w:val="single" w:color="DCE6F0" w:sz="4"/>
+              <w:left w:val="single" w:color="DCE6F0" w:sz="4"/>
+              <w:bottom w:val="single" w:color="DCE6F0" w:sz="4"/>
+              <w:right w:val="single" w:color="DCE6F0" w:sz="4"/>
+            </w:tcBorders>
+            <w:shd w:fill="F7F7FC" w:color="auto" w:val="clear"/>
+            <w:tcMar>
+              <w:top w:type="dxa" w:w="60"/>
+              <w:left w:type="dxa" w:w="100"/>
+              <w:bottom w:type="dxa" w:w="60"/>
+              <w:right w:type="dxa" w:w="100"/>
+            </w:tcMar>
+            <w:vAlign w:val="top"/>
+          </w:tcPr>
+          <w:p>
+            <w:pPr>
+              <w:spacing w:after="0" w:before="0"/>
+            </w:pPr>
+            <w:r>
+              <w:rPr>
+                <w:sz w:val="19"/>
+                <w:szCs w:val="19"/>
+              </w:rPr>
+              <w:t xml:space="preserve">You will set the mail fields yourself, for example in a separate migration step</w:t>
+            </w:r>
+          </w:p>
+        </w:tc>
+      </w:tr>
+    </w:tbl>
+    <w:p>
+      <w:pPr>
+        <w:spacing w:after="80" w:before="0"/>
+      </w:pPr>
+    </w:p>
+    <w:p>
+      <w:pPr>
+        <w:pStyle w:val="Heading3"/>
+      </w:pPr>
+      <w:r>
+        <w:t xml:space="preserve">Example: one user, before and after (CreateMailDb=0, PreserveMailSystem=1)</w:t>
+      </w:r>
+    </w:p>
+    <w:tbl>
+      <w:tblPr>
+        <w:tblW w:type="dxa" w:w="9638"/>
+        <w:tblBorders>
+          <w:top w:val="single" w:color="auto" w:sz="4"/>
+          <w:left w:val="single" w:color="auto" w:sz="4"/>
+          <w:bottom w:val="single" w:color="auto" w:sz="4"/>
+          <w:right w:val="single" w:color="auto" w:sz="4"/>
+          <w:insideH w:val="single" w:color="auto" w:sz="4"/>
+          <w:insideV w:val="single" w:color="auto" w:sz="4"/>
+        </w:tblBorders>
+      </w:tblPr>
+      <w:tblGrid>
+        <w:gridCol w:w="2265"/>
+        <w:gridCol w:w="2162"/>
+        <w:gridCol w:w="2780"/>
+        <w:gridCol w:w="2431"/>
+      </w:tblGrid>
+      <w:tr>
+        <w:trPr>
+          <w:tblHeader/>
+        </w:trPr>
+        <w:tc>
+          <w:tcPr>
+            <w:tcW w:type="dxa" w:w="2265"/>
+            <w:tcBorders>
+              <w:top w:val="single" w:color="DCE6F0" w:sz="4"/>
+              <w:left w:val="single" w:color="DCE6F0" w:sz="4"/>
+              <w:bottom w:val="single" w:color="DCE6F0" w:sz="4"/>
+              <w:right w:val="single" w:color="DCE6F0" w:sz="4"/>
+            </w:tcBorders>
+            <w:shd w:fill="17707F" w:color="auto" w:val="clear"/>
+            <w:tcMar>
+              <w:top w:type="dxa" w:w="60"/>
+              <w:left w:type="dxa" w:w="100"/>
+              <w:bottom w:type="dxa" w:w="60"/>
+              <w:right w:type="dxa" w:w="100"/>
+            </w:tcMar>
+            <w:vAlign w:val="top"/>
+          </w:tcPr>
+          <w:p>
+            <w:pPr>
+              <w:spacing w:after="0" w:before="0"/>
+            </w:pPr>
+            <w:r>
+              <w:rPr>
+                <w:b/>
+                <w:bCs/>
+                <w:color w:val="FFFFFF"/>
+                <w:sz w:val="19"/>
+                <w:szCs w:val="19"/>
+              </w:rPr>
+              <w:t xml:space="preserve">Person document field</w:t>
+            </w:r>
+          </w:p>
+        </w:tc>
+        <w:tc>
+          <w:tcPr>
+            <w:tcW w:type="dxa" w:w="2162"/>
+            <w:tcBorders>
+              <w:top w:val="single" w:color="DCE6F0" w:sz="4"/>
+              <w:left w:val="single" w:color="DCE6F0" w:sz="4"/>
+              <w:bottom w:val="single" w:color="DCE6F0" w:sz="4"/>
+              <w:right w:val="single" w:color="DCE6F0" w:sz="4"/>
+            </w:tcBorders>
+            <w:shd w:fill="17707F" w:color="auto" w:val="clear"/>
+            <w:tcMar>
+              <w:top w:type="dxa" w:w="60"/>
+              <w:left w:type="dxa" w:w="100"/>
+              <w:bottom w:type="dxa" w:w="60"/>
+              <w:right w:type="dxa" w:w="100"/>
+            </w:tcMar>
+            <w:vAlign w:val="top"/>
+          </w:tcPr>
+          <w:p>
+            <w:pPr>
+              <w:spacing w:after="0" w:before="0"/>
+            </w:pPr>
+            <w:r>
+              <w:rPr>
+                <w:b/>
+                <w:bCs/>
+                <w:color w:val="FFFFFF"/>
+                <w:sz w:val="19"/>
+                <w:szCs w:val="19"/>
+              </w:rPr>
+              <w:t xml:space="preserve">Before registration</w:t>
+            </w:r>
+          </w:p>
+        </w:tc>
+        <w:tc>
+          <w:tcPr>
+            <w:tcW w:type="dxa" w:w="2780"/>
+            <w:tcBorders>
+              <w:top w:val="single" w:color="DCE6F0" w:sz="4"/>
+              <w:left w:val="single" w:color="DCE6F0" w:sz="4"/>
+              <w:bottom w:val="single" w:color="DCE6F0" w:sz="4"/>
+              <w:right w:val="single" w:color="DCE6F0" w:sz="4"/>
+            </w:tcBorders>
+            <w:shd w:fill="17707F" w:color="auto" w:val="clear"/>
+            <w:tcMar>
+              <w:top w:type="dxa" w:w="60"/>
+              <w:left w:type="dxa" w:w="100"/>
+              <w:bottom w:type="dxa" w:w="60"/>
+              <w:right w:type="dxa" w:w="100"/>
+            </w:tcMar>
+            <w:vAlign w:val="top"/>
+          </w:tcPr>
+          <w:p>
+            <w:pPr>
+              <w:spacing w:after="0" w:before="0"/>
+            </w:pPr>
+            <w:r>
+              <w:rPr>
+                <w:b/>
+                <w:bCs/>
+                <w:color w:val="FFFFFF"/>
+                <w:sz w:val="19"/>
+                <w:szCs w:val="19"/>
+              </w:rPr>
+              <w:t xml:space="preserve">Right after RegisterNewUser (possible)</w:t>
+            </w:r>
+          </w:p>
+        </w:tc>
+        <w:tc>
+          <w:tcPr>
+            <w:tcW w:type="dxa" w:w="2431"/>
+            <w:tcBorders>
+              <w:top w:val="single" w:color="DCE6F0" w:sz="4"/>
+              <w:left w:val="single" w:color="DCE6F0" w:sz="4"/>
+              <w:bottom w:val="single" w:color="DCE6F0" w:sz="4"/>
+              <w:right w:val="single" w:color="DCE6F0" w:sz="4"/>
+            </w:tcBorders>
+            <w:shd w:fill="17707F" w:color="auto" w:val="clear"/>
+            <w:tcMar>
+              <w:top w:type="dxa" w:w="60"/>
+              <w:left w:type="dxa" w:w="100"/>
+              <w:bottom w:type="dxa" w:w="60"/>
+              <w:right w:type="dxa" w:w="100"/>
+            </w:tcMar>
+            <w:vAlign w:val="top"/>
+          </w:tcPr>
+          <w:p>
+            <w:pPr>
+              <w:spacing w:after="0" w:before="0"/>
+            </w:pPr>
+            <w:r>
+              <w:rPr>
+                <w:b/>
+                <w:bCs/>
+                <w:color w:val="FFFFFF"/>
+                <w:sz w:val="19"/>
+                <w:szCs w:val="19"/>
+              </w:rPr>
+              <w:t xml:space="preserve">After BulkReg finishes</w:t>
+            </w:r>
+          </w:p>
+        </w:tc>
+      </w:tr>
+      <w:tr>
+        <w:trPr>
+          <w:cantSplit/>
+        </w:trPr>
+        <w:tc>
+          <w:tcPr>
+            <w:tcW w:type="dxa" w:w="2265"/>
+            <w:tcBorders>
+              <w:top w:val="single" w:color="DCE6F0" w:sz="4"/>
+              <w:left w:val="single" w:color="DCE6F0" w:sz="4"/>
+              <w:bottom w:val="single" w:color="DCE6F0" w:sz="4"/>
+              <w:right w:val="single" w:color="DCE6F0" w:sz="4"/>
+            </w:tcBorders>
+            <w:shd w:fill="FFFFFF" w:color="auto" w:val="clear"/>
+            <w:tcMar>
+              <w:top w:type="dxa" w:w="60"/>
+              <w:left w:type="dxa" w:w="100"/>
+              <w:bottom w:type="dxa" w:w="60"/>
+              <w:right w:type="dxa" w:w="100"/>
+            </w:tcMar>
+            <w:vAlign w:val="top"/>
+          </w:tcPr>
+          <w:p>
+            <w:pPr>
+              <w:spacing w:after="0" w:before="0"/>
+            </w:pPr>
+            <w:r>
+              <w:rPr>
+                <w:sz w:val="19"/>
+                <w:szCs w:val="19"/>
+              </w:rPr>
+              <w:t xml:space="preserve">Full name</w:t>
+            </w:r>
+          </w:p>
+        </w:tc>
+        <w:tc>
+          <w:tcPr>
+            <w:tcW w:type="dxa" w:w="2162"/>
+            <w:tcBorders>
+              <w:top w:val="single" w:color="DCE6F0" w:sz="4"/>
+              <w:left w:val="single" w:color="DCE6F0" w:sz="4"/>
+              <w:bottom w:val="single" w:color="DCE6F0" w:sz="4"/>
+              <w:right w:val="single" w:color="DCE6F0" w:sz="4"/>
+            </w:tcBorders>
+            <w:shd w:fill="FFFFFF" w:color="auto" w:val="clear"/>
+            <w:tcMar>
+              <w:top w:type="dxa" w:w="60"/>
+              <w:left w:type="dxa" w:w="100"/>
+              <w:bottom w:type="dxa" w:w="60"/>
+              <w:right w:type="dxa" w:w="100"/>
+            </w:tcMar>
+            <w:vAlign w:val="top"/>
+          </w:tcPr>
+          <w:p>
+            <w:pPr>
+              <w:spacing w:after="0" w:before="0"/>
+            </w:pPr>
+            <w:r>
+              <w:rPr>
+                <w:sz w:val="19"/>
+                <w:szCs w:val="19"/>
+              </w:rPr>
+              <w:t xml:space="preserve">John Smith</w:t>
+            </w:r>
+          </w:p>
+        </w:tc>
+        <w:tc>
+          <w:tcPr>
+            <w:tcW w:type="dxa" w:w="2780"/>
+            <w:tcBorders>
+              <w:top w:val="single" w:color="DCE6F0" w:sz="4"/>
+              <w:left w:val="single" w:color="DCE6F0" w:sz="4"/>
+              <w:bottom w:val="single" w:color="DCE6F0" w:sz="4"/>
+              <w:right w:val="single" w:color="DCE6F0" w:sz="4"/>
+            </w:tcBorders>
+            <w:shd w:fill="FFFFFF" w:color="auto" w:val="clear"/>
+            <w:tcMar>
+              <w:top w:type="dxa" w:w="60"/>
+              <w:left w:type="dxa" w:w="100"/>
+              <w:bottom w:type="dxa" w:w="60"/>
+              <w:right w:type="dxa" w:w="100"/>
+            </w:tcMar>
+            <w:vAlign w:val="top"/>
+          </w:tcPr>
+          <w:p>
+            <w:pPr>
+              <w:spacing w:after="0" w:before="0"/>
+            </w:pPr>
+            <w:r>
+              <w:rPr>
+                <w:sz w:val="19"/>
+                <w:szCs w:val="19"/>
+              </w:rPr>
+              <w:t xml:space="preserve">John Smith/Sales/Demo</w:t>
+            </w:r>
+          </w:p>
+        </w:tc>
+        <w:tc>
+          <w:tcPr>
+            <w:tcW w:type="dxa" w:w="2431"/>
+            <w:tcBorders>
+              <w:top w:val="single" w:color="DCE6F0" w:sz="4"/>
+              <w:left w:val="single" w:color="DCE6F0" w:sz="4"/>
+              <w:bottom w:val="single" w:color="DCE6F0" w:sz="4"/>
+              <w:right w:val="single" w:color="DCE6F0" w:sz="4"/>
+            </w:tcBorders>
+            <w:shd w:fill="FFFFFF" w:color="auto" w:val="clear"/>
+            <w:tcMar>
+              <w:top w:type="dxa" w:w="60"/>
+              <w:left w:type="dxa" w:w="100"/>
+              <w:bottom w:type="dxa" w:w="60"/>
+              <w:right w:type="dxa" w:w="100"/>
+            </w:tcMar>
+            <w:vAlign w:val="top"/>
+          </w:tcPr>
+          <w:p>
+            <w:pPr>
+              <w:spacing w:after="0" w:before="0"/>
+            </w:pPr>
+            <w:r>
+              <w:rPr>
+                <w:sz w:val="19"/>
+                <w:szCs w:val="19"/>
+              </w:rPr>
+              <w:t xml:space="preserve">John Smith/Sales/Demo</w:t>
+            </w:r>
+          </w:p>
+        </w:tc>
+      </w:tr>
+      <w:tr>
+        <w:trPr>
+          <w:cantSplit/>
+        </w:trPr>
+        <w:tc>
+          <w:tcPr>
+            <w:tcW w:type="dxa" w:w="2265"/>
+            <w:tcBorders>
+              <w:top w:val="single" w:color="DCE6F0" w:sz="4"/>
+              <w:left w:val="single" w:color="DCE6F0" w:sz="4"/>
+              <w:bottom w:val="single" w:color="DCE6F0" w:sz="4"/>
+              <w:right w:val="single" w:color="DCE6F0" w:sz="4"/>
+            </w:tcBorders>
+            <w:shd w:fill="F7F7FC" w:color="auto" w:val="clear"/>
+            <w:tcMar>
+              <w:top w:type="dxa" w:w="60"/>
+              <w:left w:type="dxa" w:w="100"/>
+              <w:bottom w:type="dxa" w:w="60"/>
+              <w:right w:type="dxa" w:w="100"/>
+            </w:tcMar>
+            <w:vAlign w:val="top"/>
+          </w:tcPr>
+          <w:p>
+            <w:pPr>
+              <w:spacing w:after="0" w:before="0"/>
+            </w:pPr>
+            <w:r>
+              <w:rPr>
+                <w:sz w:val="19"/>
+                <w:szCs w:val="19"/>
+              </w:rPr>
+              <w:t xml:space="preserve">Certificate</w:t>
+            </w:r>
+          </w:p>
+        </w:tc>
+        <w:tc>
+          <w:tcPr>
+            <w:tcW w:type="dxa" w:w="2162"/>
+            <w:tcBorders>
+              <w:top w:val="single" w:color="DCE6F0" w:sz="4"/>
+              <w:left w:val="single" w:color="DCE6F0" w:sz="4"/>
+              <w:bottom w:val="single" w:color="DCE6F0" w:sz="4"/>
+              <w:right w:val="single" w:color="DCE6F0" w:sz="4"/>
+            </w:tcBorders>
+            <w:shd w:fill="F7F7FC" w:color="auto" w:val="clear"/>
+            <w:tcMar>
+              <w:top w:type="dxa" w:w="60"/>
+              <w:left w:type="dxa" w:w="100"/>
+              <w:bottom w:type="dxa" w:w="60"/>
+              <w:right w:type="dxa" w:w="100"/>
+            </w:tcMar>
+            <w:vAlign w:val="top"/>
+          </w:tcPr>
+          <w:p>
+            <w:pPr>
+              <w:spacing w:after="0" w:before="0"/>
+            </w:pPr>
+            <w:r>
+              <w:rPr>
+                <w:sz w:val="19"/>
+                <w:szCs w:val="19"/>
+              </w:rPr>
+              <w:t xml:space="preserve">(empty)</w:t>
+            </w:r>
+          </w:p>
+        </w:tc>
+        <w:tc>
+          <w:tcPr>
+            <w:tcW w:type="dxa" w:w="2780"/>
+            <w:tcBorders>
+              <w:top w:val="single" w:color="DCE6F0" w:sz="4"/>
+              <w:left w:val="single" w:color="DCE6F0" w:sz="4"/>
+              <w:bottom w:val="single" w:color="DCE6F0" w:sz="4"/>
+              <w:right w:val="single" w:color="DCE6F0" w:sz="4"/>
+            </w:tcBorders>
+            <w:shd w:fill="F7F7FC" w:color="auto" w:val="clear"/>
+            <w:tcMar>
+              <w:top w:type="dxa" w:w="60"/>
+              <w:left w:type="dxa" w:w="100"/>
+              <w:bottom w:type="dxa" w:w="60"/>
+              <w:right w:type="dxa" w:w="100"/>
+            </w:tcMar>
+            <w:vAlign w:val="top"/>
+          </w:tcPr>
+          <w:p>
+            <w:pPr>
+              <w:spacing w:after="0" w:before="0"/>
+            </w:pPr>
+            <w:r>
+              <w:rPr>
+                <w:sz w:val="19"/>
+                <w:szCs w:val="19"/>
+              </w:rPr>
+              <w:t xml:space="preserve">(present)</w:t>
+            </w:r>
+          </w:p>
+        </w:tc>
+        <w:tc>
+          <w:tcPr>
+            <w:tcW w:type="dxa" w:w="2431"/>
+            <w:tcBorders>
+              <w:top w:val="single" w:color="DCE6F0" w:sz="4"/>
+              <w:left w:val="single" w:color="DCE6F0" w:sz="4"/>
+              <w:bottom w:val="single" w:color="DCE6F0" w:sz="4"/>
+              <w:right w:val="single" w:color="DCE6F0" w:sz="4"/>
+            </w:tcBorders>
+            <w:shd w:fill="F7F7FC" w:color="auto" w:val="clear"/>
+            <w:tcMar>
+              <w:top w:type="dxa" w:w="60"/>
+              <w:left w:type="dxa" w:w="100"/>
+              <w:bottom w:type="dxa" w:w="60"/>
+              <w:right w:type="dxa" w:w="100"/>
+            </w:tcMar>
+            <w:vAlign w:val="top"/>
+          </w:tcPr>
+          <w:p>
+            <w:pPr>
+              <w:spacing w:after="0" w:before="0"/>
+            </w:pPr>
+            <w:r>
+              <w:rPr>
+                <w:sz w:val="19"/>
+                <w:szCs w:val="19"/>
+              </w:rPr>
+              <w:t xml:space="preserve">(present)</w:t>
+            </w:r>
+          </w:p>
+        </w:tc>
+      </w:tr>
+      <w:tr>
+        <w:trPr>
+          <w:cantSplit/>
+        </w:trPr>
+        <w:tc>
+          <w:tcPr>
+            <w:tcW w:type="dxa" w:w="2265"/>
+            <w:tcBorders>
+              <w:top w:val="single" w:color="DCE6F0" w:sz="4"/>
+              <w:left w:val="single" w:color="DCE6F0" w:sz="4"/>
+              <w:bottom w:val="single" w:color="DCE6F0" w:sz="4"/>
+              <w:right w:val="single" w:color="DCE6F0" w:sz="4"/>
+            </w:tcBorders>
+            <w:shd w:fill="FFFFFF" w:color="auto" w:val="clear"/>
+            <w:tcMar>
+              <w:top w:type="dxa" w:w="60"/>
+              <w:left w:type="dxa" w:w="100"/>
+              <w:bottom w:type="dxa" w:w="60"/>
+              <w:right w:type="dxa" w:w="100"/>
+            </w:tcMar>
+            <w:vAlign w:val="top"/>
+          </w:tcPr>
+          <w:p>
+            <w:pPr>
+              <w:spacing w:after="0" w:before="0"/>
+            </w:pPr>
+            <w:r>
+              <w:rPr>
+                <w:sz w:val="19"/>
+                <w:szCs w:val="19"/>
+              </w:rPr>
+              <w:t xml:space="preserve">Mail system</w:t>
+            </w:r>
+          </w:p>
+        </w:tc>
+        <w:tc>
+          <w:tcPr>
+            <w:tcW w:type="dxa" w:w="2162"/>
+            <w:tcBorders>
+              <w:top w:val="single" w:color="DCE6F0" w:sz="4"/>
+              <w:left w:val="single" w:color="DCE6F0" w:sz="4"/>
+              <w:bottom w:val="single" w:color="DCE6F0" w:sz="4"/>
+              <w:right w:val="single" w:color="DCE6F0" w:sz="4"/>
+            </w:tcBorders>
+            <w:shd w:fill="FFFFFF" w:color="auto" w:val="clear"/>
+            <w:tcMar>
+              <w:top w:type="dxa" w:w="60"/>
+              <w:left w:type="dxa" w:w="100"/>
+              <w:bottom w:type="dxa" w:w="60"/>
+              <w:right w:type="dxa" w:w="100"/>
+            </w:tcMar>
+            <w:vAlign w:val="top"/>
+          </w:tcPr>
+          <w:p>
+            <w:pPr>
+              <w:spacing w:after="0" w:before="0"/>
+            </w:pPr>
+            <w:r>
+              <w:rPr>
+                <w:sz w:val="19"/>
+                <w:szCs w:val="19"/>
+              </w:rPr>
+              <w:t xml:space="preserve">Other Internet Mail</w:t>
+            </w:r>
+          </w:p>
+        </w:tc>
+        <w:tc>
+          <w:tcPr>
+            <w:tcW w:type="dxa" w:w="2780"/>
+            <w:tcBorders>
+              <w:top w:val="single" w:color="DCE6F0" w:sz="4"/>
+              <w:left w:val="single" w:color="DCE6F0" w:sz="4"/>
+              <w:bottom w:val="single" w:color="DCE6F0" w:sz="4"/>
+              <w:right w:val="single" w:color="DCE6F0" w:sz="4"/>
+            </w:tcBorders>
+            <w:shd w:fill="FFFFFF" w:color="auto" w:val="clear"/>
+            <w:tcMar>
+              <w:top w:type="dxa" w:w="60"/>
+              <w:left w:type="dxa" w:w="100"/>
+              <w:bottom w:type="dxa" w:w="60"/>
+              <w:right w:type="dxa" w:w="100"/>
+            </w:tcMar>
+            <w:vAlign w:val="top"/>
+          </w:tcPr>
+          <w:p>
+            <w:pPr>
+              <w:spacing w:after="0" w:before="0"/>
+            </w:pPr>
+            <w:r>
+              <w:rPr>
+                <w:sz w:val="19"/>
+                <w:szCs w:val="19"/>
+              </w:rPr>
+              <w:t xml:space="preserve">Notes</w:t>
+            </w:r>
+          </w:p>
+        </w:tc>
+        <w:tc>
+          <w:tcPr>
+            <w:tcW w:type="dxa" w:w="2431"/>
+            <w:tcBorders>
+              <w:top w:val="single" w:color="DCE6F0" w:sz="4"/>
+              <w:left w:val="single" w:color="DCE6F0" w:sz="4"/>
+              <w:bottom w:val="single" w:color="DCE6F0" w:sz="4"/>
+              <w:right w:val="single" w:color="DCE6F0" w:sz="4"/>
+            </w:tcBorders>
+            <w:shd w:fill="FFFFFF" w:color="auto" w:val="clear"/>
+            <w:tcMar>
+              <w:top w:type="dxa" w:w="60"/>
+              <w:left w:type="dxa" w:w="100"/>
+              <w:bottom w:type="dxa" w:w="60"/>
+              <w:right w:type="dxa" w:w="100"/>
+            </w:tcMar>
+            <w:vAlign w:val="top"/>
+          </w:tcPr>
+          <w:p>
+            <w:pPr>
+              <w:spacing w:after="0" w:before="0"/>
+            </w:pPr>
+            <w:r>
+              <w:rPr>
+                <w:b/>
+                <w:bCs/>
+                <w:sz w:val="19"/>
+                <w:szCs w:val="19"/>
+              </w:rPr>
+              <w:t xml:space="preserve">Other Internet Mail</w:t>
+            </w:r>
+          </w:p>
+        </w:tc>
+      </w:tr>
+      <w:tr>
+        <w:trPr>
+          <w:cantSplit/>
+        </w:trPr>
+        <w:tc>
+          <w:tcPr>
+            <w:tcW w:type="dxa" w:w="2265"/>
+            <w:tcBorders>
+              <w:top w:val="single" w:color="DCE6F0" w:sz="4"/>
+              <w:left w:val="single" w:color="DCE6F0" w:sz="4"/>
+              <w:bottom w:val="single" w:color="DCE6F0" w:sz="4"/>
+              <w:right w:val="single" w:color="DCE6F0" w:sz="4"/>
+            </w:tcBorders>
+            <w:shd w:fill="F7F7FC" w:color="auto" w:val="clear"/>
+            <w:tcMar>
+              <w:top w:type="dxa" w:w="60"/>
+              <w:left w:type="dxa" w:w="100"/>
+              <w:bottom w:type="dxa" w:w="60"/>
+              <w:right w:type="dxa" w:w="100"/>
+            </w:tcMar>
+            <w:vAlign w:val="top"/>
+          </w:tcPr>
+          <w:p>
+            <w:pPr>
+              <w:spacing w:after="0" w:before="0"/>
+            </w:pPr>
+            <w:r>
+              <w:rPr>
+                <w:sz w:val="19"/>
+                <w:szCs w:val="19"/>
+              </w:rPr>
+              <w:t xml:space="preserve">Mail file</w:t>
+            </w:r>
+          </w:p>
+        </w:tc>
+        <w:tc>
+          <w:tcPr>
+            <w:tcW w:type="dxa" w:w="2162"/>
+            <w:tcBorders>
+              <w:top w:val="single" w:color="DCE6F0" w:sz="4"/>
+              <w:left w:val="single" w:color="DCE6F0" w:sz="4"/>
+              <w:bottom w:val="single" w:color="DCE6F0" w:sz="4"/>
+              <w:right w:val="single" w:color="DCE6F0" w:sz="4"/>
+            </w:tcBorders>
+            <w:shd w:fill="F7F7FC" w:color="auto" w:val="clear"/>
+            <w:tcMar>
+              <w:top w:type="dxa" w:w="60"/>
+              <w:left w:type="dxa" w:w="100"/>
+              <w:bottom w:type="dxa" w:w="60"/>
+              <w:right w:type="dxa" w:w="100"/>
+            </w:tcMar>
+            <w:vAlign w:val="top"/>
+          </w:tcPr>
+          <w:p>
+            <w:pPr>
+              <w:spacing w:after="0" w:before="0"/>
+            </w:pPr>
+            <w:r>
+              <w:rPr>
+                <w:sz w:val="19"/>
+                <w:szCs w:val="19"/>
+              </w:rPr>
+              <w:t xml:space="preserve">(empty)</w:t>
+            </w:r>
+          </w:p>
+        </w:tc>
+        <w:tc>
+          <w:tcPr>
+            <w:tcW w:type="dxa" w:w="2780"/>
+            <w:tcBorders>
+              <w:top w:val="single" w:color="DCE6F0" w:sz="4"/>
+              <w:left w:val="single" w:color="DCE6F0" w:sz="4"/>
+              <w:bottom w:val="single" w:color="DCE6F0" w:sz="4"/>
+              <w:right w:val="single" w:color="DCE6F0" w:sz="4"/>
+            </w:tcBorders>
+            <w:shd w:fill="F7F7FC" w:color="auto" w:val="clear"/>
+            <w:tcMar>
+              <w:top w:type="dxa" w:w="60"/>
+              <w:left w:type="dxa" w:w="100"/>
+              <w:bottom w:type="dxa" w:w="60"/>
+              <w:right w:type="dxa" w:w="100"/>
+            </w:tcMar>
+            <w:vAlign w:val="top"/>
+          </w:tcPr>
+          <w:p>
+            <w:pPr>
+              <w:spacing w:after="0" w:before="0"/>
+            </w:pPr>
+            <w:r>
+              <w:rPr>
+                <w:sz w:val="19"/>
+                <w:szCs w:val="19"/>
+              </w:rPr>
+              <w:t xml:space="preserve">mail\jsmith.nsf</w:t>
+            </w:r>
+          </w:p>
+        </w:tc>
+        <w:tc>
+          <w:tcPr>
+            <w:tcW w:type="dxa" w:w="2431"/>
+            <w:tcBorders>
+              <w:top w:val="single" w:color="DCE6F0" w:sz="4"/>
+              <w:left w:val="single" w:color="DCE6F0" w:sz="4"/>
+              <w:bottom w:val="single" w:color="DCE6F0" w:sz="4"/>
+              <w:right w:val="single" w:color="DCE6F0" w:sz="4"/>
+            </w:tcBorders>
+            <w:shd w:fill="F7F7FC" w:color="auto" w:val="clear"/>
+            <w:tcMar>
+              <w:top w:type="dxa" w:w="60"/>
+              <w:left w:type="dxa" w:w="100"/>
+              <w:bottom w:type="dxa" w:w="60"/>
+              <w:right w:type="dxa" w:w="100"/>
+            </w:tcMar>
+            <w:vAlign w:val="top"/>
+          </w:tcPr>
+          <w:p>
+            <w:pPr>
+              <w:spacing w:after="0" w:before="0"/>
+            </w:pPr>
+            <w:r>
+              <w:rPr>
+                <w:b/>
+                <w:bCs/>
+                <w:sz w:val="19"/>
+                <w:szCs w:val="19"/>
+              </w:rPr>
+              <w:t xml:space="preserve">(empty)</w:t>
+            </w:r>
+          </w:p>
+        </w:tc>
+      </w:tr>
+      <w:tr>
+        <w:trPr>
+          <w:cantSplit/>
+        </w:trPr>
+        <w:tc>
+          <w:tcPr>
+            <w:tcW w:type="dxa" w:w="2265"/>
+            <w:tcBorders>
+              <w:top w:val="single" w:color="DCE6F0" w:sz="4"/>
+              <w:left w:val="single" w:color="DCE6F0" w:sz="4"/>
+              <w:bottom w:val="single" w:color="DCE6F0" w:sz="4"/>
+              <w:right w:val="single" w:color="DCE6F0" w:sz="4"/>
+            </w:tcBorders>
+            <w:shd w:fill="FFFFFF" w:color="auto" w:val="clear"/>
+            <w:tcMar>
+              <w:top w:type="dxa" w:w="60"/>
+              <w:left w:type="dxa" w:w="100"/>
+              <w:bottom w:type="dxa" w:w="60"/>
+              <w:right w:type="dxa" w:w="100"/>
+            </w:tcMar>
+            <w:vAlign w:val="top"/>
+          </w:tcPr>
+          <w:p>
+            <w:pPr>
+              <w:spacing w:after="0" w:before="0"/>
+            </w:pPr>
+            <w:r>
+              <w:rPr>
+                <w:sz w:val="19"/>
+                <w:szCs w:val="19"/>
+              </w:rPr>
+              <w:t xml:space="preserve">Internet address</w:t>
+            </w:r>
+          </w:p>
+        </w:tc>
+        <w:tc>
+          <w:tcPr>
+            <w:tcW w:type="dxa" w:w="2162"/>
+            <w:tcBorders>
+              <w:top w:val="single" w:color="DCE6F0" w:sz="4"/>
+              <w:left w:val="single" w:color="DCE6F0" w:sz="4"/>
+              <w:bottom w:val="single" w:color="DCE6F0" w:sz="4"/>
+              <w:right w:val="single" w:color="DCE6F0" w:sz="4"/>
+            </w:tcBorders>
+            <w:shd w:fill="FFFFFF" w:color="auto" w:val="clear"/>
+            <w:tcMar>
+              <w:top w:type="dxa" w:w="60"/>
+              <w:left w:type="dxa" w:w="100"/>
+              <w:bottom w:type="dxa" w:w="60"/>
+              <w:right w:type="dxa" w:w="100"/>
+            </w:tcMar>
+            <w:vAlign w:val="top"/>
+          </w:tcPr>
+          <w:p>
+            <w:pPr>
+              <w:spacing w:after="0" w:before="0"/>
+            </w:pPr>
+            <w:r>
+              <w:rPr>
+                <w:sz w:val="19"/>
+                <w:szCs w:val="19"/>
+              </w:rPr>
+              <w:t xml:space="preserve">john.smith@demo.com</w:t>
+            </w:r>
+          </w:p>
+        </w:tc>
+        <w:tc>
+          <w:tcPr>
+            <w:tcW w:type="dxa" w:w="2780"/>
+            <w:tcBorders>
+              <w:top w:val="single" w:color="DCE6F0" w:sz="4"/>
+              <w:left w:val="single" w:color="DCE6F0" w:sz="4"/>
+              <w:bottom w:val="single" w:color="DCE6F0" w:sz="4"/>
+              <w:right w:val="single" w:color="DCE6F0" w:sz="4"/>
+            </w:tcBorders>
+            <w:shd w:fill="FFFFFF" w:color="auto" w:val="clear"/>
+            <w:tcMar>
+              <w:top w:type="dxa" w:w="60"/>
+              <w:left w:type="dxa" w:w="100"/>
+              <w:bottom w:type="dxa" w:w="60"/>
+              <w:right w:type="dxa" w:w="100"/>
+            </w:tcMar>
+            <w:vAlign w:val="top"/>
+          </w:tcPr>
+          <w:p>
+            <w:pPr>
+              <w:spacing w:after="0" w:before="0"/>
+            </w:pPr>
+            <w:r>
+              <w:rPr>
+                <w:sz w:val="19"/>
+                <w:szCs w:val="19"/>
+              </w:rPr>
+              <w:t xml:space="preserve">john.smith@demo.com</w:t>
+            </w:r>
+          </w:p>
+        </w:tc>
+        <w:tc>
+          <w:tcPr>
+            <w:tcW w:type="dxa" w:w="2431"/>
+            <w:tcBorders>
+              <w:top w:val="single" w:color="DCE6F0" w:sz="4"/>
+              <w:left w:val="single" w:color="DCE6F0" w:sz="4"/>
+              <w:bottom w:val="single" w:color="DCE6F0" w:sz="4"/>
+              <w:right w:val="single" w:color="DCE6F0" w:sz="4"/>
+            </w:tcBorders>
+            <w:shd w:fill="FFFFFF" w:color="auto" w:val="clear"/>
+            <w:tcMar>
+              <w:top w:type="dxa" w:w="60"/>
+              <w:left w:type="dxa" w:w="100"/>
+              <w:bottom w:type="dxa" w:w="60"/>
+              <w:right w:type="dxa" w:w="100"/>
+            </w:tcMar>
+            <w:vAlign w:val="top"/>
+          </w:tcPr>
+          <w:p>
+            <w:pPr>
+              <w:spacing w:after="0" w:before="0"/>
+            </w:pPr>
+            <w:r>
+              <w:rPr>
+                <w:sz w:val="19"/>
+                <w:szCs w:val="19"/>
+              </w:rPr>
+              <w:t xml:space="preserve">john.smith@demo.com</w:t>
+            </w:r>
+          </w:p>
+        </w:tc>
+      </w:tr>
+    </w:tbl>
+    <w:p>
+      <w:pPr>
+        <w:spacing w:after="80" w:before="0"/>
+      </w:pPr>
+    </w:p>
+    <w:p>
+      <w:pPr>
+        <w:pStyle w:val="Heading3"/>
+      </w:pPr>
+      <w:r>
+        <w:t xml:space="preserve">Which combination do I need?</w:t>
+      </w:r>
+    </w:p>
+    <w:tbl>
+      <w:tblPr>
+        <w:tblW w:type="dxa" w:w="9638"/>
+        <w:tblBorders>
+          <w:top w:val="single" w:color="auto" w:sz="4"/>
+          <w:left w:val="single" w:color="auto" w:sz="4"/>
+          <w:bottom w:val="single" w:color="auto" w:sz="4"/>
+          <w:right w:val="single" w:color="auto" w:sz="4"/>
+          <w:insideH w:val="single" w:color="auto" w:sz="4"/>
+          <w:insideV w:val="single" w:color="auto" w:sz="4"/>
+        </w:tblBorders>
+      </w:tblPr>
+      <w:tblGrid>
+        <w:gridCol w:w="5766"/>
+        <w:gridCol w:w="1853"/>
+        <w:gridCol w:w="2019"/>
+      </w:tblGrid>
+      <w:tr>
+        <w:trPr>
+          <w:tblHeader/>
+        </w:trPr>
+        <w:tc>
+          <w:tcPr>
+            <w:tcW w:type="dxa" w:w="5766"/>
+            <w:tcBorders>
+              <w:top w:val="single" w:color="DCE6F0" w:sz="4"/>
+              <w:left w:val="single" w:color="DCE6F0" w:sz="4"/>
+              <w:bottom w:val="single" w:color="DCE6F0" w:sz="4"/>
+              <w:right w:val="single" w:color="DCE6F0" w:sz="4"/>
+            </w:tcBorders>
+            <w:shd w:fill="17707F" w:color="auto" w:val="clear"/>
+            <w:tcMar>
+              <w:top w:type="dxa" w:w="60"/>
+              <w:left w:type="dxa" w:w="100"/>
+              <w:bottom w:type="dxa" w:w="60"/>
+              <w:right w:type="dxa" w:w="100"/>
+            </w:tcMar>
+            <w:vAlign w:val="top"/>
+          </w:tcPr>
+          <w:p>
+            <w:pPr>
+              <w:spacing w:after="0" w:before="0"/>
+            </w:pPr>
+            <w:r>
+              <w:rPr>
+                <w:b/>
+                <w:bCs/>
+                <w:color w:val="FFFFFF"/>
+                <w:sz w:val="19"/>
+                <w:szCs w:val="19"/>
+              </w:rPr>
+              <w:t xml:space="preserve">Your situation</w:t>
+            </w:r>
+          </w:p>
+        </w:tc>
+        <w:tc>
+          <w:tcPr>
+            <w:tcW w:type="dxa" w:w="1853"/>
+            <w:tcBorders>
+              <w:top w:val="single" w:color="DCE6F0" w:sz="4"/>
+              <w:left w:val="single" w:color="DCE6F0" w:sz="4"/>
+              <w:bottom w:val="single" w:color="DCE6F0" w:sz="4"/>
+              <w:right w:val="single" w:color="DCE6F0" w:sz="4"/>
+            </w:tcBorders>
+            <w:shd w:fill="17707F" w:color="auto" w:val="clear"/>
+            <w:tcMar>
+              <w:top w:type="dxa" w:w="60"/>
+              <w:left w:type="dxa" w:w="100"/>
+              <w:bottom w:type="dxa" w:w="60"/>
+              <w:right w:type="dxa" w:w="100"/>
+            </w:tcMar>
+            <w:vAlign w:val="top"/>
+          </w:tcPr>
+          <w:p>
+            <w:pPr>
+              <w:spacing w:after="0" w:before="0"/>
+            </w:pPr>
+            <w:r>
+              <w:rPr>
+                <w:b/>
+                <w:bCs/>
+                <w:color w:val="FFFFFF"/>
+                <w:sz w:val="19"/>
+                <w:szCs w:val="19"/>
+              </w:rPr>
+              <w:t xml:space="preserve">CreateMailDb</w:t>
+            </w:r>
+          </w:p>
+        </w:tc>
+        <w:tc>
+          <w:tcPr>
+            <w:tcW w:type="dxa" w:w="2019"/>
+            <w:tcBorders>
+              <w:top w:val="single" w:color="DCE6F0" w:sz="4"/>
+              <w:left w:val="single" w:color="DCE6F0" w:sz="4"/>
+              <w:bottom w:val="single" w:color="DCE6F0" w:sz="4"/>
+              <w:right w:val="single" w:color="DCE6F0" w:sz="4"/>
+            </w:tcBorders>
+            <w:shd w:fill="17707F" w:color="auto" w:val="clear"/>
+            <w:tcMar>
+              <w:top w:type="dxa" w:w="60"/>
+              <w:left w:type="dxa" w:w="100"/>
+              <w:bottom w:type="dxa" w:w="60"/>
+              <w:right w:type="dxa" w:w="100"/>
+            </w:tcMar>
+            <w:vAlign w:val="top"/>
+          </w:tcPr>
+          <w:p>
+            <w:pPr>
+              <w:spacing w:after="0" w:before="0"/>
+            </w:pPr>
+            <w:r>
+              <w:rPr>
+                <w:b/>
+                <w:bCs/>
+                <w:color w:val="FFFFFF"/>
+                <w:sz w:val="19"/>
+                <w:szCs w:val="19"/>
+              </w:rPr>
+              <w:t xml:space="preserve">PreserveMailSystem</w:t>
+            </w:r>
+          </w:p>
+        </w:tc>
+      </w:tr>
+      <w:tr>
+        <w:trPr>
+          <w:cantSplit/>
+        </w:trPr>
+        <w:tc>
+          <w:tcPr>
+            <w:tcW w:type="dxa" w:w="5766"/>
+            <w:tcBorders>
+              <w:top w:val="single" w:color="DCE6F0" w:sz="4"/>
+              <w:left w:val="single" w:color="DCE6F0" w:sz="4"/>
+              <w:bottom w:val="single" w:color="DCE6F0" w:sz="4"/>
+              <w:right w:val="single" w:color="DCE6F0" w:sz="4"/>
+            </w:tcBorders>
+            <w:shd w:fill="FFFFFF" w:color="auto" w:val="clear"/>
+            <w:tcMar>
+              <w:top w:type="dxa" w:w="60"/>
+              <w:left w:type="dxa" w:w="100"/>
+              <w:bottom w:type="dxa" w:w="60"/>
+              <w:right w:type="dxa" w:w="100"/>
+            </w:tcMar>
+            <w:vAlign w:val="top"/>
+          </w:tcPr>
+          <w:p>
+            <w:pPr>
+              <w:spacing w:after="0" w:before="0"/>
+            </w:pPr>
+            <w:r>
+              <w:rPr>
+                <w:sz w:val="19"/>
+                <w:szCs w:val="19"/>
+              </w:rPr>
+              <w:t xml:space="preserve">Users keep Exchange / Microsoft 365 / other external mail (normal DirSync case)</w:t>
+            </w:r>
+          </w:p>
+        </w:tc>
+        <w:tc>
+          <w:tcPr>
+            <w:tcW w:type="dxa" w:w="1853"/>
+            <w:tcBorders>
+              <w:top w:val="single" w:color="DCE6F0" w:sz="4"/>
+              <w:left w:val="single" w:color="DCE6F0" w:sz="4"/>
+              <w:bottom w:val="single" w:color="DCE6F0" w:sz="4"/>
+              <w:right w:val="single" w:color="DCE6F0" w:sz="4"/>
+            </w:tcBorders>
+            <w:shd w:fill="FFFFFF" w:color="auto" w:val="clear"/>
+            <w:tcMar>
+              <w:top w:type="dxa" w:w="60"/>
+              <w:left w:type="dxa" w:w="100"/>
+              <w:bottom w:type="dxa" w:w="60"/>
+              <w:right w:type="dxa" w:w="100"/>
+            </w:tcMar>
+            <w:vAlign w:val="top"/>
+          </w:tcPr>
+          <w:p>
+            <w:pPr>
+              <w:spacing w:after="0" w:before="0"/>
+            </w:pPr>
+            <w:r>
+              <w:rPr>
+                <w:sz w:val="19"/>
+                <w:szCs w:val="19"/>
+              </w:rPr>
+              <w:t xml:space="preserve">0</w:t>
+            </w:r>
+          </w:p>
+        </w:tc>
+        <w:tc>
+          <w:tcPr>
+            <w:tcW w:type="dxa" w:w="2019"/>
+            <w:tcBorders>
+              <w:top w:val="single" w:color="DCE6F0" w:sz="4"/>
+              <w:left w:val="single" w:color="DCE6F0" w:sz="4"/>
+              <w:bottom w:val="single" w:color="DCE6F0" w:sz="4"/>
+              <w:right w:val="single" w:color="DCE6F0" w:sz="4"/>
+            </w:tcBorders>
+            <w:shd w:fill="FFFFFF" w:color="auto" w:val="clear"/>
+            <w:tcMar>
+              <w:top w:type="dxa" w:w="60"/>
+              <w:left w:type="dxa" w:w="100"/>
+              <w:bottom w:type="dxa" w:w="60"/>
+              <w:right w:type="dxa" w:w="100"/>
+            </w:tcMar>
+            <w:vAlign w:val="top"/>
+          </w:tcPr>
+          <w:p>
+            <w:pPr>
+              <w:spacing w:after="0" w:before="0"/>
+            </w:pPr>
+            <w:r>
+              <w:rPr>
+                <w:sz w:val="19"/>
+                <w:szCs w:val="19"/>
+              </w:rPr>
+              <w:t xml:space="preserve">1</w:t>
+            </w:r>
+          </w:p>
+        </w:tc>
+      </w:tr>
+      <w:tr>
+        <w:trPr>
+          <w:cantSplit/>
+        </w:trPr>
+        <w:tc>
+          <w:tcPr>
+            <w:tcW w:type="dxa" w:w="5766"/>
+            <w:tcBorders>
+              <w:top w:val="single" w:color="DCE6F0" w:sz="4"/>
+              <w:left w:val="single" w:color="DCE6F0" w:sz="4"/>
+              <w:bottom w:val="single" w:color="DCE6F0" w:sz="4"/>
+              <w:right w:val="single" w:color="DCE6F0" w:sz="4"/>
+            </w:tcBorders>
+            <w:shd w:fill="F7F7FC" w:color="auto" w:val="clear"/>
+            <w:tcMar>
+              <w:top w:type="dxa" w:w="60"/>
+              <w:left w:type="dxa" w:w="100"/>
+              <w:bottom w:type="dxa" w:w="60"/>
+              <w:right w:type="dxa" w:w="100"/>
+            </w:tcMar>
+            <w:vAlign w:val="top"/>
+          </w:tcPr>
+          <w:p>
+            <w:pPr>
+              <w:spacing w:after="0" w:before="0"/>
+            </w:pPr>
+            <w:r>
+              <w:rPr>
+                <w:sz w:val="19"/>
+                <w:szCs w:val="19"/>
+              </w:rPr>
+              <w:t xml:space="preserve">Users should get a Domino mailbox now</w:t>
+            </w:r>
+          </w:p>
+        </w:tc>
+        <w:tc>
+          <w:tcPr>
+            <w:tcW w:type="dxa" w:w="1853"/>
+            <w:tcBorders>
+              <w:top w:val="single" w:color="DCE6F0" w:sz="4"/>
+              <w:left w:val="single" w:color="DCE6F0" w:sz="4"/>
+              <w:bottom w:val="single" w:color="DCE6F0" w:sz="4"/>
+              <w:right w:val="single" w:color="DCE6F0" w:sz="4"/>
+            </w:tcBorders>
+            <w:shd w:fill="F7F7FC" w:color="auto" w:val="clear"/>
+            <w:tcMar>
+              <w:top w:type="dxa" w:w="60"/>
+              <w:left w:type="dxa" w:w="100"/>
+              <w:bottom w:type="dxa" w:w="60"/>
+              <w:right w:type="dxa" w:w="100"/>
+            </w:tcMar>
+            <w:vAlign w:val="top"/>
+          </w:tcPr>
+          <w:p>
+            <w:pPr>
+              <w:spacing w:after="0" w:before="0"/>
+            </w:pPr>
+            <w:r>
+              <w:rPr>
+                <w:sz w:val="19"/>
+                <w:szCs w:val="19"/>
+              </w:rPr>
+              <w:t xml:space="preserve">1</w:t>
+            </w:r>
+          </w:p>
+        </w:tc>
+        <w:tc>
+          <w:tcPr>
+            <w:tcW w:type="dxa" w:w="2019"/>
+            <w:tcBorders>
+              <w:top w:val="single" w:color="DCE6F0" w:sz="4"/>
+              <w:left w:val="single" w:color="DCE6F0" w:sz="4"/>
+              <w:bottom w:val="single" w:color="DCE6F0" w:sz="4"/>
+              <w:right w:val="single" w:color="DCE6F0" w:sz="4"/>
+            </w:tcBorders>
+            <w:shd w:fill="F7F7FC" w:color="auto" w:val="clear"/>
+            <w:tcMar>
+              <w:top w:type="dxa" w:w="60"/>
+              <w:left w:type="dxa" w:w="100"/>
+              <w:bottom w:type="dxa" w:w="60"/>
+              <w:right w:type="dxa" w:w="100"/>
+            </w:tcMar>
+            <w:vAlign w:val="top"/>
+          </w:tcPr>
+          <w:p>
+            <w:pPr>
+              <w:spacing w:after="0" w:before="0"/>
+            </w:pPr>
+            <w:r>
+              <w:rPr>
+                <w:sz w:val="19"/>
+                <w:szCs w:val="19"/>
+              </w:rPr>
+              <w:t xml:space="preserve">(ignored)</w:t>
+            </w:r>
+          </w:p>
+        </w:tc>
+      </w:tr>
+      <w:tr>
+        <w:trPr>
+          <w:cantSplit/>
+        </w:trPr>
+        <w:tc>
+          <w:tcPr>
+            <w:tcW w:type="dxa" w:w="5766"/>
+            <w:tcBorders>
+              <w:top w:val="single" w:color="DCE6F0" w:sz="4"/>
+              <w:left w:val="single" w:color="DCE6F0" w:sz="4"/>
+              <w:bottom w:val="single" w:color="DCE6F0" w:sz="4"/>
+              <w:right w:val="single" w:color="DCE6F0" w:sz="4"/>
+            </w:tcBorders>
+            <w:shd w:fill="FFFFFF" w:color="auto" w:val="clear"/>
+            <w:tcMar>
+              <w:top w:type="dxa" w:w="60"/>
+              <w:left w:type="dxa" w:w="100"/>
+              <w:bottom w:type="dxa" w:w="60"/>
+              <w:right w:type="dxa" w:w="100"/>
+            </w:tcMar>
+            <w:vAlign w:val="top"/>
+          </w:tcPr>
+          <w:p>
+            <w:pPr>
+              <w:spacing w:after="0" w:before="0"/>
+            </w:pPr>
+            <w:r>
+              <w:rPr>
+                <w:sz w:val="19"/>
+                <w:szCs w:val="19"/>
+              </w:rPr>
+              <w:t xml:space="preserve">You manage the mail fields yourself after registration</w:t>
+            </w:r>
+          </w:p>
+        </w:tc>
+        <w:tc>
+          <w:tcPr>
+            <w:tcW w:type="dxa" w:w="1853"/>
+            <w:tcBorders>
+              <w:top w:val="single" w:color="DCE6F0" w:sz="4"/>
+              <w:left w:val="single" w:color="DCE6F0" w:sz="4"/>
+              <w:bottom w:val="single" w:color="DCE6F0" w:sz="4"/>
+              <w:right w:val="single" w:color="DCE6F0" w:sz="4"/>
+            </w:tcBorders>
+            <w:shd w:fill="FFFFFF" w:color="auto" w:val="clear"/>
+            <w:tcMar>
+              <w:top w:type="dxa" w:w="60"/>
+              <w:left w:type="dxa" w:w="100"/>
+              <w:bottom w:type="dxa" w:w="60"/>
+              <w:right w:type="dxa" w:w="100"/>
+            </w:tcMar>
+            <w:vAlign w:val="top"/>
+          </w:tcPr>
+          <w:p>
+            <w:pPr>
+              <w:spacing w:after="0" w:before="0"/>
+            </w:pPr>
+            <w:r>
+              <w:rPr>
+                <w:sz w:val="19"/>
+                <w:szCs w:val="19"/>
+              </w:rPr>
+              <w:t xml:space="preserve">0</w:t>
+            </w:r>
+          </w:p>
+        </w:tc>
+        <w:tc>
+          <w:tcPr>
+            <w:tcW w:type="dxa" w:w="2019"/>
+            <w:tcBorders>
+              <w:top w:val="single" w:color="DCE6F0" w:sz="4"/>
+              <w:left w:val="single" w:color="DCE6F0" w:sz="4"/>
+              <w:bottom w:val="single" w:color="DCE6F0" w:sz="4"/>
+              <w:right w:val="single" w:color="DCE6F0" w:sz="4"/>
+            </w:tcBorders>
+            <w:shd w:fill="FFFFFF" w:color="auto" w:val="clear"/>
+            <w:tcMar>
+              <w:top w:type="dxa" w:w="60"/>
+              <w:left w:type="dxa" w:w="100"/>
+              <w:bottom w:type="dxa" w:w="60"/>
+              <w:right w:type="dxa" w:w="100"/>
+            </w:tcMar>
+            <w:vAlign w:val="top"/>
+          </w:tcPr>
+          <w:p>
+            <w:pPr>
+              <w:spacing w:after="0" w:before="0"/>
+            </w:pPr>
+            <w:r>
+              <w:rPr>
+                <w:sz w:val="19"/>
+                <w:szCs w:val="19"/>
+              </w:rPr>
+              <w:t xml:space="preserve">0</w:t>
+            </w:r>
+          </w:p>
+        </w:tc>
+      </w:tr>
+    </w:tbl>
+    <w:p>
+      <w:pPr>
+        <w:spacing w:after="80" w:before="0"/>
+      </w:pPr>
+    </w:p>
+    <w:tbl>
+      <w:tblPr>
+        <w:tblW w:type="dxa" w:w="9638"/>
+        <w:tblBorders>
+          <w:top w:val="single" w:color="auto" w:sz="4"/>
+          <w:left w:val="single" w:color="auto" w:sz="4"/>
+          <w:bottom w:val="single" w:color="auto" w:sz="4"/>
+          <w:right w:val="single" w:color="auto" w:sz="4"/>
+          <w:insideH w:val="single" w:color="auto" w:sz="4"/>
+          <w:insideV w:val="single" w:color="auto" w:sz="4"/>
+        </w:tblBorders>
+      </w:tblPr>
+      <w:tblGrid>
+        <w:gridCol w:w="9638"/>
+      </w:tblGrid>
+      <w:tr>
+        <w:trPr>
+          <w:cantSplit/>
+        </w:trPr>
+        <w:tc>
+          <w:tcPr>
+            <w:tcW w:type="dxa" w:w="9638"/>
+            <w:tcBorders>
+              <w:top w:val="none" w:color="FFFFFF" w:sz="0"/>
+              <w:left w:val="single" w:color="17707F" w:sz="24"/>
+              <w:bottom w:val="none" w:color="FFFFFF" w:sz="0"/>
+              <w:right w:val="none" w:color="FFFFFF" w:sz="0"/>
+            </w:tcBorders>
+            <w:shd w:fill="ECF3F8" w:color="auto" w:val="clear"/>
+            <w:tcMar>
+              <w:top w:type="dxa" w:w="100"/>
+              <w:left w:type="dxa" w:w="180"/>
+              <w:bottom w:type="dxa" w:w="100"/>
+              <w:right w:type="dxa" w:w="140"/>
+            </w:tcMar>
+          </w:tcPr>
+          <w:p>
+            <w:r>
+              <w:rPr>
+                <w:b/>
+                <w:bCs/>
+                <w:color w:val="17707F"/>
+              </w:rPr>
+              <w:t xml:space="preserve">Note: </w:t>
+            </w:r>
+            <w:r>
+              <w:t xml:space="preserve">Every user's MailSystemBefore and MailSystemAfter values are in the audit and results CSV, so you can check them. Confirm the behaviour in the pilot (C5): compare the Mail system field with the value noted in B3. If a later DirSync run overwrites these fields, the DirSync field mapping wins (Directory Sync configuration, Synchronization tab).</w:t>
+            </w:r>
+          </w:p>
+        </w:tc>
+      </w:tr>
+    </w:tbl>
+    <w:p>
+      <w:pPr>
+        <w:spacing w:after="80" w:before="0"/>
+      </w:pPr>
+    </w:p>
+    <w:p>
+      <w:pPr>
+        <w:pStyle w:val="Heading2"/>
+      </w:pPr>
+      <w:r>
         <w:t xml:space="preserve">D4 Outputs, audit and result codes</w:t>
       </w:r>
     </w:p>
@@ -37811,7 +40138,7 @@
       <w:r>
         <w:t xml:space="preserve">Registering Active Directory users (Directory Sync) – </w:t>
       </w:r>
-      <w:hyperlink w:history="1" r:id="rIduy9d48vyubeiupedgwnm1">
+      <w:hyperlink w:history="1" r:id="rIdg0pvje5o2ywx4rrykhddk">
         <w:r>
           <w:rPr>
             <w:rStyle w:val="Hyperlink"/>
@@ -37833,7 +40160,7 @@
       <w:r>
         <w:t xml:space="preserve">ContactNoteID property – </w:t>
       </w:r>
-      <w:hyperlink w:history="1" r:id="rIdtn76mfx0br3lbmp7pilq7">
+      <w:hyperlink w:history="1" r:id="rIdmz3zty3sei2g1yuwjyczi">
         <w:r>
           <w:rPr>
             <w:rStyle w:val="Hyperlink"/>
@@ -37855,7 +40182,7 @@
       <w:r>
         <w:t xml:space="preserve">RegisterNewUser method – </w:t>
       </w:r>
-      <w:hyperlink w:history="1" r:id="rIdfd0ibxin-xmwfefese8pz">
+      <w:hyperlink w:history="1" r:id="rIdx3zknhhepydn8astxmogd">
         <w:r>
           <w:rPr>
             <w:rStyle w:val="Hyperlink"/>
@@ -37877,7 +40204,7 @@
       <w:r>
         <w:t xml:space="preserve">Creating an ID vault – </w:t>
       </w:r>
-      <w:hyperlink w:history="1" r:id="rIdqn4lbs8rue6snrw16oot3">
+      <w:hyperlink w:history="1" r:id="rIdvqb0rivn0mfgyaveh2um0">
         <w:r>
           <w:rPr>
             <w:rStyle w:val="Hyperlink"/>
@@ -37899,7 +40226,7 @@
       <w:r>
         <w:t xml:space="preserve">Assigning users to a vault (Security Settings, ID Vault tab) – </w:t>
       </w:r>
-      <w:hyperlink w:history="1" r:id="rId1vpwubgbnyqokxsetl84p">
+      <w:hyperlink w:history="1" r:id="rIdfgmwelzeyzcoadn0hbpo0">
         <w:r>
           <w:rPr>
             <w:rStyle w:val="Hyperlink"/>
@@ -37921,7 +40248,7 @@
       <w:r>
         <w:t xml:space="preserve">Creating a security policy settings document – </w:t>
       </w:r>
-      <w:hyperlink w:history="1" r:id="rIduxrrj1ff7yfyv9t0nw8-b">
+      <w:hyperlink w:history="1" r:id="rIdi_ytten_wqgahlq8wnabg">
         <w:r>
           <w:rPr>
             <w:rStyle w:val="Hyperlink"/>
@@ -37943,7 +40270,7 @@
       <w:r>
         <w:t xml:space="preserve">Creating a policy document (explicit policy names */name) – </w:t>
       </w:r>
-      <w:hyperlink w:history="1" r:id="rIdw_fotvkoefpgesb5pfiql">
+      <w:hyperlink w:history="1" r:id="rIdhqjalhbszifneyfsmrldl">
         <w:r>
           <w:rPr>
             <w:rStyle w:val="Hyperlink"/>
@@ -37965,7 +40292,7 @@
       <w:r>
         <w:t xml:space="preserve">Modifying a server-based CA (adding RAs) – </w:t>
       </w:r>
-      <w:hyperlink w:history="1" r:id="rIdkteaob0fsanyfmiopwnhn">
+      <w:hyperlink w:history="1" r:id="rId1jwgozj8kast2vaurssmc">
         <w:r>
           <w:rPr>
             <w:rStyle w:val="Hyperlink"/>
@@ -37987,7 +40314,7 @@
       <w:r>
         <w:t xml:space="preserve">Administration roles in the Domino Directory ACL – </w:t>
       </w:r>
-      <w:hyperlink w:history="1" r:id="rIdmeyf8m3zo80gipaussih6">
+      <w:hyperlink w:history="1" r:id="rIdprz1as361c4hfcebwaxlk">
         <w:r>
           <w:rPr>
             <w:rStyle w:val="Hyperlink"/>
@@ -38009,7 +40336,7 @@
       <w:r>
         <w:t xml:space="preserve">Configuring a database ACL (Manage ACL) – </w:t>
       </w:r>
-      <w:hyperlink w:history="1" r:id="rIdnm2amlu2g-tyyoakq8gr4">
+      <w:hyperlink w:history="1" r:id="rId2qewx3eozy7y7oi_qbq04">
         <w:r>
           <w:rPr>
             <w:rStyle w:val="Hyperlink"/>
@@ -38031,7 +40358,7 @@
       <w:r>
         <w:t xml:space="preserve">Creating a database from a template – </w:t>
       </w:r>
-      <w:hyperlink w:history="1" r:id="rIdekd0rqce_4me5ik0e5i3v">
+      <w:hyperlink w:history="1" r:id="rIdpvgrf9syyt8b0xqmthax8">
         <w:r>
           <w:rPr>
             <w:rStyle w:val="Hyperlink"/>
@@ -38053,7 +40380,7 @@
       <w:r>
         <w:t xml:space="preserve">Script libraries (Designer) – </w:t>
       </w:r>
-      <w:hyperlink w:history="1" r:id="rIdzpo4jmmhgnw3ielp3qkv5">
+      <w:hyperlink w:history="1" r:id="rIdzne1fn-eezi2ip2xwtugm">
         <w:r>
           <w:rPr>
             <w:rStyle w:val="Hyperlink"/>
@@ -38075,7 +40402,7 @@
       <w:r>
         <w:t xml:space="preserve">Creating an agent (Designer) – </w:t>
       </w:r>
-      <w:hyperlink w:history="1" r:id="rIdzufpdxc3_scwugjesetqn">
+      <w:hyperlink w:history="1" r:id="rIdocdzxg6i4cenlke1edxxw">
         <w:r>
           <w:rPr>
             <w:rStyle w:val="Hyperlink"/>
@@ -38097,7 +40424,7 @@
       <w:r>
         <w:t xml:space="preserve">Naming agents: aliases '|' and cascading '\' – </w:t>
       </w:r>
-      <w:hyperlink w:history="1" r:id="rIdcahh_7a7nut-vq1ekbduh">
+      <w:hyperlink w:history="1" r:id="rIdfhgwcazc3pvmrplfeilo_">
         <w:r>
           <w:rPr>
             <w:rStyle w:val="Hyperlink"/>
@@ -38119,7 +40446,7 @@
       <w:r>
         <w:t xml:space="preserve">Signing a database – </w:t>
       </w:r>
-      <w:hyperlink w:history="1" r:id="rIdaewn97eo1pcf_r-oyyljq">
+      <w:hyperlink w:history="1" r:id="rIdymzqsgxftel4kuc3gztbn">
         <w:r>
           <w:rPr>
             <w:rStyle w:val="Hyperlink"/>
@@ -38141,7 +40468,7 @@
       <w:r>
         <w:t xml:space="preserve">Checking field values (Document Properties) – </w:t>
       </w:r>
-      <w:hyperlink w:history="1" r:id="rIdw5l_b8du5yrdnl5in8pn4">
+      <w:hyperlink w:history="1" r:id="rIdrp08upq0a7h8p7yxm6phy">
         <w:r>
           <w:rPr>
             <w:rStyle w:val="Hyperlink"/>
@@ -38163,7 +40490,7 @@
       <w:r>
         <w:t xml:space="preserve">Execution Security Alert (ECL) – </w:t>
       </w:r>
-      <w:hyperlink w:history="1" r:id="rIdudcc9fhgemhndofnoali2">
+      <w:hyperlink w:history="1" r:id="rIdtyojzq_s8vqmucx_6hi7r">
         <w:r>
           <w:rPr>
             <w:rStyle w:val="Hyperlink"/>
@@ -38620,7 +40947,7 @@
         <w:sz w:val="16"/>
         <w:szCs w:val="16"/>
       </w:rPr>
-      <w:t xml:space="preserve">HCL Confidential – Internal Use  |  v2.1</w:t>
+      <w:t xml:space="preserve">HCL Confidential – Internal Use  |  v2.2</w:t>
     </w:r>
     <w:r>
       <w:rPr>

</xml_diff>

<commit_message>
Mail file naming, uniqueness and numbered folders (BulkReg 1.5.0)
- Mail file name = last name (MailFileNaming LASTNAME | FIRSTINITIAL_LASTNAME | SHORTNAME),
  accents transliterated
- Uniqueness per home server across all mail folders: server database scan, Person
  documents (MailServer+MailFile), open batches, this batch; clash -> smith2.nsf (SUFFIX)
  or row ERROR
- Numbered folders mail1, mail2 ... max MailFilesPerFolder (1000), counting existing files
- MailFileNote in batch file, summary (per-folder fill), audit and results CSV
- Guide v2.4: D3a rewritten (naming, uniqueness, folders, audit trail), B11/C2/C3/D2/D3/D6/D9
</commit_message>
<xml_diff>
--- a/docs/BulkReg_Admin_Guide.docx
+++ b/docs/BulkReg_Admin_Guide.docx
@@ -170,7 +170,7 @@
                 <w:sz w:val="20"/>
                 <w:szCs w:val="20"/>
               </w:rPr>
-              <w:t xml:space="preserve">Version 2.3  |  October 2026  |  Draft for review</w:t>
+              <w:t xml:space="preserve">Version 2.4  |  October 2026  |  Draft for review</w:t>
             </w:r>
           </w:p>
           <w:p>
@@ -482,7 +482,7 @@
                 <w:sz w:val="19"/>
                 <w:szCs w:val="19"/>
               </w:rPr>
-              <w:t xml:space="preserve">2.3 (Draft for review)</w:t>
+              <w:t xml:space="preserve">2.4 (Draft for review)</w:t>
             </w:r>
           </w:p>
         </w:tc>
@@ -766,7 +766,7 @@
                 <w:sz w:val="19"/>
                 <w:szCs w:val="19"/>
               </w:rPr>
-              <w:t xml:space="preserve">BulkReg 1.4.0: BulkRegCommon library, 5 agents, config templates, optional PowerShell helper, Audit Viewer</w:t>
+              <w:t xml:space="preserve">BulkReg 1.5.0: BulkRegCommon library, 5 agents, config templates, optional PowerShell helper, Audit Viewer</w:t>
             </w:r>
           </w:p>
         </w:tc>
@@ -972,7 +972,7 @@
                 <w:sz w:val="19"/>
                 <w:szCs w:val="19"/>
               </w:rPr>
-              <w:t xml:space="preserve">2.3</w:t>
+              <w:t xml:space="preserve">2.4</w:t>
             </w:r>
           </w:p>
         </w:tc>
@@ -998,6 +998,13 @@
             <w:pPr>
               <w:spacing w:after="0" w:before="0"/>
             </w:pPr>
+            <w:r>
+              <w:rPr>
+                <w:sz w:val="19"/>
+                <w:szCs w:val="19"/>
+              </w:rPr>
+              <w:t xml:space="preserve">Mail file </w:t>
+            </w:r>
             <w:r>
               <w:rPr>
                 <w:b/>
@@ -1005,14 +1012,46 @@
                 <w:sz w:val="19"/>
                 <w:szCs w:val="19"/>
               </w:rPr>
-              <w:t xml:space="preserve">Every registered user now gets a Domino mail file</w:t>
-            </w:r>
-            <w:r>
-              <w:rPr>
-                <w:sz w:val="19"/>
-                <w:szCs w:val="19"/>
-              </w:rPr>
-              <w:t xml:space="preserve"> on the home server (MailFile column in the batch, reviewable). CreateMailDb / PreserveMailSystem removed. Mail file settings (folder, template, ACL manager, quota, full-text index), existence checks before and after registration, and mail file status in Verify.</w:t>
+              <w:t xml:space="preserve">naming = last name</w:t>
+            </w:r>
+            <w:r>
+              <w:rPr>
+                <w:sz w:val="19"/>
+                <w:szCs w:val="19"/>
+              </w:rPr>
+              <w:t xml:space="preserve"> (configurable), </w:t>
+            </w:r>
+            <w:r>
+              <w:rPr>
+                <w:b/>
+                <w:bCs/>
+                <w:sz w:val="19"/>
+                <w:szCs w:val="19"/>
+              </w:rPr>
+              <w:t xml:space="preserve">uniqueness</w:t>
+            </w:r>
+            <w:r>
+              <w:rPr>
+                <w:sz w:val="19"/>
+                <w:szCs w:val="19"/>
+              </w:rPr>
+              <w:t xml:space="preserve"> checked against all mail folders on the home server, Person documents, open batches and the batch itself (clash → smith2.nsf or ERROR), </w:t>
+            </w:r>
+            <w:r>
+              <w:rPr>
+                <w:b/>
+                <w:bCs/>
+                <w:sz w:val="19"/>
+                <w:szCs w:val="19"/>
+              </w:rPr>
+              <w:t xml:space="preserve">numbered folders</w:t>
+            </w:r>
+            <w:r>
+              <w:rPr>
+                <w:sz w:val="19"/>
+                <w:szCs w:val="19"/>
+              </w:rPr>
+              <w:t xml:space="preserve"> mail1, mail2… with max 1000 mail files each. MailFileNote recorded in batch file, summary, results and audit.</w:t>
             </w:r>
           </w:p>
         </w:tc>
@@ -1048,7 +1087,7 @@
                 <w:sz w:val="19"/>
                 <w:szCs w:val="19"/>
               </w:rPr>
-              <w:t xml:space="preserve">2.1</w:t>
+              <w:t xml:space="preserve">2.3</w:t>
             </w:r>
           </w:p>
         </w:tc>
@@ -1074,13 +1113,6 @@
             <w:pPr>
               <w:spacing w:after="0" w:before="0"/>
             </w:pPr>
-            <w:r>
-              <w:rPr>
-                <w:sz w:val="19"/>
-                <w:szCs w:val="19"/>
-              </w:rPr>
-              <w:t xml:space="preserve">Name formats: servers in canonical (CN=DominoADMail/O=Demo) or abbreviated (DominoADMail/Demo) form, both accepted by the code. </w:t>
-            </w:r>
             <w:r>
               <w:rPr>
                 <w:b/>
@@ -1088,30 +1120,14 @@
                 <w:sz w:val="19"/>
                 <w:szCs w:val="19"/>
               </w:rPr>
-              <w:t xml:space="preserve">Organizational policies</w:t>
-            </w:r>
-            <w:r>
-              <w:rPr>
-                <w:sz w:val="19"/>
-                <w:szCs w:val="19"/>
-              </w:rPr>
-              <w:t xml:space="preserve"> (</w:t>
-            </w:r>
-            <w:r>
-              <w:rPr>
-                <w:i/>
-                <w:iCs/>
-                <w:sz w:val="19"/>
-                <w:szCs w:val="19"/>
-              </w:rPr>
-              <w:t xml:space="preserve">/Demo, </w:t>
-            </w:r>
-            <w:r>
-              <w:rPr>
-                <w:sz w:val="19"/>
-                <w:szCs w:val="19"/>
-              </w:rPr>
-              <w:t xml:space="preserve">/Sales/Demo) supported alongside explicit policies (B8 Option B, OrgPolicyAssignsVault, '-' in the mapping). Consistent 'Demo' examples.</w:t>
+              <w:t xml:space="preserve">Every registered user now gets a Domino mail file</w:t>
+            </w:r>
+            <w:r>
+              <w:rPr>
+                <w:sz w:val="19"/>
+                <w:szCs w:val="19"/>
+              </w:rPr>
+              <w:t xml:space="preserve"> on the home server (MailFile column in the batch, reviewable). CreateMailDb / PreserveMailSystem removed. Mail file settings (folder, template, ACL manager, quota, full-text index), existence checks before and after registration, and mail file status in Verify.</w:t>
             </w:r>
           </w:p>
         </w:tc>
@@ -1147,6 +1163,105 @@
                 <w:sz w:val="19"/>
                 <w:szCs w:val="19"/>
               </w:rPr>
+              <w:t xml:space="preserve">2.1</w:t>
+            </w:r>
+          </w:p>
+        </w:tc>
+        <w:tc>
+          <w:tcPr>
+            <w:tcW w:type="dxa" w:w="8403"/>
+            <w:tcBorders>
+              <w:top w:val="single" w:color="DCE6F0" w:sz="4"/>
+              <w:left w:val="single" w:color="DCE6F0" w:sz="4"/>
+              <w:bottom w:val="single" w:color="DCE6F0" w:sz="4"/>
+              <w:right w:val="single" w:color="DCE6F0" w:sz="4"/>
+            </w:tcBorders>
+            <w:shd w:fill="F7F7FC" w:color="auto" w:val="clear"/>
+            <w:tcMar>
+              <w:top w:type="dxa" w:w="60"/>
+              <w:left w:type="dxa" w:w="100"/>
+              <w:bottom w:type="dxa" w:w="60"/>
+              <w:right w:type="dxa" w:w="100"/>
+            </w:tcMar>
+            <w:vAlign w:val="top"/>
+          </w:tcPr>
+          <w:p>
+            <w:pPr>
+              <w:spacing w:after="0" w:before="0"/>
+            </w:pPr>
+            <w:r>
+              <w:rPr>
+                <w:sz w:val="19"/>
+                <w:szCs w:val="19"/>
+              </w:rPr>
+              <w:t xml:space="preserve">Name formats: servers in canonical (CN=DominoADMail/O=Demo) or abbreviated (DominoADMail/Demo) form, both accepted by the code. </w:t>
+            </w:r>
+            <w:r>
+              <w:rPr>
+                <w:b/>
+                <w:bCs/>
+                <w:sz w:val="19"/>
+                <w:szCs w:val="19"/>
+              </w:rPr>
+              <w:t xml:space="preserve">Organizational policies</w:t>
+            </w:r>
+            <w:r>
+              <w:rPr>
+                <w:sz w:val="19"/>
+                <w:szCs w:val="19"/>
+              </w:rPr>
+              <w:t xml:space="preserve"> (</w:t>
+            </w:r>
+            <w:r>
+              <w:rPr>
+                <w:i/>
+                <w:iCs/>
+                <w:sz w:val="19"/>
+                <w:szCs w:val="19"/>
+              </w:rPr>
+              <w:t xml:space="preserve">/Demo, </w:t>
+            </w:r>
+            <w:r>
+              <w:rPr>
+                <w:sz w:val="19"/>
+                <w:szCs w:val="19"/>
+              </w:rPr>
+              <w:t xml:space="preserve">/Sales/Demo) supported alongside explicit policies (B8 Option B, OrgPolicyAssignsVault, '-' in the mapping). Consistent 'Demo' examples.</w:t>
+            </w:r>
+          </w:p>
+        </w:tc>
+      </w:tr>
+      <w:tr>
+        <w:trPr>
+          <w:cantSplit/>
+        </w:trPr>
+        <w:tc>
+          <w:tcPr>
+            <w:tcW w:type="dxa" w:w="1235"/>
+            <w:tcBorders>
+              <w:top w:val="single" w:color="DCE6F0" w:sz="4"/>
+              <w:left w:val="single" w:color="DCE6F0" w:sz="4"/>
+              <w:bottom w:val="single" w:color="DCE6F0" w:sz="4"/>
+              <w:right w:val="single" w:color="DCE6F0" w:sz="4"/>
+            </w:tcBorders>
+            <w:shd w:fill="FFFFFF" w:color="auto" w:val="clear"/>
+            <w:tcMar>
+              <w:top w:type="dxa" w:w="60"/>
+              <w:left w:type="dxa" w:w="100"/>
+              <w:bottom w:type="dxa" w:w="60"/>
+              <w:right w:type="dxa" w:w="100"/>
+            </w:tcMar>
+            <w:vAlign w:val="top"/>
+          </w:tcPr>
+          <w:p>
+            <w:pPr>
+              <w:spacing w:after="0" w:before="0"/>
+            </w:pPr>
+            <w:r>
+              <w:rPr>
+                <w:sz w:val="19"/>
+                <w:szCs w:val="19"/>
+              </w:rPr>
               <w:t xml:space="preserve">2.0</w:t>
             </w:r>
           </w:p>
@@ -1160,7 +1275,7 @@
               <w:bottom w:val="single" w:color="DCE6F0" w:sz="4"/>
               <w:right w:val="single" w:color="DCE6F0" w:sz="4"/>
             </w:tcBorders>
-            <w:shd w:fill="F7F7FC" w:color="auto" w:val="clear"/>
+            <w:shd w:fill="FFFFFF" w:color="auto" w:val="clear"/>
             <w:tcMar>
               <w:top w:type="dxa" w:w="60"/>
               <w:left w:type="dxa" w:w="100"/>
@@ -8906,7 +9021,7 @@
                 <w:sz w:val="19"/>
                 <w:szCs w:val="19"/>
               </w:rPr>
-              <w:t xml:space="preserve">Mail file folder on the home servers, and naming</w:t>
+              <w:t xml:space="preserve">Mail file naming and folders (D3a)</w:t>
             </w:r>
           </w:p>
         </w:tc>
@@ -8937,7 +9052,7 @@
                 <w:sz w:val="19"/>
                 <w:szCs w:val="19"/>
               </w:rPr>
-              <w:t xml:space="preserve">mail → mail\jsmith.nsf</w:t>
+              <w:t xml:space="preserve">last name; mail1, mail2 … max 1000 each → mail1\smith.nsf</w:t>
             </w:r>
           </w:p>
         </w:tc>
@@ -16129,7 +16244,7 @@
                 <w:sz w:val="19"/>
                 <w:szCs w:val="19"/>
               </w:rPr>
-              <w:t xml:space="preserve">MailFileDir</w:t>
+              <w:t xml:space="preserve">MailFileNaming</w:t>
             </w:r>
           </w:p>
         </w:tc>
@@ -16155,13 +16270,6 @@
             <w:pPr>
               <w:spacing w:after="0" w:before="0"/>
             </w:pPr>
-            <w:r>
-              <w:rPr>
-                <w:sz w:val="19"/>
-                <w:szCs w:val="19"/>
-              </w:rPr>
-              <w:t xml:space="preserve">Folder for mail files on the home servers, normally </w:t>
-            </w:r>
             <w:r>
               <w:rPr>
                 <w:rFonts w:ascii="Consolas" w:cs="Consolas" w:eastAsia="Consolas" w:hAnsi="Consolas"/>
@@ -16169,7 +16277,317 @@
                 <w:sz w:val="18"/>
                 <w:szCs w:val="18"/>
               </w:rPr>
+              <w:t xml:space="preserve">LASTNAME</w:t>
+            </w:r>
+            <w:r>
+              <w:rPr>
+                <w:sz w:val="19"/>
+                <w:szCs w:val="19"/>
+              </w:rPr>
+              <w:t xml:space="preserve"> (smith.nsf), </w:t>
+            </w:r>
+            <w:r>
+              <w:rPr>
+                <w:rFonts w:ascii="Consolas" w:cs="Consolas" w:eastAsia="Consolas" w:hAnsi="Consolas"/>
+                <w:color w:val="0F5FDC"/>
+                <w:sz w:val="18"/>
+                <w:szCs w:val="18"/>
+              </w:rPr>
+              <w:t xml:space="preserve">FIRSTINITIAL_LASTNAME</w:t>
+            </w:r>
+            <w:r>
+              <w:rPr>
+                <w:sz w:val="19"/>
+                <w:szCs w:val="19"/>
+              </w:rPr>
+              <w:t xml:space="preserve"> (jsmith.nsf) or </w:t>
+            </w:r>
+            <w:r>
+              <w:rPr>
+                <w:rFonts w:ascii="Consolas" w:cs="Consolas" w:eastAsia="Consolas" w:hAnsi="Consolas"/>
+                <w:color w:val="0F5FDC"/>
+                <w:sz w:val="18"/>
+                <w:szCs w:val="18"/>
+              </w:rPr>
+              <w:t xml:space="preserve">SHORTNAME</w:t>
+            </w:r>
+          </w:p>
+        </w:tc>
+        <w:tc>
+          <w:tcPr>
+            <w:tcW w:type="dxa" w:w="2019"/>
+            <w:tcBorders>
+              <w:top w:val="single" w:color="DCE6F0" w:sz="4"/>
+              <w:left w:val="single" w:color="DCE6F0" w:sz="4"/>
+              <w:bottom w:val="single" w:color="DCE6F0" w:sz="4"/>
+              <w:right w:val="single" w:color="DCE6F0" w:sz="4"/>
+            </w:tcBorders>
+            <w:shd w:fill="FFFFFF" w:color="auto" w:val="clear"/>
+            <w:tcMar>
+              <w:top w:type="dxa" w:w="60"/>
+              <w:left w:type="dxa" w:w="100"/>
+              <w:bottom w:type="dxa" w:w="60"/>
+              <w:right w:type="dxa" w:w="100"/>
+            </w:tcMar>
+            <w:vAlign w:val="top"/>
+          </w:tcPr>
+          <w:p>
+            <w:pPr>
+              <w:spacing w:after="0" w:before="0"/>
+            </w:pPr>
+            <w:r>
+              <w:rPr>
+                <w:sz w:val="19"/>
+                <w:szCs w:val="19"/>
+              </w:rPr>
+              <w:t xml:space="preserve">Worksheet 11a</w:t>
+            </w:r>
+          </w:p>
+        </w:tc>
+      </w:tr>
+      <w:tr>
+        <w:trPr>
+          <w:cantSplit/>
+        </w:trPr>
+        <w:tc>
+          <w:tcPr>
+            <w:tcW w:type="dxa" w:w="2368"/>
+            <w:tcBorders>
+              <w:top w:val="single" w:color="DCE6F0" w:sz="4"/>
+              <w:left w:val="single" w:color="DCE6F0" w:sz="4"/>
+              <w:bottom w:val="single" w:color="DCE6F0" w:sz="4"/>
+              <w:right w:val="single" w:color="DCE6F0" w:sz="4"/>
+            </w:tcBorders>
+            <w:shd w:fill="F7F7FC" w:color="auto" w:val="clear"/>
+            <w:tcMar>
+              <w:top w:type="dxa" w:w="60"/>
+              <w:left w:type="dxa" w:w="100"/>
+              <w:bottom w:type="dxa" w:w="60"/>
+              <w:right w:type="dxa" w:w="100"/>
+            </w:tcMar>
+            <w:vAlign w:val="top"/>
+          </w:tcPr>
+          <w:p>
+            <w:pPr>
+              <w:spacing w:after="0" w:before="0"/>
+            </w:pPr>
+            <w:r>
+              <w:rPr>
+                <w:sz w:val="19"/>
+                <w:szCs w:val="19"/>
+              </w:rPr>
+              <w:t xml:space="preserve">MailFileCollision</w:t>
+            </w:r>
+          </w:p>
+        </w:tc>
+        <w:tc>
+          <w:tcPr>
+            <w:tcW w:type="dxa" w:w="5251"/>
+            <w:tcBorders>
+              <w:top w:val="single" w:color="DCE6F0" w:sz="4"/>
+              <w:left w:val="single" w:color="DCE6F0" w:sz="4"/>
+              <w:bottom w:val="single" w:color="DCE6F0" w:sz="4"/>
+              <w:right w:val="single" w:color="DCE6F0" w:sz="4"/>
+            </w:tcBorders>
+            <w:shd w:fill="F7F7FC" w:color="auto" w:val="clear"/>
+            <w:tcMar>
+              <w:top w:type="dxa" w:w="60"/>
+              <w:left w:type="dxa" w:w="100"/>
+              <w:bottom w:type="dxa" w:w="60"/>
+              <w:right w:type="dxa" w:w="100"/>
+            </w:tcMar>
+            <w:vAlign w:val="top"/>
+          </w:tcPr>
+          <w:p>
+            <w:pPr>
+              <w:spacing w:after="0" w:before="0"/>
+            </w:pPr>
+            <w:r>
+              <w:rPr>
+                <w:rFonts w:ascii="Consolas" w:cs="Consolas" w:eastAsia="Consolas" w:hAnsi="Consolas"/>
+                <w:color w:val="0F5FDC"/>
+                <w:sz w:val="18"/>
+                <w:szCs w:val="18"/>
+              </w:rPr>
+              <w:t xml:space="preserve">SUFFIX</w:t>
+            </w:r>
+            <w:r>
+              <w:rPr>
+                <w:sz w:val="19"/>
+                <w:szCs w:val="19"/>
+              </w:rPr>
+              <w:t xml:space="preserve"> (smith2.nsf …) or </w:t>
+            </w:r>
+            <w:r>
+              <w:rPr>
+                <w:rFonts w:ascii="Consolas" w:cs="Consolas" w:eastAsia="Consolas" w:hAnsi="Consolas"/>
+                <w:color w:val="0F5FDC"/>
+                <w:sz w:val="18"/>
+                <w:szCs w:val="18"/>
+              </w:rPr>
+              <w:t xml:space="preserve">ERROR</w:t>
+            </w:r>
+            <w:r>
+              <w:rPr>
+                <w:sz w:val="19"/>
+                <w:szCs w:val="19"/>
+              </w:rPr>
+              <w:t xml:space="preserve"> (row excluded)</w:t>
+            </w:r>
+          </w:p>
+        </w:tc>
+        <w:tc>
+          <w:tcPr>
+            <w:tcW w:type="dxa" w:w="2019"/>
+            <w:tcBorders>
+              <w:top w:val="single" w:color="DCE6F0" w:sz="4"/>
+              <w:left w:val="single" w:color="DCE6F0" w:sz="4"/>
+              <w:bottom w:val="single" w:color="DCE6F0" w:sz="4"/>
+              <w:right w:val="single" w:color="DCE6F0" w:sz="4"/>
+            </w:tcBorders>
+            <w:shd w:fill="F7F7FC" w:color="auto" w:val="clear"/>
+            <w:tcMar>
+              <w:top w:type="dxa" w:w="60"/>
+              <w:left w:type="dxa" w:w="100"/>
+              <w:bottom w:type="dxa" w:w="60"/>
+              <w:right w:type="dxa" w:w="100"/>
+            </w:tcMar>
+            <w:vAlign w:val="top"/>
+          </w:tcPr>
+          <w:p>
+            <w:pPr>
+              <w:spacing w:after="0" w:before="0"/>
+            </w:pPr>
+            <w:r>
+              <w:rPr>
+                <w:sz w:val="19"/>
+                <w:szCs w:val="19"/>
+              </w:rPr>
+              <w:t xml:space="preserve">Worksheet 11a</w:t>
+            </w:r>
+          </w:p>
+        </w:tc>
+      </w:tr>
+      <w:tr>
+        <w:trPr>
+          <w:cantSplit/>
+        </w:trPr>
+        <w:tc>
+          <w:tcPr>
+            <w:tcW w:type="dxa" w:w="2368"/>
+            <w:tcBorders>
+              <w:top w:val="single" w:color="DCE6F0" w:sz="4"/>
+              <w:left w:val="single" w:color="DCE6F0" w:sz="4"/>
+              <w:bottom w:val="single" w:color="DCE6F0" w:sz="4"/>
+              <w:right w:val="single" w:color="DCE6F0" w:sz="4"/>
+            </w:tcBorders>
+            <w:shd w:fill="FFFFFF" w:color="auto" w:val="clear"/>
+            <w:tcMar>
+              <w:top w:type="dxa" w:w="60"/>
+              <w:left w:type="dxa" w:w="100"/>
+              <w:bottom w:type="dxa" w:w="60"/>
+              <w:right w:type="dxa" w:w="100"/>
+            </w:tcMar>
+            <w:vAlign w:val="top"/>
+          </w:tcPr>
+          <w:p>
+            <w:pPr>
+              <w:spacing w:after="0" w:before="0"/>
+            </w:pPr>
+            <w:r>
+              <w:rPr>
+                <w:sz w:val="19"/>
+                <w:szCs w:val="19"/>
+              </w:rPr>
+              <w:t xml:space="preserve">MailFolderMode / MailFolderPrefix / MailFilesPerFolder</w:t>
+            </w:r>
+          </w:p>
+        </w:tc>
+        <w:tc>
+          <w:tcPr>
+            <w:tcW w:type="dxa" w:w="5251"/>
+            <w:tcBorders>
+              <w:top w:val="single" w:color="DCE6F0" w:sz="4"/>
+              <w:left w:val="single" w:color="DCE6F0" w:sz="4"/>
+              <w:bottom w:val="single" w:color="DCE6F0" w:sz="4"/>
+              <w:right w:val="single" w:color="DCE6F0" w:sz="4"/>
+            </w:tcBorders>
+            <w:shd w:fill="FFFFFF" w:color="auto" w:val="clear"/>
+            <w:tcMar>
+              <w:top w:type="dxa" w:w="60"/>
+              <w:left w:type="dxa" w:w="100"/>
+              <w:bottom w:type="dxa" w:w="60"/>
+              <w:right w:type="dxa" w:w="100"/>
+            </w:tcMar>
+            <w:vAlign w:val="top"/>
+          </w:tcPr>
+          <w:p>
+            <w:pPr>
+              <w:spacing w:after="0" w:before="0"/>
+            </w:pPr>
+            <w:r>
+              <w:rPr>
+                <w:rFonts w:ascii="Consolas" w:cs="Consolas" w:eastAsia="Consolas" w:hAnsi="Consolas"/>
+                <w:color w:val="0F5FDC"/>
+                <w:sz w:val="18"/>
+                <w:szCs w:val="18"/>
+              </w:rPr>
+              <w:t xml:space="preserve">NUMBERED</w:t>
+            </w:r>
+            <w:r>
+              <w:rPr>
+                <w:sz w:val="19"/>
+                <w:szCs w:val="19"/>
+              </w:rPr>
+              <w:t xml:space="preserve"> / </w:t>
+            </w:r>
+            <w:r>
+              <w:rPr>
+                <w:rFonts w:ascii="Consolas" w:cs="Consolas" w:eastAsia="Consolas" w:hAnsi="Consolas"/>
+                <w:color w:val="0F5FDC"/>
+                <w:sz w:val="18"/>
+                <w:szCs w:val="18"/>
+              </w:rPr>
               <w:t xml:space="preserve">mail</w:t>
+            </w:r>
+            <w:r>
+              <w:rPr>
+                <w:sz w:val="19"/>
+                <w:szCs w:val="19"/>
+              </w:rPr>
+              <w:t xml:space="preserve"> / </w:t>
+            </w:r>
+            <w:r>
+              <w:rPr>
+                <w:rFonts w:ascii="Consolas" w:cs="Consolas" w:eastAsia="Consolas" w:hAnsi="Consolas"/>
+                <w:color w:val="0F5FDC"/>
+                <w:sz w:val="18"/>
+                <w:szCs w:val="18"/>
+              </w:rPr>
+              <w:t xml:space="preserve">1000</w:t>
+            </w:r>
+            <w:r>
+              <w:rPr>
+                <w:sz w:val="19"/>
+                <w:szCs w:val="19"/>
+              </w:rPr>
+              <w:t xml:space="preserve"> → mail1, mail2 … (or </w:t>
+            </w:r>
+            <w:r>
+              <w:rPr>
+                <w:rFonts w:ascii="Consolas" w:cs="Consolas" w:eastAsia="Consolas" w:hAnsi="Consolas"/>
+                <w:color w:val="0F5FDC"/>
+                <w:sz w:val="18"/>
+                <w:szCs w:val="18"/>
+              </w:rPr>
+              <w:t xml:space="preserve">SINGLE</w:t>
+            </w:r>
+            <w:r>
+              <w:rPr>
+                <w:sz w:val="19"/>
+                <w:szCs w:val="19"/>
+              </w:rPr>
+              <w:t xml:space="preserve"> with MailFileDir)</w:t>
             </w:r>
           </w:p>
         </w:tc>
@@ -22094,7 +22512,7 @@
         <w:t xml:space="preserve">per home server</w:t>
       </w:r>
       <w:r>
-        <w:t xml:space="preserve"> and </w:t>
+        <w:t xml:space="preserve">, </w:t>
       </w:r>
       <w:r>
         <w:rPr>
@@ -22104,7 +22522,39 @@
         <w:t xml:space="preserve">per policy</w:t>
       </w:r>
       <w:r>
-        <w:t xml:space="preserve">.</w:t>
+        <w:t xml:space="preserve">, the </w:t>
+      </w:r>
+      <w:r>
+        <w:rPr>
+          <w:b/>
+          <w:bCs/>
+        </w:rPr>
+        <w:t xml:space="preserve">new mail files per server and folder</w:t>
+      </w:r>
+      <w:r>
+        <w:t xml:space="preserve">, and the </w:t>
+      </w:r>
+      <w:r>
+        <w:rPr>
+          <w:b/>
+          <w:bCs/>
+        </w:rPr>
+        <w:t xml:space="preserve">folder fill</w:t>
+      </w:r>
+      <w:r>
+        <w:t xml:space="preserve"> (for example </w:t>
+      </w:r>
+      <w:r>
+        <w:rPr>
+          <w:rFonts w:ascii="Consolas" w:cs="Consolas" w:eastAsia="Consolas" w:hAnsi="Consolas"/>
+          <w:color w:val="0F5FDC"/>
+          <w:sz w:val="20"/>
+          <w:szCs w:val="20"/>
+        </w:rPr>
+        <w:t xml:space="preserve">dominoadmail/demo : mail2 : 412</w:t>
+      </w:r>
+      <w:r>
+        <w:t xml:space="preserve">).</w:t>
       </w:r>
     </w:p>
     <w:tbl>
@@ -22829,7 +23279,7 @@
                 <w:sz w:val="19"/>
                 <w:szCs w:val="19"/>
               </w:rPr>
-              <w:t xml:space="preserve">Right mail file name</w:t>
+              <w:t xml:space="preserve">Right mail file name and folder</w:t>
             </w:r>
           </w:p>
         </w:tc>
@@ -22860,7 +23310,7 @@
                 <w:sz w:val="19"/>
                 <w:szCs w:val="19"/>
               </w:rPr>
-              <w:t xml:space="preserve">Read MailFile, for example </w:t>
+              <w:t xml:space="preserve">Read MailFile (e.g. </w:t>
             </w:r>
             <w:r>
               <w:rPr>
@@ -22869,14 +23319,30 @@
                 <w:sz w:val="18"/>
                 <w:szCs w:val="18"/>
               </w:rPr>
-              <w:t xml:space="preserve">mail\jsmith.nsf</w:t>
-            </w:r>
-            <w:r>
-              <w:rPr>
-                <w:sz w:val="19"/>
-                <w:szCs w:val="19"/>
-              </w:rPr>
-              <w:t xml:space="preserve">. Rows whose mail file already exists are marked ERROR.</w:t>
+              <w:t xml:space="preserve">mail2\smith.nsf</w:t>
+            </w:r>
+            <w:r>
+              <w:rPr>
+                <w:sz w:val="19"/>
+                <w:szCs w:val="19"/>
+              </w:rPr>
+              <w:t xml:space="preserve">) and MailFileNote (why: naming rule, renamed because the name was taken, folder fill). Renamed rows show </w:t>
+            </w:r>
+            <w:r>
+              <w:rPr>
+                <w:b/>
+                <w:bCs/>
+                <w:sz w:val="19"/>
+                <w:szCs w:val="19"/>
+              </w:rPr>
+              <w:t xml:space="preserve">WARN: mail file renamed</w:t>
+            </w:r>
+            <w:r>
+              <w:rPr>
+                <w:sz w:val="19"/>
+                <w:szCs w:val="19"/>
+              </w:rPr>
+              <w:t xml:space="preserve">.</w:t>
             </w:r>
           </w:p>
         </w:tc>
@@ -22907,16 +23373,7 @@
                 <w:sz w:val="19"/>
                 <w:szCs w:val="19"/>
               </w:rPr>
-              <w:t xml:space="preserve">Edit MailFile, for example </w:t>
-            </w:r>
-            <w:r>
-              <w:rPr>
-                <w:rFonts w:ascii="Consolas" w:cs="Consolas" w:eastAsia="Consolas" w:hAnsi="Consolas"/>
-                <w:color w:val="0F5FDC"/>
-                <w:sz w:val="18"/>
-                <w:szCs w:val="18"/>
-              </w:rPr>
-              <w:t xml:space="preserve">mail\jsmith2.nsf</w:t>
+              <w:t xml:space="preserve">Accept, or edit MailFile to a free name in a mail folder (Register Batch re-checks it)</w:t>
             </w:r>
           </w:p>
         </w:tc>
@@ -28497,7 +28954,7 @@
                 <w:sz w:val="19"/>
                 <w:szCs w:val="19"/>
               </w:rPr>
-              <w:t xml:space="preserve">HomeServer, MailFile, OrgUnit, Policy, Groups, VaultServer</w:t>
+              <w:t xml:space="preserve">MailFileNote</w:t>
             </w:r>
           </w:p>
         </w:tc>
@@ -28525,12 +28982,10 @@
             </w:pPr>
             <w:r>
               <w:rPr>
-                <w:b/>
-                <w:bCs/>
-                <w:sz w:val="19"/>
-                <w:szCs w:val="19"/>
-              </w:rPr>
-              <w:t xml:space="preserve">Yes</w:t>
+                <w:sz w:val="19"/>
+                <w:szCs w:val="19"/>
+              </w:rPr>
+              <w:t xml:space="preserve">No</w:t>
             </w:r>
           </w:p>
         </w:tc>
@@ -28561,7 +29016,7 @@
                 <w:sz w:val="19"/>
                 <w:szCs w:val="19"/>
               </w:rPr>
-              <w:t xml:space="preserve">Values used for registration (MailFile is relative to the server data directory, e.g. mail\jsmith.nsf)</w:t>
+              <w:t xml:space="preserve">How the mail file name and folder were chosen</w:t>
             </w:r>
           </w:p>
         </w:tc>
@@ -28597,6 +29052,106 @@
                 <w:sz w:val="19"/>
                 <w:szCs w:val="19"/>
               </w:rPr>
+              <w:t xml:space="preserve">HomeServer, MailFile, OrgUnit, Policy, Groups, VaultServer</w:t>
+            </w:r>
+          </w:p>
+        </w:tc>
+        <w:tc>
+          <w:tcPr>
+            <w:tcW w:type="dxa" w:w="1544"/>
+            <w:tcBorders>
+              <w:top w:val="single" w:color="DCE6F0" w:sz="4"/>
+              <w:left w:val="single" w:color="DCE6F0" w:sz="4"/>
+              <w:bottom w:val="single" w:color="DCE6F0" w:sz="4"/>
+              <w:right w:val="single" w:color="DCE6F0" w:sz="4"/>
+            </w:tcBorders>
+            <w:shd w:fill="F7F7FC" w:color="auto" w:val="clear"/>
+            <w:tcMar>
+              <w:top w:type="dxa" w:w="60"/>
+              <w:left w:type="dxa" w:w="100"/>
+              <w:bottom w:type="dxa" w:w="60"/>
+              <w:right w:type="dxa" w:w="100"/>
+            </w:tcMar>
+            <w:vAlign w:val="top"/>
+          </w:tcPr>
+          <w:p>
+            <w:pPr>
+              <w:spacing w:after="0" w:before="0"/>
+            </w:pPr>
+            <w:r>
+              <w:rPr>
+                <w:b/>
+                <w:bCs/>
+                <w:sz w:val="19"/>
+                <w:szCs w:val="19"/>
+              </w:rPr>
+              <w:t xml:space="preserve">Yes</w:t>
+            </w:r>
+          </w:p>
+        </w:tc>
+        <w:tc>
+          <w:tcPr>
+            <w:tcW w:type="dxa" w:w="4079"/>
+            <w:tcBorders>
+              <w:top w:val="single" w:color="DCE6F0" w:sz="4"/>
+              <w:left w:val="single" w:color="DCE6F0" w:sz="4"/>
+              <w:bottom w:val="single" w:color="DCE6F0" w:sz="4"/>
+              <w:right w:val="single" w:color="DCE6F0" w:sz="4"/>
+            </w:tcBorders>
+            <w:shd w:fill="F7F7FC" w:color="auto" w:val="clear"/>
+            <w:tcMar>
+              <w:top w:type="dxa" w:w="60"/>
+              <w:left w:type="dxa" w:w="100"/>
+              <w:bottom w:type="dxa" w:w="60"/>
+              <w:right w:type="dxa" w:w="100"/>
+            </w:tcMar>
+            <w:vAlign w:val="top"/>
+          </w:tcPr>
+          <w:p>
+            <w:pPr>
+              <w:spacing w:after="0" w:before="0"/>
+            </w:pPr>
+            <w:r>
+              <w:rPr>
+                <w:sz w:val="19"/>
+                <w:szCs w:val="19"/>
+              </w:rPr>
+              <w:t xml:space="preserve">Values used for registration (MailFile is relative to the server data directory, e.g. mail\jsmith.nsf)</w:t>
+            </w:r>
+          </w:p>
+        </w:tc>
+      </w:tr>
+      <w:tr>
+        <w:trPr>
+          <w:cantSplit/>
+        </w:trPr>
+        <w:tc>
+          <w:tcPr>
+            <w:tcW w:type="dxa" w:w="4015"/>
+            <w:tcBorders>
+              <w:top w:val="single" w:color="DCE6F0" w:sz="4"/>
+              <w:left w:val="single" w:color="DCE6F0" w:sz="4"/>
+              <w:bottom w:val="single" w:color="DCE6F0" w:sz="4"/>
+              <w:right w:val="single" w:color="DCE6F0" w:sz="4"/>
+            </w:tcBorders>
+            <w:shd w:fill="FFFFFF" w:color="auto" w:val="clear"/>
+            <w:tcMar>
+              <w:top w:type="dxa" w:w="60"/>
+              <w:left w:type="dxa" w:w="100"/>
+              <w:bottom w:type="dxa" w:w="60"/>
+              <w:right w:type="dxa" w:w="100"/>
+            </w:tcMar>
+            <w:vAlign w:val="top"/>
+          </w:tcPr>
+          <w:p>
+            <w:pPr>
+              <w:spacing w:after="0" w:before="0"/>
+            </w:pPr>
+            <w:r>
+              <w:rPr>
+                <w:sz w:val="19"/>
+                <w:szCs w:val="19"/>
+              </w:rPr>
               <w:t xml:space="preserve">MapRule, Check, Issues</w:t>
             </w:r>
           </w:p>
@@ -28610,7 +29165,7 @@
               <w:bottom w:val="single" w:color="DCE6F0" w:sz="4"/>
               <w:right w:val="single" w:color="DCE6F0" w:sz="4"/>
             </w:tcBorders>
-            <w:shd w:fill="F7F7FC" w:color="auto" w:val="clear"/>
+            <w:shd w:fill="FFFFFF" w:color="auto" w:val="clear"/>
             <w:tcMar>
               <w:top w:type="dxa" w:w="60"/>
               <w:left w:type="dxa" w:w="100"/>
@@ -28641,7 +29196,7 @@
               <w:bottom w:val="single" w:color="DCE6F0" w:sz="4"/>
               <w:right w:val="single" w:color="DCE6F0" w:sz="4"/>
             </w:tcBorders>
-            <w:shd w:fill="F7F7FC" w:color="auto" w:val="clear"/>
+            <w:shd w:fill="FFFFFF" w:color="auto" w:val="clear"/>
             <w:tcMar>
               <w:top w:type="dxa" w:w="60"/>
               <w:left w:type="dxa" w:w="100"/>
@@ -30221,7 +30776,7 @@
                 <w:sz w:val="19"/>
                 <w:szCs w:val="19"/>
               </w:rPr>
-              <w:t xml:space="preserve">MailFileDir / MailTemplate</w:t>
+              <w:t xml:space="preserve">MailFileNaming / MailFileCollision</w:t>
             </w:r>
           </w:p>
         </w:tc>
@@ -30252,7 +30807,7 @@
                 <w:sz w:val="19"/>
                 <w:szCs w:val="19"/>
               </w:rPr>
-              <w:t xml:space="preserve">mail / (empty)</w:t>
+              <w:t xml:space="preserve">LASTNAME / SUFFIX</w:t>
             </w:r>
           </w:p>
         </w:tc>
@@ -30283,7 +30838,203 @@
                 <w:sz w:val="19"/>
                 <w:szCs w:val="19"/>
               </w:rPr>
-              <w:t xml:space="preserve">Mail file folder on the home server; mail template (empty = registration default)</w:t>
+              <w:t xml:space="preserve">Mail file name rule; what to do when the name is taken</w:t>
+            </w:r>
+          </w:p>
+        </w:tc>
+      </w:tr>
+      <w:tr>
+        <w:trPr>
+          <w:cantSplit/>
+        </w:trPr>
+        <w:tc>
+          <w:tcPr>
+            <w:tcW w:type="dxa" w:w="4015"/>
+            <w:tcBorders>
+              <w:top w:val="single" w:color="DCE6F0" w:sz="4"/>
+              <w:left w:val="single" w:color="DCE6F0" w:sz="4"/>
+              <w:bottom w:val="single" w:color="DCE6F0" w:sz="4"/>
+              <w:right w:val="single" w:color="DCE6F0" w:sz="4"/>
+            </w:tcBorders>
+            <w:shd w:fill="F7F7FC" w:color="auto" w:val="clear"/>
+            <w:tcMar>
+              <w:top w:type="dxa" w:w="60"/>
+              <w:left w:type="dxa" w:w="100"/>
+              <w:bottom w:type="dxa" w:w="60"/>
+              <w:right w:type="dxa" w:w="100"/>
+            </w:tcMar>
+            <w:vAlign w:val="top"/>
+          </w:tcPr>
+          <w:p>
+            <w:pPr>
+              <w:spacing w:after="0" w:before="0"/>
+            </w:pPr>
+            <w:r>
+              <w:rPr>
+                <w:sz w:val="19"/>
+                <w:szCs w:val="19"/>
+              </w:rPr>
+              <w:t xml:space="preserve">MailFolderMode / MailFolderPrefix / MailFilesPerFolder / MailFileDir</w:t>
+            </w:r>
+          </w:p>
+        </w:tc>
+        <w:tc>
+          <w:tcPr>
+            <w:tcW w:type="dxa" w:w="2265"/>
+            <w:tcBorders>
+              <w:top w:val="single" w:color="DCE6F0" w:sz="4"/>
+              <w:left w:val="single" w:color="DCE6F0" w:sz="4"/>
+              <w:bottom w:val="single" w:color="DCE6F0" w:sz="4"/>
+              <w:right w:val="single" w:color="DCE6F0" w:sz="4"/>
+            </w:tcBorders>
+            <w:shd w:fill="F7F7FC" w:color="auto" w:val="clear"/>
+            <w:tcMar>
+              <w:top w:type="dxa" w:w="60"/>
+              <w:left w:type="dxa" w:w="100"/>
+              <w:bottom w:type="dxa" w:w="60"/>
+              <w:right w:type="dxa" w:w="100"/>
+            </w:tcMar>
+            <w:vAlign w:val="top"/>
+          </w:tcPr>
+          <w:p>
+            <w:pPr>
+              <w:spacing w:after="0" w:before="0"/>
+            </w:pPr>
+            <w:r>
+              <w:rPr>
+                <w:sz w:val="19"/>
+                <w:szCs w:val="19"/>
+              </w:rPr>
+              <w:t xml:space="preserve">NUMBERED / mail / 1000 / mail</w:t>
+            </w:r>
+          </w:p>
+        </w:tc>
+        <w:tc>
+          <w:tcPr>
+            <w:tcW w:type="dxa" w:w="3358"/>
+            <w:tcBorders>
+              <w:top w:val="single" w:color="DCE6F0" w:sz="4"/>
+              <w:left w:val="single" w:color="DCE6F0" w:sz="4"/>
+              <w:bottom w:val="single" w:color="DCE6F0" w:sz="4"/>
+              <w:right w:val="single" w:color="DCE6F0" w:sz="4"/>
+            </w:tcBorders>
+            <w:shd w:fill="F7F7FC" w:color="auto" w:val="clear"/>
+            <w:tcMar>
+              <w:top w:type="dxa" w:w="60"/>
+              <w:left w:type="dxa" w:w="100"/>
+              <w:bottom w:type="dxa" w:w="60"/>
+              <w:right w:type="dxa" w:w="100"/>
+            </w:tcMar>
+            <w:vAlign w:val="top"/>
+          </w:tcPr>
+          <w:p>
+            <w:pPr>
+              <w:spacing w:after="0" w:before="0"/>
+            </w:pPr>
+            <w:r>
+              <w:rPr>
+                <w:sz w:val="19"/>
+                <w:szCs w:val="19"/>
+              </w:rPr>
+              <w:t xml:space="preserve">mail1, mail2 … with max files per folder; SINGLE uses MailFileDir</w:t>
+            </w:r>
+          </w:p>
+        </w:tc>
+      </w:tr>
+      <w:tr>
+        <w:trPr>
+          <w:cantSplit/>
+        </w:trPr>
+        <w:tc>
+          <w:tcPr>
+            <w:tcW w:type="dxa" w:w="4015"/>
+            <w:tcBorders>
+              <w:top w:val="single" w:color="DCE6F0" w:sz="4"/>
+              <w:left w:val="single" w:color="DCE6F0" w:sz="4"/>
+              <w:bottom w:val="single" w:color="DCE6F0" w:sz="4"/>
+              <w:right w:val="single" w:color="DCE6F0" w:sz="4"/>
+            </w:tcBorders>
+            <w:shd w:fill="FFFFFF" w:color="auto" w:val="clear"/>
+            <w:tcMar>
+              <w:top w:type="dxa" w:w="60"/>
+              <w:left w:type="dxa" w:w="100"/>
+              <w:bottom w:type="dxa" w:w="60"/>
+              <w:right w:type="dxa" w:w="100"/>
+            </w:tcMar>
+            <w:vAlign w:val="top"/>
+          </w:tcPr>
+          <w:p>
+            <w:pPr>
+              <w:spacing w:after="0" w:before="0"/>
+            </w:pPr>
+            <w:r>
+              <w:rPr>
+                <w:sz w:val="19"/>
+                <w:szCs w:val="19"/>
+              </w:rPr>
+              <w:t xml:space="preserve">MailTemplate</w:t>
+            </w:r>
+          </w:p>
+        </w:tc>
+        <w:tc>
+          <w:tcPr>
+            <w:tcW w:type="dxa" w:w="2265"/>
+            <w:tcBorders>
+              <w:top w:val="single" w:color="DCE6F0" w:sz="4"/>
+              <w:left w:val="single" w:color="DCE6F0" w:sz="4"/>
+              <w:bottom w:val="single" w:color="DCE6F0" w:sz="4"/>
+              <w:right w:val="single" w:color="DCE6F0" w:sz="4"/>
+            </w:tcBorders>
+            <w:shd w:fill="FFFFFF" w:color="auto" w:val="clear"/>
+            <w:tcMar>
+              <w:top w:type="dxa" w:w="60"/>
+              <w:left w:type="dxa" w:w="100"/>
+              <w:bottom w:type="dxa" w:w="60"/>
+              <w:right w:type="dxa" w:w="100"/>
+            </w:tcMar>
+            <w:vAlign w:val="top"/>
+          </w:tcPr>
+          <w:p>
+            <w:pPr>
+              <w:spacing w:after="0" w:before="0"/>
+            </w:pPr>
+            <w:r>
+              <w:rPr>
+                <w:sz w:val="19"/>
+                <w:szCs w:val="19"/>
+              </w:rPr>
+              <w:t xml:space="preserve">(empty)</w:t>
+            </w:r>
+          </w:p>
+        </w:tc>
+        <w:tc>
+          <w:tcPr>
+            <w:tcW w:type="dxa" w:w="3358"/>
+            <w:tcBorders>
+              <w:top w:val="single" w:color="DCE6F0" w:sz="4"/>
+              <w:left w:val="single" w:color="DCE6F0" w:sz="4"/>
+              <w:bottom w:val="single" w:color="DCE6F0" w:sz="4"/>
+              <w:right w:val="single" w:color="DCE6F0" w:sz="4"/>
+            </w:tcBorders>
+            <w:shd w:fill="FFFFFF" w:color="auto" w:val="clear"/>
+            <w:tcMar>
+              <w:top w:type="dxa" w:w="60"/>
+              <w:left w:type="dxa" w:w="100"/>
+              <w:bottom w:type="dxa" w:w="60"/>
+              <w:right w:type="dxa" w:w="100"/>
+            </w:tcMar>
+            <w:vAlign w:val="top"/>
+          </w:tcPr>
+          <w:p>
+            <w:pPr>
+              <w:spacing w:after="0" w:before="0"/>
+            </w:pPr>
+            <w:r>
+              <w:rPr>
+                <w:sz w:val="19"/>
+                <w:szCs w:val="19"/>
+              </w:rPr>
+              <w:t xml:space="preserve">Mail template (empty = registration default)</w:t>
             </w:r>
           </w:p>
         </w:tc>
@@ -30789,7 +31540,7 @@
         <w:pStyle w:val="Heading2"/>
       </w:pPr>
       <w:r>
-        <w:t xml:space="preserve">D3a Mail files</w:t>
+        <w:t xml:space="preserve">D3a Mail files: naming, uniqueness and folders</w:t>
       </w:r>
     </w:p>
     <w:p>
@@ -30814,7 +31565,614 @@
         <w:t xml:space="preserve">home server</w:t>
       </w:r>
       <w:r>
-        <w:t xml:space="preserve"> and the Person document points to it (MailServer, MailFile, Mail system = Notes).</w:t>
+        <w:t xml:space="preserve"> and the Person document points to it (MailServer, MailFile, Mail system = Notes). Agent 02 decides each mail file's </w:t>
+      </w:r>
+      <w:r>
+        <w:rPr>
+          <w:b/>
+          <w:bCs/>
+        </w:rPr>
+        <w:t xml:space="preserve">name</w:t>
+      </w:r>
+      <w:r>
+        <w:t xml:space="preserve"> and </w:t>
+      </w:r>
+      <w:r>
+        <w:rPr>
+          <w:b/>
+          <w:bCs/>
+        </w:rPr>
+        <w:t xml:space="preserve">folder</w:t>
+      </w:r>
+      <w:r>
+        <w:t xml:space="preserve"> while it builds the batch, and records the decision so you can review it before anything is created.</w:t>
+      </w:r>
+    </w:p>
+    <w:p>
+      <w:pPr>
+        <w:pStyle w:val="Heading3"/>
+      </w:pPr>
+      <w:r>
+        <w:t xml:space="preserve">1. Name = last name</w:t>
+      </w:r>
+    </w:p>
+    <w:tbl>
+      <w:tblPr>
+        <w:tblW w:type="dxa" w:w="9638"/>
+        <w:tblBorders>
+          <w:top w:val="single" w:color="auto" w:sz="4"/>
+          <w:left w:val="single" w:color="auto" w:sz="4"/>
+          <w:bottom w:val="single" w:color="auto" w:sz="4"/>
+          <w:right w:val="single" w:color="auto" w:sz="4"/>
+          <w:insideH w:val="single" w:color="auto" w:sz="4"/>
+          <w:insideV w:val="single" w:color="auto" w:sz="4"/>
+        </w:tblBorders>
+      </w:tblPr>
+      <w:tblGrid>
+        <w:gridCol w:w="2677"/>
+        <w:gridCol w:w="2368"/>
+        <w:gridCol w:w="2265"/>
+        <w:gridCol w:w="2328"/>
+      </w:tblGrid>
+      <w:tr>
+        <w:trPr>
+          <w:tblHeader/>
+        </w:trPr>
+        <w:tc>
+          <w:tcPr>
+            <w:tcW w:type="dxa" w:w="2677"/>
+            <w:tcBorders>
+              <w:top w:val="single" w:color="DCE6F0" w:sz="4"/>
+              <w:left w:val="single" w:color="DCE6F0" w:sz="4"/>
+              <w:bottom w:val="single" w:color="DCE6F0" w:sz="4"/>
+              <w:right w:val="single" w:color="DCE6F0" w:sz="4"/>
+            </w:tcBorders>
+            <w:shd w:fill="17707F" w:color="auto" w:val="clear"/>
+            <w:tcMar>
+              <w:top w:type="dxa" w:w="60"/>
+              <w:left w:type="dxa" w:w="100"/>
+              <w:bottom w:type="dxa" w:w="60"/>
+              <w:right w:type="dxa" w:w="100"/>
+            </w:tcMar>
+            <w:vAlign w:val="top"/>
+          </w:tcPr>
+          <w:p>
+            <w:pPr>
+              <w:spacing w:after="0" w:before="0"/>
+            </w:pPr>
+            <w:r>
+              <w:rPr>
+                <w:b/>
+                <w:bCs/>
+                <w:color w:val="FFFFFF"/>
+                <w:sz w:val="19"/>
+                <w:szCs w:val="19"/>
+              </w:rPr>
+              <w:t xml:space="preserve">MailFileNaming</w:t>
+            </w:r>
+          </w:p>
+        </w:tc>
+        <w:tc>
+          <w:tcPr>
+            <w:tcW w:type="dxa" w:w="2368"/>
+            <w:tcBorders>
+              <w:top w:val="single" w:color="DCE6F0" w:sz="4"/>
+              <w:left w:val="single" w:color="DCE6F0" w:sz="4"/>
+              <w:bottom w:val="single" w:color="DCE6F0" w:sz="4"/>
+              <w:right w:val="single" w:color="DCE6F0" w:sz="4"/>
+            </w:tcBorders>
+            <w:shd w:fill="17707F" w:color="auto" w:val="clear"/>
+            <w:tcMar>
+              <w:top w:type="dxa" w:w="60"/>
+              <w:left w:type="dxa" w:w="100"/>
+              <w:bottom w:type="dxa" w:w="60"/>
+              <w:right w:type="dxa" w:w="100"/>
+            </w:tcMar>
+            <w:vAlign w:val="top"/>
+          </w:tcPr>
+          <w:p>
+            <w:pPr>
+              <w:spacing w:after="0" w:before="0"/>
+            </w:pPr>
+            <w:r>
+              <w:rPr>
+                <w:b/>
+                <w:bCs/>
+                <w:color w:val="FFFFFF"/>
+                <w:sz w:val="19"/>
+                <w:szCs w:val="19"/>
+              </w:rPr>
+              <w:t xml:space="preserve">John Smith</w:t>
+            </w:r>
+          </w:p>
+        </w:tc>
+        <w:tc>
+          <w:tcPr>
+            <w:tcW w:type="dxa" w:w="2265"/>
+            <w:tcBorders>
+              <w:top w:val="single" w:color="DCE6F0" w:sz="4"/>
+              <w:left w:val="single" w:color="DCE6F0" w:sz="4"/>
+              <w:bottom w:val="single" w:color="DCE6F0" w:sz="4"/>
+              <w:right w:val="single" w:color="DCE6F0" w:sz="4"/>
+            </w:tcBorders>
+            <w:shd w:fill="17707F" w:color="auto" w:val="clear"/>
+            <w:tcMar>
+              <w:top w:type="dxa" w:w="60"/>
+              <w:left w:type="dxa" w:w="100"/>
+              <w:bottom w:type="dxa" w:w="60"/>
+              <w:right w:type="dxa" w:w="100"/>
+            </w:tcMar>
+            <w:vAlign w:val="top"/>
+          </w:tcPr>
+          <w:p>
+            <w:pPr>
+              <w:spacing w:after="0" w:before="0"/>
+            </w:pPr>
+            <w:r>
+              <w:rPr>
+                <w:b/>
+                <w:bCs/>
+                <w:color w:val="FFFFFF"/>
+                <w:sz w:val="19"/>
+                <w:szCs w:val="19"/>
+              </w:rPr>
+              <w:t xml:space="preserve">Anna Müller</w:t>
+            </w:r>
+          </w:p>
+        </w:tc>
+        <w:tc>
+          <w:tcPr>
+            <w:tcW w:type="dxa" w:w="2328"/>
+            <w:tcBorders>
+              <w:top w:val="single" w:color="DCE6F0" w:sz="4"/>
+              <w:left w:val="single" w:color="DCE6F0" w:sz="4"/>
+              <w:bottom w:val="single" w:color="DCE6F0" w:sz="4"/>
+              <w:right w:val="single" w:color="DCE6F0" w:sz="4"/>
+            </w:tcBorders>
+            <w:shd w:fill="17707F" w:color="auto" w:val="clear"/>
+            <w:tcMar>
+              <w:top w:type="dxa" w:w="60"/>
+              <w:left w:type="dxa" w:w="100"/>
+              <w:bottom w:type="dxa" w:w="60"/>
+              <w:right w:type="dxa" w:w="100"/>
+            </w:tcMar>
+            <w:vAlign w:val="top"/>
+          </w:tcPr>
+          <w:p>
+            <w:pPr>
+              <w:spacing w:after="0" w:before="0"/>
+            </w:pPr>
+            <w:r>
+              <w:rPr>
+                <w:b/>
+                <w:bCs/>
+                <w:color w:val="FFFFFF"/>
+                <w:sz w:val="19"/>
+                <w:szCs w:val="19"/>
+              </w:rPr>
+              <w:t xml:space="preserve">Seán O'Brien</w:t>
+            </w:r>
+          </w:p>
+        </w:tc>
+      </w:tr>
+      <w:tr>
+        <w:trPr>
+          <w:cantSplit/>
+        </w:trPr>
+        <w:tc>
+          <w:tcPr>
+            <w:tcW w:type="dxa" w:w="2677"/>
+            <w:tcBorders>
+              <w:top w:val="single" w:color="DCE6F0" w:sz="4"/>
+              <w:left w:val="single" w:color="DCE6F0" w:sz="4"/>
+              <w:bottom w:val="single" w:color="DCE6F0" w:sz="4"/>
+              <w:right w:val="single" w:color="DCE6F0" w:sz="4"/>
+            </w:tcBorders>
+            <w:shd w:fill="FFFFFF" w:color="auto" w:val="clear"/>
+            <w:tcMar>
+              <w:top w:type="dxa" w:w="60"/>
+              <w:left w:type="dxa" w:w="100"/>
+              <w:bottom w:type="dxa" w:w="60"/>
+              <w:right w:type="dxa" w:w="100"/>
+            </w:tcMar>
+            <w:vAlign w:val="top"/>
+          </w:tcPr>
+          <w:p>
+            <w:pPr>
+              <w:spacing w:after="0" w:before="0"/>
+            </w:pPr>
+            <w:r>
+              <w:rPr>
+                <w:rFonts w:ascii="Consolas" w:cs="Consolas" w:eastAsia="Consolas" w:hAnsi="Consolas"/>
+                <w:color w:val="0F5FDC"/>
+                <w:sz w:val="18"/>
+                <w:szCs w:val="18"/>
+              </w:rPr>
+              <w:t xml:space="preserve">LASTNAME</w:t>
+            </w:r>
+            <w:r>
+              <w:rPr>
+                <w:sz w:val="19"/>
+                <w:szCs w:val="19"/>
+              </w:rPr>
+              <w:t xml:space="preserve"> (default)</w:t>
+            </w:r>
+          </w:p>
+        </w:tc>
+        <w:tc>
+          <w:tcPr>
+            <w:tcW w:type="dxa" w:w="2368"/>
+            <w:tcBorders>
+              <w:top w:val="single" w:color="DCE6F0" w:sz="4"/>
+              <w:left w:val="single" w:color="DCE6F0" w:sz="4"/>
+              <w:bottom w:val="single" w:color="DCE6F0" w:sz="4"/>
+              <w:right w:val="single" w:color="DCE6F0" w:sz="4"/>
+            </w:tcBorders>
+            <w:shd w:fill="FFFFFF" w:color="auto" w:val="clear"/>
+            <w:tcMar>
+              <w:top w:type="dxa" w:w="60"/>
+              <w:left w:type="dxa" w:w="100"/>
+              <w:bottom w:type="dxa" w:w="60"/>
+              <w:right w:type="dxa" w:w="100"/>
+            </w:tcMar>
+            <w:vAlign w:val="top"/>
+          </w:tcPr>
+          <w:p>
+            <w:pPr>
+              <w:spacing w:after="0" w:before="0"/>
+            </w:pPr>
+            <w:r>
+              <w:rPr>
+                <w:sz w:val="19"/>
+                <w:szCs w:val="19"/>
+              </w:rPr>
+              <w:t xml:space="preserve">smith.nsf</w:t>
+            </w:r>
+          </w:p>
+        </w:tc>
+        <w:tc>
+          <w:tcPr>
+            <w:tcW w:type="dxa" w:w="2265"/>
+            <w:tcBorders>
+              <w:top w:val="single" w:color="DCE6F0" w:sz="4"/>
+              <w:left w:val="single" w:color="DCE6F0" w:sz="4"/>
+              <w:bottom w:val="single" w:color="DCE6F0" w:sz="4"/>
+              <w:right w:val="single" w:color="DCE6F0" w:sz="4"/>
+            </w:tcBorders>
+            <w:shd w:fill="FFFFFF" w:color="auto" w:val="clear"/>
+            <w:tcMar>
+              <w:top w:type="dxa" w:w="60"/>
+              <w:left w:type="dxa" w:w="100"/>
+              <w:bottom w:type="dxa" w:w="60"/>
+              <w:right w:type="dxa" w:w="100"/>
+            </w:tcMar>
+            <w:vAlign w:val="top"/>
+          </w:tcPr>
+          <w:p>
+            <w:pPr>
+              <w:spacing w:after="0" w:before="0"/>
+            </w:pPr>
+            <w:r>
+              <w:rPr>
+                <w:sz w:val="19"/>
+                <w:szCs w:val="19"/>
+              </w:rPr>
+              <w:t xml:space="preserve">mueller.nsf</w:t>
+            </w:r>
+          </w:p>
+        </w:tc>
+        <w:tc>
+          <w:tcPr>
+            <w:tcW w:type="dxa" w:w="2328"/>
+            <w:tcBorders>
+              <w:top w:val="single" w:color="DCE6F0" w:sz="4"/>
+              <w:left w:val="single" w:color="DCE6F0" w:sz="4"/>
+              <w:bottom w:val="single" w:color="DCE6F0" w:sz="4"/>
+              <w:right w:val="single" w:color="DCE6F0" w:sz="4"/>
+            </w:tcBorders>
+            <w:shd w:fill="FFFFFF" w:color="auto" w:val="clear"/>
+            <w:tcMar>
+              <w:top w:type="dxa" w:w="60"/>
+              <w:left w:type="dxa" w:w="100"/>
+              <w:bottom w:type="dxa" w:w="60"/>
+              <w:right w:type="dxa" w:w="100"/>
+            </w:tcMar>
+            <w:vAlign w:val="top"/>
+          </w:tcPr>
+          <w:p>
+            <w:pPr>
+              <w:spacing w:after="0" w:before="0"/>
+            </w:pPr>
+            <w:r>
+              <w:rPr>
+                <w:sz w:val="19"/>
+                <w:szCs w:val="19"/>
+              </w:rPr>
+              <w:t xml:space="preserve">obrien.nsf</w:t>
+            </w:r>
+          </w:p>
+        </w:tc>
+      </w:tr>
+      <w:tr>
+        <w:trPr>
+          <w:cantSplit/>
+        </w:trPr>
+        <w:tc>
+          <w:tcPr>
+            <w:tcW w:type="dxa" w:w="2677"/>
+            <w:tcBorders>
+              <w:top w:val="single" w:color="DCE6F0" w:sz="4"/>
+              <w:left w:val="single" w:color="DCE6F0" w:sz="4"/>
+              <w:bottom w:val="single" w:color="DCE6F0" w:sz="4"/>
+              <w:right w:val="single" w:color="DCE6F0" w:sz="4"/>
+            </w:tcBorders>
+            <w:shd w:fill="F7F7FC" w:color="auto" w:val="clear"/>
+            <w:tcMar>
+              <w:top w:type="dxa" w:w="60"/>
+              <w:left w:type="dxa" w:w="100"/>
+              <w:bottom w:type="dxa" w:w="60"/>
+              <w:right w:type="dxa" w:w="100"/>
+            </w:tcMar>
+            <w:vAlign w:val="top"/>
+          </w:tcPr>
+          <w:p>
+            <w:pPr>
+              <w:spacing w:after="0" w:before="0"/>
+            </w:pPr>
+            <w:r>
+              <w:rPr>
+                <w:rFonts w:ascii="Consolas" w:cs="Consolas" w:eastAsia="Consolas" w:hAnsi="Consolas"/>
+                <w:color w:val="0F5FDC"/>
+                <w:sz w:val="18"/>
+                <w:szCs w:val="18"/>
+              </w:rPr>
+              <w:t xml:space="preserve">FIRSTINITIAL_LASTNAME</w:t>
+            </w:r>
+          </w:p>
+        </w:tc>
+        <w:tc>
+          <w:tcPr>
+            <w:tcW w:type="dxa" w:w="2368"/>
+            <w:tcBorders>
+              <w:top w:val="single" w:color="DCE6F0" w:sz="4"/>
+              <w:left w:val="single" w:color="DCE6F0" w:sz="4"/>
+              <w:bottom w:val="single" w:color="DCE6F0" w:sz="4"/>
+              <w:right w:val="single" w:color="DCE6F0" w:sz="4"/>
+            </w:tcBorders>
+            <w:shd w:fill="F7F7FC" w:color="auto" w:val="clear"/>
+            <w:tcMar>
+              <w:top w:type="dxa" w:w="60"/>
+              <w:left w:type="dxa" w:w="100"/>
+              <w:bottom w:type="dxa" w:w="60"/>
+              <w:right w:type="dxa" w:w="100"/>
+            </w:tcMar>
+            <w:vAlign w:val="top"/>
+          </w:tcPr>
+          <w:p>
+            <w:pPr>
+              <w:spacing w:after="0" w:before="0"/>
+            </w:pPr>
+            <w:r>
+              <w:rPr>
+                <w:sz w:val="19"/>
+                <w:szCs w:val="19"/>
+              </w:rPr>
+              <w:t xml:space="preserve">jsmith.nsf</w:t>
+            </w:r>
+          </w:p>
+        </w:tc>
+        <w:tc>
+          <w:tcPr>
+            <w:tcW w:type="dxa" w:w="2265"/>
+            <w:tcBorders>
+              <w:top w:val="single" w:color="DCE6F0" w:sz="4"/>
+              <w:left w:val="single" w:color="DCE6F0" w:sz="4"/>
+              <w:bottom w:val="single" w:color="DCE6F0" w:sz="4"/>
+              <w:right w:val="single" w:color="DCE6F0" w:sz="4"/>
+            </w:tcBorders>
+            <w:shd w:fill="F7F7FC" w:color="auto" w:val="clear"/>
+            <w:tcMar>
+              <w:top w:type="dxa" w:w="60"/>
+              <w:left w:type="dxa" w:w="100"/>
+              <w:bottom w:type="dxa" w:w="60"/>
+              <w:right w:type="dxa" w:w="100"/>
+            </w:tcMar>
+            <w:vAlign w:val="top"/>
+          </w:tcPr>
+          <w:p>
+            <w:pPr>
+              <w:spacing w:after="0" w:before="0"/>
+            </w:pPr>
+            <w:r>
+              <w:rPr>
+                <w:sz w:val="19"/>
+                <w:szCs w:val="19"/>
+              </w:rPr>
+              <w:t xml:space="preserve">amueller.nsf</w:t>
+            </w:r>
+          </w:p>
+        </w:tc>
+        <w:tc>
+          <w:tcPr>
+            <w:tcW w:type="dxa" w:w="2328"/>
+            <w:tcBorders>
+              <w:top w:val="single" w:color="DCE6F0" w:sz="4"/>
+              <w:left w:val="single" w:color="DCE6F0" w:sz="4"/>
+              <w:bottom w:val="single" w:color="DCE6F0" w:sz="4"/>
+              <w:right w:val="single" w:color="DCE6F0" w:sz="4"/>
+            </w:tcBorders>
+            <w:shd w:fill="F7F7FC" w:color="auto" w:val="clear"/>
+            <w:tcMar>
+              <w:top w:type="dxa" w:w="60"/>
+              <w:left w:type="dxa" w:w="100"/>
+              <w:bottom w:type="dxa" w:w="60"/>
+              <w:right w:type="dxa" w:w="100"/>
+            </w:tcMar>
+            <w:vAlign w:val="top"/>
+          </w:tcPr>
+          <w:p>
+            <w:pPr>
+              <w:spacing w:after="0" w:before="0"/>
+            </w:pPr>
+            <w:r>
+              <w:rPr>
+                <w:sz w:val="19"/>
+                <w:szCs w:val="19"/>
+              </w:rPr>
+              <w:t xml:space="preserve">sobrien.nsf</w:t>
+            </w:r>
+          </w:p>
+        </w:tc>
+      </w:tr>
+      <w:tr>
+        <w:trPr>
+          <w:cantSplit/>
+        </w:trPr>
+        <w:tc>
+          <w:tcPr>
+            <w:tcW w:type="dxa" w:w="2677"/>
+            <w:tcBorders>
+              <w:top w:val="single" w:color="DCE6F0" w:sz="4"/>
+              <w:left w:val="single" w:color="DCE6F0" w:sz="4"/>
+              <w:bottom w:val="single" w:color="DCE6F0" w:sz="4"/>
+              <w:right w:val="single" w:color="DCE6F0" w:sz="4"/>
+            </w:tcBorders>
+            <w:shd w:fill="FFFFFF" w:color="auto" w:val="clear"/>
+            <w:tcMar>
+              <w:top w:type="dxa" w:w="60"/>
+              <w:left w:type="dxa" w:w="100"/>
+              <w:bottom w:type="dxa" w:w="60"/>
+              <w:right w:type="dxa" w:w="100"/>
+            </w:tcMar>
+            <w:vAlign w:val="top"/>
+          </w:tcPr>
+          <w:p>
+            <w:pPr>
+              <w:spacing w:after="0" w:before="0"/>
+            </w:pPr>
+            <w:r>
+              <w:rPr>
+                <w:rFonts w:ascii="Consolas" w:cs="Consolas" w:eastAsia="Consolas" w:hAnsi="Consolas"/>
+                <w:color w:val="0F5FDC"/>
+                <w:sz w:val="18"/>
+                <w:szCs w:val="18"/>
+              </w:rPr>
+              <w:t xml:space="preserve">SHORTNAME</w:t>
+            </w:r>
+          </w:p>
+        </w:tc>
+        <w:tc>
+          <w:tcPr>
+            <w:tcW w:type="dxa" w:w="2368"/>
+            <w:tcBorders>
+              <w:top w:val="single" w:color="DCE6F0" w:sz="4"/>
+              <w:left w:val="single" w:color="DCE6F0" w:sz="4"/>
+              <w:bottom w:val="single" w:color="DCE6F0" w:sz="4"/>
+              <w:right w:val="single" w:color="DCE6F0" w:sz="4"/>
+            </w:tcBorders>
+            <w:shd w:fill="FFFFFF" w:color="auto" w:val="clear"/>
+            <w:tcMar>
+              <w:top w:type="dxa" w:w="60"/>
+              <w:left w:type="dxa" w:w="100"/>
+              <w:bottom w:type="dxa" w:w="60"/>
+              <w:right w:type="dxa" w:w="100"/>
+            </w:tcMar>
+            <w:vAlign w:val="top"/>
+          </w:tcPr>
+          <w:p>
+            <w:pPr>
+              <w:spacing w:after="0" w:before="0"/>
+            </w:pPr>
+            <w:r>
+              <w:rPr>
+                <w:sz w:val="19"/>
+                <w:szCs w:val="19"/>
+              </w:rPr>
+              <w:t xml:space="preserve">&lt;ShortName&gt;.nsf (last name if empty)</w:t>
+            </w:r>
+          </w:p>
+        </w:tc>
+        <w:tc>
+          <w:tcPr>
+            <w:tcW w:type="dxa" w:w="2265"/>
+            <w:tcBorders>
+              <w:top w:val="single" w:color="DCE6F0" w:sz="4"/>
+              <w:left w:val="single" w:color="DCE6F0" w:sz="4"/>
+              <w:bottom w:val="single" w:color="DCE6F0" w:sz="4"/>
+              <w:right w:val="single" w:color="DCE6F0" w:sz="4"/>
+            </w:tcBorders>
+            <w:shd w:fill="FFFFFF" w:color="auto" w:val="clear"/>
+            <w:tcMar>
+              <w:top w:type="dxa" w:w="60"/>
+              <w:left w:type="dxa" w:w="100"/>
+              <w:bottom w:type="dxa" w:w="60"/>
+              <w:right w:type="dxa" w:w="100"/>
+            </w:tcMar>
+            <w:vAlign w:val="top"/>
+          </w:tcPr>
+          <w:p>
+            <w:pPr>
+              <w:spacing w:after="0" w:before="0"/>
+            </w:pPr>
+          </w:p>
+        </w:tc>
+        <w:tc>
+          <w:tcPr>
+            <w:tcW w:type="dxa" w:w="2328"/>
+            <w:tcBorders>
+              <w:top w:val="single" w:color="DCE6F0" w:sz="4"/>
+              <w:left w:val="single" w:color="DCE6F0" w:sz="4"/>
+              <w:bottom w:val="single" w:color="DCE6F0" w:sz="4"/>
+              <w:right w:val="single" w:color="DCE6F0" w:sz="4"/>
+            </w:tcBorders>
+            <w:shd w:fill="FFFFFF" w:color="auto" w:val="clear"/>
+            <w:tcMar>
+              <w:top w:type="dxa" w:w="60"/>
+              <w:left w:type="dxa" w:w="100"/>
+              <w:bottom w:type="dxa" w:w="60"/>
+              <w:right w:type="dxa" w:w="100"/>
+            </w:tcMar>
+            <w:vAlign w:val="top"/>
+          </w:tcPr>
+          <w:p>
+            <w:pPr>
+              <w:spacing w:after="0" w:before="0"/>
+            </w:pPr>
+          </w:p>
+        </w:tc>
+      </w:tr>
+    </w:tbl>
+    <w:p>
+      <w:pPr>
+        <w:spacing w:after="80" w:before="0"/>
+      </w:pPr>
+    </w:p>
+    <w:p>
+      <w:r>
+        <w:t xml:space="preserve">Names are lower case. Accents are converted (ä→ae, ö→oe, ü→ue, é→e, ß→ss…), and only a–z, 0–9, _ and - are kept.</w:t>
+      </w:r>
+    </w:p>
+    <w:p>
+      <w:pPr>
+        <w:pStyle w:val="Heading3"/>
+      </w:pPr>
+      <w:r>
+        <w:t xml:space="preserve">2. Uniqueness on each home server</w:t>
+      </w:r>
+    </w:p>
+    <w:p>
+      <w:r>
+        <w:t xml:space="preserve">A name counts as </w:t>
+      </w:r>
+      <w:r>
+        <w:rPr>
+          <w:b/>
+          <w:bCs/>
+        </w:rPr>
+        <w:t xml:space="preserve">taken</w:t>
+      </w:r>
+      <w:r>
+        <w:t xml:space="preserve"> on a home server if it is found in any of these, checked in this order:</w:t>
       </w:r>
     </w:p>
     <w:tbl>
@@ -30867,7 +32225,7 @@
                 <w:sz w:val="19"/>
                 <w:szCs w:val="19"/>
               </w:rPr>
-              <w:t xml:space="preserve">Item</w:t>
+              <w:t xml:space="preserve">Source</w:t>
             </w:r>
           </w:p>
         </w:tc>
@@ -30901,7 +32259,7 @@
                 <w:sz w:val="19"/>
                 <w:szCs w:val="19"/>
               </w:rPr>
-              <w:t xml:space="preserve">How BulkReg handles it</w:t>
+              <w:t xml:space="preserve">How it is checked</w:t>
             </w:r>
           </w:p>
         </w:tc>
@@ -30937,7 +32295,7 @@
                 <w:sz w:val="19"/>
                 <w:szCs w:val="19"/>
               </w:rPr>
-              <w:t xml:space="preserve">Location</w:t>
+              <w:t xml:space="preserve">Files on the server</w:t>
             </w:r>
           </w:p>
         </w:tc>
@@ -30968,7 +32326,7 @@
                 <w:sz w:val="19"/>
                 <w:szCs w:val="19"/>
               </w:rPr>
-              <w:t xml:space="preserve">On the user's HomeServer (server_mapping.csv, reviewable in the batch)</w:t>
+              <w:t xml:space="preserve">Agent 02 reads the server's database list once per run and records every file in folders starting with the prefix (mail, mail1, mail2 …)</w:t>
             </w:r>
           </w:p>
         </w:tc>
@@ -31004,7 +32362,7 @@
                 <w:sz w:val="19"/>
                 <w:szCs w:val="19"/>
               </w:rPr>
-              <w:t xml:space="preserve">Path</w:t>
+              <w:t xml:space="preserve">Person documents</w:t>
             </w:r>
           </w:p>
         </w:tc>
@@ -31032,35 +32390,10 @@
             </w:pPr>
             <w:r>
               <w:rPr>
-                <w:rFonts w:ascii="Consolas" w:cs="Consolas" w:eastAsia="Consolas" w:hAnsi="Consolas"/>
-                <w:color w:val="0F5FDC"/>
-                <w:sz w:val="18"/>
-                <w:szCs w:val="18"/>
-              </w:rPr>
-              <w:t xml:space="preserve">&lt;MailFileDir&gt;\&lt;ShortName&gt;.nsf</w:t>
-            </w:r>
-            <w:r>
-              <w:rPr>
-                <w:sz w:val="19"/>
-                <w:szCs w:val="19"/>
-              </w:rPr>
-              <w:t xml:space="preserve">, e.g. </w:t>
-            </w:r>
-            <w:r>
-              <w:rPr>
-                <w:rFonts w:ascii="Consolas" w:cs="Consolas" w:eastAsia="Consolas" w:hAnsi="Consolas"/>
-                <w:color w:val="0F5FDC"/>
-                <w:sz w:val="18"/>
-                <w:szCs w:val="18"/>
-              </w:rPr>
-              <w:t xml:space="preserve">mail\jsmith.nsf</w:t>
-            </w:r>
-            <w:r>
-              <w:rPr>
-                <w:sz w:val="19"/>
-                <w:szCs w:val="19"/>
-              </w:rPr>
-              <w:t xml:space="preserve">. Without a ShortName: first initial + last name. Editable per user in the batch (MailFile column).</w:t>
+                <w:sz w:val="19"/>
+                <w:szCs w:val="19"/>
+              </w:rPr>
+              <w:t xml:space="preserve">Every Person document with a MailFile (and its MailServer) in the Domino Directory</w:t>
             </w:r>
           </w:p>
         </w:tc>
@@ -31096,7 +32429,7 @@
                 <w:sz w:val="19"/>
                 <w:szCs w:val="19"/>
               </w:rPr>
-              <w:t xml:space="preserve">Duplicates</w:t>
+              <w:t xml:space="preserve">Open batches</w:t>
             </w:r>
           </w:p>
         </w:tc>
@@ -31127,23 +32460,7 @@
                 <w:sz w:val="19"/>
                 <w:szCs w:val="19"/>
               </w:rPr>
-              <w:t xml:space="preserve">Build Batch marks a row ERROR if the same mail file appears twice in the batch for a server, or if the file </w:t>
-            </w:r>
-            <w:r>
-              <w:rPr>
-                <w:b/>
-                <w:bCs/>
-                <w:sz w:val="19"/>
-                <w:szCs w:val="19"/>
-              </w:rPr>
-              <w:t xml:space="preserve">already exists</w:t>
-            </w:r>
-            <w:r>
-              <w:rPr>
-                <w:sz w:val="19"/>
-                <w:szCs w:val="19"/>
-              </w:rPr>
-              <w:t xml:space="preserve"> on the home server. Register Batch checks again just before registering. An existing mail file is never overwritten.</w:t>
+              <w:t xml:space="preserve">Mail files reserved by other OPEN batch files</w:t>
             </w:r>
           </w:p>
         </w:tc>
@@ -31179,7 +32496,7 @@
                 <w:sz w:val="19"/>
                 <w:szCs w:val="19"/>
               </w:rPr>
-              <w:t xml:space="preserve">Template</w:t>
+              <w:t xml:space="preserve">This batch</w:t>
             </w:r>
           </w:p>
         </w:tc>
@@ -31207,19 +32524,237 @@
             </w:pPr>
             <w:r>
               <w:rPr>
-                <w:rFonts w:ascii="Consolas" w:cs="Consolas" w:eastAsia="Consolas" w:hAnsi="Consolas"/>
-                <w:color w:val="0F5FDC"/>
-                <w:sz w:val="18"/>
-                <w:szCs w:val="18"/>
-              </w:rPr>
-              <w:t xml:space="preserve">MailTemplate</w:t>
-            </w:r>
-            <w:r>
-              <w:rPr>
-                <w:sz w:val="19"/>
-                <w:szCs w:val="19"/>
-              </w:rPr>
-              <w:t xml:space="preserve"> (e.g. mail12.ntf), or the registration default when empty. It must exist on every home server (B4).</w:t>
+                <w:sz w:val="19"/>
+                <w:szCs w:val="19"/>
+              </w:rPr>
+              <w:t xml:space="preserve">Rows already allocated earlier in the same batch</w:t>
+            </w:r>
+          </w:p>
+        </w:tc>
+      </w:tr>
+    </w:tbl>
+    <w:p>
+      <w:pPr>
+        <w:spacing w:after="80" w:before="0"/>
+      </w:pPr>
+    </w:p>
+    <w:p>
+      <w:r>
+        <w:t xml:space="preserve">If the name is taken: with </w:t>
+      </w:r>
+      <w:r>
+        <w:rPr>
+          <w:rFonts w:ascii="Consolas" w:cs="Consolas" w:eastAsia="Consolas" w:hAnsi="Consolas"/>
+          <w:color w:val="0F5FDC"/>
+          <w:sz w:val="20"/>
+          <w:szCs w:val="20"/>
+        </w:rPr>
+        <w:t xml:space="preserve">MailFileCollision=SUFFIX</w:t>
+      </w:r>
+      <w:r>
+        <w:t xml:space="preserve"> (default) the next free name is used (smith2.nsf, smith3.nsf …) and the row is marked </w:t>
+      </w:r>
+      <w:r>
+        <w:rPr>
+          <w:b/>
+          <w:bCs/>
+        </w:rPr>
+        <w:t xml:space="preserve">WARN: mail file renamed</w:t>
+      </w:r>
+      <w:r>
+        <w:t xml:space="preserve">. With </w:t>
+      </w:r>
+      <w:r>
+        <w:rPr>
+          <w:rFonts w:ascii="Consolas" w:cs="Consolas" w:eastAsia="Consolas" w:hAnsi="Consolas"/>
+          <w:color w:val="0F5FDC"/>
+          <w:sz w:val="20"/>
+          <w:szCs w:val="20"/>
+        </w:rPr>
+        <w:t xml:space="preserve">ERROR</w:t>
+      </w:r>
+      <w:r>
+        <w:t xml:space="preserve"> the row gets Check=ERROR and Include=N. Uniqueness is per home server and across </w:t>
+      </w:r>
+      <w:r>
+        <w:rPr>
+          <w:b/>
+          <w:bCs/>
+        </w:rPr>
+        <w:t xml:space="preserve">all</w:t>
+      </w:r>
+      <w:r>
+        <w:t xml:space="preserve"> its mail folders, so the same name is never used twice on one server. Agent 03 checks again just before registering that the exact file does not exist, so an existing mail file is never overwritten.</w:t>
+      </w:r>
+    </w:p>
+    <w:p>
+      <w:pPr>
+        <w:pStyle w:val="Heading3"/>
+      </w:pPr>
+      <w:r>
+        <w:t xml:space="preserve">3. Numbered folders: mail1, mail2 …</w:t>
+      </w:r>
+    </w:p>
+    <w:p>
+      <w:r>
+        <w:t xml:space="preserve">With </w:t>
+      </w:r>
+      <w:r>
+        <w:rPr>
+          <w:rFonts w:ascii="Consolas" w:cs="Consolas" w:eastAsia="Consolas" w:hAnsi="Consolas"/>
+          <w:color w:val="0F5FDC"/>
+          <w:sz w:val="20"/>
+          <w:szCs w:val="20"/>
+        </w:rPr>
+        <w:t xml:space="preserve">MailFolderMode=NUMBERED</w:t>
+      </w:r>
+      <w:r>
+        <w:t xml:space="preserve"> (default), mail files go into numbered subfolders of the data directory: </w:t>
+      </w:r>
+      <w:r>
+        <w:rPr>
+          <w:rFonts w:ascii="Consolas" w:cs="Consolas" w:eastAsia="Consolas" w:hAnsi="Consolas"/>
+          <w:color w:val="0F5FDC"/>
+          <w:sz w:val="20"/>
+          <w:szCs w:val="20"/>
+        </w:rPr>
+        <w:t xml:space="preserve">mail1</w:t>
+      </w:r>
+      <w:r>
+        <w:t xml:space="preserve">, </w:t>
+      </w:r>
+      <w:r>
+        <w:rPr>
+          <w:rFonts w:ascii="Consolas" w:cs="Consolas" w:eastAsia="Consolas" w:hAnsi="Consolas"/>
+          <w:color w:val="0F5FDC"/>
+          <w:sz w:val="20"/>
+          <w:szCs w:val="20"/>
+        </w:rPr>
+        <w:t xml:space="preserve">mail2</w:t>
+      </w:r>
+      <w:r>
+        <w:t xml:space="preserve">, </w:t>
+      </w:r>
+      <w:r>
+        <w:rPr>
+          <w:rFonts w:ascii="Consolas" w:cs="Consolas" w:eastAsia="Consolas" w:hAnsi="Consolas"/>
+          <w:color w:val="0F5FDC"/>
+          <w:sz w:val="20"/>
+          <w:szCs w:val="20"/>
+        </w:rPr>
+        <w:t xml:space="preserve">mail3</w:t>
+      </w:r>
+      <w:r>
+        <w:t xml:space="preserve"> …. Each holds at most </w:t>
+      </w:r>
+      <w:r>
+        <w:rPr>
+          <w:rFonts w:ascii="Consolas" w:cs="Consolas" w:eastAsia="Consolas" w:hAnsi="Consolas"/>
+          <w:color w:val="0F5FDC"/>
+          <w:sz w:val="20"/>
+          <w:szCs w:val="20"/>
+        </w:rPr>
+        <w:t xml:space="preserve">MailFilesPerFolder</w:t>
+      </w:r>
+      <w:r>
+        <w:t xml:space="preserve"> (default </w:t>
+      </w:r>
+      <w:r>
+        <w:rPr>
+          <w:b/>
+          <w:bCs/>
+        </w:rPr>
+        <w:t xml:space="preserve">1000</w:t>
+      </w:r>
+      <w:r>
+        <w:t xml:space="preserve">). Files already in those folders are counted, per home server, and so are open batches. A folder is filled before the next one is used.</w:t>
+      </w:r>
+    </w:p>
+    <w:tbl>
+      <w:tblPr>
+        <w:tblW w:type="dxa" w:w="9638"/>
+        <w:tblBorders>
+          <w:top w:val="single" w:color="auto" w:sz="4"/>
+          <w:left w:val="single" w:color="auto" w:sz="4"/>
+          <w:bottom w:val="single" w:color="auto" w:sz="4"/>
+          <w:right w:val="single" w:color="auto" w:sz="4"/>
+          <w:insideH w:val="single" w:color="auto" w:sz="4"/>
+          <w:insideV w:val="single" w:color="auto" w:sz="4"/>
+        </w:tblBorders>
+      </w:tblPr>
+      <w:tblGrid>
+        <w:gridCol w:w="4324"/>
+        <w:gridCol w:w="5314"/>
+      </w:tblGrid>
+      <w:tr>
+        <w:trPr>
+          <w:tblHeader/>
+        </w:trPr>
+        <w:tc>
+          <w:tcPr>
+            <w:tcW w:type="dxa" w:w="4324"/>
+            <w:tcBorders>
+              <w:top w:val="single" w:color="DCE6F0" w:sz="4"/>
+              <w:left w:val="single" w:color="DCE6F0" w:sz="4"/>
+              <w:bottom w:val="single" w:color="DCE6F0" w:sz="4"/>
+              <w:right w:val="single" w:color="DCE6F0" w:sz="4"/>
+            </w:tcBorders>
+            <w:shd w:fill="17707F" w:color="auto" w:val="clear"/>
+            <w:tcMar>
+              <w:top w:type="dxa" w:w="60"/>
+              <w:left w:type="dxa" w:w="100"/>
+              <w:bottom w:type="dxa" w:w="60"/>
+              <w:right w:type="dxa" w:w="100"/>
+            </w:tcMar>
+            <w:vAlign w:val="top"/>
+          </w:tcPr>
+          <w:p>
+            <w:pPr>
+              <w:spacing w:after="0" w:before="0"/>
+            </w:pPr>
+            <w:r>
+              <w:rPr>
+                <w:b/>
+                <w:bCs/>
+                <w:color w:val="FFFFFF"/>
+                <w:sz w:val="19"/>
+                <w:szCs w:val="19"/>
+              </w:rPr>
+              <w:t xml:space="preserve">Situation on DominoADMail/Demo</w:t>
+            </w:r>
+          </w:p>
+        </w:tc>
+        <w:tc>
+          <w:tcPr>
+            <w:tcW w:type="dxa" w:w="5314"/>
+            <w:tcBorders>
+              <w:top w:val="single" w:color="DCE6F0" w:sz="4"/>
+              <w:left w:val="single" w:color="DCE6F0" w:sz="4"/>
+              <w:bottom w:val="single" w:color="DCE6F0" w:sz="4"/>
+              <w:right w:val="single" w:color="DCE6F0" w:sz="4"/>
+            </w:tcBorders>
+            <w:shd w:fill="17707F" w:color="auto" w:val="clear"/>
+            <w:tcMar>
+              <w:top w:type="dxa" w:w="60"/>
+              <w:left w:type="dxa" w:w="100"/>
+              <w:bottom w:type="dxa" w:w="60"/>
+              <w:right w:type="dxa" w:w="100"/>
+            </w:tcMar>
+            <w:vAlign w:val="top"/>
+          </w:tcPr>
+          <w:p>
+            <w:pPr>
+              <w:spacing w:after="0" w:before="0"/>
+            </w:pPr>
+            <w:r>
+              <w:rPr>
+                <w:b/>
+                <w:bCs/>
+                <w:color w:val="FFFFFF"/>
+                <w:sz w:val="19"/>
+                <w:szCs w:val="19"/>
+              </w:rPr>
+              <w:t xml:space="preserve">Batch of 500 users gets</w:t>
             </w:r>
           </w:p>
         </w:tc>
@@ -31230,7 +32765,7 @@
         </w:trPr>
         <w:tc>
           <w:tcPr>
-            <w:tcW w:type="dxa" w:w="2471"/>
+            <w:tcW w:type="dxa" w:w="4324"/>
             <w:tcBorders>
               <w:top w:val="single" w:color="DCE6F0" w:sz="4"/>
               <w:left w:val="single" w:color="DCE6F0" w:sz="4"/>
@@ -31255,13 +32790,13 @@
                 <w:sz w:val="19"/>
                 <w:szCs w:val="19"/>
               </w:rPr>
-              <w:t xml:space="preserve">Access and size</w:t>
-            </w:r>
-          </w:p>
-        </w:tc>
-        <w:tc>
-          <w:tcPr>
-            <w:tcW w:type="dxa" w:w="7167"/>
+              <w:t xml:space="preserve">mail1 has 980 mail files</w:t>
+            </w:r>
+          </w:p>
+        </w:tc>
+        <w:tc>
+          <w:tcPr>
+            <w:tcW w:type="dxa" w:w="5314"/>
             <w:tcBorders>
               <w:top w:val="single" w:color="DCE6F0" w:sz="4"/>
               <w:left w:val="single" w:color="DCE6F0" w:sz="4"/>
@@ -31283,60 +32818,10 @@
             </w:pPr>
             <w:r>
               <w:rPr>
-                <w:rFonts w:ascii="Consolas" w:cs="Consolas" w:eastAsia="Consolas" w:hAnsi="Consolas"/>
-                <w:color w:val="0F5FDC"/>
-                <w:sz w:val="18"/>
-                <w:szCs w:val="18"/>
-              </w:rPr>
-              <w:t xml:space="preserve">MailACLManager</w:t>
-            </w:r>
-            <w:r>
-              <w:rPr>
-                <w:sz w:val="19"/>
-                <w:szCs w:val="19"/>
-              </w:rPr>
-              <w:t xml:space="preserve"> (optional extra Manager), </w:t>
-            </w:r>
-            <w:r>
-              <w:rPr>
-                <w:rFonts w:ascii="Consolas" w:cs="Consolas" w:eastAsia="Consolas" w:hAnsi="Consolas"/>
-                <w:color w:val="0F5FDC"/>
-                <w:sz w:val="18"/>
-                <w:szCs w:val="18"/>
-              </w:rPr>
-              <w:t xml:space="preserve">MailQuotaSizeLimit</w:t>
-            </w:r>
-            <w:r>
-              <w:rPr>
-                <w:sz w:val="19"/>
-                <w:szCs w:val="19"/>
-              </w:rPr>
-              <w:t xml:space="preserve"> / </w:t>
-            </w:r>
-            <w:r>
-              <w:rPr>
-                <w:rFonts w:ascii="Consolas" w:cs="Consolas" w:eastAsia="Consolas" w:hAnsi="Consolas"/>
-                <w:color w:val="0F5FDC"/>
-                <w:sz w:val="18"/>
-                <w:szCs w:val="18"/>
-              </w:rPr>
-              <w:t xml:space="preserve">MailQuotaWarningThreshold</w:t>
-            </w:r>
-            <w:r>
-              <w:rPr>
-                <w:sz w:val="19"/>
-                <w:szCs w:val="19"/>
-              </w:rPr>
-              <w:t xml:space="preserve"> in MB, </w:t>
-            </w:r>
-            <w:r>
-              <w:rPr>
-                <w:rFonts w:ascii="Consolas" w:cs="Consolas" w:eastAsia="Consolas" w:hAnsi="Consolas"/>
-                <w:color w:val="0F5FDC"/>
-                <w:sz w:val="18"/>
-                <w:szCs w:val="18"/>
-              </w:rPr>
-              <w:t xml:space="preserve">MailCreateFTIndex</w:t>
+                <w:sz w:val="19"/>
+                <w:szCs w:val="19"/>
+              </w:rPr>
+              <w:t xml:space="preserve">20 users → mail1 (now 1000), 480 users → mail2</w:t>
             </w:r>
           </w:p>
         </w:tc>
@@ -31347,7 +32832,7 @@
         </w:trPr>
         <w:tc>
           <w:tcPr>
-            <w:tcW w:type="dxa" w:w="2471"/>
+            <w:tcW w:type="dxa" w:w="4324"/>
             <w:tcBorders>
               <w:top w:val="single" w:color="DCE6F0" w:sz="4"/>
               <w:left w:val="single" w:color="DCE6F0" w:sz="4"/>
@@ -31372,13 +32857,13 @@
                 <w:sz w:val="19"/>
                 <w:szCs w:val="19"/>
               </w:rPr>
-              <w:t xml:space="preserve">Check after registration</w:t>
-            </w:r>
-          </w:p>
-        </w:tc>
-        <w:tc>
-          <w:tcPr>
-            <w:tcW w:type="dxa" w:w="7167"/>
+              <w:t xml:space="preserve">mail1 and mail2 full, mail3 has 300</w:t>
+            </w:r>
+          </w:p>
+        </w:tc>
+        <w:tc>
+          <w:tcPr>
+            <w:tcW w:type="dxa" w:w="5314"/>
             <w:tcBorders>
               <w:top w:val="single" w:color="DCE6F0" w:sz="4"/>
               <w:left w:val="single" w:color="DCE6F0" w:sz="4"/>
@@ -31403,7 +32888,1000 @@
                 <w:sz w:val="19"/>
                 <w:szCs w:val="19"/>
               </w:rPr>
-              <w:t xml:space="preserve">Register Batch records MailFileStatus (MAILFILE_OK or MAILFILE_PENDING). Verify (C7) checks the mail file named in the Person document on the MailServer: MAILFILE_OK, MAILFILE_MISSING or NO_MAILFILE_IN_PERSON_DOC.</w:t>
+              <w:t xml:space="preserve">500 users → mail3 (now 800)</w:t>
+            </w:r>
+          </w:p>
+        </w:tc>
+      </w:tr>
+      <w:tr>
+        <w:trPr>
+          <w:cantSplit/>
+        </w:trPr>
+        <w:tc>
+          <w:tcPr>
+            <w:tcW w:type="dxa" w:w="4324"/>
+            <w:tcBorders>
+              <w:top w:val="single" w:color="DCE6F0" w:sz="4"/>
+              <w:left w:val="single" w:color="DCE6F0" w:sz="4"/>
+              <w:bottom w:val="single" w:color="DCE6F0" w:sz="4"/>
+              <w:right w:val="single" w:color="DCE6F0" w:sz="4"/>
+            </w:tcBorders>
+            <w:shd w:fill="FFFFFF" w:color="auto" w:val="clear"/>
+            <w:tcMar>
+              <w:top w:type="dxa" w:w="60"/>
+              <w:left w:type="dxa" w:w="100"/>
+              <w:bottom w:type="dxa" w:w="60"/>
+              <w:right w:type="dxa" w:w="100"/>
+            </w:tcMar>
+            <w:vAlign w:val="top"/>
+          </w:tcPr>
+          <w:p>
+            <w:pPr>
+              <w:spacing w:after="0" w:before="0"/>
+            </w:pPr>
+            <w:r>
+              <w:rPr>
+                <w:sz w:val="19"/>
+                <w:szCs w:val="19"/>
+              </w:rPr>
+              <w:t xml:space="preserve">No mail folders yet</w:t>
+            </w:r>
+          </w:p>
+        </w:tc>
+        <w:tc>
+          <w:tcPr>
+            <w:tcW w:type="dxa" w:w="5314"/>
+            <w:tcBorders>
+              <w:top w:val="single" w:color="DCE6F0" w:sz="4"/>
+              <w:left w:val="single" w:color="DCE6F0" w:sz="4"/>
+              <w:bottom w:val="single" w:color="DCE6F0" w:sz="4"/>
+              <w:right w:val="single" w:color="DCE6F0" w:sz="4"/>
+            </w:tcBorders>
+            <w:shd w:fill="FFFFFF" w:color="auto" w:val="clear"/>
+            <w:tcMar>
+              <w:top w:type="dxa" w:w="60"/>
+              <w:left w:type="dxa" w:w="100"/>
+              <w:bottom w:type="dxa" w:w="60"/>
+              <w:right w:type="dxa" w:w="100"/>
+            </w:tcMar>
+            <w:vAlign w:val="top"/>
+          </w:tcPr>
+          <w:p>
+            <w:pPr>
+              <w:spacing w:after="0" w:before="0"/>
+            </w:pPr>
+            <w:r>
+              <w:rPr>
+                <w:sz w:val="19"/>
+                <w:szCs w:val="19"/>
+              </w:rPr>
+              <w:t xml:space="preserve">500 users → mail1</w:t>
+            </w:r>
+          </w:p>
+        </w:tc>
+      </w:tr>
+    </w:tbl>
+    <w:p>
+      <w:pPr>
+        <w:spacing w:after="80" w:before="0"/>
+      </w:pPr>
+    </w:p>
+    <w:p>
+      <w:r>
+        <w:t xml:space="preserve">With </w:t>
+      </w:r>
+      <w:r>
+        <w:rPr>
+          <w:rFonts w:ascii="Consolas" w:cs="Consolas" w:eastAsia="Consolas" w:hAnsi="Consolas"/>
+          <w:color w:val="0F5FDC"/>
+          <w:sz w:val="20"/>
+          <w:szCs w:val="20"/>
+        </w:rPr>
+        <w:t xml:space="preserve">MailFolderMode=SINGLE</w:t>
+      </w:r>
+      <w:r>
+        <w:t xml:space="preserve">, all mail files go into </w:t>
+      </w:r>
+      <w:r>
+        <w:rPr>
+          <w:rFonts w:ascii="Consolas" w:cs="Consolas" w:eastAsia="Consolas" w:hAnsi="Consolas"/>
+          <w:color w:val="0F5FDC"/>
+          <w:sz w:val="20"/>
+          <w:szCs w:val="20"/>
+        </w:rPr>
+        <w:t xml:space="preserve">MailFileDir</w:t>
+      </w:r>
+      <w:r>
+        <w:t xml:space="preserve"> (for example </w:t>
+      </w:r>
+      <w:r>
+        <w:rPr>
+          <w:rFonts w:ascii="Consolas" w:cs="Consolas" w:eastAsia="Consolas" w:hAnsi="Consolas"/>
+          <w:color w:val="0F5FDC"/>
+          <w:sz w:val="20"/>
+          <w:szCs w:val="20"/>
+        </w:rPr>
+        <w:t xml:space="preserve">mail</w:t>
+      </w:r>
+      <w:r>
+        <w:t xml:space="preserve">).</w:t>
+      </w:r>
+    </w:p>
+    <w:p>
+      <w:pPr>
+        <w:pStyle w:val="Heading3"/>
+      </w:pPr>
+      <w:r>
+        <w:t xml:space="preserve">4. Where every decision is recorded</w:t>
+      </w:r>
+    </w:p>
+    <w:tbl>
+      <w:tblPr>
+        <w:tblW w:type="dxa" w:w="9638"/>
+        <w:tblBorders>
+          <w:top w:val="single" w:color="auto" w:sz="4"/>
+          <w:left w:val="single" w:color="auto" w:sz="4"/>
+          <w:bottom w:val="single" w:color="auto" w:sz="4"/>
+          <w:right w:val="single" w:color="auto" w:sz="4"/>
+          <w:insideH w:val="single" w:color="auto" w:sz="4"/>
+          <w:insideV w:val="single" w:color="auto" w:sz="4"/>
+        </w:tblBorders>
+      </w:tblPr>
+      <w:tblGrid>
+        <w:gridCol w:w="3089"/>
+        <w:gridCol w:w="6549"/>
+      </w:tblGrid>
+      <w:tr>
+        <w:trPr>
+          <w:tblHeader/>
+        </w:trPr>
+        <w:tc>
+          <w:tcPr>
+            <w:tcW w:type="dxa" w:w="3089"/>
+            <w:tcBorders>
+              <w:top w:val="single" w:color="DCE6F0" w:sz="4"/>
+              <w:left w:val="single" w:color="DCE6F0" w:sz="4"/>
+              <w:bottom w:val="single" w:color="DCE6F0" w:sz="4"/>
+              <w:right w:val="single" w:color="DCE6F0" w:sz="4"/>
+            </w:tcBorders>
+            <w:shd w:fill="17707F" w:color="auto" w:val="clear"/>
+            <w:tcMar>
+              <w:top w:type="dxa" w:w="60"/>
+              <w:left w:type="dxa" w:w="100"/>
+              <w:bottom w:type="dxa" w:w="60"/>
+              <w:right w:type="dxa" w:w="100"/>
+            </w:tcMar>
+            <w:vAlign w:val="top"/>
+          </w:tcPr>
+          <w:p>
+            <w:pPr>
+              <w:spacing w:after="0" w:before="0"/>
+            </w:pPr>
+            <w:r>
+              <w:rPr>
+                <w:b/>
+                <w:bCs/>
+                <w:color w:val="FFFFFF"/>
+                <w:sz w:val="19"/>
+                <w:szCs w:val="19"/>
+              </w:rPr>
+              <w:t xml:space="preserve">Record</w:t>
+            </w:r>
+          </w:p>
+        </w:tc>
+        <w:tc>
+          <w:tcPr>
+            <w:tcW w:type="dxa" w:w="6549"/>
+            <w:tcBorders>
+              <w:top w:val="single" w:color="DCE6F0" w:sz="4"/>
+              <w:left w:val="single" w:color="DCE6F0" w:sz="4"/>
+              <w:bottom w:val="single" w:color="DCE6F0" w:sz="4"/>
+              <w:right w:val="single" w:color="DCE6F0" w:sz="4"/>
+            </w:tcBorders>
+            <w:shd w:fill="17707F" w:color="auto" w:val="clear"/>
+            <w:tcMar>
+              <w:top w:type="dxa" w:w="60"/>
+              <w:left w:type="dxa" w:w="100"/>
+              <w:bottom w:type="dxa" w:w="60"/>
+              <w:right w:type="dxa" w:w="100"/>
+            </w:tcMar>
+            <w:vAlign w:val="top"/>
+          </w:tcPr>
+          <w:p>
+            <w:pPr>
+              <w:spacing w:after="0" w:before="0"/>
+            </w:pPr>
+            <w:r>
+              <w:rPr>
+                <w:b/>
+                <w:bCs/>
+                <w:color w:val="FFFFFF"/>
+                <w:sz w:val="19"/>
+                <w:szCs w:val="19"/>
+              </w:rPr>
+              <w:t xml:space="preserve">Content</w:t>
+            </w:r>
+          </w:p>
+        </w:tc>
+      </w:tr>
+      <w:tr>
+        <w:trPr>
+          <w:cantSplit/>
+        </w:trPr>
+        <w:tc>
+          <w:tcPr>
+            <w:tcW w:type="dxa" w:w="3089"/>
+            <w:tcBorders>
+              <w:top w:val="single" w:color="DCE6F0" w:sz="4"/>
+              <w:left w:val="single" w:color="DCE6F0" w:sz="4"/>
+              <w:bottom w:val="single" w:color="DCE6F0" w:sz="4"/>
+              <w:right w:val="single" w:color="DCE6F0" w:sz="4"/>
+            </w:tcBorders>
+            <w:shd w:fill="FFFFFF" w:color="auto" w:val="clear"/>
+            <w:tcMar>
+              <w:top w:type="dxa" w:w="60"/>
+              <w:left w:type="dxa" w:w="100"/>
+              <w:bottom w:type="dxa" w:w="60"/>
+              <w:right w:type="dxa" w:w="100"/>
+            </w:tcMar>
+            <w:vAlign w:val="top"/>
+          </w:tcPr>
+          <w:p>
+            <w:pPr>
+              <w:spacing w:after="0" w:before="0"/>
+            </w:pPr>
+            <w:r>
+              <w:rPr>
+                <w:sz w:val="19"/>
+                <w:szCs w:val="19"/>
+              </w:rPr>
+              <w:t xml:space="preserve">Batch file (MailFile, MailFileNote)</w:t>
+            </w:r>
+          </w:p>
+        </w:tc>
+        <w:tc>
+          <w:tcPr>
+            <w:tcW w:type="dxa" w:w="6549"/>
+            <w:tcBorders>
+              <w:top w:val="single" w:color="DCE6F0" w:sz="4"/>
+              <w:left w:val="single" w:color="DCE6F0" w:sz="4"/>
+              <w:bottom w:val="single" w:color="DCE6F0" w:sz="4"/>
+              <w:right w:val="single" w:color="DCE6F0" w:sz="4"/>
+            </w:tcBorders>
+            <w:shd w:fill="FFFFFF" w:color="auto" w:val="clear"/>
+            <w:tcMar>
+              <w:top w:type="dxa" w:w="60"/>
+              <w:left w:type="dxa" w:w="100"/>
+              <w:bottom w:type="dxa" w:w="60"/>
+              <w:right w:type="dxa" w:w="100"/>
+            </w:tcMar>
+            <w:vAlign w:val="top"/>
+          </w:tcPr>
+          <w:p>
+            <w:pPr>
+              <w:spacing w:after="0" w:before="0"/>
+            </w:pPr>
+            <w:r>
+              <w:rPr>
+                <w:sz w:val="19"/>
+                <w:szCs w:val="19"/>
+              </w:rPr>
+              <w:t xml:space="preserve">Path, plus e.g. </w:t>
+            </w:r>
+            <w:r>
+              <w:rPr>
+                <w:rFonts w:ascii="Consolas" w:cs="Consolas" w:eastAsia="Consolas" w:hAnsi="Consolas"/>
+                <w:color w:val="0F5FDC"/>
+                <w:sz w:val="18"/>
+                <w:szCs w:val="18"/>
+              </w:rPr>
+              <w:t xml:space="preserve">smith.nsf already used (file mail1\smith.nsf) -&gt; smith2.nsf; naming LASTNAME; folder mail2 412/1000</w:t>
+            </w:r>
+          </w:p>
+        </w:tc>
+      </w:tr>
+      <w:tr>
+        <w:trPr>
+          <w:cantSplit/>
+        </w:trPr>
+        <w:tc>
+          <w:tcPr>
+            <w:tcW w:type="dxa" w:w="3089"/>
+            <w:tcBorders>
+              <w:top w:val="single" w:color="DCE6F0" w:sz="4"/>
+              <w:left w:val="single" w:color="DCE6F0" w:sz="4"/>
+              <w:bottom w:val="single" w:color="DCE6F0" w:sz="4"/>
+              <w:right w:val="single" w:color="DCE6F0" w:sz="4"/>
+            </w:tcBorders>
+            <w:shd w:fill="F7F7FC" w:color="auto" w:val="clear"/>
+            <w:tcMar>
+              <w:top w:type="dxa" w:w="60"/>
+              <w:left w:type="dxa" w:w="100"/>
+              <w:bottom w:type="dxa" w:w="60"/>
+              <w:right w:type="dxa" w:w="100"/>
+            </w:tcMar>
+            <w:vAlign w:val="top"/>
+          </w:tcPr>
+          <w:p>
+            <w:pPr>
+              <w:spacing w:after="0" w:before="0"/>
+            </w:pPr>
+            <w:r>
+              <w:rPr>
+                <w:sz w:val="19"/>
+                <w:szCs w:val="19"/>
+              </w:rPr>
+              <w:t xml:space="preserve">Batch summary</w:t>
+            </w:r>
+          </w:p>
+        </w:tc>
+        <w:tc>
+          <w:tcPr>
+            <w:tcW w:type="dxa" w:w="6549"/>
+            <w:tcBorders>
+              <w:top w:val="single" w:color="DCE6F0" w:sz="4"/>
+              <w:left w:val="single" w:color="DCE6F0" w:sz="4"/>
+              <w:bottom w:val="single" w:color="DCE6F0" w:sz="4"/>
+              <w:right w:val="single" w:color="DCE6F0" w:sz="4"/>
+            </w:tcBorders>
+            <w:shd w:fill="F7F7FC" w:color="auto" w:val="clear"/>
+            <w:tcMar>
+              <w:top w:type="dxa" w:w="60"/>
+              <w:left w:type="dxa" w:w="100"/>
+              <w:bottom w:type="dxa" w:w="60"/>
+              <w:right w:type="dxa" w:w="100"/>
+            </w:tcMar>
+            <w:vAlign w:val="top"/>
+          </w:tcPr>
+          <w:p>
+            <w:pPr>
+              <w:spacing w:after="0" w:before="0"/>
+            </w:pPr>
+            <w:r>
+              <w:rPr>
+                <w:sz w:val="19"/>
+                <w:szCs w:val="19"/>
+              </w:rPr>
+              <w:t xml:space="preserve">Naming and folder settings, new mail files per server and folder, folder fill after the batch</w:t>
+            </w:r>
+          </w:p>
+        </w:tc>
+      </w:tr>
+      <w:tr>
+        <w:trPr>
+          <w:cantSplit/>
+        </w:trPr>
+        <w:tc>
+          <w:tcPr>
+            <w:tcW w:type="dxa" w:w="3089"/>
+            <w:tcBorders>
+              <w:top w:val="single" w:color="DCE6F0" w:sz="4"/>
+              <w:left w:val="single" w:color="DCE6F0" w:sz="4"/>
+              <w:bottom w:val="single" w:color="DCE6F0" w:sz="4"/>
+              <w:right w:val="single" w:color="DCE6F0" w:sz="4"/>
+            </w:tcBorders>
+            <w:shd w:fill="FFFFFF" w:color="auto" w:val="clear"/>
+            <w:tcMar>
+              <w:top w:type="dxa" w:w="60"/>
+              <w:left w:type="dxa" w:w="100"/>
+              <w:bottom w:type="dxa" w:w="60"/>
+              <w:right w:type="dxa" w:w="100"/>
+            </w:tcMar>
+            <w:vAlign w:val="top"/>
+          </w:tcPr>
+          <w:p>
+            <w:pPr>
+              <w:spacing w:after="0" w:before="0"/>
+            </w:pPr>
+            <w:r>
+              <w:rPr>
+                <w:sz w:val="19"/>
+                <w:szCs w:val="19"/>
+              </w:rPr>
+              <w:t xml:space="preserve">Build audit CSV / debug log</w:t>
+            </w:r>
+          </w:p>
+        </w:tc>
+        <w:tc>
+          <w:tcPr>
+            <w:tcW w:type="dxa" w:w="6549"/>
+            <w:tcBorders>
+              <w:top w:val="single" w:color="DCE6F0" w:sz="4"/>
+              <w:left w:val="single" w:color="DCE6F0" w:sz="4"/>
+              <w:bottom w:val="single" w:color="DCE6F0" w:sz="4"/>
+              <w:right w:val="single" w:color="DCE6F0" w:sz="4"/>
+            </w:tcBorders>
+            <w:shd w:fill="FFFFFF" w:color="auto" w:val="clear"/>
+            <w:tcMar>
+              <w:top w:type="dxa" w:w="60"/>
+              <w:left w:type="dxa" w:w="100"/>
+              <w:bottom w:type="dxa" w:w="60"/>
+              <w:right w:type="dxa" w:w="100"/>
+            </w:tcMar>
+            <w:vAlign w:val="top"/>
+          </w:tcPr>
+          <w:p>
+            <w:pPr>
+              <w:spacing w:after="0" w:before="0"/>
+            </w:pPr>
+            <w:r>
+              <w:rPr>
+                <w:sz w:val="19"/>
+                <w:szCs w:val="19"/>
+              </w:rPr>
+              <w:t xml:space="preserve">One row per user (MailFile, MailFileNote), plus a server scan line (number of mail databases found)</w:t>
+            </w:r>
+          </w:p>
+        </w:tc>
+      </w:tr>
+      <w:tr>
+        <w:trPr>
+          <w:cantSplit/>
+        </w:trPr>
+        <w:tc>
+          <w:tcPr>
+            <w:tcW w:type="dxa" w:w="3089"/>
+            <w:tcBorders>
+              <w:top w:val="single" w:color="DCE6F0" w:sz="4"/>
+              <w:left w:val="single" w:color="DCE6F0" w:sz="4"/>
+              <w:bottom w:val="single" w:color="DCE6F0" w:sz="4"/>
+              <w:right w:val="single" w:color="DCE6F0" w:sz="4"/>
+            </w:tcBorders>
+            <w:shd w:fill="F7F7FC" w:color="auto" w:val="clear"/>
+            <w:tcMar>
+              <w:top w:type="dxa" w:w="60"/>
+              <w:left w:type="dxa" w:w="100"/>
+              <w:bottom w:type="dxa" w:w="60"/>
+              <w:right w:type="dxa" w:w="100"/>
+            </w:tcMar>
+            <w:vAlign w:val="top"/>
+          </w:tcPr>
+          <w:p>
+            <w:pPr>
+              <w:spacing w:after="0" w:before="0"/>
+            </w:pPr>
+            <w:r>
+              <w:rPr>
+                <w:sz w:val="19"/>
+                <w:szCs w:val="19"/>
+              </w:rPr>
+              <w:t xml:space="preserve">Results and audit CSV of Register Batch</w:t>
+            </w:r>
+          </w:p>
+        </w:tc>
+        <w:tc>
+          <w:tcPr>
+            <w:tcW w:type="dxa" w:w="6549"/>
+            <w:tcBorders>
+              <w:top w:val="single" w:color="DCE6F0" w:sz="4"/>
+              <w:left w:val="single" w:color="DCE6F0" w:sz="4"/>
+              <w:bottom w:val="single" w:color="DCE6F0" w:sz="4"/>
+              <w:right w:val="single" w:color="DCE6F0" w:sz="4"/>
+            </w:tcBorders>
+            <w:shd w:fill="F7F7FC" w:color="auto" w:val="clear"/>
+            <w:tcMar>
+              <w:top w:type="dxa" w:w="60"/>
+              <w:left w:type="dxa" w:w="100"/>
+              <w:bottom w:type="dxa" w:w="60"/>
+              <w:right w:type="dxa" w:w="100"/>
+            </w:tcMar>
+            <w:vAlign w:val="top"/>
+          </w:tcPr>
+          <w:p>
+            <w:pPr>
+              <w:spacing w:after="0" w:before="0"/>
+            </w:pPr>
+            <w:r>
+              <w:rPr>
+                <w:sz w:val="19"/>
+                <w:szCs w:val="19"/>
+              </w:rPr>
+              <w:t xml:space="preserve">MailFile, MailFileStatus (MAILFILE_OK / MAILFILE_PENDING), MailFileNote</w:t>
+            </w:r>
+          </w:p>
+        </w:tc>
+      </w:tr>
+      <w:tr>
+        <w:trPr>
+          <w:cantSplit/>
+        </w:trPr>
+        <w:tc>
+          <w:tcPr>
+            <w:tcW w:type="dxa" w:w="3089"/>
+            <w:tcBorders>
+              <w:top w:val="single" w:color="DCE6F0" w:sz="4"/>
+              <w:left w:val="single" w:color="DCE6F0" w:sz="4"/>
+              <w:bottom w:val="single" w:color="DCE6F0" w:sz="4"/>
+              <w:right w:val="single" w:color="DCE6F0" w:sz="4"/>
+            </w:tcBorders>
+            <w:shd w:fill="FFFFFF" w:color="auto" w:val="clear"/>
+            <w:tcMar>
+              <w:top w:type="dxa" w:w="60"/>
+              <w:left w:type="dxa" w:w="100"/>
+              <w:bottom w:type="dxa" w:w="60"/>
+              <w:right w:type="dxa" w:w="100"/>
+            </w:tcMar>
+            <w:vAlign w:val="top"/>
+          </w:tcPr>
+          <w:p>
+            <w:pPr>
+              <w:spacing w:after="0" w:before="0"/>
+            </w:pPr>
+            <w:r>
+              <w:rPr>
+                <w:sz w:val="19"/>
+                <w:szCs w:val="19"/>
+              </w:rPr>
+              <w:t xml:space="preserve">Verify report</w:t>
+            </w:r>
+          </w:p>
+        </w:tc>
+        <w:tc>
+          <w:tcPr>
+            <w:tcW w:type="dxa" w:w="6549"/>
+            <w:tcBorders>
+              <w:top w:val="single" w:color="DCE6F0" w:sz="4"/>
+              <w:left w:val="single" w:color="DCE6F0" w:sz="4"/>
+              <w:bottom w:val="single" w:color="DCE6F0" w:sz="4"/>
+              <w:right w:val="single" w:color="DCE6F0" w:sz="4"/>
+            </w:tcBorders>
+            <w:shd w:fill="FFFFFF" w:color="auto" w:val="clear"/>
+            <w:tcMar>
+              <w:top w:type="dxa" w:w="60"/>
+              <w:left w:type="dxa" w:w="100"/>
+              <w:bottom w:type="dxa" w:w="60"/>
+              <w:right w:type="dxa" w:w="100"/>
+            </w:tcMar>
+            <w:vAlign w:val="top"/>
+          </w:tcPr>
+          <w:p>
+            <w:pPr>
+              <w:spacing w:after="0" w:before="0"/>
+            </w:pPr>
+            <w:r>
+              <w:rPr>
+                <w:sz w:val="19"/>
+                <w:szCs w:val="19"/>
+              </w:rPr>
+              <w:t xml:space="preserve">MailFileStatus from the Person document and the server (MAILFILE_OK / MAILFILE_MISSING)</w:t>
+            </w:r>
+          </w:p>
+        </w:tc>
+      </w:tr>
+    </w:tbl>
+    <w:p>
+      <w:pPr>
+        <w:spacing w:after="80" w:before="0"/>
+      </w:pPr>
+    </w:p>
+    <w:p>
+      <w:pPr>
+        <w:pStyle w:val="Heading3"/>
+      </w:pPr>
+      <w:r>
+        <w:t xml:space="preserve">5. Other mail file settings</w:t>
+      </w:r>
+    </w:p>
+    <w:tbl>
+      <w:tblPr>
+        <w:tblW w:type="dxa" w:w="9638"/>
+        <w:tblBorders>
+          <w:top w:val="single" w:color="auto" w:sz="4"/>
+          <w:left w:val="single" w:color="auto" w:sz="4"/>
+          <w:bottom w:val="single" w:color="auto" w:sz="4"/>
+          <w:right w:val="single" w:color="auto" w:sz="4"/>
+          <w:insideH w:val="single" w:color="auto" w:sz="4"/>
+          <w:insideV w:val="single" w:color="auto" w:sz="4"/>
+        </w:tblBorders>
+      </w:tblPr>
+      <w:tblGrid>
+        <w:gridCol w:w="3603"/>
+        <w:gridCol w:w="6035"/>
+      </w:tblGrid>
+      <w:tr>
+        <w:trPr>
+          <w:tblHeader/>
+        </w:trPr>
+        <w:tc>
+          <w:tcPr>
+            <w:tcW w:type="dxa" w:w="3603"/>
+            <w:tcBorders>
+              <w:top w:val="single" w:color="DCE6F0" w:sz="4"/>
+              <w:left w:val="single" w:color="DCE6F0" w:sz="4"/>
+              <w:bottom w:val="single" w:color="DCE6F0" w:sz="4"/>
+              <w:right w:val="single" w:color="DCE6F0" w:sz="4"/>
+            </w:tcBorders>
+            <w:shd w:fill="17707F" w:color="auto" w:val="clear"/>
+            <w:tcMar>
+              <w:top w:type="dxa" w:w="60"/>
+              <w:left w:type="dxa" w:w="100"/>
+              <w:bottom w:type="dxa" w:w="60"/>
+              <w:right w:type="dxa" w:w="100"/>
+            </w:tcMar>
+            <w:vAlign w:val="top"/>
+          </w:tcPr>
+          <w:p>
+            <w:pPr>
+              <w:spacing w:after="0" w:before="0"/>
+            </w:pPr>
+            <w:r>
+              <w:rPr>
+                <w:b/>
+                <w:bCs/>
+                <w:color w:val="FFFFFF"/>
+                <w:sz w:val="19"/>
+                <w:szCs w:val="19"/>
+              </w:rPr>
+              <w:t xml:space="preserve">Setting</w:t>
+            </w:r>
+          </w:p>
+        </w:tc>
+        <w:tc>
+          <w:tcPr>
+            <w:tcW w:type="dxa" w:w="6035"/>
+            <w:tcBorders>
+              <w:top w:val="single" w:color="DCE6F0" w:sz="4"/>
+              <w:left w:val="single" w:color="DCE6F0" w:sz="4"/>
+              <w:bottom w:val="single" w:color="DCE6F0" w:sz="4"/>
+              <w:right w:val="single" w:color="DCE6F0" w:sz="4"/>
+            </w:tcBorders>
+            <w:shd w:fill="17707F" w:color="auto" w:val="clear"/>
+            <w:tcMar>
+              <w:top w:type="dxa" w:w="60"/>
+              <w:left w:type="dxa" w:w="100"/>
+              <w:bottom w:type="dxa" w:w="60"/>
+              <w:right w:type="dxa" w:w="100"/>
+            </w:tcMar>
+            <w:vAlign w:val="top"/>
+          </w:tcPr>
+          <w:p>
+            <w:pPr>
+              <w:spacing w:after="0" w:before="0"/>
+            </w:pPr>
+            <w:r>
+              <w:rPr>
+                <w:b/>
+                <w:bCs/>
+                <w:color w:val="FFFFFF"/>
+                <w:sz w:val="19"/>
+                <w:szCs w:val="19"/>
+              </w:rPr>
+              <w:t xml:space="preserve">Effect</w:t>
+            </w:r>
+          </w:p>
+        </w:tc>
+      </w:tr>
+      <w:tr>
+        <w:trPr>
+          <w:cantSplit/>
+        </w:trPr>
+        <w:tc>
+          <w:tcPr>
+            <w:tcW w:type="dxa" w:w="3603"/>
+            <w:tcBorders>
+              <w:top w:val="single" w:color="DCE6F0" w:sz="4"/>
+              <w:left w:val="single" w:color="DCE6F0" w:sz="4"/>
+              <w:bottom w:val="single" w:color="DCE6F0" w:sz="4"/>
+              <w:right w:val="single" w:color="DCE6F0" w:sz="4"/>
+            </w:tcBorders>
+            <w:shd w:fill="FFFFFF" w:color="auto" w:val="clear"/>
+            <w:tcMar>
+              <w:top w:type="dxa" w:w="60"/>
+              <w:left w:type="dxa" w:w="100"/>
+              <w:bottom w:type="dxa" w:w="60"/>
+              <w:right w:type="dxa" w:w="100"/>
+            </w:tcMar>
+            <w:vAlign w:val="top"/>
+          </w:tcPr>
+          <w:p>
+            <w:pPr>
+              <w:spacing w:after="0" w:before="0"/>
+            </w:pPr>
+            <w:r>
+              <w:rPr>
+                <w:sz w:val="19"/>
+                <w:szCs w:val="19"/>
+              </w:rPr>
+              <w:t xml:space="preserve">MailTemplate</w:t>
+            </w:r>
+          </w:p>
+        </w:tc>
+        <w:tc>
+          <w:tcPr>
+            <w:tcW w:type="dxa" w:w="6035"/>
+            <w:tcBorders>
+              <w:top w:val="single" w:color="DCE6F0" w:sz="4"/>
+              <w:left w:val="single" w:color="DCE6F0" w:sz="4"/>
+              <w:bottom w:val="single" w:color="DCE6F0" w:sz="4"/>
+              <w:right w:val="single" w:color="DCE6F0" w:sz="4"/>
+            </w:tcBorders>
+            <w:shd w:fill="FFFFFF" w:color="auto" w:val="clear"/>
+            <w:tcMar>
+              <w:top w:type="dxa" w:w="60"/>
+              <w:left w:type="dxa" w:w="100"/>
+              <w:bottom w:type="dxa" w:w="60"/>
+              <w:right w:type="dxa" w:w="100"/>
+            </w:tcMar>
+            <w:vAlign w:val="top"/>
+          </w:tcPr>
+          <w:p>
+            <w:pPr>
+              <w:spacing w:after="0" w:before="0"/>
+            </w:pPr>
+            <w:r>
+              <w:rPr>
+                <w:sz w:val="19"/>
+                <w:szCs w:val="19"/>
+              </w:rPr>
+              <w:t xml:space="preserve">Template for new mail files (empty = registration default). Must exist on every home server (B4).</w:t>
+            </w:r>
+          </w:p>
+        </w:tc>
+      </w:tr>
+      <w:tr>
+        <w:trPr>
+          <w:cantSplit/>
+        </w:trPr>
+        <w:tc>
+          <w:tcPr>
+            <w:tcW w:type="dxa" w:w="3603"/>
+            <w:tcBorders>
+              <w:top w:val="single" w:color="DCE6F0" w:sz="4"/>
+              <w:left w:val="single" w:color="DCE6F0" w:sz="4"/>
+              <w:bottom w:val="single" w:color="DCE6F0" w:sz="4"/>
+              <w:right w:val="single" w:color="DCE6F0" w:sz="4"/>
+            </w:tcBorders>
+            <w:shd w:fill="F7F7FC" w:color="auto" w:val="clear"/>
+            <w:tcMar>
+              <w:top w:type="dxa" w:w="60"/>
+              <w:left w:type="dxa" w:w="100"/>
+              <w:bottom w:type="dxa" w:w="60"/>
+              <w:right w:type="dxa" w:w="100"/>
+            </w:tcMar>
+            <w:vAlign w:val="top"/>
+          </w:tcPr>
+          <w:p>
+            <w:pPr>
+              <w:spacing w:after="0" w:before="0"/>
+            </w:pPr>
+            <w:r>
+              <w:rPr>
+                <w:sz w:val="19"/>
+                <w:szCs w:val="19"/>
+              </w:rPr>
+              <w:t xml:space="preserve">MailACLManager</w:t>
+            </w:r>
+          </w:p>
+        </w:tc>
+        <w:tc>
+          <w:tcPr>
+            <w:tcW w:type="dxa" w:w="6035"/>
+            <w:tcBorders>
+              <w:top w:val="single" w:color="DCE6F0" w:sz="4"/>
+              <w:left w:val="single" w:color="DCE6F0" w:sz="4"/>
+              <w:bottom w:val="single" w:color="DCE6F0" w:sz="4"/>
+              <w:right w:val="single" w:color="DCE6F0" w:sz="4"/>
+            </w:tcBorders>
+            <w:shd w:fill="F7F7FC" w:color="auto" w:val="clear"/>
+            <w:tcMar>
+              <w:top w:type="dxa" w:w="60"/>
+              <w:left w:type="dxa" w:w="100"/>
+              <w:bottom w:type="dxa" w:w="60"/>
+              <w:right w:type="dxa" w:w="100"/>
+            </w:tcMar>
+            <w:vAlign w:val="top"/>
+          </w:tcPr>
+          <w:p>
+            <w:pPr>
+              <w:spacing w:after="0" w:before="0"/>
+            </w:pPr>
+            <w:r>
+              <w:rPr>
+                <w:sz w:val="19"/>
+                <w:szCs w:val="19"/>
+              </w:rPr>
+              <w:t xml:space="preserve">Extra person or group with Manager access to every new mail file</w:t>
+            </w:r>
+          </w:p>
+        </w:tc>
+      </w:tr>
+      <w:tr>
+        <w:trPr>
+          <w:cantSplit/>
+        </w:trPr>
+        <w:tc>
+          <w:tcPr>
+            <w:tcW w:type="dxa" w:w="3603"/>
+            <w:tcBorders>
+              <w:top w:val="single" w:color="DCE6F0" w:sz="4"/>
+              <w:left w:val="single" w:color="DCE6F0" w:sz="4"/>
+              <w:bottom w:val="single" w:color="DCE6F0" w:sz="4"/>
+              <w:right w:val="single" w:color="DCE6F0" w:sz="4"/>
+            </w:tcBorders>
+            <w:shd w:fill="FFFFFF" w:color="auto" w:val="clear"/>
+            <w:tcMar>
+              <w:top w:type="dxa" w:w="60"/>
+              <w:left w:type="dxa" w:w="100"/>
+              <w:bottom w:type="dxa" w:w="60"/>
+              <w:right w:type="dxa" w:w="100"/>
+            </w:tcMar>
+            <w:vAlign w:val="top"/>
+          </w:tcPr>
+          <w:p>
+            <w:pPr>
+              <w:spacing w:after="0" w:before="0"/>
+            </w:pPr>
+            <w:r>
+              <w:rPr>
+                <w:sz w:val="19"/>
+                <w:szCs w:val="19"/>
+              </w:rPr>
+              <w:t xml:space="preserve">MailQuotaSizeLimit / MailQuotaWarningThreshold</w:t>
+            </w:r>
+          </w:p>
+        </w:tc>
+        <w:tc>
+          <w:tcPr>
+            <w:tcW w:type="dxa" w:w="6035"/>
+            <w:tcBorders>
+              <w:top w:val="single" w:color="DCE6F0" w:sz="4"/>
+              <w:left w:val="single" w:color="DCE6F0" w:sz="4"/>
+              <w:bottom w:val="single" w:color="DCE6F0" w:sz="4"/>
+              <w:right w:val="single" w:color="DCE6F0" w:sz="4"/>
+            </w:tcBorders>
+            <w:shd w:fill="FFFFFF" w:color="auto" w:val="clear"/>
+            <w:tcMar>
+              <w:top w:type="dxa" w:w="60"/>
+              <w:left w:type="dxa" w:w="100"/>
+              <w:bottom w:type="dxa" w:w="60"/>
+              <w:right w:type="dxa" w:w="100"/>
+            </w:tcMar>
+            <w:vAlign w:val="top"/>
+          </w:tcPr>
+          <w:p>
+            <w:pPr>
+              <w:spacing w:after="0" w:before="0"/>
+            </w:pPr>
+            <w:r>
+              <w:rPr>
+                <w:sz w:val="19"/>
+                <w:szCs w:val="19"/>
+              </w:rPr>
+              <w:t xml:space="preserve">Quota and warning threshold in MB (0 = none)</w:t>
+            </w:r>
+          </w:p>
+        </w:tc>
+      </w:tr>
+      <w:tr>
+        <w:trPr>
+          <w:cantSplit/>
+        </w:trPr>
+        <w:tc>
+          <w:tcPr>
+            <w:tcW w:type="dxa" w:w="3603"/>
+            <w:tcBorders>
+              <w:top w:val="single" w:color="DCE6F0" w:sz="4"/>
+              <w:left w:val="single" w:color="DCE6F0" w:sz="4"/>
+              <w:bottom w:val="single" w:color="DCE6F0" w:sz="4"/>
+              <w:right w:val="single" w:color="DCE6F0" w:sz="4"/>
+            </w:tcBorders>
+            <w:shd w:fill="F7F7FC" w:color="auto" w:val="clear"/>
+            <w:tcMar>
+              <w:top w:type="dxa" w:w="60"/>
+              <w:left w:type="dxa" w:w="100"/>
+              <w:bottom w:type="dxa" w:w="60"/>
+              <w:right w:type="dxa" w:w="100"/>
+            </w:tcMar>
+            <w:vAlign w:val="top"/>
+          </w:tcPr>
+          <w:p>
+            <w:pPr>
+              <w:spacing w:after="0" w:before="0"/>
+            </w:pPr>
+            <w:r>
+              <w:rPr>
+                <w:sz w:val="19"/>
+                <w:szCs w:val="19"/>
+              </w:rPr>
+              <w:t xml:space="preserve">MailCreateFTIndex</w:t>
+            </w:r>
+          </w:p>
+        </w:tc>
+        <w:tc>
+          <w:tcPr>
+            <w:tcW w:type="dxa" w:w="6035"/>
+            <w:tcBorders>
+              <w:top w:val="single" w:color="DCE6F0" w:sz="4"/>
+              <w:left w:val="single" w:color="DCE6F0" w:sz="4"/>
+              <w:bottom w:val="single" w:color="DCE6F0" w:sz="4"/>
+              <w:right w:val="single" w:color="DCE6F0" w:sz="4"/>
+            </w:tcBorders>
+            <w:shd w:fill="F7F7FC" w:color="auto" w:val="clear"/>
+            <w:tcMar>
+              <w:top w:type="dxa" w:w="60"/>
+              <w:left w:type="dxa" w:w="100"/>
+              <w:bottom w:type="dxa" w:w="60"/>
+              <w:right w:type="dxa" w:w="100"/>
+            </w:tcMar>
+            <w:vAlign w:val="top"/>
+          </w:tcPr>
+          <w:p>
+            <w:pPr>
+              <w:spacing w:after="0" w:before="0"/>
+            </w:pPr>
+            <w:r>
+              <w:rPr>
+                <w:sz w:val="19"/>
+                <w:szCs w:val="19"/>
+              </w:rPr>
+              <w:t xml:space="preserve">Create a full-text index for new mail files</w:t>
+            </w:r>
+          </w:p>
+        </w:tc>
+      </w:tr>
+      <w:tr>
+        <w:trPr>
+          <w:cantSplit/>
+        </w:trPr>
+        <w:tc>
+          <w:tcPr>
+            <w:tcW w:type="dxa" w:w="3603"/>
+            <w:tcBorders>
+              <w:top w:val="single" w:color="DCE6F0" w:sz="4"/>
+              <w:left w:val="single" w:color="DCE6F0" w:sz="4"/>
+              <w:bottom w:val="single" w:color="DCE6F0" w:sz="4"/>
+              <w:right w:val="single" w:color="DCE6F0" w:sz="4"/>
+            </w:tcBorders>
+            <w:shd w:fill="FFFFFF" w:color="auto" w:val="clear"/>
+            <w:tcMar>
+              <w:top w:type="dxa" w:w="60"/>
+              <w:left w:type="dxa" w:w="100"/>
+              <w:bottom w:type="dxa" w:w="60"/>
+              <w:right w:type="dxa" w:w="100"/>
+            </w:tcMar>
+            <w:vAlign w:val="top"/>
+          </w:tcPr>
+          <w:p>
+            <w:pPr>
+              <w:spacing w:after="0" w:before="0"/>
+            </w:pPr>
+            <w:r>
+              <w:rPr>
+                <w:sz w:val="19"/>
+                <w:szCs w:val="19"/>
+              </w:rPr>
+              <w:t xml:space="preserve">CheckMailFileExists</w:t>
+            </w:r>
+          </w:p>
+        </w:tc>
+        <w:tc>
+          <w:tcPr>
+            <w:tcW w:type="dxa" w:w="6035"/>
+            <w:tcBorders>
+              <w:top w:val="single" w:color="DCE6F0" w:sz="4"/>
+              <w:left w:val="single" w:color="DCE6F0" w:sz="4"/>
+              <w:bottom w:val="single" w:color="DCE6F0" w:sz="4"/>
+              <w:right w:val="single" w:color="DCE6F0" w:sz="4"/>
+            </w:tcBorders>
+            <w:shd w:fill="FFFFFF" w:color="auto" w:val="clear"/>
+            <w:tcMar>
+              <w:top w:type="dxa" w:w="60"/>
+              <w:left w:type="dxa" w:w="100"/>
+              <w:bottom w:type="dxa" w:w="60"/>
+              <w:right w:type="dxa" w:w="100"/>
+            </w:tcMar>
+            <w:vAlign w:val="top"/>
+          </w:tcPr>
+          <w:p>
+            <w:pPr>
+              <w:spacing w:after="0" w:before="0"/>
+            </w:pPr>
+            <w:r>
+              <w:rPr>
+                <w:sz w:val="19"/>
+                <w:szCs w:val="19"/>
+              </w:rPr>
+              <w:t xml:space="preserve">Direct check of the exact path (Build and Register Batch)</w:t>
             </w:r>
           </w:p>
         </w:tc>
@@ -32031,7 +34509,7 @@
                 <w:sz w:val="19"/>
                 <w:szCs w:val="19"/>
               </w:rPr>
-              <w:t xml:space="preserve">mail\jsmith.nsf</w:t>
+              <w:t xml:space="preserve">mail2\smith.nsf</w:t>
             </w:r>
           </w:p>
         </w:tc>
@@ -32530,7 +35008,7 @@
                 <w:sz w:val="19"/>
                 <w:szCs w:val="19"/>
               </w:rPr>
-              <w:t xml:space="preserve">One row per user per action, including BatchID. </w:t>
+              <w:t xml:space="preserve">One row per user per action, including BatchID, MailFile, MailFileStatus and MailFileNote. </w:t>
             </w:r>
             <w:r>
               <w:rPr>
@@ -36384,6 +38862,202 @@
                 <w:sz w:val="19"/>
                 <w:szCs w:val="19"/>
               </w:rPr>
+              <w:t xml:space="preserve">WARN: mail file renamed</w:t>
+            </w:r>
+          </w:p>
+        </w:tc>
+        <w:tc>
+          <w:tcPr>
+            <w:tcW w:type="dxa" w:w="3398"/>
+            <w:tcBorders>
+              <w:top w:val="single" w:color="DCE6F0" w:sz="4"/>
+              <w:left w:val="single" w:color="DCE6F0" w:sz="4"/>
+              <w:bottom w:val="single" w:color="DCE6F0" w:sz="4"/>
+              <w:right w:val="single" w:color="DCE6F0" w:sz="4"/>
+            </w:tcBorders>
+            <w:shd w:fill="FFFFFF" w:color="auto" w:val="clear"/>
+            <w:tcMar>
+              <w:top w:type="dxa" w:w="60"/>
+              <w:left w:type="dxa" w:w="100"/>
+              <w:bottom w:type="dxa" w:w="60"/>
+              <w:right w:type="dxa" w:w="100"/>
+            </w:tcMar>
+            <w:vAlign w:val="top"/>
+          </w:tcPr>
+          <w:p>
+            <w:pPr>
+              <w:spacing w:after="0" w:before="0"/>
+            </w:pPr>
+            <w:r>
+              <w:rPr>
+                <w:sz w:val="19"/>
+                <w:szCs w:val="19"/>
+              </w:rPr>
+              <w:t xml:space="preserve">The last-name file already exists on that server, in the directory or in an open batch</w:t>
+            </w:r>
+          </w:p>
+        </w:tc>
+        <w:tc>
+          <w:tcPr>
+            <w:tcW w:type="dxa" w:w="3254"/>
+            <w:tcBorders>
+              <w:top w:val="single" w:color="DCE6F0" w:sz="4"/>
+              <w:left w:val="single" w:color="DCE6F0" w:sz="4"/>
+              <w:bottom w:val="single" w:color="DCE6F0" w:sz="4"/>
+              <w:right w:val="single" w:color="DCE6F0" w:sz="4"/>
+            </w:tcBorders>
+            <w:shd w:fill="FFFFFF" w:color="auto" w:val="clear"/>
+            <w:tcMar>
+              <w:top w:type="dxa" w:w="60"/>
+              <w:left w:type="dxa" w:w="100"/>
+              <w:bottom w:type="dxa" w:w="60"/>
+              <w:right w:type="dxa" w:w="100"/>
+            </w:tcMar>
+            <w:vAlign w:val="top"/>
+          </w:tcPr>
+          <w:p>
+            <w:pPr>
+              <w:spacing w:after="0" w:before="0"/>
+            </w:pPr>
+            <w:r>
+              <w:rPr>
+                <w:sz w:val="19"/>
+                <w:szCs w:val="19"/>
+              </w:rPr>
+              <w:t xml:space="preserve">Normal with SUFFIX. Review the new name, or edit MailFile</w:t>
+            </w:r>
+          </w:p>
+        </w:tc>
+      </w:tr>
+      <w:tr>
+        <w:trPr>
+          <w:cantSplit/>
+        </w:trPr>
+        <w:tc>
+          <w:tcPr>
+            <w:tcW w:type="dxa" w:w="2986"/>
+            <w:tcBorders>
+              <w:top w:val="single" w:color="DCE6F0" w:sz="4"/>
+              <w:left w:val="single" w:color="DCE6F0" w:sz="4"/>
+              <w:bottom w:val="single" w:color="DCE6F0" w:sz="4"/>
+              <w:right w:val="single" w:color="DCE6F0" w:sz="4"/>
+            </w:tcBorders>
+            <w:shd w:fill="F7F7FC" w:color="auto" w:val="clear"/>
+            <w:tcMar>
+              <w:top w:type="dxa" w:w="60"/>
+              <w:left w:type="dxa" w:w="100"/>
+              <w:bottom w:type="dxa" w:w="60"/>
+              <w:right w:type="dxa" w:w="100"/>
+            </w:tcMar>
+            <w:vAlign w:val="top"/>
+          </w:tcPr>
+          <w:p>
+            <w:pPr>
+              <w:spacing w:after="0" w:before="0"/>
+            </w:pPr>
+            <w:r>
+              <w:rPr>
+                <w:sz w:val="19"/>
+                <w:szCs w:val="19"/>
+              </w:rPr>
+              <w:t xml:space="preserve">"Could not scan &lt;server&gt;" in the debug log</w:t>
+            </w:r>
+          </w:p>
+        </w:tc>
+        <w:tc>
+          <w:tcPr>
+            <w:tcW w:type="dxa" w:w="3398"/>
+            <w:tcBorders>
+              <w:top w:val="single" w:color="DCE6F0" w:sz="4"/>
+              <w:left w:val="single" w:color="DCE6F0" w:sz="4"/>
+              <w:bottom w:val="single" w:color="DCE6F0" w:sz="4"/>
+              <w:right w:val="single" w:color="DCE6F0" w:sz="4"/>
+            </w:tcBorders>
+            <w:shd w:fill="F7F7FC" w:color="auto" w:val="clear"/>
+            <w:tcMar>
+              <w:top w:type="dxa" w:w="60"/>
+              <w:left w:type="dxa" w:w="100"/>
+              <w:bottom w:type="dxa" w:w="60"/>
+              <w:right w:type="dxa" w:w="100"/>
+            </w:tcMar>
+            <w:vAlign w:val="top"/>
+          </w:tcPr>
+          <w:p>
+            <w:pPr>
+              <w:spacing w:after="0" w:before="0"/>
+            </w:pPr>
+            <w:r>
+              <w:rPr>
+                <w:sz w:val="19"/>
+                <w:szCs w:val="19"/>
+              </w:rPr>
+              <w:t xml:space="preserve">No access to the server's database list</w:t>
+            </w:r>
+          </w:p>
+        </w:tc>
+        <w:tc>
+          <w:tcPr>
+            <w:tcW w:type="dxa" w:w="3254"/>
+            <w:tcBorders>
+              <w:top w:val="single" w:color="DCE6F0" w:sz="4"/>
+              <w:left w:val="single" w:color="DCE6F0" w:sz="4"/>
+              <w:bottom w:val="single" w:color="DCE6F0" w:sz="4"/>
+              <w:right w:val="single" w:color="DCE6F0" w:sz="4"/>
+            </w:tcBorders>
+            <w:shd w:fill="F7F7FC" w:color="auto" w:val="clear"/>
+            <w:tcMar>
+              <w:top w:type="dxa" w:w="60"/>
+              <w:left w:type="dxa" w:w="100"/>
+              <w:bottom w:type="dxa" w:w="60"/>
+              <w:right w:type="dxa" w:w="100"/>
+            </w:tcMar>
+            <w:vAlign w:val="top"/>
+          </w:tcPr>
+          <w:p>
+            <w:pPr>
+              <w:spacing w:after="0" w:before="0"/>
+            </w:pPr>
+            <w:r>
+              <w:rPr>
+                <w:sz w:val="19"/>
+                <w:szCs w:val="19"/>
+              </w:rPr>
+              <w:t xml:space="preserve">Uniqueness then uses the directory and the direct file check. Fix access and rebuild for full checking.</w:t>
+            </w:r>
+          </w:p>
+        </w:tc>
+      </w:tr>
+      <w:tr>
+        <w:trPr>
+          <w:cantSplit/>
+        </w:trPr>
+        <w:tc>
+          <w:tcPr>
+            <w:tcW w:type="dxa" w:w="2986"/>
+            <w:tcBorders>
+              <w:top w:val="single" w:color="DCE6F0" w:sz="4"/>
+              <w:left w:val="single" w:color="DCE6F0" w:sz="4"/>
+              <w:bottom w:val="single" w:color="DCE6F0" w:sz="4"/>
+              <w:right w:val="single" w:color="DCE6F0" w:sz="4"/>
+            </w:tcBorders>
+            <w:shd w:fill="FFFFFF" w:color="auto" w:val="clear"/>
+            <w:tcMar>
+              <w:top w:type="dxa" w:w="60"/>
+              <w:left w:type="dxa" w:w="100"/>
+              <w:bottom w:type="dxa" w:w="60"/>
+              <w:right w:type="dxa" w:w="100"/>
+            </w:tcMar>
+            <w:vAlign w:val="top"/>
+          </w:tcPr>
+          <w:p>
+            <w:pPr>
+              <w:spacing w:after="0" w:before="0"/>
+            </w:pPr>
+            <w:r>
+              <w:rPr>
+                <w:sz w:val="19"/>
+                <w:szCs w:val="19"/>
+              </w:rPr>
               <w:t xml:space="preserve">MAILFILE_PENDING / MAILFILE_MISSING</w:t>
             </w:r>
           </w:p>
@@ -38384,7 +41058,7 @@
                 <w:sz w:val="19"/>
                 <w:szCs w:val="19"/>
               </w:rPr>
-              <w:t xml:space="preserve">5</w:t>
+              <w:t xml:space="preserve">5a</w:t>
             </w:r>
           </w:p>
         </w:tc>
@@ -38415,7 +41089,7 @@
                 <w:sz w:val="19"/>
                 <w:szCs w:val="19"/>
               </w:rPr>
-              <w:t xml:space="preserve">Mail file creation through NotesRegistration (immediate or via the Administration Process) and the DirSync mapping of mail fields</w:t>
+              <w:t xml:space="preserve">Domino creating a new subfolder (mail2, mail3 …) when the first mail file is created in it</w:t>
             </w:r>
           </w:p>
         </w:tc>
@@ -38446,7 +41120,7 @@
                 <w:sz w:val="19"/>
                 <w:szCs w:val="19"/>
               </w:rPr>
-              <w:t xml:space="preserve">Mail file present after the pilot and Person document unchanged after the next DirSync</w:t>
+              <w:t xml:space="preserve">Pilot with an empty folder. If not created, create the folders on the home servers first.</w:t>
             </w:r>
           </w:p>
         </w:tc>
@@ -38482,7 +41156,7 @@
                 <w:sz w:val="19"/>
                 <w:szCs w:val="19"/>
               </w:rPr>
-              <w:t xml:space="preserve">6</w:t>
+              <w:t xml:space="preserve">5</w:t>
             </w:r>
           </w:p>
         </w:tc>
@@ -38513,7 +41187,7 @@
                 <w:sz w:val="19"/>
                 <w:szCs w:val="19"/>
               </w:rPr>
-              <w:t xml:space="preserve">The Agent Log template file name differs between releases (alog4.ntf / alog.ntf)</w:t>
+              <w:t xml:space="preserve">Mail file creation through NotesRegistration (immediate or via the Administration Process) and the DirSync mapping of mail fields</w:t>
             </w:r>
           </w:p>
         </w:tc>
@@ -38544,7 +41218,7 @@
                 <w:sz w:val="19"/>
                 <w:szCs w:val="19"/>
               </w:rPr>
-              <w:t xml:space="preserve">B15</w:t>
+              <w:t xml:space="preserve">Mail file present after the pilot and Person document unchanged after the next DirSync</w:t>
             </w:r>
           </w:p>
         </w:tc>
@@ -38580,7 +41254,7 @@
                 <w:sz w:val="19"/>
                 <w:szCs w:val="19"/>
               </w:rPr>
-              <w:t xml:space="preserve">7</w:t>
+              <w:t xml:space="preserve">6</w:t>
             </w:r>
           </w:p>
         </w:tc>
@@ -38611,7 +41285,7 @@
                 <w:sz w:val="19"/>
                 <w:szCs w:val="19"/>
               </w:rPr>
-              <w:t xml:space="preserve">bulkreg.ps1 was reviewed but not executed</w:t>
+              <w:t xml:space="preserve">The Agent Log template file name differs between releases (alog4.ntf / alog.ntf)</w:t>
             </w:r>
           </w:p>
         </w:tc>
@@ -38642,23 +41316,7 @@
                 <w:sz w:val="19"/>
                 <w:szCs w:val="19"/>
               </w:rPr>
-              <w:t xml:space="preserve">Run </w:t>
-            </w:r>
-            <w:r>
-              <w:rPr>
-                <w:rFonts w:ascii="Consolas" w:cs="Consolas" w:eastAsia="Consolas" w:hAnsi="Consolas"/>
-                <w:color w:val="0F5FDC"/>
-                <w:sz w:val="18"/>
-                <w:szCs w:val="18"/>
-              </w:rPr>
-              <w:t xml:space="preserve">bulkreg.cmd Check</w:t>
-            </w:r>
-            <w:r>
-              <w:rPr>
-                <w:sz w:val="19"/>
-                <w:szCs w:val="19"/>
-              </w:rPr>
-              <w:t xml:space="preserve"> once</w:t>
+              <w:t xml:space="preserve">B15</w:t>
             </w:r>
           </w:p>
         </w:tc>
@@ -38694,6 +41352,120 @@
                 <w:sz w:val="19"/>
                 <w:szCs w:val="19"/>
               </w:rPr>
+              <w:t xml:space="preserve">7</w:t>
+            </w:r>
+          </w:p>
+        </w:tc>
+        <w:tc>
+          <w:tcPr>
+            <w:tcW w:type="dxa" w:w="5766"/>
+            <w:tcBorders>
+              <w:top w:val="single" w:color="DCE6F0" w:sz="4"/>
+              <w:left w:val="single" w:color="DCE6F0" w:sz="4"/>
+              <w:bottom w:val="single" w:color="DCE6F0" w:sz="4"/>
+              <w:right w:val="single" w:color="DCE6F0" w:sz="4"/>
+            </w:tcBorders>
+            <w:shd w:fill="F7F7FC" w:color="auto" w:val="clear"/>
+            <w:tcMar>
+              <w:top w:type="dxa" w:w="60"/>
+              <w:left w:type="dxa" w:w="100"/>
+              <w:bottom w:type="dxa" w:w="60"/>
+              <w:right w:type="dxa" w:w="100"/>
+            </w:tcMar>
+            <w:vAlign w:val="top"/>
+          </w:tcPr>
+          <w:p>
+            <w:pPr>
+              <w:spacing w:after="0" w:before="0"/>
+            </w:pPr>
+            <w:r>
+              <w:rPr>
+                <w:sz w:val="19"/>
+                <w:szCs w:val="19"/>
+              </w:rPr>
+              <w:t xml:space="preserve">bulkreg.ps1 was reviewed but not executed</w:t>
+            </w:r>
+          </w:p>
+        </w:tc>
+        <w:tc>
+          <w:tcPr>
+            <w:tcW w:type="dxa" w:w="3358"/>
+            <w:tcBorders>
+              <w:top w:val="single" w:color="DCE6F0" w:sz="4"/>
+              <w:left w:val="single" w:color="DCE6F0" w:sz="4"/>
+              <w:bottom w:val="single" w:color="DCE6F0" w:sz="4"/>
+              <w:right w:val="single" w:color="DCE6F0" w:sz="4"/>
+            </w:tcBorders>
+            <w:shd w:fill="F7F7FC" w:color="auto" w:val="clear"/>
+            <w:tcMar>
+              <w:top w:type="dxa" w:w="60"/>
+              <w:left w:type="dxa" w:w="100"/>
+              <w:bottom w:type="dxa" w:w="60"/>
+              <w:right w:type="dxa" w:w="100"/>
+            </w:tcMar>
+            <w:vAlign w:val="top"/>
+          </w:tcPr>
+          <w:p>
+            <w:pPr>
+              <w:spacing w:after="0" w:before="0"/>
+            </w:pPr>
+            <w:r>
+              <w:rPr>
+                <w:sz w:val="19"/>
+                <w:szCs w:val="19"/>
+              </w:rPr>
+              <w:t xml:space="preserve">Run </w:t>
+            </w:r>
+            <w:r>
+              <w:rPr>
+                <w:rFonts w:ascii="Consolas" w:cs="Consolas" w:eastAsia="Consolas" w:hAnsi="Consolas"/>
+                <w:color w:val="0F5FDC"/>
+                <w:sz w:val="18"/>
+                <w:szCs w:val="18"/>
+              </w:rPr>
+              <w:t xml:space="preserve">bulkreg.cmd Check</w:t>
+            </w:r>
+            <w:r>
+              <w:rPr>
+                <w:sz w:val="19"/>
+                <w:szCs w:val="19"/>
+              </w:rPr>
+              <w:t xml:space="preserve"> once</w:t>
+            </w:r>
+          </w:p>
+        </w:tc>
+      </w:tr>
+      <w:tr>
+        <w:trPr>
+          <w:cantSplit/>
+        </w:trPr>
+        <w:tc>
+          <w:tcPr>
+            <w:tcW w:type="dxa" w:w="514"/>
+            <w:tcBorders>
+              <w:top w:val="single" w:color="DCE6F0" w:sz="4"/>
+              <w:left w:val="single" w:color="DCE6F0" w:sz="4"/>
+              <w:bottom w:val="single" w:color="DCE6F0" w:sz="4"/>
+              <w:right w:val="single" w:color="DCE6F0" w:sz="4"/>
+            </w:tcBorders>
+            <w:shd w:fill="FFFFFF" w:color="auto" w:val="clear"/>
+            <w:tcMar>
+              <w:top w:type="dxa" w:w="60"/>
+              <w:left w:type="dxa" w:w="100"/>
+              <w:bottom w:type="dxa" w:w="60"/>
+              <w:right w:type="dxa" w:w="100"/>
+            </w:tcMar>
+            <w:vAlign w:val="top"/>
+          </w:tcPr>
+          <w:p>
+            <w:pPr>
+              <w:spacing w:after="0" w:before="0"/>
+            </w:pPr>
+            <w:r>
+              <w:rPr>
+                <w:sz w:val="19"/>
+                <w:szCs w:val="19"/>
+              </w:rPr>
               <w:t xml:space="preserve">8</w:t>
             </w:r>
           </w:p>
@@ -38707,7 +41479,7 @@
               <w:bottom w:val="single" w:color="DCE6F0" w:sz="4"/>
               <w:right w:val="single" w:color="DCE6F0" w:sz="4"/>
             </w:tcBorders>
-            <w:shd w:fill="F7F7FC" w:color="auto" w:val="clear"/>
+            <w:shd w:fill="FFFFFF" w:color="auto" w:val="clear"/>
             <w:tcMar>
               <w:top w:type="dxa" w:w="60"/>
               <w:left w:type="dxa" w:w="100"/>
@@ -38738,7 +41510,7 @@
               <w:bottom w:val="single" w:color="DCE6F0" w:sz="4"/>
               <w:right w:val="single" w:color="DCE6F0" w:sz="4"/>
             </w:tcBorders>
-            <w:shd w:fill="F7F7FC" w:color="auto" w:val="clear"/>
+            <w:shd w:fill="FFFFFF" w:color="auto" w:val="clear"/>
             <w:tcMar>
               <w:top w:type="dxa" w:w="60"/>
               <w:left w:type="dxa" w:w="100"/>
@@ -40801,7 +43573,7 @@
       <w:r>
         <w:t xml:space="preserve">Registering Active Directory users (Directory Sync) – </w:t>
       </w:r>
-      <w:hyperlink w:history="1" r:id="rIdvoxin05brek4metz16a7o">
+      <w:hyperlink w:history="1" r:id="rId-0v5joa1jor0wtr1selfl">
         <w:r>
           <w:rPr>
             <w:rStyle w:val="Hyperlink"/>
@@ -40823,7 +43595,7 @@
       <w:r>
         <w:t xml:space="preserve">ContactNoteID property – </w:t>
       </w:r>
-      <w:hyperlink w:history="1" r:id="rIdso8ctgz58nzxwgqfsyd48">
+      <w:hyperlink w:history="1" r:id="rIddera7m8fujmogm2wyswjx">
         <w:r>
           <w:rPr>
             <w:rStyle w:val="Hyperlink"/>
@@ -40845,7 +43617,7 @@
       <w:r>
         <w:t xml:space="preserve">RegisterNewUser method – </w:t>
       </w:r>
-      <w:hyperlink w:history="1" r:id="rIdmgrlrbjgn_9mfreurbtqq">
+      <w:hyperlink w:history="1" r:id="rIdydjdztg6jwz8lqn4lr6lb">
         <w:r>
           <w:rPr>
             <w:rStyle w:val="Hyperlink"/>
@@ -40867,7 +43639,7 @@
       <w:r>
         <w:t xml:space="preserve">Creating an ID vault – </w:t>
       </w:r>
-      <w:hyperlink w:history="1" r:id="rIdfy-bnubxtcv0e1s8s6qce">
+      <w:hyperlink w:history="1" r:id="rId77qhey3jcfl2ajlvi985m">
         <w:r>
           <w:rPr>
             <w:rStyle w:val="Hyperlink"/>
@@ -40889,7 +43661,7 @@
       <w:r>
         <w:t xml:space="preserve">Assigning users to a vault (Security Settings, ID Vault tab) – </w:t>
       </w:r>
-      <w:hyperlink w:history="1" r:id="rIdomqmvvadpjgptdgyq8-tf">
+      <w:hyperlink w:history="1" r:id="rIdoccpo_vj_dp1xr2xmnr1m">
         <w:r>
           <w:rPr>
             <w:rStyle w:val="Hyperlink"/>
@@ -40911,7 +43683,7 @@
       <w:r>
         <w:t xml:space="preserve">Creating a security policy settings document – </w:t>
       </w:r>
-      <w:hyperlink w:history="1" r:id="rIdf1gc76m4u1olwy2hwuost">
+      <w:hyperlink w:history="1" r:id="rIdp6jsnvhbpahn8iq4lc5mp">
         <w:r>
           <w:rPr>
             <w:rStyle w:val="Hyperlink"/>
@@ -40933,7 +43705,7 @@
       <w:r>
         <w:t xml:space="preserve">Creating a policy document (explicit policy names */name) – </w:t>
       </w:r>
-      <w:hyperlink w:history="1" r:id="rIdnmdsj66k602tpcruy8ro1">
+      <w:hyperlink w:history="1" r:id="rIdyfz7vxoypzkyeh58zs2e9">
         <w:r>
           <w:rPr>
             <w:rStyle w:val="Hyperlink"/>
@@ -40955,7 +43727,7 @@
       <w:r>
         <w:t xml:space="preserve">Modifying a server-based CA (adding RAs) – </w:t>
       </w:r>
-      <w:hyperlink w:history="1" r:id="rIdmn2uc-mslvczsq0ljbylr">
+      <w:hyperlink w:history="1" r:id="rId_5zv9sipr7uzl5iqenvut">
         <w:r>
           <w:rPr>
             <w:rStyle w:val="Hyperlink"/>
@@ -40977,7 +43749,7 @@
       <w:r>
         <w:t xml:space="preserve">Administration roles in the Domino Directory ACL – </w:t>
       </w:r>
-      <w:hyperlink w:history="1" r:id="rIdbfdmgtolqahwbmo1phnez">
+      <w:hyperlink w:history="1" r:id="rIdxz2ggn4ofamxeuaoxbta8">
         <w:r>
           <w:rPr>
             <w:rStyle w:val="Hyperlink"/>
@@ -40999,7 +43771,7 @@
       <w:r>
         <w:t xml:space="preserve">Configuring a database ACL (Manage ACL) – </w:t>
       </w:r>
-      <w:hyperlink w:history="1" r:id="rIdsp3wgsh9huqgonwmwkj_q">
+      <w:hyperlink w:history="1" r:id="rIdyqbmlwhmgr3js4oa_dd8f">
         <w:r>
           <w:rPr>
             <w:rStyle w:val="Hyperlink"/>
@@ -41021,7 +43793,7 @@
       <w:r>
         <w:t xml:space="preserve">Creating a database from a template – </w:t>
       </w:r>
-      <w:hyperlink w:history="1" r:id="rIdsjlvqfzb11psl7oil_pte">
+      <w:hyperlink w:history="1" r:id="rId_ceqeuzxstavpjfttyphd">
         <w:r>
           <w:rPr>
             <w:rStyle w:val="Hyperlink"/>
@@ -41043,7 +43815,7 @@
       <w:r>
         <w:t xml:space="preserve">Script libraries (Designer) – </w:t>
       </w:r>
-      <w:hyperlink w:history="1" r:id="rIdyhrk49c-kzqihki2cy44m">
+      <w:hyperlink w:history="1" r:id="rIdeojkfkl1cuoq4aumliwcm">
         <w:r>
           <w:rPr>
             <w:rStyle w:val="Hyperlink"/>
@@ -41065,7 +43837,7 @@
       <w:r>
         <w:t xml:space="preserve">Creating an agent (Designer) – </w:t>
       </w:r>
-      <w:hyperlink w:history="1" r:id="rIdolrcxdi-z1ebszmtunwer">
+      <w:hyperlink w:history="1" r:id="rIdn16glneabhkixozsehesz">
         <w:r>
           <w:rPr>
             <w:rStyle w:val="Hyperlink"/>
@@ -41087,7 +43859,7 @@
       <w:r>
         <w:t xml:space="preserve">Naming agents: aliases '|' and cascading '\' – </w:t>
       </w:r>
-      <w:hyperlink w:history="1" r:id="rIdw8cvqcymtcewhgq5e7u2q">
+      <w:hyperlink w:history="1" r:id="rId2a5b3aoqvm7mrze7v13rl">
         <w:r>
           <w:rPr>
             <w:rStyle w:val="Hyperlink"/>
@@ -41109,7 +43881,7 @@
       <w:r>
         <w:t xml:space="preserve">Signing a database – </w:t>
       </w:r>
-      <w:hyperlink w:history="1" r:id="rIdzk9lcagjczetb_mmcnidu">
+      <w:hyperlink w:history="1" r:id="rIduyuixqz6qjdt-dlxvxu5d">
         <w:r>
           <w:rPr>
             <w:rStyle w:val="Hyperlink"/>
@@ -41131,7 +43903,7 @@
       <w:r>
         <w:t xml:space="preserve">Checking field values (Document Properties) – </w:t>
       </w:r>
-      <w:hyperlink w:history="1" r:id="rIdbldeevkiyuyjkros_weo5">
+      <w:hyperlink w:history="1" r:id="rIdgizijg1-yef6gbbysmg6t">
         <w:r>
           <w:rPr>
             <w:rStyle w:val="Hyperlink"/>
@@ -41153,7 +43925,7 @@
       <w:r>
         <w:t xml:space="preserve">Execution Security Alert (ECL) – </w:t>
       </w:r>
-      <w:hyperlink w:history="1" r:id="rIdlmybobqdp4hnaksr-sjbi">
+      <w:hyperlink w:history="1" r:id="rId3aqpdslkrn3zxbfmj4x2o">
         <w:r>
           <w:rPr>
             <w:rStyle w:val="Hyperlink"/>
@@ -41610,7 +44382,7 @@
         <w:sz w:val="16"/>
         <w:szCs w:val="16"/>
       </w:rPr>
-      <w:t xml:space="preserve">HCL Confidential – Internal Use  |  v2.3</w:t>
+      <w:t xml:space="preserve">HCL Confidential – Internal Use  |  v2.4</w:t>
     </w:r>
     <w:r>
       <w:rPr>

</xml_diff>

<commit_message>
RegistrationLog: use the Certification Log certlog.nsf
- HCL: RegistrationLog non-empty -> CERTLOG.NSF on the registration server, empty = no logging
- bulkreg.ini and Agent 03 default changed from log.nsf to certlog.nsf, with explanation
- Guide v2.6: B4 certlog.nsf prerequisite check, B11/D3/D4 corrected, D6 cross-check
  certlog.nsf (certification) and log.nsf (server events)
</commit_message>
<xml_diff>
--- a/docs/BulkReg_Admin_Guide.docx
+++ b/docs/BulkReg_Admin_Guide.docx
@@ -170,7 +170,7 @@
                 <w:sz w:val="20"/>
                 <w:szCs w:val="20"/>
               </w:rPr>
-              <w:t xml:space="preserve">Version 2.5  |  October 2026  |  Draft for review</w:t>
+              <w:t xml:space="preserve">Version 2.6  |  October 2026  |  Draft for review</w:t>
             </w:r>
           </w:p>
           <w:p>
@@ -482,7 +482,7 @@
                 <w:sz w:val="19"/>
                 <w:szCs w:val="19"/>
               </w:rPr>
-              <w:t xml:space="preserve">2.5 (Draft for review)</w:t>
+              <w:t xml:space="preserve">2.6 (Draft for review)</w:t>
             </w:r>
           </w:p>
         </w:tc>
@@ -972,7 +972,7 @@
                 <w:sz w:val="19"/>
                 <w:szCs w:val="19"/>
               </w:rPr>
-              <w:t xml:space="preserve">2.5</w:t>
+              <w:t xml:space="preserve">2.6</w:t>
             </w:r>
           </w:p>
         </w:tc>
@@ -998,6 +998,13 @@
             <w:pPr>
               <w:spacing w:after="0" w:before="0"/>
             </w:pPr>
+            <w:r>
+              <w:rPr>
+                <w:sz w:val="19"/>
+                <w:szCs w:val="19"/>
+              </w:rPr>
+              <w:t xml:space="preserve">RegistrationLog corrected: registration is logged to the </w:t>
+            </w:r>
             <w:r>
               <w:rPr>
                 <w:b/>
@@ -1005,30 +1012,14 @@
                 <w:sz w:val="19"/>
                 <w:szCs w:val="19"/>
               </w:rPr>
-              <w:t xml:space="preserve">Prerequisite: pre-create the numbered mail folders</w:t>
-            </w:r>
-            <w:r>
-              <w:rPr>
-                <w:sz w:val="19"/>
-                <w:szCs w:val="19"/>
-              </w:rPr>
-              <w:t xml:space="preserve"> (mail1…mailN, one per 1000 users) on every home server (B4). Preflight calculates the folders needed per server and writes the create commands. New </w:t>
-            </w:r>
-            <w:r>
-              <w:rPr>
-                <w:rFonts w:ascii="Consolas" w:cs="Consolas" w:eastAsia="Consolas" w:hAnsi="Consolas"/>
-                <w:color w:val="0F5FDC"/>
-                <w:sz w:val="18"/>
-                <w:szCs w:val="18"/>
-              </w:rPr>
-              <w:t xml:space="preserve">MailFolderMax</w:t>
-            </w:r>
-            <w:r>
-              <w:rPr>
-                <w:sz w:val="19"/>
-                <w:szCs w:val="19"/>
-              </w:rPr>
-              <w:t xml:space="preserve">: Build Batch never assigns a folder above the number you created.</w:t>
+              <w:t xml:space="preserve">Certification Log certlog.nsf</w:t>
+            </w:r>
+            <w:r>
+              <w:rPr>
+                <w:sz w:val="19"/>
+                <w:szCs w:val="19"/>
+              </w:rPr>
+              <w:t xml:space="preserve"> on the registration server (HCL: any non-empty value → CERTLOG.NSF; empty = no logging). log.nsf is the server's general log. Prerequisite check for certlog.nsf added (B4).</w:t>
             </w:r>
           </w:p>
         </w:tc>
@@ -1064,7 +1055,7 @@
                 <w:sz w:val="19"/>
                 <w:szCs w:val="19"/>
               </w:rPr>
-              <w:t xml:space="preserve">2.4</w:t>
+              <w:t xml:space="preserve">2.5</w:t>
             </w:r>
           </w:p>
         </w:tc>
@@ -1090,13 +1081,6 @@
             <w:pPr>
               <w:spacing w:after="0" w:before="0"/>
             </w:pPr>
-            <w:r>
-              <w:rPr>
-                <w:sz w:val="19"/>
-                <w:szCs w:val="19"/>
-              </w:rPr>
-              <w:t xml:space="preserve">Mail file </w:t>
-            </w:r>
             <w:r>
               <w:rPr>
                 <w:b/>
@@ -1104,46 +1088,30 @@
                 <w:sz w:val="19"/>
                 <w:szCs w:val="19"/>
               </w:rPr>
-              <w:t xml:space="preserve">naming = last name</w:t>
-            </w:r>
-            <w:r>
-              <w:rPr>
-                <w:sz w:val="19"/>
-                <w:szCs w:val="19"/>
-              </w:rPr>
-              <w:t xml:space="preserve"> (configurable), </w:t>
-            </w:r>
-            <w:r>
-              <w:rPr>
-                <w:b/>
-                <w:bCs/>
-                <w:sz w:val="19"/>
-                <w:szCs w:val="19"/>
-              </w:rPr>
-              <w:t xml:space="preserve">uniqueness</w:t>
-            </w:r>
-            <w:r>
-              <w:rPr>
-                <w:sz w:val="19"/>
-                <w:szCs w:val="19"/>
-              </w:rPr>
-              <w:t xml:space="preserve"> checked against all mail folders on the home server, Person documents, open batches and the batch itself (clash → smith2.nsf or ERROR), </w:t>
-            </w:r>
-            <w:r>
-              <w:rPr>
-                <w:b/>
-                <w:bCs/>
-                <w:sz w:val="19"/>
-                <w:szCs w:val="19"/>
-              </w:rPr>
-              <w:t xml:space="preserve">numbered folders</w:t>
-            </w:r>
-            <w:r>
-              <w:rPr>
-                <w:sz w:val="19"/>
-                <w:szCs w:val="19"/>
-              </w:rPr>
-              <w:t xml:space="preserve"> mail1, mail2… with max 1000 mail files each. MailFileNote recorded in batch file, summary, results and audit.</w:t>
+              <w:t xml:space="preserve">Prerequisite: pre-create the numbered mail folders</w:t>
+            </w:r>
+            <w:r>
+              <w:rPr>
+                <w:sz w:val="19"/>
+                <w:szCs w:val="19"/>
+              </w:rPr>
+              <w:t xml:space="preserve"> (mail1…mailN, one per 1000 users) on every home server (B4). Preflight calculates the folders needed per server and writes the create commands. New </w:t>
+            </w:r>
+            <w:r>
+              <w:rPr>
+                <w:rFonts w:ascii="Consolas" w:cs="Consolas" w:eastAsia="Consolas" w:hAnsi="Consolas"/>
+                <w:color w:val="0F5FDC"/>
+                <w:sz w:val="18"/>
+                <w:szCs w:val="18"/>
+              </w:rPr>
+              <w:t xml:space="preserve">MailFolderMax</w:t>
+            </w:r>
+            <w:r>
+              <w:rPr>
+                <w:sz w:val="19"/>
+                <w:szCs w:val="19"/>
+              </w:rPr>
+              <w:t xml:space="preserve">: Build Batch never assigns a folder above the number you created.</w:t>
             </w:r>
           </w:p>
         </w:tc>
@@ -1179,7 +1147,7 @@
                 <w:sz w:val="19"/>
                 <w:szCs w:val="19"/>
               </w:rPr>
-              <w:t xml:space="preserve">2.3</w:t>
+              <w:t xml:space="preserve">2.4</w:t>
             </w:r>
           </w:p>
         </w:tc>
@@ -1205,6 +1173,13 @@
             <w:pPr>
               <w:spacing w:after="0" w:before="0"/>
             </w:pPr>
+            <w:r>
+              <w:rPr>
+                <w:sz w:val="19"/>
+                <w:szCs w:val="19"/>
+              </w:rPr>
+              <w:t xml:space="preserve">Mail file </w:t>
+            </w:r>
             <w:r>
               <w:rPr>
                 <w:b/>
@@ -1212,14 +1187,46 @@
                 <w:sz w:val="19"/>
                 <w:szCs w:val="19"/>
               </w:rPr>
-              <w:t xml:space="preserve">Every registered user now gets a Domino mail file</w:t>
-            </w:r>
-            <w:r>
-              <w:rPr>
-                <w:sz w:val="19"/>
-                <w:szCs w:val="19"/>
-              </w:rPr>
-              <w:t xml:space="preserve"> on the home server (MailFile column in the batch, reviewable). CreateMailDb / PreserveMailSystem removed. Mail file settings (folder, template, ACL manager, quota, full-text index), existence checks before and after registration, and mail file status in Verify.</w:t>
+              <w:t xml:space="preserve">naming = last name</w:t>
+            </w:r>
+            <w:r>
+              <w:rPr>
+                <w:sz w:val="19"/>
+                <w:szCs w:val="19"/>
+              </w:rPr>
+              <w:t xml:space="preserve"> (configurable), </w:t>
+            </w:r>
+            <w:r>
+              <w:rPr>
+                <w:b/>
+                <w:bCs/>
+                <w:sz w:val="19"/>
+                <w:szCs w:val="19"/>
+              </w:rPr>
+              <w:t xml:space="preserve">uniqueness</w:t>
+            </w:r>
+            <w:r>
+              <w:rPr>
+                <w:sz w:val="19"/>
+                <w:szCs w:val="19"/>
+              </w:rPr>
+              <w:t xml:space="preserve"> checked against all mail folders on the home server, Person documents, open batches and the batch itself (clash → smith2.nsf or ERROR), </w:t>
+            </w:r>
+            <w:r>
+              <w:rPr>
+                <w:b/>
+                <w:bCs/>
+                <w:sz w:val="19"/>
+                <w:szCs w:val="19"/>
+              </w:rPr>
+              <w:t xml:space="preserve">numbered folders</w:t>
+            </w:r>
+            <w:r>
+              <w:rPr>
+                <w:sz w:val="19"/>
+                <w:szCs w:val="19"/>
+              </w:rPr>
+              <w:t xml:space="preserve"> mail1, mail2… with max 1000 mail files each. MailFileNote recorded in batch file, summary, results and audit.</w:t>
             </w:r>
           </w:p>
         </w:tc>
@@ -1255,7 +1262,7 @@
                 <w:sz w:val="19"/>
                 <w:szCs w:val="19"/>
               </w:rPr>
-              <w:t xml:space="preserve">2.1</w:t>
+              <w:t xml:space="preserve">2.3</w:t>
             </w:r>
           </w:p>
         </w:tc>
@@ -1281,13 +1288,6 @@
             <w:pPr>
               <w:spacing w:after="0" w:before="0"/>
             </w:pPr>
-            <w:r>
-              <w:rPr>
-                <w:sz w:val="19"/>
-                <w:szCs w:val="19"/>
-              </w:rPr>
-              <w:t xml:space="preserve">Name formats: servers in canonical (CN=DominoADMail/O=Demo) or abbreviated (DominoADMail/Demo) form, both accepted by the code. </w:t>
-            </w:r>
             <w:r>
               <w:rPr>
                 <w:b/>
@@ -1295,30 +1295,14 @@
                 <w:sz w:val="19"/>
                 <w:szCs w:val="19"/>
               </w:rPr>
-              <w:t xml:space="preserve">Organizational policies</w:t>
-            </w:r>
-            <w:r>
-              <w:rPr>
-                <w:sz w:val="19"/>
-                <w:szCs w:val="19"/>
-              </w:rPr>
-              <w:t xml:space="preserve"> (</w:t>
-            </w:r>
-            <w:r>
-              <w:rPr>
-                <w:i/>
-                <w:iCs/>
-                <w:sz w:val="19"/>
-                <w:szCs w:val="19"/>
-              </w:rPr>
-              <w:t xml:space="preserve">/Demo, </w:t>
-            </w:r>
-            <w:r>
-              <w:rPr>
-                <w:sz w:val="19"/>
-                <w:szCs w:val="19"/>
-              </w:rPr>
-              <w:t xml:space="preserve">/Sales/Demo) supported alongside explicit policies (B8 Option B, OrgPolicyAssignsVault, '-' in the mapping). Consistent 'Demo' examples.</w:t>
+              <w:t xml:space="preserve">Every registered user now gets a Domino mail file</w:t>
+            </w:r>
+            <w:r>
+              <w:rPr>
+                <w:sz w:val="19"/>
+                <w:szCs w:val="19"/>
+              </w:rPr>
+              <w:t xml:space="preserve"> on the home server (MailFile column in the batch, reviewable). CreateMailDb / PreserveMailSystem removed. Mail file settings (folder, template, ACL manager, quota, full-text index), existence checks before and after registration, and mail file status in Verify.</w:t>
             </w:r>
           </w:p>
         </w:tc>
@@ -1354,6 +1338,105 @@
                 <w:sz w:val="19"/>
                 <w:szCs w:val="19"/>
               </w:rPr>
+              <w:t xml:space="preserve">2.1</w:t>
+            </w:r>
+          </w:p>
+        </w:tc>
+        <w:tc>
+          <w:tcPr>
+            <w:tcW w:type="dxa" w:w="8403"/>
+            <w:tcBorders>
+              <w:top w:val="single" w:color="DCE6F0" w:sz="4"/>
+              <w:left w:val="single" w:color="DCE6F0" w:sz="4"/>
+              <w:bottom w:val="single" w:color="DCE6F0" w:sz="4"/>
+              <w:right w:val="single" w:color="DCE6F0" w:sz="4"/>
+            </w:tcBorders>
+            <w:shd w:fill="F7F7FC" w:color="auto" w:val="clear"/>
+            <w:tcMar>
+              <w:top w:type="dxa" w:w="60"/>
+              <w:left w:type="dxa" w:w="100"/>
+              <w:bottom w:type="dxa" w:w="60"/>
+              <w:right w:type="dxa" w:w="100"/>
+            </w:tcMar>
+            <w:vAlign w:val="top"/>
+          </w:tcPr>
+          <w:p>
+            <w:pPr>
+              <w:spacing w:after="0" w:before="0"/>
+            </w:pPr>
+            <w:r>
+              <w:rPr>
+                <w:sz w:val="19"/>
+                <w:szCs w:val="19"/>
+              </w:rPr>
+              <w:t xml:space="preserve">Name formats: servers in canonical (CN=DominoADMail/O=Demo) or abbreviated (DominoADMail/Demo) form, both accepted by the code. </w:t>
+            </w:r>
+            <w:r>
+              <w:rPr>
+                <w:b/>
+                <w:bCs/>
+                <w:sz w:val="19"/>
+                <w:szCs w:val="19"/>
+              </w:rPr>
+              <w:t xml:space="preserve">Organizational policies</w:t>
+            </w:r>
+            <w:r>
+              <w:rPr>
+                <w:sz w:val="19"/>
+                <w:szCs w:val="19"/>
+              </w:rPr>
+              <w:t xml:space="preserve"> (</w:t>
+            </w:r>
+            <w:r>
+              <w:rPr>
+                <w:i/>
+                <w:iCs/>
+                <w:sz w:val="19"/>
+                <w:szCs w:val="19"/>
+              </w:rPr>
+              <w:t xml:space="preserve">/Demo, </w:t>
+            </w:r>
+            <w:r>
+              <w:rPr>
+                <w:sz w:val="19"/>
+                <w:szCs w:val="19"/>
+              </w:rPr>
+              <w:t xml:space="preserve">/Sales/Demo) supported alongside explicit policies (B8 Option B, OrgPolicyAssignsVault, '-' in the mapping). Consistent 'Demo' examples.</w:t>
+            </w:r>
+          </w:p>
+        </w:tc>
+      </w:tr>
+      <w:tr>
+        <w:trPr>
+          <w:cantSplit/>
+        </w:trPr>
+        <w:tc>
+          <w:tcPr>
+            <w:tcW w:type="dxa" w:w="1235"/>
+            <w:tcBorders>
+              <w:top w:val="single" w:color="DCE6F0" w:sz="4"/>
+              <w:left w:val="single" w:color="DCE6F0" w:sz="4"/>
+              <w:bottom w:val="single" w:color="DCE6F0" w:sz="4"/>
+              <w:right w:val="single" w:color="DCE6F0" w:sz="4"/>
+            </w:tcBorders>
+            <w:shd w:fill="FFFFFF" w:color="auto" w:val="clear"/>
+            <w:tcMar>
+              <w:top w:type="dxa" w:w="60"/>
+              <w:left w:type="dxa" w:w="100"/>
+              <w:bottom w:type="dxa" w:w="60"/>
+              <w:right w:type="dxa" w:w="100"/>
+            </w:tcMar>
+            <w:vAlign w:val="top"/>
+          </w:tcPr>
+          <w:p>
+            <w:pPr>
+              <w:spacing w:after="0" w:before="0"/>
+            </w:pPr>
+            <w:r>
+              <w:rPr>
+                <w:sz w:val="19"/>
+                <w:szCs w:val="19"/>
+              </w:rPr>
               <w:t xml:space="preserve">2.0</w:t>
             </w:r>
           </w:p>
@@ -1367,7 +1450,7 @@
               <w:bottom w:val="single" w:color="DCE6F0" w:sz="4"/>
               <w:right w:val="single" w:color="DCE6F0" w:sz="4"/>
             </w:tcBorders>
-            <w:shd w:fill="F7F7FC" w:color="auto" w:val="clear"/>
+            <w:shd w:fill="FFFFFF" w:color="auto" w:val="clear"/>
             <w:tcMar>
               <w:top w:type="dxa" w:w="60"/>
               <w:left w:type="dxa" w:w="100"/>
@@ -12157,6 +12240,80 @@
         <w:t xml:space="preserve"> tab of each server, filter on .ntf).</w:t>
       </w:r>
     </w:p>
+    <w:p>
+      <w:pPr>
+        <w:pStyle w:val="ListParagraph"/>
+        <w:numPr>
+          <w:ilvl w:val="0"/>
+          <w:numId w:val="7"/>
+        </w:numPr>
+      </w:pPr>
+      <w:r>
+        <w:t xml:space="preserve">On the </w:t>
+      </w:r>
+      <w:r>
+        <w:rPr>
+          <w:b/>
+          <w:bCs/>
+        </w:rPr>
+        <w:t xml:space="preserve">registration server</w:t>
+      </w:r>
+      <w:r>
+        <w:t xml:space="preserve">, check that the Certification Log </w:t>
+      </w:r>
+      <w:r>
+        <w:rPr>
+          <w:rFonts w:ascii="Consolas" w:cs="Consolas" w:eastAsia="Consolas" w:hAnsi="Consolas"/>
+          <w:color w:val="0F5FDC"/>
+          <w:sz w:val="20"/>
+          <w:szCs w:val="20"/>
+        </w:rPr>
+        <w:t xml:space="preserve">certlog.nsf</w:t>
+      </w:r>
+      <w:r>
+        <w:t xml:space="preserve"> exists in the data directory (</w:t>
+      </w:r>
+      <w:r>
+        <w:rPr>
+          <w:b/>
+          <w:bCs/>
+        </w:rPr>
+        <w:t xml:space="preserve">Files</w:t>
+      </w:r>
+      <w:r>
+        <w:t xml:space="preserve"> tab) and that your admin ID can write to it. If it is missing, create it with </w:t>
+      </w:r>
+      <w:r>
+        <w:rPr>
+          <w:b/>
+          <w:bCs/>
+        </w:rPr>
+        <w:t xml:space="preserve">File &gt; Application &gt; New</w:t>
+      </w:r>
+      <w:r>
+        <w:t xml:space="preserve"> on that server from the </w:t>
+      </w:r>
+      <w:r>
+        <w:rPr>
+          <w:b/>
+          <w:bCs/>
+        </w:rPr>
+        <w:t xml:space="preserve">Certification Log</w:t>
+      </w:r>
+      <w:r>
+        <w:t xml:space="preserve"> template (certlog.ntf, under </w:t>
+      </w:r>
+      <w:r>
+        <w:rPr>
+          <w:b/>
+          <w:bCs/>
+        </w:rPr>
+        <w:t xml:space="preserve">Show advanced templates</w:t>
+      </w:r>
+      <w:r>
+        <w:t xml:space="preserve">).</w:t>
+      </w:r>
+    </w:p>
     <w:tbl>
       <w:tblPr>
         <w:tblW w:type="dxa" w:w="9638"/>
@@ -16442,7 +16599,7 @@
                 <w:sz w:val="19"/>
                 <w:szCs w:val="19"/>
               </w:rPr>
-              <w:t xml:space="preserve">UseCA</w:t>
+              <w:t xml:space="preserve">RegistrationLog</w:t>
             </w:r>
           </w:p>
         </w:tc>
@@ -16468,6 +16625,13 @@
             <w:pPr>
               <w:spacing w:after="0" w:before="0"/>
             </w:pPr>
+            <w:r>
+              <w:rPr>
+                <w:sz w:val="19"/>
+                <w:szCs w:val="19"/>
+              </w:rPr>
+              <w:t xml:space="preserve">Leave </w:t>
+            </w:r>
             <w:r>
               <w:rPr>
                 <w:rFonts w:ascii="Consolas" w:cs="Consolas" w:eastAsia="Consolas" w:hAnsi="Consolas"/>
@@ -16475,30 +16639,14 @@
                 <w:sz w:val="18"/>
                 <w:szCs w:val="18"/>
               </w:rPr>
-              <w:t xml:space="preserve">1</w:t>
-            </w:r>
-            <w:r>
-              <w:rPr>
-                <w:sz w:val="19"/>
-                <w:szCs w:val="19"/>
-              </w:rPr>
-              <w:t xml:space="preserve"> for the Domino CA, </w:t>
-            </w:r>
-            <w:r>
-              <w:rPr>
-                <w:rFonts w:ascii="Consolas" w:cs="Consolas" w:eastAsia="Consolas" w:hAnsi="Consolas"/>
-                <w:color w:val="0F5FDC"/>
-                <w:sz w:val="18"/>
-                <w:szCs w:val="18"/>
-              </w:rPr>
-              <w:t xml:space="preserve">0</w:t>
-            </w:r>
-            <w:r>
-              <w:rPr>
-                <w:sz w:val="19"/>
-                <w:szCs w:val="19"/>
-              </w:rPr>
-              <w:t xml:space="preserve"> for a certifier ID file</w:t>
+              <w:t xml:space="preserve">certlog.nsf</w:t>
+            </w:r>
+            <w:r>
+              <w:rPr>
+                <w:sz w:val="19"/>
+                <w:szCs w:val="19"/>
+              </w:rPr>
+              <w:t xml:space="preserve">. Registration records go to the Certification Log on the registration server.</w:t>
             </w:r>
           </w:p>
         </w:tc>
@@ -16529,7 +16677,7 @@
                 <w:sz w:val="19"/>
                 <w:szCs w:val="19"/>
               </w:rPr>
-              <w:t xml:space="preserve">Worksheet 5</w:t>
+              <w:t xml:space="preserve">–</w:t>
             </w:r>
           </w:p>
         </w:tc>
@@ -16565,7 +16713,7 @@
                 <w:sz w:val="19"/>
                 <w:szCs w:val="19"/>
               </w:rPr>
-              <w:t xml:space="preserve">CertifierName</w:t>
+              <w:t xml:space="preserve">UseCA</w:t>
             </w:r>
           </w:p>
         </w:tc>
@@ -16591,13 +16739,6 @@
             <w:pPr>
               <w:spacing w:after="0" w:before="0"/>
             </w:pPr>
-            <w:r>
-              <w:rPr>
-                <w:sz w:val="19"/>
-                <w:szCs w:val="19"/>
-              </w:rPr>
-              <w:t xml:space="preserve">With UseCA=1: the CA certifier, e.g. </w:t>
-            </w:r>
             <w:r>
               <w:rPr>
                 <w:rFonts w:ascii="Consolas" w:cs="Consolas" w:eastAsia="Consolas" w:hAnsi="Consolas"/>
@@ -16605,14 +16746,14 @@
                 <w:sz w:val="18"/>
                 <w:szCs w:val="18"/>
               </w:rPr>
-              <w:t xml:space="preserve">O=Demo</w:t>
-            </w:r>
-            <w:r>
-              <w:rPr>
-                <w:sz w:val="19"/>
-                <w:szCs w:val="19"/>
-              </w:rPr>
-              <w:t xml:space="preserve"> or </w:t>
+              <w:t xml:space="preserve">1</w:t>
+            </w:r>
+            <w:r>
+              <w:rPr>
+                <w:sz w:val="19"/>
+                <w:szCs w:val="19"/>
+              </w:rPr>
+              <w:t xml:space="preserve"> for the Domino CA, </w:t>
             </w:r>
             <w:r>
               <w:rPr>
@@ -16621,7 +16762,14 @@
                 <w:sz w:val="18"/>
                 <w:szCs w:val="18"/>
               </w:rPr>
-              <w:t xml:space="preserve">OU=Sales/O=Demo</w:t>
+              <w:t xml:space="preserve">0</w:t>
+            </w:r>
+            <w:r>
+              <w:rPr>
+                <w:sz w:val="19"/>
+                <w:szCs w:val="19"/>
+              </w:rPr>
+              <w:t xml:space="preserve"> for a certifier ID file</w:t>
             </w:r>
           </w:p>
         </w:tc>
@@ -16652,7 +16800,7 @@
                 <w:sz w:val="19"/>
                 <w:szCs w:val="19"/>
               </w:rPr>
-              <w:t xml:space="preserve">Worksheet 6</w:t>
+              <w:t xml:space="preserve">Worksheet 5</w:t>
             </w:r>
           </w:p>
         </w:tc>
@@ -16688,7 +16836,7 @@
                 <w:sz w:val="19"/>
                 <w:szCs w:val="19"/>
               </w:rPr>
-              <w:t xml:space="preserve">CertifierIDFile</w:t>
+              <w:t xml:space="preserve">CertifierName</w:t>
             </w:r>
           </w:p>
         </w:tc>
@@ -16719,7 +16867,7 @@
                 <w:sz w:val="19"/>
                 <w:szCs w:val="19"/>
               </w:rPr>
-              <w:t xml:space="preserve">With UseCA=0: </w:t>
+              <w:t xml:space="preserve">With UseCA=1: the CA certifier, e.g. </w:t>
             </w:r>
             <w:r>
               <w:rPr>
@@ -16728,14 +16876,23 @@
                 <w:sz w:val="18"/>
                 <w:szCs w:val="18"/>
               </w:rPr>
-              <w:t xml:space="preserve">C:\BulkReg\cert\&lt;file&gt;.id</w:t>
-            </w:r>
-            <w:r>
-              <w:rPr>
-                <w:sz w:val="19"/>
-                <w:szCs w:val="19"/>
-              </w:rPr>
-              <w:t xml:space="preserve">. With UseCA=1: leave the placeholder or clear it.</w:t>
+              <w:t xml:space="preserve">O=Demo</w:t>
+            </w:r>
+            <w:r>
+              <w:rPr>
+                <w:sz w:val="19"/>
+                <w:szCs w:val="19"/>
+              </w:rPr>
+              <w:t xml:space="preserve"> or </w:t>
+            </w:r>
+            <w:r>
+              <w:rPr>
+                <w:rFonts w:ascii="Consolas" w:cs="Consolas" w:eastAsia="Consolas" w:hAnsi="Consolas"/>
+                <w:color w:val="0F5FDC"/>
+                <w:sz w:val="18"/>
+                <w:szCs w:val="18"/>
+              </w:rPr>
+              <w:t xml:space="preserve">OU=Sales/O=Demo</w:t>
             </w:r>
           </w:p>
         </w:tc>
@@ -16766,7 +16923,7 @@
                 <w:sz w:val="19"/>
                 <w:szCs w:val="19"/>
               </w:rPr>
-              <w:t xml:space="preserve">B5 Option 2</w:t>
+              <w:t xml:space="preserve">Worksheet 6</w:t>
             </w:r>
           </w:p>
         </w:tc>
@@ -16802,7 +16959,7 @@
                 <w:sz w:val="19"/>
                 <w:szCs w:val="19"/>
               </w:rPr>
-              <w:t xml:space="preserve">DefaultHomeServer</w:t>
+              <w:t xml:space="preserve">CertifierIDFile</w:t>
             </w:r>
           </w:p>
         </w:tc>
@@ -16833,7 +16990,7 @@
                 <w:sz w:val="19"/>
                 <w:szCs w:val="19"/>
               </w:rPr>
-              <w:t xml:space="preserve">Home server for users that match no specific rule: </w:t>
+              <w:t xml:space="preserve">With UseCA=0: </w:t>
             </w:r>
             <w:r>
               <w:rPr>
@@ -16842,23 +16999,14 @@
                 <w:sz w:val="18"/>
                 <w:szCs w:val="18"/>
               </w:rPr>
-              <w:t xml:space="preserve">DominoADMail/Demo</w:t>
-            </w:r>
-            <w:r>
-              <w:rPr>
-                <w:sz w:val="19"/>
-                <w:szCs w:val="19"/>
-              </w:rPr>
-              <w:t xml:space="preserve"> or </w:t>
-            </w:r>
-            <w:r>
-              <w:rPr>
-                <w:rFonts w:ascii="Consolas" w:cs="Consolas" w:eastAsia="Consolas" w:hAnsi="Consolas"/>
-                <w:color w:val="0F5FDC"/>
-                <w:sz w:val="18"/>
-                <w:szCs w:val="18"/>
-              </w:rPr>
-              <w:t xml:space="preserve">CN=DominoADMail/O=Demo</w:t>
+              <w:t xml:space="preserve">C:\BulkReg\cert\&lt;file&gt;.id</w:t>
+            </w:r>
+            <w:r>
+              <w:rPr>
+                <w:sz w:val="19"/>
+                <w:szCs w:val="19"/>
+              </w:rPr>
+              <w:t xml:space="preserve">. With UseCA=1: leave the placeholder or clear it.</w:t>
             </w:r>
           </w:p>
         </w:tc>
@@ -16889,7 +17037,7 @@
                 <w:sz w:val="19"/>
                 <w:szCs w:val="19"/>
               </w:rPr>
-              <w:t xml:space="preserve">Worksheet 3</w:t>
+              <w:t xml:space="preserve">B5 Option 2</w:t>
             </w:r>
           </w:p>
         </w:tc>
@@ -16925,7 +17073,7 @@
                 <w:sz w:val="19"/>
                 <w:szCs w:val="19"/>
               </w:rPr>
-              <w:t xml:space="preserve">DefaultPolicy</w:t>
+              <w:t xml:space="preserve">DefaultHomeServer</w:t>
             </w:r>
           </w:p>
         </w:tc>
@@ -16956,23 +17104,7 @@
                 <w:sz w:val="19"/>
                 <w:szCs w:val="19"/>
               </w:rPr>
-              <w:t xml:space="preserve">Explicit policy </w:t>
-            </w:r>
-            <w:r>
-              <w:rPr>
-                <w:b/>
-                <w:bCs/>
-                <w:sz w:val="19"/>
-                <w:szCs w:val="19"/>
-              </w:rPr>
-              <w:t xml:space="preserve">exactly</w:t>
-            </w:r>
-            <w:r>
-              <w:rPr>
-                <w:sz w:val="19"/>
-                <w:szCs w:val="19"/>
-              </w:rPr>
-              <w:t xml:space="preserve"> as listed, e.g. </w:t>
+              <w:t xml:space="preserve">Home server for users that match no specific rule: </w:t>
             </w:r>
             <w:r>
               <w:rPr>
@@ -16981,30 +17113,23 @@
                 <w:sz w:val="18"/>
                 <w:szCs w:val="18"/>
               </w:rPr>
-              <w:t xml:space="preserve">*/DirSync-Vault</w:t>
-            </w:r>
-            <w:r>
-              <w:rPr>
-                <w:sz w:val="19"/>
-                <w:szCs w:val="19"/>
-              </w:rPr>
-              <w:t xml:space="preserve">. </w:t>
-            </w:r>
-            <w:r>
-              <w:rPr>
-                <w:b/>
-                <w:bCs/>
-                <w:sz w:val="19"/>
-                <w:szCs w:val="19"/>
-              </w:rPr>
-              <w:t xml:space="preserve">Empty</w:t>
-            </w:r>
-            <w:r>
-              <w:rPr>
-                <w:sz w:val="19"/>
-                <w:szCs w:val="19"/>
-              </w:rPr>
-              <w:t xml:space="preserve"> with an organizational policy.</w:t>
+              <w:t xml:space="preserve">DominoADMail/Demo</w:t>
+            </w:r>
+            <w:r>
+              <w:rPr>
+                <w:sz w:val="19"/>
+                <w:szCs w:val="19"/>
+              </w:rPr>
+              <w:t xml:space="preserve"> or </w:t>
+            </w:r>
+            <w:r>
+              <w:rPr>
+                <w:rFonts w:ascii="Consolas" w:cs="Consolas" w:eastAsia="Consolas" w:hAnsi="Consolas"/>
+                <w:color w:val="0F5FDC"/>
+                <w:sz w:val="18"/>
+                <w:szCs w:val="18"/>
+              </w:rPr>
+              <w:t xml:space="preserve">CN=DominoADMail/O=Demo</w:t>
             </w:r>
           </w:p>
         </w:tc>
@@ -17035,7 +17160,7 @@
                 <w:sz w:val="19"/>
                 <w:szCs w:val="19"/>
               </w:rPr>
-              <w:t xml:space="preserve">Worksheet 9</w:t>
+              <w:t xml:space="preserve">Worksheet 3</w:t>
             </w:r>
           </w:p>
         </w:tc>
@@ -17071,7 +17196,7 @@
                 <w:sz w:val="19"/>
                 <w:szCs w:val="19"/>
               </w:rPr>
-              <w:t xml:space="preserve">OrgPolicyAssignsVault</w:t>
+              <w:t xml:space="preserve">DefaultPolicy</w:t>
             </w:r>
           </w:p>
         </w:tc>
@@ -17097,6 +17222,29 @@
             <w:pPr>
               <w:spacing w:after="0" w:before="0"/>
             </w:pPr>
+            <w:r>
+              <w:rPr>
+                <w:sz w:val="19"/>
+                <w:szCs w:val="19"/>
+              </w:rPr>
+              <w:t xml:space="preserve">Explicit policy </w:t>
+            </w:r>
+            <w:r>
+              <w:rPr>
+                <w:b/>
+                <w:bCs/>
+                <w:sz w:val="19"/>
+                <w:szCs w:val="19"/>
+              </w:rPr>
+              <w:t xml:space="preserve">exactly</w:t>
+            </w:r>
+            <w:r>
+              <w:rPr>
+                <w:sz w:val="19"/>
+                <w:szCs w:val="19"/>
+              </w:rPr>
+              <w:t xml:space="preserve"> as listed, e.g. </w:t>
+            </w:r>
             <w:r>
               <w:rPr>
                 <w:rFonts w:ascii="Consolas" w:cs="Consolas" w:eastAsia="Consolas" w:hAnsi="Consolas"/>
@@ -17104,55 +17252,30 @@
                 <w:sz w:val="18"/>
                 <w:szCs w:val="18"/>
               </w:rPr>
-              <w:t xml:space="preserve">1</w:t>
-            </w:r>
-            <w:r>
-              <w:rPr>
-                <w:sz w:val="19"/>
-                <w:szCs w:val="19"/>
-              </w:rPr>
-              <w:t xml:space="preserve"> if an organizational policy (</w:t>
-            </w:r>
-            <w:r>
-              <w:rPr>
-                <w:rFonts w:ascii="Consolas" w:cs="Consolas" w:eastAsia="Consolas" w:hAnsi="Consolas"/>
-                <w:color w:val="0F5FDC"/>
-                <w:sz w:val="18"/>
-                <w:szCs w:val="18"/>
-              </w:rPr>
-              <w:t xml:space="preserve">*/Demo</w:t>
-            </w:r>
-            <w:r>
-              <w:rPr>
-                <w:sz w:val="19"/>
-                <w:szCs w:val="19"/>
-              </w:rPr>
-              <w:t xml:space="preserve">, </w:t>
-            </w:r>
-            <w:r>
-              <w:rPr>
-                <w:rFonts w:ascii="Consolas" w:cs="Consolas" w:eastAsia="Consolas" w:hAnsi="Consolas"/>
-                <w:color w:val="0F5FDC"/>
-                <w:sz w:val="18"/>
-                <w:szCs w:val="18"/>
-              </w:rPr>
-              <w:t xml:space="preserve">*/Sales/Demo</w:t>
-            </w:r>
-            <w:r>
-              <w:rPr>
-                <w:sz w:val="19"/>
-                <w:szCs w:val="19"/>
-              </w:rPr>
-              <w:t xml:space="preserve">) assigns the vault, otherwise </w:t>
-            </w:r>
-            <w:r>
-              <w:rPr>
-                <w:rFonts w:ascii="Consolas" w:cs="Consolas" w:eastAsia="Consolas" w:hAnsi="Consolas"/>
-                <w:color w:val="0F5FDC"/>
-                <w:sz w:val="18"/>
-                <w:szCs w:val="18"/>
-              </w:rPr>
-              <w:t xml:space="preserve">0</w:t>
+              <w:t xml:space="preserve">*/DirSync-Vault</w:t>
+            </w:r>
+            <w:r>
+              <w:rPr>
+                <w:sz w:val="19"/>
+                <w:szCs w:val="19"/>
+              </w:rPr>
+              <w:t xml:space="preserve">. </w:t>
+            </w:r>
+            <w:r>
+              <w:rPr>
+                <w:b/>
+                <w:bCs/>
+                <w:sz w:val="19"/>
+                <w:szCs w:val="19"/>
+              </w:rPr>
+              <w:t xml:space="preserve">Empty</w:t>
+            </w:r>
+            <w:r>
+              <w:rPr>
+                <w:sz w:val="19"/>
+                <w:szCs w:val="19"/>
+              </w:rPr>
+              <w:t xml:space="preserve"> with an organizational policy.</w:t>
             </w:r>
           </w:p>
         </w:tc>
@@ -17183,7 +17306,7 @@
                 <w:sz w:val="19"/>
                 <w:szCs w:val="19"/>
               </w:rPr>
-              <w:t xml:space="preserve">B8</w:t>
+              <w:t xml:space="preserve">Worksheet 9</w:t>
             </w:r>
           </w:p>
         </w:tc>
@@ -17219,7 +17342,7 @@
                 <w:sz w:val="19"/>
                 <w:szCs w:val="19"/>
               </w:rPr>
-              <w:t xml:space="preserve">VaultServer</w:t>
+              <w:t xml:space="preserve">OrgPolicyAssignsVault</w:t>
             </w:r>
           </w:p>
         </w:tc>
@@ -17245,13 +17368,6 @@
             <w:pPr>
               <w:spacing w:after="0" w:before="0"/>
             </w:pPr>
-            <w:r>
-              <w:rPr>
-                <w:sz w:val="19"/>
-                <w:szCs w:val="19"/>
-              </w:rPr>
-              <w:t xml:space="preserve">The vault server, e.g. </w:t>
-            </w:r>
             <w:r>
               <w:rPr>
                 <w:rFonts w:ascii="Consolas" w:cs="Consolas" w:eastAsia="Consolas" w:hAnsi="Consolas"/>
@@ -17259,14 +17375,55 @@
                 <w:sz w:val="18"/>
                 <w:szCs w:val="18"/>
               </w:rPr>
-              <w:t xml:space="preserve">DominoVault/Demo</w:t>
-            </w:r>
-            <w:r>
-              <w:rPr>
-                <w:sz w:val="19"/>
-                <w:szCs w:val="19"/>
-              </w:rPr>
-              <w:t xml:space="preserve"> (as shown in the vault document)</w:t>
+              <w:t xml:space="preserve">1</w:t>
+            </w:r>
+            <w:r>
+              <w:rPr>
+                <w:sz w:val="19"/>
+                <w:szCs w:val="19"/>
+              </w:rPr>
+              <w:t xml:space="preserve"> if an organizational policy (</w:t>
+            </w:r>
+            <w:r>
+              <w:rPr>
+                <w:rFonts w:ascii="Consolas" w:cs="Consolas" w:eastAsia="Consolas" w:hAnsi="Consolas"/>
+                <w:color w:val="0F5FDC"/>
+                <w:sz w:val="18"/>
+                <w:szCs w:val="18"/>
+              </w:rPr>
+              <w:t xml:space="preserve">*/Demo</w:t>
+            </w:r>
+            <w:r>
+              <w:rPr>
+                <w:sz w:val="19"/>
+                <w:szCs w:val="19"/>
+              </w:rPr>
+              <w:t xml:space="preserve">, </w:t>
+            </w:r>
+            <w:r>
+              <w:rPr>
+                <w:rFonts w:ascii="Consolas" w:cs="Consolas" w:eastAsia="Consolas" w:hAnsi="Consolas"/>
+                <w:color w:val="0F5FDC"/>
+                <w:sz w:val="18"/>
+                <w:szCs w:val="18"/>
+              </w:rPr>
+              <w:t xml:space="preserve">*/Sales/Demo</w:t>
+            </w:r>
+            <w:r>
+              <w:rPr>
+                <w:sz w:val="19"/>
+                <w:szCs w:val="19"/>
+              </w:rPr>
+              <w:t xml:space="preserve">) assigns the vault, otherwise </w:t>
+            </w:r>
+            <w:r>
+              <w:rPr>
+                <w:rFonts w:ascii="Consolas" w:cs="Consolas" w:eastAsia="Consolas" w:hAnsi="Consolas"/>
+                <w:color w:val="0F5FDC"/>
+                <w:sz w:val="18"/>
+                <w:szCs w:val="18"/>
+              </w:rPr>
+              <w:t xml:space="preserve">0</w:t>
             </w:r>
           </w:p>
         </w:tc>
@@ -17297,7 +17454,7 @@
                 <w:sz w:val="19"/>
                 <w:szCs w:val="19"/>
               </w:rPr>
-              <w:t xml:space="preserve">Worksheet 7</w:t>
+              <w:t xml:space="preserve">B8</w:t>
             </w:r>
           </w:p>
         </w:tc>
@@ -17333,7 +17490,7 @@
                 <w:sz w:val="19"/>
                 <w:szCs w:val="19"/>
               </w:rPr>
-              <w:t xml:space="preserve">BatchSize</w:t>
+              <w:t xml:space="preserve">VaultServer</w:t>
             </w:r>
           </w:p>
         </w:tc>
@@ -17359,6 +17516,13 @@
             <w:pPr>
               <w:spacing w:after="0" w:before="0"/>
             </w:pPr>
+            <w:r>
+              <w:rPr>
+                <w:sz w:val="19"/>
+                <w:szCs w:val="19"/>
+              </w:rPr>
+              <w:t xml:space="preserve">The vault server, e.g. </w:t>
+            </w:r>
             <w:r>
               <w:rPr>
                 <w:rFonts w:ascii="Consolas" w:cs="Consolas" w:eastAsia="Consolas" w:hAnsi="Consolas"/>
@@ -17366,14 +17530,14 @@
                 <w:sz w:val="18"/>
                 <w:szCs w:val="18"/>
               </w:rPr>
-              <w:t xml:space="preserve">500</w:t>
-            </w:r>
-            <w:r>
-              <w:rPr>
-                <w:sz w:val="19"/>
-                <w:szCs w:val="19"/>
-              </w:rPr>
-              <w:t xml:space="preserve"> or your value</w:t>
+              <w:t xml:space="preserve">DominoVault/Demo</w:t>
+            </w:r>
+            <w:r>
+              <w:rPr>
+                <w:sz w:val="19"/>
+                <w:szCs w:val="19"/>
+              </w:rPr>
+              <w:t xml:space="preserve"> (as shown in the vault document)</w:t>
             </w:r>
           </w:p>
         </w:tc>
@@ -17404,7 +17568,7 @@
                 <w:sz w:val="19"/>
                 <w:szCs w:val="19"/>
               </w:rPr>
-              <w:t xml:space="preserve">Worksheet 14</w:t>
+              <w:t xml:space="preserve">Worksheet 7</w:t>
             </w:r>
           </w:p>
         </w:tc>
@@ -17440,7 +17604,7 @@
                 <w:sz w:val="19"/>
                 <w:szCs w:val="19"/>
               </w:rPr>
-              <w:t xml:space="preserve">MailFileNaming</w:t>
+              <w:t xml:space="preserve">BatchSize</w:t>
             </w:r>
           </w:p>
         </w:tc>
@@ -17473,39 +17637,14 @@
                 <w:sz w:val="18"/>
                 <w:szCs w:val="18"/>
               </w:rPr>
-              <w:t xml:space="preserve">LASTNAME</w:t>
-            </w:r>
-            <w:r>
-              <w:rPr>
-                <w:sz w:val="19"/>
-                <w:szCs w:val="19"/>
-              </w:rPr>
-              <w:t xml:space="preserve"> (smith.nsf), </w:t>
-            </w:r>
-            <w:r>
-              <w:rPr>
-                <w:rFonts w:ascii="Consolas" w:cs="Consolas" w:eastAsia="Consolas" w:hAnsi="Consolas"/>
-                <w:color w:val="0F5FDC"/>
-                <w:sz w:val="18"/>
-                <w:szCs w:val="18"/>
-              </w:rPr>
-              <w:t xml:space="preserve">FIRSTINITIAL_LASTNAME</w:t>
-            </w:r>
-            <w:r>
-              <w:rPr>
-                <w:sz w:val="19"/>
-                <w:szCs w:val="19"/>
-              </w:rPr>
-              <w:t xml:space="preserve"> (jsmith.nsf) or </w:t>
-            </w:r>
-            <w:r>
-              <w:rPr>
-                <w:rFonts w:ascii="Consolas" w:cs="Consolas" w:eastAsia="Consolas" w:hAnsi="Consolas"/>
-                <w:color w:val="0F5FDC"/>
-                <w:sz w:val="18"/>
-                <w:szCs w:val="18"/>
-              </w:rPr>
-              <w:t xml:space="preserve">SHORTNAME</w:t>
+              <w:t xml:space="preserve">500</w:t>
+            </w:r>
+            <w:r>
+              <w:rPr>
+                <w:sz w:val="19"/>
+                <w:szCs w:val="19"/>
+              </w:rPr>
+              <w:t xml:space="preserve"> or your value</w:t>
             </w:r>
           </w:p>
         </w:tc>
@@ -17536,7 +17675,7 @@
                 <w:sz w:val="19"/>
                 <w:szCs w:val="19"/>
               </w:rPr>
-              <w:t xml:space="preserve">Worksheet 11a</w:t>
+              <w:t xml:space="preserve">Worksheet 14</w:t>
             </w:r>
           </w:p>
         </w:tc>
@@ -17572,7 +17711,7 @@
                 <w:sz w:val="19"/>
                 <w:szCs w:val="19"/>
               </w:rPr>
-              <w:t xml:space="preserve">MailFileCollision</w:t>
+              <w:t xml:space="preserve">MailFileNaming</w:t>
             </w:r>
           </w:p>
         </w:tc>
@@ -17605,14 +17744,14 @@
                 <w:sz w:val="18"/>
                 <w:szCs w:val="18"/>
               </w:rPr>
-              <w:t xml:space="preserve">SUFFIX</w:t>
-            </w:r>
-            <w:r>
-              <w:rPr>
-                <w:sz w:val="19"/>
-                <w:szCs w:val="19"/>
-              </w:rPr>
-              <w:t xml:space="preserve"> (smith2.nsf …) or </w:t>
+              <w:t xml:space="preserve">LASTNAME</w:t>
+            </w:r>
+            <w:r>
+              <w:rPr>
+                <w:sz w:val="19"/>
+                <w:szCs w:val="19"/>
+              </w:rPr>
+              <w:t xml:space="preserve"> (smith.nsf), </w:t>
             </w:r>
             <w:r>
               <w:rPr>
@@ -17621,14 +17760,23 @@
                 <w:sz w:val="18"/>
                 <w:szCs w:val="18"/>
               </w:rPr>
-              <w:t xml:space="preserve">ERROR</w:t>
-            </w:r>
-            <w:r>
-              <w:rPr>
-                <w:sz w:val="19"/>
-                <w:szCs w:val="19"/>
-              </w:rPr>
-              <w:t xml:space="preserve"> (row excluded)</w:t>
+              <w:t xml:space="preserve">FIRSTINITIAL_LASTNAME</w:t>
+            </w:r>
+            <w:r>
+              <w:rPr>
+                <w:sz w:val="19"/>
+                <w:szCs w:val="19"/>
+              </w:rPr>
+              <w:t xml:space="preserve"> (jsmith.nsf) or </w:t>
+            </w:r>
+            <w:r>
+              <w:rPr>
+                <w:rFonts w:ascii="Consolas" w:cs="Consolas" w:eastAsia="Consolas" w:hAnsi="Consolas"/>
+                <w:color w:val="0F5FDC"/>
+                <w:sz w:val="18"/>
+                <w:szCs w:val="18"/>
+              </w:rPr>
+              <w:t xml:space="preserve">SHORTNAME</w:t>
             </w:r>
           </w:p>
         </w:tc>
@@ -17695,7 +17843,7 @@
                 <w:sz w:val="19"/>
                 <w:szCs w:val="19"/>
               </w:rPr>
-              <w:t xml:space="preserve">MailFolderMode / MailFolderPrefix / MailFilesPerFolder</w:t>
+              <w:t xml:space="preserve">MailFileCollision</w:t>
             </w:r>
           </w:p>
         </w:tc>
@@ -17728,14 +17876,14 @@
                 <w:sz w:val="18"/>
                 <w:szCs w:val="18"/>
               </w:rPr>
-              <w:t xml:space="preserve">NUMBERED</w:t>
-            </w:r>
-            <w:r>
-              <w:rPr>
-                <w:sz w:val="19"/>
-                <w:szCs w:val="19"/>
-              </w:rPr>
-              <w:t xml:space="preserve"> / </w:t>
+              <w:t xml:space="preserve">SUFFIX</w:t>
+            </w:r>
+            <w:r>
+              <w:rPr>
+                <w:sz w:val="19"/>
+                <w:szCs w:val="19"/>
+              </w:rPr>
+              <w:t xml:space="preserve"> (smith2.nsf …) or </w:t>
             </w:r>
             <w:r>
               <w:rPr>
@@ -17744,46 +17892,14 @@
                 <w:sz w:val="18"/>
                 <w:szCs w:val="18"/>
               </w:rPr>
-              <w:t xml:space="preserve">mail</w:t>
-            </w:r>
-            <w:r>
-              <w:rPr>
-                <w:sz w:val="19"/>
-                <w:szCs w:val="19"/>
-              </w:rPr>
-              <w:t xml:space="preserve"> / </w:t>
-            </w:r>
-            <w:r>
-              <w:rPr>
-                <w:rFonts w:ascii="Consolas" w:cs="Consolas" w:eastAsia="Consolas" w:hAnsi="Consolas"/>
-                <w:color w:val="0F5FDC"/>
-                <w:sz w:val="18"/>
-                <w:szCs w:val="18"/>
-              </w:rPr>
-              <w:t xml:space="preserve">1000</w:t>
-            </w:r>
-            <w:r>
-              <w:rPr>
-                <w:sz w:val="19"/>
-                <w:szCs w:val="19"/>
-              </w:rPr>
-              <w:t xml:space="preserve"> → mail1, mail2 … (or </w:t>
-            </w:r>
-            <w:r>
-              <w:rPr>
-                <w:rFonts w:ascii="Consolas" w:cs="Consolas" w:eastAsia="Consolas" w:hAnsi="Consolas"/>
-                <w:color w:val="0F5FDC"/>
-                <w:sz w:val="18"/>
-                <w:szCs w:val="18"/>
-              </w:rPr>
-              <w:t xml:space="preserve">SINGLE</w:t>
-            </w:r>
-            <w:r>
-              <w:rPr>
-                <w:sz w:val="19"/>
-                <w:szCs w:val="19"/>
-              </w:rPr>
-              <w:t xml:space="preserve"> with MailFileDir)</w:t>
+              <w:t xml:space="preserve">ERROR</w:t>
+            </w:r>
+            <w:r>
+              <w:rPr>
+                <w:sz w:val="19"/>
+                <w:szCs w:val="19"/>
+              </w:rPr>
+              <w:t xml:space="preserve"> (row excluded)</w:t>
             </w:r>
           </w:p>
         </w:tc>
@@ -17850,7 +17966,7 @@
                 <w:sz w:val="19"/>
                 <w:szCs w:val="19"/>
               </w:rPr>
-              <w:t xml:space="preserve">MailFolderMax</w:t>
+              <w:t xml:space="preserve">MailFolderMode / MailFolderPrefix / MailFilesPerFolder</w:t>
             </w:r>
           </w:p>
         </w:tc>
@@ -17876,13 +17992,6 @@
             <w:pPr>
               <w:spacing w:after="0" w:before="0"/>
             </w:pPr>
-            <w:r>
-              <w:rPr>
-                <w:sz w:val="19"/>
-                <w:szCs w:val="19"/>
-              </w:rPr>
-              <w:t xml:space="preserve">The number of folders you created in B4, e.g. </w:t>
-            </w:r>
             <w:r>
               <w:rPr>
                 <w:rFonts w:ascii="Consolas" w:cs="Consolas" w:eastAsia="Consolas" w:hAnsi="Consolas"/>
@@ -17890,14 +17999,62 @@
                 <w:sz w:val="18"/>
                 <w:szCs w:val="18"/>
               </w:rPr>
-              <w:t xml:space="preserve">5</w:t>
-            </w:r>
-            <w:r>
-              <w:rPr>
-                <w:sz w:val="19"/>
-                <w:szCs w:val="19"/>
-              </w:rPr>
-              <w:t xml:space="preserve"> for mail1–mail5</w:t>
+              <w:t xml:space="preserve">NUMBERED</w:t>
+            </w:r>
+            <w:r>
+              <w:rPr>
+                <w:sz w:val="19"/>
+                <w:szCs w:val="19"/>
+              </w:rPr>
+              <w:t xml:space="preserve"> / </w:t>
+            </w:r>
+            <w:r>
+              <w:rPr>
+                <w:rFonts w:ascii="Consolas" w:cs="Consolas" w:eastAsia="Consolas" w:hAnsi="Consolas"/>
+                <w:color w:val="0F5FDC"/>
+                <w:sz w:val="18"/>
+                <w:szCs w:val="18"/>
+              </w:rPr>
+              <w:t xml:space="preserve">mail</w:t>
+            </w:r>
+            <w:r>
+              <w:rPr>
+                <w:sz w:val="19"/>
+                <w:szCs w:val="19"/>
+              </w:rPr>
+              <w:t xml:space="preserve"> / </w:t>
+            </w:r>
+            <w:r>
+              <w:rPr>
+                <w:rFonts w:ascii="Consolas" w:cs="Consolas" w:eastAsia="Consolas" w:hAnsi="Consolas"/>
+                <w:color w:val="0F5FDC"/>
+                <w:sz w:val="18"/>
+                <w:szCs w:val="18"/>
+              </w:rPr>
+              <w:t xml:space="preserve">1000</w:t>
+            </w:r>
+            <w:r>
+              <w:rPr>
+                <w:sz w:val="19"/>
+                <w:szCs w:val="19"/>
+              </w:rPr>
+              <w:t xml:space="preserve"> → mail1, mail2 … (or </w:t>
+            </w:r>
+            <w:r>
+              <w:rPr>
+                <w:rFonts w:ascii="Consolas" w:cs="Consolas" w:eastAsia="Consolas" w:hAnsi="Consolas"/>
+                <w:color w:val="0F5FDC"/>
+                <w:sz w:val="18"/>
+                <w:szCs w:val="18"/>
+              </w:rPr>
+              <w:t xml:space="preserve">SINGLE</w:t>
+            </w:r>
+            <w:r>
+              <w:rPr>
+                <w:sz w:val="19"/>
+                <w:szCs w:val="19"/>
+              </w:rPr>
+              <w:t xml:space="preserve"> with MailFileDir)</w:t>
             </w:r>
           </w:p>
         </w:tc>
@@ -17928,7 +18085,7 @@
                 <w:sz w:val="19"/>
                 <w:szCs w:val="19"/>
               </w:rPr>
-              <w:t xml:space="preserve">Worksheet 11d</w:t>
+              <w:t xml:space="preserve">Worksheet 11a</w:t>
             </w:r>
           </w:p>
         </w:tc>
@@ -17964,7 +18121,7 @@
                 <w:sz w:val="19"/>
                 <w:szCs w:val="19"/>
               </w:rPr>
-              <w:t xml:space="preserve">MailTemplate</w:t>
+              <w:t xml:space="preserve">MailFolderMax</w:t>
             </w:r>
           </w:p>
         </w:tc>
@@ -17995,7 +18152,7 @@
                 <w:sz w:val="19"/>
                 <w:szCs w:val="19"/>
               </w:rPr>
-              <w:t xml:space="preserve">Mail template file, e.g. </w:t>
+              <w:t xml:space="preserve">The number of folders you created in B4, e.g. </w:t>
             </w:r>
             <w:r>
               <w:rPr>
@@ -18004,14 +18161,14 @@
                 <w:sz w:val="18"/>
                 <w:szCs w:val="18"/>
               </w:rPr>
-              <w:t xml:space="preserve">mail12.ntf</w:t>
-            </w:r>
-            <w:r>
-              <w:rPr>
-                <w:sz w:val="19"/>
-                <w:szCs w:val="19"/>
-              </w:rPr>
-              <w:t xml:space="preserve"> (empty = registration default)</w:t>
+              <w:t xml:space="preserve">5</w:t>
+            </w:r>
+            <w:r>
+              <w:rPr>
+                <w:sz w:val="19"/>
+                <w:szCs w:val="19"/>
+              </w:rPr>
+              <w:t xml:space="preserve"> for mail1–mail5</w:t>
             </w:r>
           </w:p>
         </w:tc>
@@ -18042,7 +18199,7 @@
                 <w:sz w:val="19"/>
                 <w:szCs w:val="19"/>
               </w:rPr>
-              <w:t xml:space="preserve">Worksheet 11b</w:t>
+              <w:t xml:space="preserve">Worksheet 11d</w:t>
             </w:r>
           </w:p>
         </w:tc>
@@ -18078,7 +18235,7 @@
                 <w:sz w:val="19"/>
                 <w:szCs w:val="19"/>
               </w:rPr>
-              <w:t xml:space="preserve">MailACLManager / MailQuotaSizeLimit</w:t>
+              <w:t xml:space="preserve">MailTemplate</w:t>
             </w:r>
           </w:p>
         </w:tc>
@@ -18109,7 +18266,23 @@
                 <w:sz w:val="19"/>
                 <w:szCs w:val="19"/>
               </w:rPr>
-              <w:t xml:space="preserve">Optional: Manager of each new mail file; quota in MB (0 = none)</w:t>
+              <w:t xml:space="preserve">Mail template file, e.g. </w:t>
+            </w:r>
+            <w:r>
+              <w:rPr>
+                <w:rFonts w:ascii="Consolas" w:cs="Consolas" w:eastAsia="Consolas" w:hAnsi="Consolas"/>
+                <w:color w:val="0F5FDC"/>
+                <w:sz w:val="18"/>
+                <w:szCs w:val="18"/>
+              </w:rPr>
+              <w:t xml:space="preserve">mail12.ntf</w:t>
+            </w:r>
+            <w:r>
+              <w:rPr>
+                <w:sz w:val="19"/>
+                <w:szCs w:val="19"/>
+              </w:rPr>
+              <w:t xml:space="preserve"> (empty = registration default)</w:t>
             </w:r>
           </w:p>
         </w:tc>
@@ -18140,7 +18313,7 @@
                 <w:sz w:val="19"/>
                 <w:szCs w:val="19"/>
               </w:rPr>
-              <w:t xml:space="preserve">Worksheet 11c</w:t>
+              <w:t xml:space="preserve">Worksheet 11b</w:t>
             </w:r>
           </w:p>
         </w:tc>
@@ -18176,7 +18349,7 @@
                 <w:sz w:val="19"/>
                 <w:szCs w:val="19"/>
               </w:rPr>
-              <w:t xml:space="preserve">LogServer / LogDb</w:t>
+              <w:t xml:space="preserve">MailACLManager / MailQuotaSizeLimit</w:t>
             </w:r>
           </w:p>
         </w:tc>
@@ -18207,7 +18380,7 @@
                 <w:sz w:val="19"/>
                 <w:szCs w:val="19"/>
               </w:rPr>
-              <w:t xml:space="preserve">Leave empty unless you create the log database in B15</w:t>
+              <w:t xml:space="preserve">Optional: Manager of each new mail file; quota in MB (0 = none)</w:t>
             </w:r>
           </w:p>
         </w:tc>
@@ -18238,7 +18411,7 @@
                 <w:sz w:val="19"/>
                 <w:szCs w:val="19"/>
               </w:rPr>
-              <w:t xml:space="preserve">B15</w:t>
+              <w:t xml:space="preserve">Worksheet 11c</w:t>
             </w:r>
           </w:p>
         </w:tc>
@@ -18274,6 +18447,104 @@
                 <w:sz w:val="19"/>
                 <w:szCs w:val="19"/>
               </w:rPr>
+              <w:t xml:space="preserve">LogServer / LogDb</w:t>
+            </w:r>
+          </w:p>
+        </w:tc>
+        <w:tc>
+          <w:tcPr>
+            <w:tcW w:type="dxa" w:w="5251"/>
+            <w:tcBorders>
+              <w:top w:val="single" w:color="DCE6F0" w:sz="4"/>
+              <w:left w:val="single" w:color="DCE6F0" w:sz="4"/>
+              <w:bottom w:val="single" w:color="DCE6F0" w:sz="4"/>
+              <w:right w:val="single" w:color="DCE6F0" w:sz="4"/>
+            </w:tcBorders>
+            <w:shd w:fill="F7F7FC" w:color="auto" w:val="clear"/>
+            <w:tcMar>
+              <w:top w:type="dxa" w:w="60"/>
+              <w:left w:type="dxa" w:w="100"/>
+              <w:bottom w:type="dxa" w:w="60"/>
+              <w:right w:type="dxa" w:w="100"/>
+            </w:tcMar>
+            <w:vAlign w:val="top"/>
+          </w:tcPr>
+          <w:p>
+            <w:pPr>
+              <w:spacing w:after="0" w:before="0"/>
+            </w:pPr>
+            <w:r>
+              <w:rPr>
+                <w:sz w:val="19"/>
+                <w:szCs w:val="19"/>
+              </w:rPr>
+              <w:t xml:space="preserve">Leave empty unless you create the log database in B15</w:t>
+            </w:r>
+          </w:p>
+        </w:tc>
+        <w:tc>
+          <w:tcPr>
+            <w:tcW w:type="dxa" w:w="2019"/>
+            <w:tcBorders>
+              <w:top w:val="single" w:color="DCE6F0" w:sz="4"/>
+              <w:left w:val="single" w:color="DCE6F0" w:sz="4"/>
+              <w:bottom w:val="single" w:color="DCE6F0" w:sz="4"/>
+              <w:right w:val="single" w:color="DCE6F0" w:sz="4"/>
+            </w:tcBorders>
+            <w:shd w:fill="F7F7FC" w:color="auto" w:val="clear"/>
+            <w:tcMar>
+              <w:top w:type="dxa" w:w="60"/>
+              <w:left w:type="dxa" w:w="100"/>
+              <w:bottom w:type="dxa" w:w="60"/>
+              <w:right w:type="dxa" w:w="100"/>
+            </w:tcMar>
+            <w:vAlign w:val="top"/>
+          </w:tcPr>
+          <w:p>
+            <w:pPr>
+              <w:spacing w:after="0" w:before="0"/>
+            </w:pPr>
+            <w:r>
+              <w:rPr>
+                <w:sz w:val="19"/>
+                <w:szCs w:val="19"/>
+              </w:rPr>
+              <w:t xml:space="preserve">B15</w:t>
+            </w:r>
+          </w:p>
+        </w:tc>
+      </w:tr>
+      <w:tr>
+        <w:trPr>
+          <w:cantSplit/>
+        </w:trPr>
+        <w:tc>
+          <w:tcPr>
+            <w:tcW w:type="dxa" w:w="2368"/>
+            <w:tcBorders>
+              <w:top w:val="single" w:color="DCE6F0" w:sz="4"/>
+              <w:left w:val="single" w:color="DCE6F0" w:sz="4"/>
+              <w:bottom w:val="single" w:color="DCE6F0" w:sz="4"/>
+              <w:right w:val="single" w:color="DCE6F0" w:sz="4"/>
+            </w:tcBorders>
+            <w:shd w:fill="FFFFFF" w:color="auto" w:val="clear"/>
+            <w:tcMar>
+              <w:top w:type="dxa" w:w="60"/>
+              <w:left w:type="dxa" w:w="100"/>
+              <w:bottom w:type="dxa" w:w="60"/>
+              <w:right w:type="dxa" w:w="100"/>
+            </w:tcMar>
+            <w:vAlign w:val="top"/>
+          </w:tcPr>
+          <w:p>
+            <w:pPr>
+              <w:spacing w:after="0" w:before="0"/>
+            </w:pPr>
+            <w:r>
+              <w:rPr>
+                <w:sz w:val="19"/>
+                <w:szCs w:val="19"/>
+              </w:rPr>
               <w:t xml:space="preserve">DryRun</w:t>
             </w:r>
           </w:p>
@@ -18287,7 +18558,7 @@
               <w:bottom w:val="single" w:color="DCE6F0" w:sz="4"/>
               <w:right w:val="single" w:color="DCE6F0" w:sz="4"/>
             </w:tcBorders>
-            <w:shd w:fill="F7F7FC" w:color="auto" w:val="clear"/>
+            <w:shd w:fill="FFFFFF" w:color="auto" w:val="clear"/>
             <w:tcMar>
               <w:top w:type="dxa" w:w="60"/>
               <w:left w:type="dxa" w:w="100"/>
@@ -18327,7 +18598,7 @@
               <w:bottom w:val="single" w:color="DCE6F0" w:sz="4"/>
               <w:right w:val="single" w:color="DCE6F0" w:sz="4"/>
             </w:tcBorders>
-            <w:shd w:fill="F7F7FC" w:color="auto" w:val="clear"/>
+            <w:shd w:fill="FFFFFF" w:color="auto" w:val="clear"/>
             <w:tcMar>
               <w:top w:type="dxa" w:w="60"/>
               <w:left w:type="dxa" w:w="100"/>
@@ -30973,7 +31244,7 @@
                 <w:sz w:val="19"/>
                 <w:szCs w:val="19"/>
               </w:rPr>
-              <w:t xml:space="preserve">– / log.nsf</w:t>
+              <w:t xml:space="preserve">– / certlog.nsf</w:t>
             </w:r>
           </w:p>
         </w:tc>
@@ -31004,7 +31275,23 @@
                 <w:sz w:val="19"/>
                 <w:szCs w:val="19"/>
               </w:rPr>
-              <w:t xml:space="preserve">Server that registers; Domino registration log</w:t>
+              <w:t xml:space="preserve">Server that registers. RegistrationLog: HCL logs to </w:t>
+            </w:r>
+            <w:r>
+              <w:rPr>
+                <w:b/>
+                <w:bCs/>
+                <w:sz w:val="19"/>
+                <w:szCs w:val="19"/>
+              </w:rPr>
+              <w:t xml:space="preserve">CERTLOG.NSF</w:t>
+            </w:r>
+            <w:r>
+              <w:rPr>
+                <w:sz w:val="19"/>
+                <w:szCs w:val="19"/>
+              </w:rPr>
+              <w:t xml:space="preserve"> on the registration server when the value is not empty (empty = no certification logging). Keep certlog.nsf.</w:t>
             </w:r>
           </w:p>
         </w:tc>
@@ -36732,7 +37019,7 @@
                 <w:sz w:val="19"/>
                 <w:szCs w:val="19"/>
               </w:rPr>
-              <w:t xml:space="preserve">Domino registration log</w:t>
+              <w:t xml:space="preserve">Certification Log</w:t>
             </w:r>
           </w:p>
         </w:tc>
@@ -36763,7 +37050,7 @@
                 <w:sz w:val="19"/>
                 <w:szCs w:val="19"/>
               </w:rPr>
-              <w:t xml:space="preserve">log.nsf on the registration server</w:t>
+              <w:t xml:space="preserve">certlog.nsf on the registration server</w:t>
             </w:r>
           </w:p>
         </w:tc>
@@ -36794,7 +37081,7 @@
                 <w:sz w:val="19"/>
                 <w:szCs w:val="19"/>
               </w:rPr>
-              <w:t xml:space="preserve">Domino's own records</w:t>
+              <w:t xml:space="preserve">Domino's record of every certification and registration (written because RegistrationLog is not empty)</w:t>
             </w:r>
           </w:p>
         </w:tc>
@@ -36830,6 +37117,104 @@
                 <w:sz w:val="19"/>
                 <w:szCs w:val="19"/>
               </w:rPr>
+              <w:t xml:space="preserve">Domino server log</w:t>
+            </w:r>
+          </w:p>
+        </w:tc>
+        <w:tc>
+          <w:tcPr>
+            <w:tcW w:type="dxa" w:w="4427"/>
+            <w:tcBorders>
+              <w:top w:val="single" w:color="DCE6F0" w:sz="4"/>
+              <w:left w:val="single" w:color="DCE6F0" w:sz="4"/>
+              <w:bottom w:val="single" w:color="DCE6F0" w:sz="4"/>
+              <w:right w:val="single" w:color="DCE6F0" w:sz="4"/>
+            </w:tcBorders>
+            <w:shd w:fill="F7F7FC" w:color="auto" w:val="clear"/>
+            <w:tcMar>
+              <w:top w:type="dxa" w:w="60"/>
+              <w:left w:type="dxa" w:w="100"/>
+              <w:bottom w:type="dxa" w:w="60"/>
+              <w:right w:type="dxa" w:w="100"/>
+            </w:tcMar>
+            <w:vAlign w:val="top"/>
+          </w:tcPr>
+          <w:p>
+            <w:pPr>
+              <w:spacing w:after="0" w:before="0"/>
+            </w:pPr>
+            <w:r>
+              <w:rPr>
+                <w:sz w:val="19"/>
+                <w:szCs w:val="19"/>
+              </w:rPr>
+              <w:t xml:space="preserve">log.nsf on the registration and home servers</w:t>
+            </w:r>
+          </w:p>
+        </w:tc>
+        <w:tc>
+          <w:tcPr>
+            <w:tcW w:type="dxa" w:w="3152"/>
+            <w:tcBorders>
+              <w:top w:val="single" w:color="DCE6F0" w:sz="4"/>
+              <w:left w:val="single" w:color="DCE6F0" w:sz="4"/>
+              <w:bottom w:val="single" w:color="DCE6F0" w:sz="4"/>
+              <w:right w:val="single" w:color="DCE6F0" w:sz="4"/>
+            </w:tcBorders>
+            <w:shd w:fill="F7F7FC" w:color="auto" w:val="clear"/>
+            <w:tcMar>
+              <w:top w:type="dxa" w:w="60"/>
+              <w:left w:type="dxa" w:w="100"/>
+              <w:bottom w:type="dxa" w:w="60"/>
+              <w:right w:type="dxa" w:w="100"/>
+            </w:tcMar>
+            <w:vAlign w:val="top"/>
+          </w:tcPr>
+          <w:p>
+            <w:pPr>
+              <w:spacing w:after="0" w:before="0"/>
+            </w:pPr>
+            <w:r>
+              <w:rPr>
+                <w:sz w:val="19"/>
+                <w:szCs w:val="19"/>
+              </w:rPr>
+              <w:t xml:space="preserve">General server events, e.g. mail file creation and Administration Process messages; useful for troubleshooting</w:t>
+            </w:r>
+          </w:p>
+        </w:tc>
+      </w:tr>
+      <w:tr>
+        <w:trPr>
+          <w:cantSplit/>
+        </w:trPr>
+        <w:tc>
+          <w:tcPr>
+            <w:tcW w:type="dxa" w:w="2059"/>
+            <w:tcBorders>
+              <w:top w:val="single" w:color="DCE6F0" w:sz="4"/>
+              <w:left w:val="single" w:color="DCE6F0" w:sz="4"/>
+              <w:bottom w:val="single" w:color="DCE6F0" w:sz="4"/>
+              <w:right w:val="single" w:color="DCE6F0" w:sz="4"/>
+            </w:tcBorders>
+            <w:shd w:fill="FFFFFF" w:color="auto" w:val="clear"/>
+            <w:tcMar>
+              <w:top w:type="dxa" w:w="60"/>
+              <w:left w:type="dxa" w:w="100"/>
+              <w:bottom w:type="dxa" w:w="60"/>
+              <w:right w:type="dxa" w:w="100"/>
+            </w:tcMar>
+            <w:vAlign w:val="top"/>
+          </w:tcPr>
+          <w:p>
+            <w:pPr>
+              <w:spacing w:after="0" w:before="0"/>
+            </w:pPr>
+            <w:r>
+              <w:rPr>
+                <w:sz w:val="19"/>
+                <w:szCs w:val="19"/>
+              </w:rPr>
               <w:t xml:space="preserve">Helper actions log</w:t>
             </w:r>
           </w:p>
@@ -36843,7 +37228,7 @@
               <w:bottom w:val="single" w:color="DCE6F0" w:sz="4"/>
               <w:right w:val="single" w:color="DCE6F0" w:sz="4"/>
             </w:tcBorders>
-            <w:shd w:fill="F7F7FC" w:color="auto" w:val="clear"/>
+            <w:shd w:fill="FFFFFF" w:color="auto" w:val="clear"/>
             <w:tcMar>
               <w:top w:type="dxa" w:w="60"/>
               <w:left w:type="dxa" w:w="100"/>
@@ -36874,7 +37259,7 @@
               <w:bottom w:val="single" w:color="DCE6F0" w:sz="4"/>
               <w:right w:val="single" w:color="DCE6F0" w:sz="4"/>
             </w:tcBorders>
-            <w:shd w:fill="F7F7FC" w:color="auto" w:val="clear"/>
+            <w:shd w:fill="FFFFFF" w:color="auto" w:val="clear"/>
             <w:tcMar>
               <w:top w:type="dxa" w:w="60"/>
               <w:left w:type="dxa" w:w="100"/>
@@ -38576,7 +38961,27 @@
         <w:t xml:space="preserve">LogLevel=DEBUG</w:t>
       </w:r>
       <w:r>
-        <w:t xml:space="preserve">, rebuild a 1-user batch (ExtraSelection), dry-run it, and read the debug log. FAILED rows show the stage (load, validate, configure, RegisterNewUser, verify, preserveMail, vault) and the Notes error.</w:t>
+        <w:t xml:space="preserve">, rebuild a 1-user batch (ExtraSelection), dry-run it, and read the debug log. FAILED rows show the stage (load, validate, configure, RegisterNewUser, verify, preserveMail, vault) and the Notes error. Cross-check the same time in </w:t>
+      </w:r>
+      <w:r>
+        <w:rPr>
+          <w:b/>
+          <w:bCs/>
+        </w:rPr>
+        <w:t xml:space="preserve">certlog.nsf</w:t>
+      </w:r>
+      <w:r>
+        <w:t xml:space="preserve"> on the registration server (certification and registration records) and in </w:t>
+      </w:r>
+      <w:r>
+        <w:rPr>
+          <w:b/>
+          <w:bCs/>
+        </w:rPr>
+        <w:t xml:space="preserve">log.nsf</w:t>
+      </w:r>
+      <w:r>
+        <w:t xml:space="preserve"> on the registration and home servers (server events, mail file creation, Administration Process).</w:t>
       </w:r>
     </w:p>
     <w:tbl>
@@ -45252,7 +45657,7 @@
       <w:r>
         <w:t xml:space="preserve">Registering Active Directory users (Directory Sync) – </w:t>
       </w:r>
-      <w:hyperlink w:history="1" r:id="rIdc5her6wrk9seq7rmz9a5s">
+      <w:hyperlink w:history="1" r:id="rIdmq-im0sw-3s1u3wssxgu3">
         <w:r>
           <w:rPr>
             <w:rStyle w:val="Hyperlink"/>
@@ -45274,7 +45679,7 @@
       <w:r>
         <w:t xml:space="preserve">ContactNoteID property – </w:t>
       </w:r>
-      <w:hyperlink w:history="1" r:id="rIdsen41p-y3z3_zwzlkwye3">
+      <w:hyperlink w:history="1" r:id="rIduve4x23givjkmy2ph8zj-">
         <w:r>
           <w:rPr>
             <w:rStyle w:val="Hyperlink"/>
@@ -45296,7 +45701,7 @@
       <w:r>
         <w:t xml:space="preserve">RegisterNewUser method – </w:t>
       </w:r>
-      <w:hyperlink w:history="1" r:id="rId82rxm0vzugay1ccubiubj">
+      <w:hyperlink w:history="1" r:id="rIdexf8kuohi4hj5t7k3vxse">
         <w:r>
           <w:rPr>
             <w:rStyle w:val="Hyperlink"/>
@@ -45318,7 +45723,7 @@
       <w:r>
         <w:t xml:space="preserve">Creating an ID vault – </w:t>
       </w:r>
-      <w:hyperlink w:history="1" r:id="rIddg602vdyl7si-iermxuan">
+      <w:hyperlink w:history="1" r:id="rIdlojxu4wesz0_viymdds-w">
         <w:r>
           <w:rPr>
             <w:rStyle w:val="Hyperlink"/>
@@ -45340,7 +45745,7 @@
       <w:r>
         <w:t xml:space="preserve">Assigning users to a vault (Security Settings, ID Vault tab) – </w:t>
       </w:r>
-      <w:hyperlink w:history="1" r:id="rIdsektiz8yvqzboigvz1c7-">
+      <w:hyperlink w:history="1" r:id="rIdkfrrbt2ac2jvsobac1ixt">
         <w:r>
           <w:rPr>
             <w:rStyle w:val="Hyperlink"/>
@@ -45362,7 +45767,7 @@
       <w:r>
         <w:t xml:space="preserve">Creating a security policy settings document – </w:t>
       </w:r>
-      <w:hyperlink w:history="1" r:id="rIdwst9mtajefcqxyna715y8">
+      <w:hyperlink w:history="1" r:id="rIdsfeopfp4ehof6jkdhipsc">
         <w:r>
           <w:rPr>
             <w:rStyle w:val="Hyperlink"/>
@@ -45384,7 +45789,7 @@
       <w:r>
         <w:t xml:space="preserve">Creating a policy document (explicit policy names */name) – </w:t>
       </w:r>
-      <w:hyperlink w:history="1" r:id="rIdbec2l8bn9py2rahqwsu_l">
+      <w:hyperlink w:history="1" r:id="rIdzkt-i8lvwhgqfva49a6ax">
         <w:r>
           <w:rPr>
             <w:rStyle w:val="Hyperlink"/>
@@ -45406,7 +45811,7 @@
       <w:r>
         <w:t xml:space="preserve">Modifying a server-based CA (adding RAs) – </w:t>
       </w:r>
-      <w:hyperlink w:history="1" r:id="rIdmsomjq0vz3mattjhq7xz4">
+      <w:hyperlink w:history="1" r:id="rId4mxq8mai5ieogig4xiowz">
         <w:r>
           <w:rPr>
             <w:rStyle w:val="Hyperlink"/>
@@ -45428,7 +45833,7 @@
       <w:r>
         <w:t xml:space="preserve">Administration roles in the Domino Directory ACL – </w:t>
       </w:r>
-      <w:hyperlink w:history="1" r:id="rIdckgvwrkr5v6hnzzpxfrbr">
+      <w:hyperlink w:history="1" r:id="rIdswmaipkoncspgga5pagap">
         <w:r>
           <w:rPr>
             <w:rStyle w:val="Hyperlink"/>
@@ -45450,7 +45855,7 @@
       <w:r>
         <w:t xml:space="preserve">Configuring a database ACL (Manage ACL) – </w:t>
       </w:r>
-      <w:hyperlink w:history="1" r:id="rIdwljnw4vkpealagse0nbvc">
+      <w:hyperlink w:history="1" r:id="rIdqt321r5ipbmaxok5ipmrv">
         <w:r>
           <w:rPr>
             <w:rStyle w:val="Hyperlink"/>
@@ -45472,7 +45877,7 @@
       <w:r>
         <w:t xml:space="preserve">Creating a database from a template – </w:t>
       </w:r>
-      <w:hyperlink w:history="1" r:id="rIdbdaknycptkgd-1ozgnaps">
+      <w:hyperlink w:history="1" r:id="rIdstg2_hz5etd6kvb6_s4v_">
         <w:r>
           <w:rPr>
             <w:rStyle w:val="Hyperlink"/>
@@ -45494,7 +45899,7 @@
       <w:r>
         <w:t xml:space="preserve">Script libraries (Designer) – </w:t>
       </w:r>
-      <w:hyperlink w:history="1" r:id="rId8r3o4dninujkrlabyg8r5">
+      <w:hyperlink w:history="1" r:id="rIdtpqtaf9ipgt9rx75-l9hi">
         <w:r>
           <w:rPr>
             <w:rStyle w:val="Hyperlink"/>
@@ -45516,7 +45921,7 @@
       <w:r>
         <w:t xml:space="preserve">Creating an agent (Designer) – </w:t>
       </w:r>
-      <w:hyperlink w:history="1" r:id="rIdu59wh8gp_qfzmcmrmbosh">
+      <w:hyperlink w:history="1" r:id="rIdka4q6wkkxiui1jd-jcrvf">
         <w:r>
           <w:rPr>
             <w:rStyle w:val="Hyperlink"/>
@@ -45538,7 +45943,7 @@
       <w:r>
         <w:t xml:space="preserve">Naming agents: aliases '|' and cascading '\' – </w:t>
       </w:r>
-      <w:hyperlink w:history="1" r:id="rIdsdpcedhws8snipeza15mq">
+      <w:hyperlink w:history="1" r:id="rIdhobe3vpvx37vvrwzkhzfp">
         <w:r>
           <w:rPr>
             <w:rStyle w:val="Hyperlink"/>
@@ -45560,7 +45965,7 @@
       <w:r>
         <w:t xml:space="preserve">Signing a database – </w:t>
       </w:r>
-      <w:hyperlink w:history="1" r:id="rIdfnnivbbz8tm-izfosxznz">
+      <w:hyperlink w:history="1" r:id="rIdjkfhu56wbrgb6iuk9vgl6">
         <w:r>
           <w:rPr>
             <w:rStyle w:val="Hyperlink"/>
@@ -45582,7 +45987,7 @@
       <w:r>
         <w:t xml:space="preserve">Checking field values (Document Properties) – </w:t>
       </w:r>
-      <w:hyperlink w:history="1" r:id="rIdrarufed7ggpomeyvgk9s5">
+      <w:hyperlink w:history="1" r:id="rIdjcinhmx0e-i9qlbsfzh4u">
         <w:r>
           <w:rPr>
             <w:rStyle w:val="Hyperlink"/>
@@ -45604,7 +46009,7 @@
       <w:r>
         <w:t xml:space="preserve">Execution Security Alert (ECL) – </w:t>
       </w:r>
-      <w:hyperlink w:history="1" r:id="rIdtjgrn1kawkucyqzcuo4j3">
+      <w:hyperlink w:history="1" r:id="rIdmplrjqw-4pxjf0y6g1yuj">
         <w:r>
           <w:rPr>
             <w:rStyle w:val="Hyperlink"/>
@@ -46061,7 +46466,7 @@
         <w:sz w:val="16"/>
         <w:szCs w:val="16"/>
       </w:rPr>
-      <w:t xml:space="preserve">HCL Confidential – Internal Use  |  v2.5</w:t>
+      <w:t xml:space="preserve">HCL Confidential – Internal Use  |  v2.6</w:t>
     </w:r>
     <w:r>
       <w:rPr>

</xml_diff>

<commit_message>
Mail folders directly under the data directory, clearer settings (BulkReg 1.7.0)
- Numbered folders <MailFolderPrefix><n> (mail1, mail2 ...) sit directly in the Domino data
  directory next to the existing mail folder; start-up check rejects a prefix with a
  number (mail1) or a path (mail\\mail)
- New MailExistingFolders (default mail): checked for duplicate names, never written to;
  uniqueness scan now limited to numbered folders + existing mail folders
- bulkreg.ini: folder diagram and plain explanations; MailFileDir only for SINGLE mode
- Guide v2.8 (B4, B11, D3, D3a, D6) and README
</commit_message>
<xml_diff>
--- a/docs/BulkReg_Admin_Guide.docx
+++ b/docs/BulkReg_Admin_Guide.docx
@@ -170,7 +170,7 @@
                 <w:sz w:val="20"/>
                 <w:szCs w:val="20"/>
               </w:rPr>
-              <w:t xml:space="preserve">Version 2.7  |  October 2026  |  Draft for review</w:t>
+              <w:t xml:space="preserve">Version 2.8  |  October 2026  |  Draft for review</w:t>
             </w:r>
           </w:p>
           <w:p>
@@ -482,7 +482,7 @@
                 <w:sz w:val="19"/>
                 <w:szCs w:val="19"/>
               </w:rPr>
-              <w:t xml:space="preserve">2.7 (Draft for review)</w:t>
+              <w:t xml:space="preserve">2.8 (Draft for review)</w:t>
             </w:r>
           </w:p>
         </w:tc>
@@ -766,7 +766,7 @@
                 <w:sz w:val="19"/>
                 <w:szCs w:val="19"/>
               </w:rPr>
-              <w:t xml:space="preserve">BulkReg 1.6.0: BulkRegCommon library, 5 agents, config templates, optional PowerShell helper, Audit Viewer</w:t>
+              <w:t xml:space="preserve">BulkReg 1.7.0: BulkRegCommon library, 5 agents, config templates, optional PowerShell helper, Audit Viewer</w:t>
             </w:r>
           </w:p>
         </w:tc>
@@ -972,7 +972,7 @@
                 <w:sz w:val="19"/>
                 <w:szCs w:val="19"/>
               </w:rPr>
-              <w:t xml:space="preserve">2.7</w:t>
+              <w:t xml:space="preserve">2.8</w:t>
             </w:r>
           </w:p>
         </w:tc>
@@ -1003,7 +1003,7 @@
                 <w:sz w:val="19"/>
                 <w:szCs w:val="19"/>
               </w:rPr>
-              <w:t xml:space="preserve">New one-page </w:t>
+              <w:t xml:space="preserve">Mail folder layout made explicit: mail1, mail2 … are created </w:t>
             </w:r>
             <w:r>
               <w:rPr>
@@ -1012,14 +1012,14 @@
                 <w:sz w:val="19"/>
                 <w:szCs w:val="19"/>
               </w:rPr>
-              <w:t xml:space="preserve">Agent Run Order</w:t>
-            </w:r>
-            <w:r>
-              <w:rPr>
-                <w:sz w:val="19"/>
-                <w:szCs w:val="19"/>
-              </w:rPr>
-              <w:t xml:space="preserve"> at the front of the guide (flow, step table with DryRun setting, input/output and go/no-go per step, rules).</w:t>
+              <w:t xml:space="preserve">directly under the Domino data directory</w:t>
+            </w:r>
+            <w:r>
+              <w:rPr>
+                <w:sz w:val="19"/>
+                <w:szCs w:val="19"/>
+              </w:rPr>
+              <w:t xml:space="preserve">, next to the existing mail folder, not inside it. Folder diagram, plain explanation of MailFolderPrefix / MailFileDir / new MailExistingFolders. BulkReg rejects a prefix with a number (mail1) or a path (mail\mail) at start-up.</w:t>
             </w:r>
           </w:p>
         </w:tc>
@@ -1055,7 +1055,7 @@
                 <w:sz w:val="19"/>
                 <w:szCs w:val="19"/>
               </w:rPr>
-              <w:t xml:space="preserve">2.6</w:t>
+              <w:t xml:space="preserve">2.7</w:t>
             </w:r>
           </w:p>
         </w:tc>
@@ -1086,7 +1086,7 @@
                 <w:sz w:val="19"/>
                 <w:szCs w:val="19"/>
               </w:rPr>
-              <w:t xml:space="preserve">RegistrationLog corrected: registration is logged to the </w:t>
+              <w:t xml:space="preserve">New one-page </w:t>
             </w:r>
             <w:r>
               <w:rPr>
@@ -1095,14 +1095,14 @@
                 <w:sz w:val="19"/>
                 <w:szCs w:val="19"/>
               </w:rPr>
-              <w:t xml:space="preserve">Certification Log certlog.nsf</w:t>
-            </w:r>
-            <w:r>
-              <w:rPr>
-                <w:sz w:val="19"/>
-                <w:szCs w:val="19"/>
-              </w:rPr>
-              <w:t xml:space="preserve"> on the registration server (HCL: any non-empty value → CERTLOG.NSF; empty = no logging). log.nsf is the server's general log. Prerequisite check for certlog.nsf added (B4).</w:t>
+              <w:t xml:space="preserve">Agent Run Order</w:t>
+            </w:r>
+            <w:r>
+              <w:rPr>
+                <w:sz w:val="19"/>
+                <w:szCs w:val="19"/>
+              </w:rPr>
+              <w:t xml:space="preserve"> at the front of the guide (flow, step table with DryRun setting, input/output and go/no-go per step, rules).</w:t>
             </w:r>
           </w:p>
         </w:tc>
@@ -1138,7 +1138,7 @@
                 <w:sz w:val="19"/>
                 <w:szCs w:val="19"/>
               </w:rPr>
-              <w:t xml:space="preserve">2.5</w:t>
+              <w:t xml:space="preserve">2.6</w:t>
             </w:r>
           </w:p>
         </w:tc>
@@ -1164,6 +1164,13 @@
             <w:pPr>
               <w:spacing w:after="0" w:before="0"/>
             </w:pPr>
+            <w:r>
+              <w:rPr>
+                <w:sz w:val="19"/>
+                <w:szCs w:val="19"/>
+              </w:rPr>
+              <w:t xml:space="preserve">RegistrationLog corrected: registration is logged to the </w:t>
+            </w:r>
             <w:r>
               <w:rPr>
                 <w:b/>
@@ -1171,30 +1178,14 @@
                 <w:sz w:val="19"/>
                 <w:szCs w:val="19"/>
               </w:rPr>
-              <w:t xml:space="preserve">Prerequisite: pre-create the numbered mail folders</w:t>
-            </w:r>
-            <w:r>
-              <w:rPr>
-                <w:sz w:val="19"/>
-                <w:szCs w:val="19"/>
-              </w:rPr>
-              <w:t xml:space="preserve"> (mail1…mailN, one per 1000 users) on every home server (B4). Preflight calculates the folders needed per server and writes the create commands. New </w:t>
-            </w:r>
-            <w:r>
-              <w:rPr>
-                <w:rFonts w:ascii="Consolas" w:cs="Consolas" w:eastAsia="Consolas" w:hAnsi="Consolas"/>
-                <w:color w:val="0F5FDC"/>
-                <w:sz w:val="18"/>
-                <w:szCs w:val="18"/>
-              </w:rPr>
-              <w:t xml:space="preserve">MailFolderMax</w:t>
-            </w:r>
-            <w:r>
-              <w:rPr>
-                <w:sz w:val="19"/>
-                <w:szCs w:val="19"/>
-              </w:rPr>
-              <w:t xml:space="preserve">: Build Batch never assigns a folder above the number you created.</w:t>
+              <w:t xml:space="preserve">Certification Log certlog.nsf</w:t>
+            </w:r>
+            <w:r>
+              <w:rPr>
+                <w:sz w:val="19"/>
+                <w:szCs w:val="19"/>
+              </w:rPr>
+              <w:t xml:space="preserve"> on the registration server (HCL: any non-empty value → CERTLOG.NSF; empty = no logging). log.nsf is the server's general log. Prerequisite check for certlog.nsf added (B4).</w:t>
             </w:r>
           </w:p>
         </w:tc>
@@ -1230,7 +1221,7 @@
                 <w:sz w:val="19"/>
                 <w:szCs w:val="19"/>
               </w:rPr>
-              <w:t xml:space="preserve">2.4</w:t>
+              <w:t xml:space="preserve">2.5</w:t>
             </w:r>
           </w:p>
         </w:tc>
@@ -1256,13 +1247,6 @@
             <w:pPr>
               <w:spacing w:after="0" w:before="0"/>
             </w:pPr>
-            <w:r>
-              <w:rPr>
-                <w:sz w:val="19"/>
-                <w:szCs w:val="19"/>
-              </w:rPr>
-              <w:t xml:space="preserve">Mail file </w:t>
-            </w:r>
             <w:r>
               <w:rPr>
                 <w:b/>
@@ -1270,46 +1254,30 @@
                 <w:sz w:val="19"/>
                 <w:szCs w:val="19"/>
               </w:rPr>
-              <w:t xml:space="preserve">naming = last name</w:t>
-            </w:r>
-            <w:r>
-              <w:rPr>
-                <w:sz w:val="19"/>
-                <w:szCs w:val="19"/>
-              </w:rPr>
-              <w:t xml:space="preserve"> (configurable), </w:t>
-            </w:r>
-            <w:r>
-              <w:rPr>
-                <w:b/>
-                <w:bCs/>
-                <w:sz w:val="19"/>
-                <w:szCs w:val="19"/>
-              </w:rPr>
-              <w:t xml:space="preserve">uniqueness</w:t>
-            </w:r>
-            <w:r>
-              <w:rPr>
-                <w:sz w:val="19"/>
-                <w:szCs w:val="19"/>
-              </w:rPr>
-              <w:t xml:space="preserve"> checked against all mail folders on the home server, Person documents, open batches and the batch itself (clash → smith2.nsf or ERROR), </w:t>
-            </w:r>
-            <w:r>
-              <w:rPr>
-                <w:b/>
-                <w:bCs/>
-                <w:sz w:val="19"/>
-                <w:szCs w:val="19"/>
-              </w:rPr>
-              <w:t xml:space="preserve">numbered folders</w:t>
-            </w:r>
-            <w:r>
-              <w:rPr>
-                <w:sz w:val="19"/>
-                <w:szCs w:val="19"/>
-              </w:rPr>
-              <w:t xml:space="preserve"> mail1, mail2… with max 1000 mail files each. MailFileNote recorded in batch file, summary, results and audit.</w:t>
+              <w:t xml:space="preserve">Prerequisite: pre-create the numbered mail folders</w:t>
+            </w:r>
+            <w:r>
+              <w:rPr>
+                <w:sz w:val="19"/>
+                <w:szCs w:val="19"/>
+              </w:rPr>
+              <w:t xml:space="preserve"> (mail1…mailN, one per 1000 users) on every home server (B4). Preflight calculates the folders needed per server and writes the create commands. New </w:t>
+            </w:r>
+            <w:r>
+              <w:rPr>
+                <w:rFonts w:ascii="Consolas" w:cs="Consolas" w:eastAsia="Consolas" w:hAnsi="Consolas"/>
+                <w:color w:val="0F5FDC"/>
+                <w:sz w:val="18"/>
+                <w:szCs w:val="18"/>
+              </w:rPr>
+              <w:t xml:space="preserve">MailFolderMax</w:t>
+            </w:r>
+            <w:r>
+              <w:rPr>
+                <w:sz w:val="19"/>
+                <w:szCs w:val="19"/>
+              </w:rPr>
+              <w:t xml:space="preserve">: Build Batch never assigns a folder above the number you created.</w:t>
             </w:r>
           </w:p>
         </w:tc>
@@ -1345,7 +1313,7 @@
                 <w:sz w:val="19"/>
                 <w:szCs w:val="19"/>
               </w:rPr>
-              <w:t xml:space="preserve">2.3</w:t>
+              <w:t xml:space="preserve">2.4</w:t>
             </w:r>
           </w:p>
         </w:tc>
@@ -1371,6 +1339,13 @@
             <w:pPr>
               <w:spacing w:after="0" w:before="0"/>
             </w:pPr>
+            <w:r>
+              <w:rPr>
+                <w:sz w:val="19"/>
+                <w:szCs w:val="19"/>
+              </w:rPr>
+              <w:t xml:space="preserve">Mail file </w:t>
+            </w:r>
             <w:r>
               <w:rPr>
                 <w:b/>
@@ -1378,14 +1353,46 @@
                 <w:sz w:val="19"/>
                 <w:szCs w:val="19"/>
               </w:rPr>
-              <w:t xml:space="preserve">Every registered user now gets a Domino mail file</w:t>
-            </w:r>
-            <w:r>
-              <w:rPr>
-                <w:sz w:val="19"/>
-                <w:szCs w:val="19"/>
-              </w:rPr>
-              <w:t xml:space="preserve"> on the home server (MailFile column in the batch, reviewable). CreateMailDb / PreserveMailSystem removed. Mail file settings (folder, template, ACL manager, quota, full-text index), existence checks before and after registration, and mail file status in Verify.</w:t>
+              <w:t xml:space="preserve">naming = last name</w:t>
+            </w:r>
+            <w:r>
+              <w:rPr>
+                <w:sz w:val="19"/>
+                <w:szCs w:val="19"/>
+              </w:rPr>
+              <w:t xml:space="preserve"> (configurable), </w:t>
+            </w:r>
+            <w:r>
+              <w:rPr>
+                <w:b/>
+                <w:bCs/>
+                <w:sz w:val="19"/>
+                <w:szCs w:val="19"/>
+              </w:rPr>
+              <w:t xml:space="preserve">uniqueness</w:t>
+            </w:r>
+            <w:r>
+              <w:rPr>
+                <w:sz w:val="19"/>
+                <w:szCs w:val="19"/>
+              </w:rPr>
+              <w:t xml:space="preserve"> checked against all mail folders on the home server, Person documents, open batches and the batch itself (clash → smith2.nsf or ERROR), </w:t>
+            </w:r>
+            <w:r>
+              <w:rPr>
+                <w:b/>
+                <w:bCs/>
+                <w:sz w:val="19"/>
+                <w:szCs w:val="19"/>
+              </w:rPr>
+              <w:t xml:space="preserve">numbered folders</w:t>
+            </w:r>
+            <w:r>
+              <w:rPr>
+                <w:sz w:val="19"/>
+                <w:szCs w:val="19"/>
+              </w:rPr>
+              <w:t xml:space="preserve"> mail1, mail2… with max 1000 mail files each. MailFileNote recorded in batch file, summary, results and audit.</w:t>
             </w:r>
           </w:p>
         </w:tc>
@@ -1421,7 +1428,7 @@
                 <w:sz w:val="19"/>
                 <w:szCs w:val="19"/>
               </w:rPr>
-              <w:t xml:space="preserve">2.1</w:t>
+              <w:t xml:space="preserve">2.3</w:t>
             </w:r>
           </w:p>
         </w:tc>
@@ -1447,13 +1454,6 @@
             <w:pPr>
               <w:spacing w:after="0" w:before="0"/>
             </w:pPr>
-            <w:r>
-              <w:rPr>
-                <w:sz w:val="19"/>
-                <w:szCs w:val="19"/>
-              </w:rPr>
-              <w:t xml:space="preserve">Name formats: servers in canonical (CN=DominoADMail/O=Demo) or abbreviated (DominoADMail/Demo) form, both accepted by the code. </w:t>
-            </w:r>
             <w:r>
               <w:rPr>
                 <w:b/>
@@ -1461,30 +1461,14 @@
                 <w:sz w:val="19"/>
                 <w:szCs w:val="19"/>
               </w:rPr>
-              <w:t xml:space="preserve">Organizational policies</w:t>
-            </w:r>
-            <w:r>
-              <w:rPr>
-                <w:sz w:val="19"/>
-                <w:szCs w:val="19"/>
-              </w:rPr>
-              <w:t xml:space="preserve"> (</w:t>
-            </w:r>
-            <w:r>
-              <w:rPr>
-                <w:i/>
-                <w:iCs/>
-                <w:sz w:val="19"/>
-                <w:szCs w:val="19"/>
-              </w:rPr>
-              <w:t xml:space="preserve">/Demo, </w:t>
-            </w:r>
-            <w:r>
-              <w:rPr>
-                <w:sz w:val="19"/>
-                <w:szCs w:val="19"/>
-              </w:rPr>
-              <w:t xml:space="preserve">/Sales/Demo) supported alongside explicit policies (B8 Option B, OrgPolicyAssignsVault, '-' in the mapping). Consistent 'Demo' examples.</w:t>
+              <w:t xml:space="preserve">Every registered user now gets a Domino mail file</w:t>
+            </w:r>
+            <w:r>
+              <w:rPr>
+                <w:sz w:val="19"/>
+                <w:szCs w:val="19"/>
+              </w:rPr>
+              <w:t xml:space="preserve"> on the home server (MailFile column in the batch, reviewable). CreateMailDb / PreserveMailSystem removed. Mail file settings (folder, template, ACL manager, quota, full-text index), existence checks before and after registration, and mail file status in Verify.</w:t>
             </w:r>
           </w:p>
         </w:tc>
@@ -1520,6 +1504,105 @@
                 <w:sz w:val="19"/>
                 <w:szCs w:val="19"/>
               </w:rPr>
+              <w:t xml:space="preserve">2.1</w:t>
+            </w:r>
+          </w:p>
+        </w:tc>
+        <w:tc>
+          <w:tcPr>
+            <w:tcW w:type="dxa" w:w="8403"/>
+            <w:tcBorders>
+              <w:top w:val="single" w:color="DCE6F0" w:sz="4"/>
+              <w:left w:val="single" w:color="DCE6F0" w:sz="4"/>
+              <w:bottom w:val="single" w:color="DCE6F0" w:sz="4"/>
+              <w:right w:val="single" w:color="DCE6F0" w:sz="4"/>
+            </w:tcBorders>
+            <w:shd w:fill="F7F7FC" w:color="auto" w:val="clear"/>
+            <w:tcMar>
+              <w:top w:type="dxa" w:w="60"/>
+              <w:left w:type="dxa" w:w="100"/>
+              <w:bottom w:type="dxa" w:w="60"/>
+              <w:right w:type="dxa" w:w="100"/>
+            </w:tcMar>
+            <w:vAlign w:val="top"/>
+          </w:tcPr>
+          <w:p>
+            <w:pPr>
+              <w:spacing w:after="0" w:before="0"/>
+            </w:pPr>
+            <w:r>
+              <w:rPr>
+                <w:sz w:val="19"/>
+                <w:szCs w:val="19"/>
+              </w:rPr>
+              <w:t xml:space="preserve">Name formats: servers in canonical (CN=DominoADMail/O=Demo) or abbreviated (DominoADMail/Demo) form, both accepted by the code. </w:t>
+            </w:r>
+            <w:r>
+              <w:rPr>
+                <w:b/>
+                <w:bCs/>
+                <w:sz w:val="19"/>
+                <w:szCs w:val="19"/>
+              </w:rPr>
+              <w:t xml:space="preserve">Organizational policies</w:t>
+            </w:r>
+            <w:r>
+              <w:rPr>
+                <w:sz w:val="19"/>
+                <w:szCs w:val="19"/>
+              </w:rPr>
+              <w:t xml:space="preserve"> (</w:t>
+            </w:r>
+            <w:r>
+              <w:rPr>
+                <w:i/>
+                <w:iCs/>
+                <w:sz w:val="19"/>
+                <w:szCs w:val="19"/>
+              </w:rPr>
+              <w:t xml:space="preserve">/Demo, </w:t>
+            </w:r>
+            <w:r>
+              <w:rPr>
+                <w:sz w:val="19"/>
+                <w:szCs w:val="19"/>
+              </w:rPr>
+              <w:t xml:space="preserve">/Sales/Demo) supported alongside explicit policies (B8 Option B, OrgPolicyAssignsVault, '-' in the mapping). Consistent 'Demo' examples.</w:t>
+            </w:r>
+          </w:p>
+        </w:tc>
+      </w:tr>
+      <w:tr>
+        <w:trPr>
+          <w:cantSplit/>
+        </w:trPr>
+        <w:tc>
+          <w:tcPr>
+            <w:tcW w:type="dxa" w:w="1235"/>
+            <w:tcBorders>
+              <w:top w:val="single" w:color="DCE6F0" w:sz="4"/>
+              <w:left w:val="single" w:color="DCE6F0" w:sz="4"/>
+              <w:bottom w:val="single" w:color="DCE6F0" w:sz="4"/>
+              <w:right w:val="single" w:color="DCE6F0" w:sz="4"/>
+            </w:tcBorders>
+            <w:shd w:fill="FFFFFF" w:color="auto" w:val="clear"/>
+            <w:tcMar>
+              <w:top w:type="dxa" w:w="60"/>
+              <w:left w:type="dxa" w:w="100"/>
+              <w:bottom w:type="dxa" w:w="60"/>
+              <w:right w:type="dxa" w:w="100"/>
+            </w:tcMar>
+            <w:vAlign w:val="top"/>
+          </w:tcPr>
+          <w:p>
+            <w:pPr>
+              <w:spacing w:after="0" w:before="0"/>
+            </w:pPr>
+            <w:r>
+              <w:rPr>
+                <w:sz w:val="19"/>
+                <w:szCs w:val="19"/>
+              </w:rPr>
               <w:t xml:space="preserve">2.0</w:t>
             </w:r>
           </w:p>
@@ -1533,7 +1616,7 @@
               <w:bottom w:val="single" w:color="DCE6F0" w:sz="4"/>
               <w:right w:val="single" w:color="DCE6F0" w:sz="4"/>
             </w:tcBorders>
-            <w:shd w:fill="F7F7FC" w:color="auto" w:val="clear"/>
+            <w:shd w:fill="FFFFFF" w:color="auto" w:val="clear"/>
             <w:tcMar>
               <w:top w:type="dxa" w:w="60"/>
               <w:left w:type="dxa" w:w="100"/>
@@ -14800,7 +14883,200 @@
     </w:p>
     <w:p>
       <w:r>
-        <w:t xml:space="preserve">Create the mail subfolders in advance on every home server, so registration never depends on Domino creating a folder. You need </w:t>
+        <w:t xml:space="preserve">Create the numbered mail folders in advance on every home server, so registration never depends on Domino creating a folder. Create them </w:t>
+      </w:r>
+      <w:r>
+        <w:rPr>
+          <w:b/>
+          <w:bCs/>
+        </w:rPr>
+        <w:t xml:space="preserve">directly in the Domino data directory</w:t>
+      </w:r>
+      <w:r>
+        <w:t xml:space="preserve">, next to the existing </w:t>
+      </w:r>
+      <w:r>
+        <w:rPr>
+          <w:rFonts w:ascii="Consolas" w:cs="Consolas" w:eastAsia="Consolas" w:hAnsi="Consolas"/>
+          <w:color w:val="0F5FDC"/>
+          <w:sz w:val="20"/>
+          <w:szCs w:val="20"/>
+        </w:rPr>
+        <w:t xml:space="preserve">mail</w:t>
+      </w:r>
+      <w:r>
+        <w:t xml:space="preserve"> folder, </w:t>
+      </w:r>
+      <w:r>
+        <w:rPr>
+          <w:b/>
+          <w:bCs/>
+        </w:rPr>
+        <w:t xml:space="preserve">not inside it</w:t>
+      </w:r>
+      <w:r>
+        <w:t xml:space="preserve">:</w:t>
+      </w:r>
+    </w:p>
+    <w:tbl>
+      <w:tblPr>
+        <w:tblW w:type="dxa" w:w="9638"/>
+        <w:tblBorders>
+          <w:top w:val="single" w:color="auto" w:sz="4"/>
+          <w:left w:val="single" w:color="auto" w:sz="4"/>
+          <w:bottom w:val="single" w:color="auto" w:sz="4"/>
+          <w:right w:val="single" w:color="auto" w:sz="4"/>
+          <w:insideH w:val="single" w:color="auto" w:sz="4"/>
+          <w:insideV w:val="single" w:color="auto" w:sz="4"/>
+        </w:tblBorders>
+      </w:tblPr>
+      <w:tblGrid>
+        <w:gridCol w:w="9638"/>
+      </w:tblGrid>
+      <w:tr>
+        <w:trPr>
+          <w:cantSplit/>
+        </w:trPr>
+        <w:tc>
+          <w:tcPr>
+            <w:tcW w:type="dxa" w:w="9638"/>
+            <w:tcBorders>
+              <w:top w:val="single" w:color="DCE6F0" w:sz="4"/>
+              <w:left w:val="single" w:color="DCE6F0" w:sz="4"/>
+              <w:bottom w:val="single" w:color="DCE6F0" w:sz="4"/>
+              <w:right w:val="single" w:color="DCE6F0" w:sz="4"/>
+            </w:tcBorders>
+            <w:shd w:fill="F4F4F4" w:color="auto" w:val="clear"/>
+            <w:tcMar>
+              <w:top w:type="dxa" w:w="100"/>
+              <w:left w:type="dxa" w:w="140"/>
+              <w:bottom w:type="dxa" w:w="100"/>
+              <w:right w:type="dxa" w:w="140"/>
+            </w:tcMar>
+          </w:tcPr>
+          <w:p>
+            <w:pPr>
+              <w:spacing w:after="0" w:before="0" w:line="240"/>
+            </w:pPr>
+            <w:r>
+              <w:rPr>
+                <w:rFonts w:ascii="Consolas" w:cs="Consolas" w:eastAsia="Consolas" w:hAnsi="Consolas"/>
+                <w:color w:val="14142B"/>
+                <w:sz w:val="16"/>
+                <w:szCs w:val="16"/>
+              </w:rPr>
+              <w:t xml:space="preserve">&lt;Domino data directory&gt;            e.g. D:\Domino\Data   or   /local/notesdata</w:t>
+            </w:r>
+          </w:p>
+          <w:p>
+            <w:pPr>
+              <w:spacing w:after="0" w:before="0" w:line="240"/>
+            </w:pPr>
+            <w:r>
+              <w:rPr>
+                <w:rFonts w:ascii="Consolas" w:cs="Consolas" w:eastAsia="Consolas" w:hAnsi="Consolas"/>
+                <w:color w:val="14142B"/>
+                <w:sz w:val="16"/>
+                <w:szCs w:val="16"/>
+              </w:rPr>
+              <w:t xml:space="preserve">  |-- names.nsf, log.nsf, certlog.nsf ...</w:t>
+            </w:r>
+          </w:p>
+          <w:p>
+            <w:pPr>
+              <w:spacing w:after="0" w:before="0" w:line="240"/>
+            </w:pPr>
+            <w:r>
+              <w:rPr>
+                <w:rFonts w:ascii="Consolas" w:cs="Consolas" w:eastAsia="Consolas" w:hAnsi="Consolas"/>
+                <w:color w:val="14142B"/>
+                <w:sz w:val="16"/>
+                <w:szCs w:val="16"/>
+              </w:rPr>
+              <w:t xml:space="preserve">  |-- mail\       EXISTING mail files: left untouched; their names are checked for uniqueness</w:t>
+            </w:r>
+          </w:p>
+          <w:p>
+            <w:pPr>
+              <w:spacing w:after="0" w:before="0" w:line="240"/>
+            </w:pPr>
+            <w:r>
+              <w:rPr>
+                <w:rFonts w:ascii="Consolas" w:cs="Consolas" w:eastAsia="Consolas" w:hAnsi="Consolas"/>
+                <w:color w:val="14142B"/>
+                <w:sz w:val="16"/>
+                <w:szCs w:val="16"/>
+              </w:rPr>
+              <w:t xml:space="preserve">  |-- mail1\      NEW mail files    1 - 1000</w:t>
+            </w:r>
+          </w:p>
+          <w:p>
+            <w:pPr>
+              <w:spacing w:after="0" w:before="0" w:line="240"/>
+            </w:pPr>
+            <w:r>
+              <w:rPr>
+                <w:rFonts w:ascii="Consolas" w:cs="Consolas" w:eastAsia="Consolas" w:hAnsi="Consolas"/>
+                <w:color w:val="14142B"/>
+                <w:sz w:val="16"/>
+                <w:szCs w:val="16"/>
+              </w:rPr>
+              <w:t xml:space="preserve">  |-- mail2\      NEW mail files 1001 - 2000</w:t>
+            </w:r>
+          </w:p>
+          <w:p>
+            <w:pPr>
+              <w:spacing w:after="0" w:before="0" w:line="240"/>
+            </w:pPr>
+            <w:r>
+              <w:rPr>
+                <w:rFonts w:ascii="Consolas" w:cs="Consolas" w:eastAsia="Consolas" w:hAnsi="Consolas"/>
+                <w:color w:val="14142B"/>
+                <w:sz w:val="16"/>
+                <w:szCs w:val="16"/>
+              </w:rPr>
+              <w:t xml:space="preserve">  |-- mail3\ ...  one folder per 1000 users, up to MailFolderMax</w:t>
+            </w:r>
+          </w:p>
+          <w:p>
+            <w:pPr>
+              <w:spacing w:after="0" w:before="0" w:line="240"/>
+            </w:pPr>
+            <w:r>
+              <w:rPr>
+                <w:rFonts w:ascii="Consolas" w:cs="Consolas" w:eastAsia="Consolas" w:hAnsi="Consolas"/>
+                <w:color w:val="14142B"/>
+                <w:sz w:val="16"/>
+                <w:szCs w:val="16"/>
+              </w:rPr>
+              <w:t xml:space="preserve"> </w:t>
+            </w:r>
+          </w:p>
+          <w:p>
+            <w:pPr>
+              <w:spacing w:after="0" w:before="0" w:line="240"/>
+            </w:pPr>
+            <w:r>
+              <w:rPr>
+                <w:rFonts w:ascii="Consolas" w:cs="Consolas" w:eastAsia="Consolas" w:hAnsi="Consolas"/>
+                <w:color w:val="14142B"/>
+                <w:sz w:val="16"/>
+                <w:szCs w:val="16"/>
+              </w:rPr>
+              <w:t xml:space="preserve">Person document after registration:  MailFile = mail1\smith.nsf   (relative to the data directory)</w:t>
+            </w:r>
+          </w:p>
+        </w:tc>
+      </w:tr>
+    </w:tbl>
+    <w:p>
+      <w:pPr>
+        <w:spacing w:after="80" w:before="0"/>
+      </w:pPr>
+    </w:p>
+    <w:p>
+      <w:r>
+        <w:t xml:space="preserve">You need </w:t>
       </w:r>
       <w:r>
         <w:rPr>
@@ -15723,7 +15999,17 @@
         <w:t xml:space="preserve">Result:</w:t>
       </w:r>
       <w:r>
-        <w:t xml:space="preserve"> mail1 … mail5 appear in the folder list.</w:t>
+        <w:t xml:space="preserve"> mail1 … mail5 appear at the </w:t>
+      </w:r>
+      <w:r>
+        <w:rPr>
+          <w:b/>
+          <w:bCs/>
+        </w:rPr>
+        <w:t xml:space="preserve">same level as mail</w:t>
+      </w:r>
+      <w:r>
+        <w:t xml:space="preserve"> in the folder list, not under it.</w:t>
       </w:r>
     </w:p>
     <w:p>
@@ -21636,7 +21922,7 @@
                 <w:sz w:val="19"/>
                 <w:szCs w:val="19"/>
               </w:rPr>
-              <w:t xml:space="preserve">MailFolderMode / MailFolderPrefix / MailFilesPerFolder</w:t>
+              <w:t xml:space="preserve">MailFolderMode</w:t>
             </w:r>
           </w:p>
         </w:tc>
@@ -21676,8 +21962,99 @@
                 <w:sz w:val="19"/>
                 <w:szCs w:val="19"/>
               </w:rPr>
-              <w:t xml:space="preserve"> / </w:t>
-            </w:r>
+              <w:t xml:space="preserve"> (new mail files in mail1, mail2 … under the data directory)</w:t>
+            </w:r>
+          </w:p>
+        </w:tc>
+        <w:tc>
+          <w:tcPr>
+            <w:tcW w:type="dxa" w:w="2019"/>
+            <w:tcBorders>
+              <w:top w:val="single" w:color="DCE6F0" w:sz="4"/>
+              <w:left w:val="single" w:color="DCE6F0" w:sz="4"/>
+              <w:bottom w:val="single" w:color="DCE6F0" w:sz="4"/>
+              <w:right w:val="single" w:color="DCE6F0" w:sz="4"/>
+            </w:tcBorders>
+            <w:shd w:fill="F7F7FC" w:color="auto" w:val="clear"/>
+            <w:tcMar>
+              <w:top w:type="dxa" w:w="60"/>
+              <w:left w:type="dxa" w:w="100"/>
+              <w:bottom w:type="dxa" w:w="60"/>
+              <w:right w:type="dxa" w:w="100"/>
+            </w:tcMar>
+            <w:vAlign w:val="top"/>
+          </w:tcPr>
+          <w:p>
+            <w:pPr>
+              <w:spacing w:after="0" w:before="0"/>
+            </w:pPr>
+            <w:r>
+              <w:rPr>
+                <w:sz w:val="19"/>
+                <w:szCs w:val="19"/>
+              </w:rPr>
+              <w:t xml:space="preserve">Worksheet 11a</w:t>
+            </w:r>
+          </w:p>
+        </w:tc>
+      </w:tr>
+      <w:tr>
+        <w:trPr>
+          <w:cantSplit/>
+        </w:trPr>
+        <w:tc>
+          <w:tcPr>
+            <w:tcW w:type="dxa" w:w="2368"/>
+            <w:tcBorders>
+              <w:top w:val="single" w:color="DCE6F0" w:sz="4"/>
+              <w:left w:val="single" w:color="DCE6F0" w:sz="4"/>
+              <w:bottom w:val="single" w:color="DCE6F0" w:sz="4"/>
+              <w:right w:val="single" w:color="DCE6F0" w:sz="4"/>
+            </w:tcBorders>
+            <w:shd w:fill="FFFFFF" w:color="auto" w:val="clear"/>
+            <w:tcMar>
+              <w:top w:type="dxa" w:w="60"/>
+              <w:left w:type="dxa" w:w="100"/>
+              <w:bottom w:type="dxa" w:w="60"/>
+              <w:right w:type="dxa" w:w="100"/>
+            </w:tcMar>
+            <w:vAlign w:val="top"/>
+          </w:tcPr>
+          <w:p>
+            <w:pPr>
+              <w:spacing w:after="0" w:before="0"/>
+            </w:pPr>
+            <w:r>
+              <w:rPr>
+                <w:sz w:val="19"/>
+                <w:szCs w:val="19"/>
+              </w:rPr>
+              <w:t xml:space="preserve">MailFolderPrefix</w:t>
+            </w:r>
+          </w:p>
+        </w:tc>
+        <w:tc>
+          <w:tcPr>
+            <w:tcW w:type="dxa" w:w="5251"/>
+            <w:tcBorders>
+              <w:top w:val="single" w:color="DCE6F0" w:sz="4"/>
+              <w:left w:val="single" w:color="DCE6F0" w:sz="4"/>
+              <w:bottom w:val="single" w:color="DCE6F0" w:sz="4"/>
+              <w:right w:val="single" w:color="DCE6F0" w:sz="4"/>
+            </w:tcBorders>
+            <w:shd w:fill="FFFFFF" w:color="auto" w:val="clear"/>
+            <w:tcMar>
+              <w:top w:type="dxa" w:w="60"/>
+              <w:left w:type="dxa" w:w="100"/>
+              <w:bottom w:type="dxa" w:w="60"/>
+              <w:right w:type="dxa" w:w="100"/>
+            </w:tcMar>
+            <w:vAlign w:val="top"/>
+          </w:tcPr>
+          <w:p>
+            <w:pPr>
+              <w:spacing w:after="0" w:before="0"/>
+            </w:pPr>
             <w:r>
               <w:rPr>
                 <w:rFonts w:ascii="Consolas" w:cs="Consolas" w:eastAsia="Consolas" w:hAnsi="Consolas"/>
@@ -21692,7 +22069,39 @@
                 <w:sz w:val="19"/>
                 <w:szCs w:val="19"/>
               </w:rPr>
-              <w:t xml:space="preserve"> / </w:t>
+              <w:t xml:space="preserve">: the folder name </w:t>
+            </w:r>
+            <w:r>
+              <w:rPr>
+                <w:b/>
+                <w:bCs/>
+                <w:sz w:val="19"/>
+                <w:szCs w:val="19"/>
+              </w:rPr>
+              <w:t xml:space="preserve">without</w:t>
+            </w:r>
+            <w:r>
+              <w:rPr>
+                <w:sz w:val="19"/>
+                <w:szCs w:val="19"/>
+              </w:rPr>
+              <w:t xml:space="preserve"> the number and </w:t>
+            </w:r>
+            <w:r>
+              <w:rPr>
+                <w:b/>
+                <w:bCs/>
+                <w:sz w:val="19"/>
+                <w:szCs w:val="19"/>
+              </w:rPr>
+              <w:t xml:space="preserve">without</w:t>
+            </w:r>
+            <w:r>
+              <w:rPr>
+                <w:sz w:val="19"/>
+                <w:szCs w:val="19"/>
+              </w:rPr>
+              <w:t xml:space="preserve"> a path. BulkReg adds 1, 2, 3 … → </w:t>
             </w:r>
             <w:r>
               <w:rPr>
@@ -21701,14 +22110,14 @@
                 <w:sz w:val="18"/>
                 <w:szCs w:val="18"/>
               </w:rPr>
-              <w:t xml:space="preserve">1000</w:t>
-            </w:r>
-            <w:r>
-              <w:rPr>
-                <w:sz w:val="19"/>
-                <w:szCs w:val="19"/>
-              </w:rPr>
-              <w:t xml:space="preserve"> → mail1, mail2 … (or </w:t>
+              <w:t xml:space="preserve">mail1</w:t>
+            </w:r>
+            <w:r>
+              <w:rPr>
+                <w:sz w:val="19"/>
+                <w:szCs w:val="19"/>
+              </w:rPr>
+              <w:t xml:space="preserve">, </w:t>
             </w:r>
             <w:r>
               <w:rPr>
@@ -21717,14 +22126,46 @@
                 <w:sz w:val="18"/>
                 <w:szCs w:val="18"/>
               </w:rPr>
-              <w:t xml:space="preserve">SINGLE</w:t>
-            </w:r>
-            <w:r>
-              <w:rPr>
-                <w:sz w:val="19"/>
-                <w:szCs w:val="19"/>
-              </w:rPr>
-              <w:t xml:space="preserve"> with MailFileDir)</w:t>
+              <w:t xml:space="preserve">mail2</w:t>
+            </w:r>
+            <w:r>
+              <w:rPr>
+                <w:sz w:val="19"/>
+                <w:szCs w:val="19"/>
+              </w:rPr>
+              <w:t xml:space="preserve">. Never </w:t>
+            </w:r>
+            <w:r>
+              <w:rPr>
+                <w:rFonts w:ascii="Consolas" w:cs="Consolas" w:eastAsia="Consolas" w:hAnsi="Consolas"/>
+                <w:color w:val="0F5FDC"/>
+                <w:sz w:val="18"/>
+                <w:szCs w:val="18"/>
+              </w:rPr>
+              <w:t xml:space="preserve">mail1</w:t>
+            </w:r>
+            <w:r>
+              <w:rPr>
+                <w:sz w:val="19"/>
+                <w:szCs w:val="19"/>
+              </w:rPr>
+              <w:t xml:space="preserve"> or </w:t>
+            </w:r>
+            <w:r>
+              <w:rPr>
+                <w:rFonts w:ascii="Consolas" w:cs="Consolas" w:eastAsia="Consolas" w:hAnsi="Consolas"/>
+                <w:color w:val="0F5FDC"/>
+                <w:sz w:val="18"/>
+                <w:szCs w:val="18"/>
+              </w:rPr>
+              <w:t xml:space="preserve">mail\mail</w:t>
+            </w:r>
+            <w:r>
+              <w:rPr>
+                <w:sz w:val="19"/>
+                <w:szCs w:val="19"/>
+              </w:rPr>
+              <w:t xml:space="preserve">.</w:t>
             </w:r>
           </w:p>
         </w:tc>
@@ -21737,6 +22178,42 @@
               <w:bottom w:val="single" w:color="DCE6F0" w:sz="4"/>
               <w:right w:val="single" w:color="DCE6F0" w:sz="4"/>
             </w:tcBorders>
+            <w:shd w:fill="FFFFFF" w:color="auto" w:val="clear"/>
+            <w:tcMar>
+              <w:top w:type="dxa" w:w="60"/>
+              <w:left w:type="dxa" w:w="100"/>
+              <w:bottom w:type="dxa" w:w="60"/>
+              <w:right w:type="dxa" w:w="100"/>
+            </w:tcMar>
+            <w:vAlign w:val="top"/>
+          </w:tcPr>
+          <w:p>
+            <w:pPr>
+              <w:spacing w:after="0" w:before="0"/>
+            </w:pPr>
+            <w:r>
+              <w:rPr>
+                <w:sz w:val="19"/>
+                <w:szCs w:val="19"/>
+              </w:rPr>
+              <w:t xml:space="preserve">B4</w:t>
+            </w:r>
+          </w:p>
+        </w:tc>
+      </w:tr>
+      <w:tr>
+        <w:trPr>
+          <w:cantSplit/>
+        </w:trPr>
+        <w:tc>
+          <w:tcPr>
+            <w:tcW w:type="dxa" w:w="2368"/>
+            <w:tcBorders>
+              <w:top w:val="single" w:color="DCE6F0" w:sz="4"/>
+              <w:left w:val="single" w:color="DCE6F0" w:sz="4"/>
+              <w:bottom w:val="single" w:color="DCE6F0" w:sz="4"/>
+              <w:right w:val="single" w:color="DCE6F0" w:sz="4"/>
+            </w:tcBorders>
             <w:shd w:fill="F7F7FC" w:color="auto" w:val="clear"/>
             <w:tcMar>
               <w:top w:type="dxa" w:w="60"/>
@@ -21755,7 +22232,308 @@
                 <w:sz w:val="19"/>
                 <w:szCs w:val="19"/>
               </w:rPr>
-              <w:t xml:space="preserve">Worksheet 11a</w:t>
+              <w:t xml:space="preserve">MailFilesPerFolder</w:t>
+            </w:r>
+          </w:p>
+        </w:tc>
+        <w:tc>
+          <w:tcPr>
+            <w:tcW w:type="dxa" w:w="5251"/>
+            <w:tcBorders>
+              <w:top w:val="single" w:color="DCE6F0" w:sz="4"/>
+              <w:left w:val="single" w:color="DCE6F0" w:sz="4"/>
+              <w:bottom w:val="single" w:color="DCE6F0" w:sz="4"/>
+              <w:right w:val="single" w:color="DCE6F0" w:sz="4"/>
+            </w:tcBorders>
+            <w:shd w:fill="F7F7FC" w:color="auto" w:val="clear"/>
+            <w:tcMar>
+              <w:top w:type="dxa" w:w="60"/>
+              <w:left w:type="dxa" w:w="100"/>
+              <w:bottom w:type="dxa" w:w="60"/>
+              <w:right w:type="dxa" w:w="100"/>
+            </w:tcMar>
+            <w:vAlign w:val="top"/>
+          </w:tcPr>
+          <w:p>
+            <w:pPr>
+              <w:spacing w:after="0" w:before="0"/>
+            </w:pPr>
+            <w:r>
+              <w:rPr>
+                <w:rFonts w:ascii="Consolas" w:cs="Consolas" w:eastAsia="Consolas" w:hAnsi="Consolas"/>
+                <w:color w:val="0F5FDC"/>
+                <w:sz w:val="18"/>
+                <w:szCs w:val="18"/>
+              </w:rPr>
+              <w:t xml:space="preserve">1000</w:t>
+            </w:r>
+          </w:p>
+        </w:tc>
+        <w:tc>
+          <w:tcPr>
+            <w:tcW w:type="dxa" w:w="2019"/>
+            <w:tcBorders>
+              <w:top w:val="single" w:color="DCE6F0" w:sz="4"/>
+              <w:left w:val="single" w:color="DCE6F0" w:sz="4"/>
+              <w:bottom w:val="single" w:color="DCE6F0" w:sz="4"/>
+              <w:right w:val="single" w:color="DCE6F0" w:sz="4"/>
+            </w:tcBorders>
+            <w:shd w:fill="F7F7FC" w:color="auto" w:val="clear"/>
+            <w:tcMar>
+              <w:top w:type="dxa" w:w="60"/>
+              <w:left w:type="dxa" w:w="100"/>
+              <w:bottom w:type="dxa" w:w="60"/>
+              <w:right w:type="dxa" w:w="100"/>
+            </w:tcMar>
+            <w:vAlign w:val="top"/>
+          </w:tcPr>
+          <w:p>
+            <w:pPr>
+              <w:spacing w:after="0" w:before="0"/>
+            </w:pPr>
+            <w:r>
+              <w:rPr>
+                <w:sz w:val="19"/>
+                <w:szCs w:val="19"/>
+              </w:rPr>
+              <w:t xml:space="preserve">–</w:t>
+            </w:r>
+          </w:p>
+        </w:tc>
+      </w:tr>
+      <w:tr>
+        <w:trPr>
+          <w:cantSplit/>
+        </w:trPr>
+        <w:tc>
+          <w:tcPr>
+            <w:tcW w:type="dxa" w:w="2368"/>
+            <w:tcBorders>
+              <w:top w:val="single" w:color="DCE6F0" w:sz="4"/>
+              <w:left w:val="single" w:color="DCE6F0" w:sz="4"/>
+              <w:bottom w:val="single" w:color="DCE6F0" w:sz="4"/>
+              <w:right w:val="single" w:color="DCE6F0" w:sz="4"/>
+            </w:tcBorders>
+            <w:shd w:fill="FFFFFF" w:color="auto" w:val="clear"/>
+            <w:tcMar>
+              <w:top w:type="dxa" w:w="60"/>
+              <w:left w:type="dxa" w:w="100"/>
+              <w:bottom w:type="dxa" w:w="60"/>
+              <w:right w:type="dxa" w:w="100"/>
+            </w:tcMar>
+            <w:vAlign w:val="top"/>
+          </w:tcPr>
+          <w:p>
+            <w:pPr>
+              <w:spacing w:after="0" w:before="0"/>
+            </w:pPr>
+            <w:r>
+              <w:rPr>
+                <w:sz w:val="19"/>
+                <w:szCs w:val="19"/>
+              </w:rPr>
+              <w:t xml:space="preserve">MailExistingFolders</w:t>
+            </w:r>
+          </w:p>
+        </w:tc>
+        <w:tc>
+          <w:tcPr>
+            <w:tcW w:type="dxa" w:w="5251"/>
+            <w:tcBorders>
+              <w:top w:val="single" w:color="DCE6F0" w:sz="4"/>
+              <w:left w:val="single" w:color="DCE6F0" w:sz="4"/>
+              <w:bottom w:val="single" w:color="DCE6F0" w:sz="4"/>
+              <w:right w:val="single" w:color="DCE6F0" w:sz="4"/>
+            </w:tcBorders>
+            <w:shd w:fill="FFFFFF" w:color="auto" w:val="clear"/>
+            <w:tcMar>
+              <w:top w:type="dxa" w:w="60"/>
+              <w:left w:type="dxa" w:w="100"/>
+              <w:bottom w:type="dxa" w:w="60"/>
+              <w:right w:type="dxa" w:w="100"/>
+            </w:tcMar>
+            <w:vAlign w:val="top"/>
+          </w:tcPr>
+          <w:p>
+            <w:pPr>
+              <w:spacing w:after="0" w:before="0"/>
+            </w:pPr>
+            <w:r>
+              <w:rPr>
+                <w:rFonts w:ascii="Consolas" w:cs="Consolas" w:eastAsia="Consolas" w:hAnsi="Consolas"/>
+                <w:color w:val="0F5FDC"/>
+                <w:sz w:val="18"/>
+                <w:szCs w:val="18"/>
+              </w:rPr>
+              <w:t xml:space="preserve">mail</w:t>
+            </w:r>
+            <w:r>
+              <w:rPr>
+                <w:sz w:val="19"/>
+                <w:szCs w:val="19"/>
+              </w:rPr>
+              <w:t xml:space="preserve">: your existing mail folder(s). Their file names are checked so no duplicate is created; BulkReg never writes there.</w:t>
+            </w:r>
+          </w:p>
+        </w:tc>
+        <w:tc>
+          <w:tcPr>
+            <w:tcW w:type="dxa" w:w="2019"/>
+            <w:tcBorders>
+              <w:top w:val="single" w:color="DCE6F0" w:sz="4"/>
+              <w:left w:val="single" w:color="DCE6F0" w:sz="4"/>
+              <w:bottom w:val="single" w:color="DCE6F0" w:sz="4"/>
+              <w:right w:val="single" w:color="DCE6F0" w:sz="4"/>
+            </w:tcBorders>
+            <w:shd w:fill="FFFFFF" w:color="auto" w:val="clear"/>
+            <w:tcMar>
+              <w:top w:type="dxa" w:w="60"/>
+              <w:left w:type="dxa" w:w="100"/>
+              <w:bottom w:type="dxa" w:w="60"/>
+              <w:right w:type="dxa" w:w="100"/>
+            </w:tcMar>
+            <w:vAlign w:val="top"/>
+          </w:tcPr>
+          <w:p>
+            <w:pPr>
+              <w:spacing w:after="0" w:before="0"/>
+            </w:pPr>
+            <w:r>
+              <w:rPr>
+                <w:sz w:val="19"/>
+                <w:szCs w:val="19"/>
+              </w:rPr>
+              <w:t xml:space="preserve">–</w:t>
+            </w:r>
+          </w:p>
+        </w:tc>
+      </w:tr>
+      <w:tr>
+        <w:trPr>
+          <w:cantSplit/>
+        </w:trPr>
+        <w:tc>
+          <w:tcPr>
+            <w:tcW w:type="dxa" w:w="2368"/>
+            <w:tcBorders>
+              <w:top w:val="single" w:color="DCE6F0" w:sz="4"/>
+              <w:left w:val="single" w:color="DCE6F0" w:sz="4"/>
+              <w:bottom w:val="single" w:color="DCE6F0" w:sz="4"/>
+              <w:right w:val="single" w:color="DCE6F0" w:sz="4"/>
+            </w:tcBorders>
+            <w:shd w:fill="F7F7FC" w:color="auto" w:val="clear"/>
+            <w:tcMar>
+              <w:top w:type="dxa" w:w="60"/>
+              <w:left w:type="dxa" w:w="100"/>
+              <w:bottom w:type="dxa" w:w="60"/>
+              <w:right w:type="dxa" w:w="100"/>
+            </w:tcMar>
+            <w:vAlign w:val="top"/>
+          </w:tcPr>
+          <w:p>
+            <w:pPr>
+              <w:spacing w:after="0" w:before="0"/>
+            </w:pPr>
+            <w:r>
+              <w:rPr>
+                <w:sz w:val="19"/>
+                <w:szCs w:val="19"/>
+              </w:rPr>
+              <w:t xml:space="preserve">MailFileDir</w:t>
+            </w:r>
+          </w:p>
+        </w:tc>
+        <w:tc>
+          <w:tcPr>
+            <w:tcW w:type="dxa" w:w="5251"/>
+            <w:tcBorders>
+              <w:top w:val="single" w:color="DCE6F0" w:sz="4"/>
+              <w:left w:val="single" w:color="DCE6F0" w:sz="4"/>
+              <w:bottom w:val="single" w:color="DCE6F0" w:sz="4"/>
+              <w:right w:val="single" w:color="DCE6F0" w:sz="4"/>
+            </w:tcBorders>
+            <w:shd w:fill="F7F7FC" w:color="auto" w:val="clear"/>
+            <w:tcMar>
+              <w:top w:type="dxa" w:w="60"/>
+              <w:left w:type="dxa" w:w="100"/>
+              <w:bottom w:type="dxa" w:w="60"/>
+              <w:right w:type="dxa" w:w="100"/>
+            </w:tcMar>
+            <w:vAlign w:val="top"/>
+          </w:tcPr>
+          <w:p>
+            <w:pPr>
+              <w:spacing w:after="0" w:before="0"/>
+            </w:pPr>
+            <w:r>
+              <w:rPr>
+                <w:sz w:val="19"/>
+                <w:szCs w:val="19"/>
+              </w:rPr>
+              <w:t xml:space="preserve">Only used with </w:t>
+            </w:r>
+            <w:r>
+              <w:rPr>
+                <w:rFonts w:ascii="Consolas" w:cs="Consolas" w:eastAsia="Consolas" w:hAnsi="Consolas"/>
+                <w:color w:val="0F5FDC"/>
+                <w:sz w:val="18"/>
+                <w:szCs w:val="18"/>
+              </w:rPr>
+              <w:t xml:space="preserve">MailFolderMode=SINGLE</w:t>
+            </w:r>
+            <w:r>
+              <w:rPr>
+                <w:sz w:val="19"/>
+                <w:szCs w:val="19"/>
+              </w:rPr>
+              <w:t xml:space="preserve">. Leave </w:t>
+            </w:r>
+            <w:r>
+              <w:rPr>
+                <w:rFonts w:ascii="Consolas" w:cs="Consolas" w:eastAsia="Consolas" w:hAnsi="Consolas"/>
+                <w:color w:val="0F5FDC"/>
+                <w:sz w:val="18"/>
+                <w:szCs w:val="18"/>
+              </w:rPr>
+              <w:t xml:space="preserve">mail</w:t>
+            </w:r>
+            <w:r>
+              <w:rPr>
+                <w:sz w:val="19"/>
+                <w:szCs w:val="19"/>
+              </w:rPr>
+              <w:t xml:space="preserve">.</w:t>
+            </w:r>
+          </w:p>
+        </w:tc>
+        <w:tc>
+          <w:tcPr>
+            <w:tcW w:type="dxa" w:w="2019"/>
+            <w:tcBorders>
+              <w:top w:val="single" w:color="DCE6F0" w:sz="4"/>
+              <w:left w:val="single" w:color="DCE6F0" w:sz="4"/>
+              <w:bottom w:val="single" w:color="DCE6F0" w:sz="4"/>
+              <w:right w:val="single" w:color="DCE6F0" w:sz="4"/>
+            </w:tcBorders>
+            <w:shd w:fill="F7F7FC" w:color="auto" w:val="clear"/>
+            <w:tcMar>
+              <w:top w:type="dxa" w:w="60"/>
+              <w:left w:type="dxa" w:w="100"/>
+              <w:bottom w:type="dxa" w:w="60"/>
+              <w:right w:type="dxa" w:w="100"/>
+            </w:tcMar>
+            <w:vAlign w:val="top"/>
+          </w:tcPr>
+          <w:p>
+            <w:pPr>
+              <w:spacing w:after="0" w:before="0"/>
+            </w:pPr>
+            <w:r>
+              <w:rPr>
+                <w:sz w:val="19"/>
+                <w:szCs w:val="19"/>
+              </w:rPr>
+              <w:t xml:space="preserve">–</w:t>
             </w:r>
           </w:p>
         </w:tc>
@@ -36199,7 +36977,7 @@
                 <w:sz w:val="19"/>
                 <w:szCs w:val="19"/>
               </w:rPr>
-              <w:t xml:space="preserve">MailFolderMode / MailFolderPrefix / MailFilesPerFolder / MailFileDir</w:t>
+              <w:t xml:space="preserve">MailFolderMode</w:t>
             </w:r>
           </w:p>
         </w:tc>
@@ -36230,7 +37008,7 @@
                 <w:sz w:val="19"/>
                 <w:szCs w:val="19"/>
               </w:rPr>
-              <w:t xml:space="preserve">NUMBERED / mail / 1000 / mail</w:t>
+              <w:t xml:space="preserve">NUMBERED</w:t>
             </w:r>
           </w:p>
         </w:tc>
@@ -36261,7 +37039,399 @@
                 <w:sz w:val="19"/>
                 <w:szCs w:val="19"/>
               </w:rPr>
-              <w:t xml:space="preserve">mail1, mail2 … with max files per folder; SINGLE uses MailFileDir</w:t>
+              <w:t xml:space="preserve">NUMBERED: new mail files in &lt;prefix&gt;1, &lt;prefix&gt;2 … directly under the data directory. SINGLE: all in MailFileDir.</w:t>
+            </w:r>
+          </w:p>
+        </w:tc>
+      </w:tr>
+      <w:tr>
+        <w:trPr>
+          <w:cantSplit/>
+        </w:trPr>
+        <w:tc>
+          <w:tcPr>
+            <w:tcW w:type="dxa" w:w="4015"/>
+            <w:tcBorders>
+              <w:top w:val="single" w:color="DCE6F0" w:sz="4"/>
+              <w:left w:val="single" w:color="DCE6F0" w:sz="4"/>
+              <w:bottom w:val="single" w:color="DCE6F0" w:sz="4"/>
+              <w:right w:val="single" w:color="DCE6F0" w:sz="4"/>
+            </w:tcBorders>
+            <w:shd w:fill="FFFFFF" w:color="auto" w:val="clear"/>
+            <w:tcMar>
+              <w:top w:type="dxa" w:w="60"/>
+              <w:left w:type="dxa" w:w="100"/>
+              <w:bottom w:type="dxa" w:w="60"/>
+              <w:right w:type="dxa" w:w="100"/>
+            </w:tcMar>
+            <w:vAlign w:val="top"/>
+          </w:tcPr>
+          <w:p>
+            <w:pPr>
+              <w:spacing w:after="0" w:before="0"/>
+            </w:pPr>
+            <w:r>
+              <w:rPr>
+                <w:sz w:val="19"/>
+                <w:szCs w:val="19"/>
+              </w:rPr>
+              <w:t xml:space="preserve">MailFolderPrefix</w:t>
+            </w:r>
+          </w:p>
+        </w:tc>
+        <w:tc>
+          <w:tcPr>
+            <w:tcW w:type="dxa" w:w="2265"/>
+            <w:tcBorders>
+              <w:top w:val="single" w:color="DCE6F0" w:sz="4"/>
+              <w:left w:val="single" w:color="DCE6F0" w:sz="4"/>
+              <w:bottom w:val="single" w:color="DCE6F0" w:sz="4"/>
+              <w:right w:val="single" w:color="DCE6F0" w:sz="4"/>
+            </w:tcBorders>
+            <w:shd w:fill="FFFFFF" w:color="auto" w:val="clear"/>
+            <w:tcMar>
+              <w:top w:type="dxa" w:w="60"/>
+              <w:left w:type="dxa" w:w="100"/>
+              <w:bottom w:type="dxa" w:w="60"/>
+              <w:right w:type="dxa" w:w="100"/>
+            </w:tcMar>
+            <w:vAlign w:val="top"/>
+          </w:tcPr>
+          <w:p>
+            <w:pPr>
+              <w:spacing w:after="0" w:before="0"/>
+            </w:pPr>
+            <w:r>
+              <w:rPr>
+                <w:sz w:val="19"/>
+                <w:szCs w:val="19"/>
+              </w:rPr>
+              <w:t xml:space="preserve">mail</w:t>
+            </w:r>
+          </w:p>
+        </w:tc>
+        <w:tc>
+          <w:tcPr>
+            <w:tcW w:type="dxa" w:w="3358"/>
+            <w:tcBorders>
+              <w:top w:val="single" w:color="DCE6F0" w:sz="4"/>
+              <w:left w:val="single" w:color="DCE6F0" w:sz="4"/>
+              <w:bottom w:val="single" w:color="DCE6F0" w:sz="4"/>
+              <w:right w:val="single" w:color="DCE6F0" w:sz="4"/>
+            </w:tcBorders>
+            <w:shd w:fill="FFFFFF" w:color="auto" w:val="clear"/>
+            <w:tcMar>
+              <w:top w:type="dxa" w:w="60"/>
+              <w:left w:type="dxa" w:w="100"/>
+              <w:bottom w:type="dxa" w:w="60"/>
+              <w:right w:type="dxa" w:w="100"/>
+            </w:tcMar>
+            <w:vAlign w:val="top"/>
+          </w:tcPr>
+          <w:p>
+            <w:pPr>
+              <w:spacing w:after="0" w:before="0"/>
+            </w:pPr>
+            <w:r>
+              <w:rPr>
+                <w:sz w:val="19"/>
+                <w:szCs w:val="19"/>
+              </w:rPr>
+              <w:t xml:space="preserve">Folder name without number and without path. mail → mail1, mail2 … (mail1 or mail\mail are rejected at start-up)</w:t>
+            </w:r>
+          </w:p>
+        </w:tc>
+      </w:tr>
+      <w:tr>
+        <w:trPr>
+          <w:cantSplit/>
+        </w:trPr>
+        <w:tc>
+          <w:tcPr>
+            <w:tcW w:type="dxa" w:w="4015"/>
+            <w:tcBorders>
+              <w:top w:val="single" w:color="DCE6F0" w:sz="4"/>
+              <w:left w:val="single" w:color="DCE6F0" w:sz="4"/>
+              <w:bottom w:val="single" w:color="DCE6F0" w:sz="4"/>
+              <w:right w:val="single" w:color="DCE6F0" w:sz="4"/>
+            </w:tcBorders>
+            <w:shd w:fill="F7F7FC" w:color="auto" w:val="clear"/>
+            <w:tcMar>
+              <w:top w:type="dxa" w:w="60"/>
+              <w:left w:type="dxa" w:w="100"/>
+              <w:bottom w:type="dxa" w:w="60"/>
+              <w:right w:type="dxa" w:w="100"/>
+            </w:tcMar>
+            <w:vAlign w:val="top"/>
+          </w:tcPr>
+          <w:p>
+            <w:pPr>
+              <w:spacing w:after="0" w:before="0"/>
+            </w:pPr>
+            <w:r>
+              <w:rPr>
+                <w:sz w:val="19"/>
+                <w:szCs w:val="19"/>
+              </w:rPr>
+              <w:t xml:space="preserve">MailFilesPerFolder</w:t>
+            </w:r>
+          </w:p>
+        </w:tc>
+        <w:tc>
+          <w:tcPr>
+            <w:tcW w:type="dxa" w:w="2265"/>
+            <w:tcBorders>
+              <w:top w:val="single" w:color="DCE6F0" w:sz="4"/>
+              <w:left w:val="single" w:color="DCE6F0" w:sz="4"/>
+              <w:bottom w:val="single" w:color="DCE6F0" w:sz="4"/>
+              <w:right w:val="single" w:color="DCE6F0" w:sz="4"/>
+            </w:tcBorders>
+            <w:shd w:fill="F7F7FC" w:color="auto" w:val="clear"/>
+            <w:tcMar>
+              <w:top w:type="dxa" w:w="60"/>
+              <w:left w:type="dxa" w:w="100"/>
+              <w:bottom w:type="dxa" w:w="60"/>
+              <w:right w:type="dxa" w:w="100"/>
+            </w:tcMar>
+            <w:vAlign w:val="top"/>
+          </w:tcPr>
+          <w:p>
+            <w:pPr>
+              <w:spacing w:after="0" w:before="0"/>
+            </w:pPr>
+            <w:r>
+              <w:rPr>
+                <w:sz w:val="19"/>
+                <w:szCs w:val="19"/>
+              </w:rPr>
+              <w:t xml:space="preserve">1000</w:t>
+            </w:r>
+          </w:p>
+        </w:tc>
+        <w:tc>
+          <w:tcPr>
+            <w:tcW w:type="dxa" w:w="3358"/>
+            <w:tcBorders>
+              <w:top w:val="single" w:color="DCE6F0" w:sz="4"/>
+              <w:left w:val="single" w:color="DCE6F0" w:sz="4"/>
+              <w:bottom w:val="single" w:color="DCE6F0" w:sz="4"/>
+              <w:right w:val="single" w:color="DCE6F0" w:sz="4"/>
+            </w:tcBorders>
+            <w:shd w:fill="F7F7FC" w:color="auto" w:val="clear"/>
+            <w:tcMar>
+              <w:top w:type="dxa" w:w="60"/>
+              <w:left w:type="dxa" w:w="100"/>
+              <w:bottom w:type="dxa" w:w="60"/>
+              <w:right w:type="dxa" w:w="100"/>
+            </w:tcMar>
+            <w:vAlign w:val="top"/>
+          </w:tcPr>
+          <w:p>
+            <w:pPr>
+              <w:spacing w:after="0" w:before="0"/>
+            </w:pPr>
+            <w:r>
+              <w:rPr>
+                <w:sz w:val="19"/>
+                <w:szCs w:val="19"/>
+              </w:rPr>
+              <w:t xml:space="preserve">Maximum mail files per numbered folder</w:t>
+            </w:r>
+          </w:p>
+        </w:tc>
+      </w:tr>
+      <w:tr>
+        <w:trPr>
+          <w:cantSplit/>
+        </w:trPr>
+        <w:tc>
+          <w:tcPr>
+            <w:tcW w:type="dxa" w:w="4015"/>
+            <w:tcBorders>
+              <w:top w:val="single" w:color="DCE6F0" w:sz="4"/>
+              <w:left w:val="single" w:color="DCE6F0" w:sz="4"/>
+              <w:bottom w:val="single" w:color="DCE6F0" w:sz="4"/>
+              <w:right w:val="single" w:color="DCE6F0" w:sz="4"/>
+            </w:tcBorders>
+            <w:shd w:fill="FFFFFF" w:color="auto" w:val="clear"/>
+            <w:tcMar>
+              <w:top w:type="dxa" w:w="60"/>
+              <w:left w:type="dxa" w:w="100"/>
+              <w:bottom w:type="dxa" w:w="60"/>
+              <w:right w:type="dxa" w:w="100"/>
+            </w:tcMar>
+            <w:vAlign w:val="top"/>
+          </w:tcPr>
+          <w:p>
+            <w:pPr>
+              <w:spacing w:after="0" w:before="0"/>
+            </w:pPr>
+            <w:r>
+              <w:rPr>
+                <w:sz w:val="19"/>
+                <w:szCs w:val="19"/>
+              </w:rPr>
+              <w:t xml:space="preserve">MailExistingFolders</w:t>
+            </w:r>
+          </w:p>
+        </w:tc>
+        <w:tc>
+          <w:tcPr>
+            <w:tcW w:type="dxa" w:w="2265"/>
+            <w:tcBorders>
+              <w:top w:val="single" w:color="DCE6F0" w:sz="4"/>
+              <w:left w:val="single" w:color="DCE6F0" w:sz="4"/>
+              <w:bottom w:val="single" w:color="DCE6F0" w:sz="4"/>
+              <w:right w:val="single" w:color="DCE6F0" w:sz="4"/>
+            </w:tcBorders>
+            <w:shd w:fill="FFFFFF" w:color="auto" w:val="clear"/>
+            <w:tcMar>
+              <w:top w:type="dxa" w:w="60"/>
+              <w:left w:type="dxa" w:w="100"/>
+              <w:bottom w:type="dxa" w:w="60"/>
+              <w:right w:type="dxa" w:w="100"/>
+            </w:tcMar>
+            <w:vAlign w:val="top"/>
+          </w:tcPr>
+          <w:p>
+            <w:pPr>
+              <w:spacing w:after="0" w:before="0"/>
+            </w:pPr>
+            <w:r>
+              <w:rPr>
+                <w:sz w:val="19"/>
+                <w:szCs w:val="19"/>
+              </w:rPr>
+              <w:t xml:space="preserve">mail</w:t>
+            </w:r>
+          </w:p>
+        </w:tc>
+        <w:tc>
+          <w:tcPr>
+            <w:tcW w:type="dxa" w:w="3358"/>
+            <w:tcBorders>
+              <w:top w:val="single" w:color="DCE6F0" w:sz="4"/>
+              <w:left w:val="single" w:color="DCE6F0" w:sz="4"/>
+              <w:bottom w:val="single" w:color="DCE6F0" w:sz="4"/>
+              <w:right w:val="single" w:color="DCE6F0" w:sz="4"/>
+            </w:tcBorders>
+            <w:shd w:fill="FFFFFF" w:color="auto" w:val="clear"/>
+            <w:tcMar>
+              <w:top w:type="dxa" w:w="60"/>
+              <w:left w:type="dxa" w:w="100"/>
+              <w:bottom w:type="dxa" w:w="60"/>
+              <w:right w:type="dxa" w:w="100"/>
+            </w:tcMar>
+            <w:vAlign w:val="top"/>
+          </w:tcPr>
+          <w:p>
+            <w:pPr>
+              <w:spacing w:after="0" w:before="0"/>
+            </w:pPr>
+            <w:r>
+              <w:rPr>
+                <w:sz w:val="19"/>
+                <w:szCs w:val="19"/>
+              </w:rPr>
+              <w:t xml:space="preserve">Existing mail folder(s), comma separated, checked for duplicate names; never written to</w:t>
+            </w:r>
+          </w:p>
+        </w:tc>
+      </w:tr>
+      <w:tr>
+        <w:trPr>
+          <w:cantSplit/>
+        </w:trPr>
+        <w:tc>
+          <w:tcPr>
+            <w:tcW w:type="dxa" w:w="4015"/>
+            <w:tcBorders>
+              <w:top w:val="single" w:color="DCE6F0" w:sz="4"/>
+              <w:left w:val="single" w:color="DCE6F0" w:sz="4"/>
+              <w:bottom w:val="single" w:color="DCE6F0" w:sz="4"/>
+              <w:right w:val="single" w:color="DCE6F0" w:sz="4"/>
+            </w:tcBorders>
+            <w:shd w:fill="F7F7FC" w:color="auto" w:val="clear"/>
+            <w:tcMar>
+              <w:top w:type="dxa" w:w="60"/>
+              <w:left w:type="dxa" w:w="100"/>
+              <w:bottom w:type="dxa" w:w="60"/>
+              <w:right w:type="dxa" w:w="100"/>
+            </w:tcMar>
+            <w:vAlign w:val="top"/>
+          </w:tcPr>
+          <w:p>
+            <w:pPr>
+              <w:spacing w:after="0" w:before="0"/>
+            </w:pPr>
+            <w:r>
+              <w:rPr>
+                <w:sz w:val="19"/>
+                <w:szCs w:val="19"/>
+              </w:rPr>
+              <w:t xml:space="preserve">MailFileDir</w:t>
+            </w:r>
+          </w:p>
+        </w:tc>
+        <w:tc>
+          <w:tcPr>
+            <w:tcW w:type="dxa" w:w="2265"/>
+            <w:tcBorders>
+              <w:top w:val="single" w:color="DCE6F0" w:sz="4"/>
+              <w:left w:val="single" w:color="DCE6F0" w:sz="4"/>
+              <w:bottom w:val="single" w:color="DCE6F0" w:sz="4"/>
+              <w:right w:val="single" w:color="DCE6F0" w:sz="4"/>
+            </w:tcBorders>
+            <w:shd w:fill="F7F7FC" w:color="auto" w:val="clear"/>
+            <w:tcMar>
+              <w:top w:type="dxa" w:w="60"/>
+              <w:left w:type="dxa" w:w="100"/>
+              <w:bottom w:type="dxa" w:w="60"/>
+              <w:right w:type="dxa" w:w="100"/>
+            </w:tcMar>
+            <w:vAlign w:val="top"/>
+          </w:tcPr>
+          <w:p>
+            <w:pPr>
+              <w:spacing w:after="0" w:before="0"/>
+            </w:pPr>
+            <w:r>
+              <w:rPr>
+                <w:sz w:val="19"/>
+                <w:szCs w:val="19"/>
+              </w:rPr>
+              <w:t xml:space="preserve">mail</w:t>
+            </w:r>
+          </w:p>
+        </w:tc>
+        <w:tc>
+          <w:tcPr>
+            <w:tcW w:type="dxa" w:w="3358"/>
+            <w:tcBorders>
+              <w:top w:val="single" w:color="DCE6F0" w:sz="4"/>
+              <w:left w:val="single" w:color="DCE6F0" w:sz="4"/>
+              <w:bottom w:val="single" w:color="DCE6F0" w:sz="4"/>
+              <w:right w:val="single" w:color="DCE6F0" w:sz="4"/>
+            </w:tcBorders>
+            <w:shd w:fill="F7F7FC" w:color="auto" w:val="clear"/>
+            <w:tcMar>
+              <w:top w:type="dxa" w:w="60"/>
+              <w:left w:type="dxa" w:w="100"/>
+              <w:bottom w:type="dxa" w:w="60"/>
+              <w:right w:type="dxa" w:w="100"/>
+            </w:tcMar>
+            <w:vAlign w:val="top"/>
+          </w:tcPr>
+          <w:p>
+            <w:pPr>
+              <w:spacing w:after="0" w:before="0"/>
+            </w:pPr>
+            <w:r>
+              <w:rPr>
+                <w:sz w:val="19"/>
+                <w:szCs w:val="19"/>
+              </w:rPr>
+              <w:t xml:space="preserve">Only for MailFolderMode=SINGLE</w:t>
             </w:r>
           </w:p>
         </w:tc>
@@ -37749,7 +38919,7 @@
                 <w:sz w:val="19"/>
                 <w:szCs w:val="19"/>
               </w:rPr>
-              <w:t xml:space="preserve">Agent 02 reads the server's database list once per run and records every file in folders starting with the prefix (mail, mail1, mail2 …)</w:t>
+              <w:t xml:space="preserve">Agent 02 reads the server's database list once per run and records the files in the numbered folders (mail1, mail2 …) and in MailExistingFolders (mail)</w:t>
             </w:r>
           </w:p>
         </w:tc>
@@ -38015,8 +39185,800 @@
         <w:pStyle w:val="Heading3"/>
       </w:pPr>
       <w:r>
-        <w:t xml:space="preserve">3. Numbered folders: mail1, mail2 …</w:t>
-      </w:r>
+        <w:t xml:space="preserve">3. Numbered folders: mail1, mail2 … directly under the data directory</w:t>
+      </w:r>
+    </w:p>
+    <w:tbl>
+      <w:tblPr>
+        <w:tblW w:type="dxa" w:w="9638"/>
+        <w:tblBorders>
+          <w:top w:val="single" w:color="auto" w:sz="4"/>
+          <w:left w:val="single" w:color="auto" w:sz="4"/>
+          <w:bottom w:val="single" w:color="auto" w:sz="4"/>
+          <w:right w:val="single" w:color="auto" w:sz="4"/>
+          <w:insideH w:val="single" w:color="auto" w:sz="4"/>
+          <w:insideV w:val="single" w:color="auto" w:sz="4"/>
+        </w:tblBorders>
+      </w:tblPr>
+      <w:tblGrid>
+        <w:gridCol w:w="9638"/>
+      </w:tblGrid>
+      <w:tr>
+        <w:trPr>
+          <w:cantSplit/>
+        </w:trPr>
+        <w:tc>
+          <w:tcPr>
+            <w:tcW w:type="dxa" w:w="9638"/>
+            <w:tcBorders>
+              <w:top w:val="single" w:color="DCE6F0" w:sz="4"/>
+              <w:left w:val="single" w:color="DCE6F0" w:sz="4"/>
+              <w:bottom w:val="single" w:color="DCE6F0" w:sz="4"/>
+              <w:right w:val="single" w:color="DCE6F0" w:sz="4"/>
+            </w:tcBorders>
+            <w:shd w:fill="F4F4F4" w:color="auto" w:val="clear"/>
+            <w:tcMar>
+              <w:top w:type="dxa" w:w="100"/>
+              <w:left w:type="dxa" w:w="140"/>
+              <w:bottom w:type="dxa" w:w="100"/>
+              <w:right w:type="dxa" w:w="140"/>
+            </w:tcMar>
+          </w:tcPr>
+          <w:p>
+            <w:pPr>
+              <w:spacing w:after="0" w:before="0" w:line="240"/>
+            </w:pPr>
+            <w:r>
+              <w:rPr>
+                <w:rFonts w:ascii="Consolas" w:cs="Consolas" w:eastAsia="Consolas" w:hAnsi="Consolas"/>
+                <w:color w:val="14142B"/>
+                <w:sz w:val="16"/>
+                <w:szCs w:val="16"/>
+              </w:rPr>
+              <w:t xml:space="preserve">&lt;Domino data directory&gt;            e.g. D:\Domino\Data   or   /local/notesdata</w:t>
+            </w:r>
+          </w:p>
+          <w:p>
+            <w:pPr>
+              <w:spacing w:after="0" w:before="0" w:line="240"/>
+            </w:pPr>
+            <w:r>
+              <w:rPr>
+                <w:rFonts w:ascii="Consolas" w:cs="Consolas" w:eastAsia="Consolas" w:hAnsi="Consolas"/>
+                <w:color w:val="14142B"/>
+                <w:sz w:val="16"/>
+                <w:szCs w:val="16"/>
+              </w:rPr>
+              <w:t xml:space="preserve">  |-- names.nsf, log.nsf, certlog.nsf ...</w:t>
+            </w:r>
+          </w:p>
+          <w:p>
+            <w:pPr>
+              <w:spacing w:after="0" w:before="0" w:line="240"/>
+            </w:pPr>
+            <w:r>
+              <w:rPr>
+                <w:rFonts w:ascii="Consolas" w:cs="Consolas" w:eastAsia="Consolas" w:hAnsi="Consolas"/>
+                <w:color w:val="14142B"/>
+                <w:sz w:val="16"/>
+                <w:szCs w:val="16"/>
+              </w:rPr>
+              <w:t xml:space="preserve">  |-- mail\       EXISTING mail files: left untouched; their names are checked for uniqueness</w:t>
+            </w:r>
+          </w:p>
+          <w:p>
+            <w:pPr>
+              <w:spacing w:after="0" w:before="0" w:line="240"/>
+            </w:pPr>
+            <w:r>
+              <w:rPr>
+                <w:rFonts w:ascii="Consolas" w:cs="Consolas" w:eastAsia="Consolas" w:hAnsi="Consolas"/>
+                <w:color w:val="14142B"/>
+                <w:sz w:val="16"/>
+                <w:szCs w:val="16"/>
+              </w:rPr>
+              <w:t xml:space="preserve">  |-- mail1\      NEW mail files    1 - 1000</w:t>
+            </w:r>
+          </w:p>
+          <w:p>
+            <w:pPr>
+              <w:spacing w:after="0" w:before="0" w:line="240"/>
+            </w:pPr>
+            <w:r>
+              <w:rPr>
+                <w:rFonts w:ascii="Consolas" w:cs="Consolas" w:eastAsia="Consolas" w:hAnsi="Consolas"/>
+                <w:color w:val="14142B"/>
+                <w:sz w:val="16"/>
+                <w:szCs w:val="16"/>
+              </w:rPr>
+              <w:t xml:space="preserve">  |-- mail2\      NEW mail files 1001 - 2000</w:t>
+            </w:r>
+          </w:p>
+          <w:p>
+            <w:pPr>
+              <w:spacing w:after="0" w:before="0" w:line="240"/>
+            </w:pPr>
+            <w:r>
+              <w:rPr>
+                <w:rFonts w:ascii="Consolas" w:cs="Consolas" w:eastAsia="Consolas" w:hAnsi="Consolas"/>
+                <w:color w:val="14142B"/>
+                <w:sz w:val="16"/>
+                <w:szCs w:val="16"/>
+              </w:rPr>
+              <w:t xml:space="preserve">  |-- mail3\ ...  one folder per 1000 users, up to MailFolderMax</w:t>
+            </w:r>
+          </w:p>
+          <w:p>
+            <w:pPr>
+              <w:spacing w:after="0" w:before="0" w:line="240"/>
+            </w:pPr>
+            <w:r>
+              <w:rPr>
+                <w:rFonts w:ascii="Consolas" w:cs="Consolas" w:eastAsia="Consolas" w:hAnsi="Consolas"/>
+                <w:color w:val="14142B"/>
+                <w:sz w:val="16"/>
+                <w:szCs w:val="16"/>
+              </w:rPr>
+              <w:t xml:space="preserve"> </w:t>
+            </w:r>
+          </w:p>
+          <w:p>
+            <w:pPr>
+              <w:spacing w:after="0" w:before="0" w:line="240"/>
+            </w:pPr>
+            <w:r>
+              <w:rPr>
+                <w:rFonts w:ascii="Consolas" w:cs="Consolas" w:eastAsia="Consolas" w:hAnsi="Consolas"/>
+                <w:color w:val="14142B"/>
+                <w:sz w:val="16"/>
+                <w:szCs w:val="16"/>
+              </w:rPr>
+              <w:t xml:space="preserve">Person document after registration:  MailFile = mail1\smith.nsf   (relative to the data directory)</w:t>
+            </w:r>
+          </w:p>
+        </w:tc>
+      </w:tr>
+    </w:tbl>
+    <w:p>
+      <w:pPr>
+        <w:spacing w:after="80" w:before="0"/>
+      </w:pPr>
+    </w:p>
+    <w:tbl>
+      <w:tblPr>
+        <w:tblW w:type="dxa" w:w="9638"/>
+        <w:tblBorders>
+          <w:top w:val="single" w:color="auto" w:sz="4"/>
+          <w:left w:val="single" w:color="auto" w:sz="4"/>
+          <w:bottom w:val="single" w:color="auto" w:sz="4"/>
+          <w:right w:val="single" w:color="auto" w:sz="4"/>
+          <w:insideH w:val="single" w:color="auto" w:sz="4"/>
+          <w:insideV w:val="single" w:color="auto" w:sz="4"/>
+        </w:tblBorders>
+      </w:tblPr>
+      <w:tblGrid>
+        <w:gridCol w:w="2471"/>
+        <w:gridCol w:w="1132"/>
+        <w:gridCol w:w="6035"/>
+      </w:tblGrid>
+      <w:tr>
+        <w:trPr>
+          <w:tblHeader/>
+        </w:trPr>
+        <w:tc>
+          <w:tcPr>
+            <w:tcW w:type="dxa" w:w="2471"/>
+            <w:tcBorders>
+              <w:top w:val="single" w:color="DCE6F0" w:sz="4"/>
+              <w:left w:val="single" w:color="DCE6F0" w:sz="4"/>
+              <w:bottom w:val="single" w:color="DCE6F0" w:sz="4"/>
+              <w:right w:val="single" w:color="DCE6F0" w:sz="4"/>
+            </w:tcBorders>
+            <w:shd w:fill="17707F" w:color="auto" w:val="clear"/>
+            <w:tcMar>
+              <w:top w:type="dxa" w:w="60"/>
+              <w:left w:type="dxa" w:w="100"/>
+              <w:bottom w:type="dxa" w:w="60"/>
+              <w:right w:type="dxa" w:w="100"/>
+            </w:tcMar>
+            <w:vAlign w:val="top"/>
+          </w:tcPr>
+          <w:p>
+            <w:pPr>
+              <w:spacing w:after="0" w:before="0"/>
+            </w:pPr>
+            <w:r>
+              <w:rPr>
+                <w:b/>
+                <w:bCs/>
+                <w:color w:val="FFFFFF"/>
+                <w:sz w:val="19"/>
+                <w:szCs w:val="19"/>
+              </w:rPr>
+              <w:t xml:space="preserve">Setting</w:t>
+            </w:r>
+          </w:p>
+        </w:tc>
+        <w:tc>
+          <w:tcPr>
+            <w:tcW w:type="dxa" w:w="1132"/>
+            <w:tcBorders>
+              <w:top w:val="single" w:color="DCE6F0" w:sz="4"/>
+              <w:left w:val="single" w:color="DCE6F0" w:sz="4"/>
+              <w:bottom w:val="single" w:color="DCE6F0" w:sz="4"/>
+              <w:right w:val="single" w:color="DCE6F0" w:sz="4"/>
+            </w:tcBorders>
+            <w:shd w:fill="17707F" w:color="auto" w:val="clear"/>
+            <w:tcMar>
+              <w:top w:type="dxa" w:w="60"/>
+              <w:left w:type="dxa" w:w="100"/>
+              <w:bottom w:type="dxa" w:w="60"/>
+              <w:right w:type="dxa" w:w="100"/>
+            </w:tcMar>
+            <w:vAlign w:val="top"/>
+          </w:tcPr>
+          <w:p>
+            <w:pPr>
+              <w:spacing w:after="0" w:before="0"/>
+            </w:pPr>
+            <w:r>
+              <w:rPr>
+                <w:b/>
+                <w:bCs/>
+                <w:color w:val="FFFFFF"/>
+                <w:sz w:val="19"/>
+                <w:szCs w:val="19"/>
+              </w:rPr>
+              <w:t xml:space="preserve">Value</w:t>
+            </w:r>
+          </w:p>
+        </w:tc>
+        <w:tc>
+          <w:tcPr>
+            <w:tcW w:type="dxa" w:w="6035"/>
+            <w:tcBorders>
+              <w:top w:val="single" w:color="DCE6F0" w:sz="4"/>
+              <w:left w:val="single" w:color="DCE6F0" w:sz="4"/>
+              <w:bottom w:val="single" w:color="DCE6F0" w:sz="4"/>
+              <w:right w:val="single" w:color="DCE6F0" w:sz="4"/>
+            </w:tcBorders>
+            <w:shd w:fill="17707F" w:color="auto" w:val="clear"/>
+            <w:tcMar>
+              <w:top w:type="dxa" w:w="60"/>
+              <w:left w:type="dxa" w:w="100"/>
+              <w:bottom w:type="dxa" w:w="60"/>
+              <w:right w:type="dxa" w:w="100"/>
+            </w:tcMar>
+            <w:vAlign w:val="top"/>
+          </w:tcPr>
+          <w:p>
+            <w:pPr>
+              <w:spacing w:after="0" w:before="0"/>
+            </w:pPr>
+            <w:r>
+              <w:rPr>
+                <w:b/>
+                <w:bCs/>
+                <w:color w:val="FFFFFF"/>
+                <w:sz w:val="19"/>
+                <w:szCs w:val="19"/>
+              </w:rPr>
+              <w:t xml:space="preserve">Meaning</w:t>
+            </w:r>
+          </w:p>
+        </w:tc>
+      </w:tr>
+      <w:tr>
+        <w:trPr>
+          <w:cantSplit/>
+        </w:trPr>
+        <w:tc>
+          <w:tcPr>
+            <w:tcW w:type="dxa" w:w="2471"/>
+            <w:tcBorders>
+              <w:top w:val="single" w:color="DCE6F0" w:sz="4"/>
+              <w:left w:val="single" w:color="DCE6F0" w:sz="4"/>
+              <w:bottom w:val="single" w:color="DCE6F0" w:sz="4"/>
+              <w:right w:val="single" w:color="DCE6F0" w:sz="4"/>
+            </w:tcBorders>
+            <w:shd w:fill="FFFFFF" w:color="auto" w:val="clear"/>
+            <w:tcMar>
+              <w:top w:type="dxa" w:w="60"/>
+              <w:left w:type="dxa" w:w="100"/>
+              <w:bottom w:type="dxa" w:w="60"/>
+              <w:right w:type="dxa" w:w="100"/>
+            </w:tcMar>
+            <w:vAlign w:val="top"/>
+          </w:tcPr>
+          <w:p>
+            <w:pPr>
+              <w:spacing w:after="0" w:before="0"/>
+            </w:pPr>
+            <w:r>
+              <w:rPr>
+                <w:sz w:val="19"/>
+                <w:szCs w:val="19"/>
+              </w:rPr>
+              <w:t xml:space="preserve">MailFolderPrefix</w:t>
+            </w:r>
+          </w:p>
+        </w:tc>
+        <w:tc>
+          <w:tcPr>
+            <w:tcW w:type="dxa" w:w="1132"/>
+            <w:tcBorders>
+              <w:top w:val="single" w:color="DCE6F0" w:sz="4"/>
+              <w:left w:val="single" w:color="DCE6F0" w:sz="4"/>
+              <w:bottom w:val="single" w:color="DCE6F0" w:sz="4"/>
+              <w:right w:val="single" w:color="DCE6F0" w:sz="4"/>
+            </w:tcBorders>
+            <w:shd w:fill="FFFFFF" w:color="auto" w:val="clear"/>
+            <w:tcMar>
+              <w:top w:type="dxa" w:w="60"/>
+              <w:left w:type="dxa" w:w="100"/>
+              <w:bottom w:type="dxa" w:w="60"/>
+              <w:right w:type="dxa" w:w="100"/>
+            </w:tcMar>
+            <w:vAlign w:val="top"/>
+          </w:tcPr>
+          <w:p>
+            <w:pPr>
+              <w:spacing w:after="0" w:before="0"/>
+            </w:pPr>
+            <w:r>
+              <w:rPr>
+                <w:sz w:val="19"/>
+                <w:szCs w:val="19"/>
+              </w:rPr>
+              <w:t xml:space="preserve">mail</w:t>
+            </w:r>
+          </w:p>
+        </w:tc>
+        <w:tc>
+          <w:tcPr>
+            <w:tcW w:type="dxa" w:w="6035"/>
+            <w:tcBorders>
+              <w:top w:val="single" w:color="DCE6F0" w:sz="4"/>
+              <w:left w:val="single" w:color="DCE6F0" w:sz="4"/>
+              <w:bottom w:val="single" w:color="DCE6F0" w:sz="4"/>
+              <w:right w:val="single" w:color="DCE6F0" w:sz="4"/>
+            </w:tcBorders>
+            <w:shd w:fill="FFFFFF" w:color="auto" w:val="clear"/>
+            <w:tcMar>
+              <w:top w:type="dxa" w:w="60"/>
+              <w:left w:type="dxa" w:w="100"/>
+              <w:bottom w:type="dxa" w:w="60"/>
+              <w:right w:type="dxa" w:w="100"/>
+            </w:tcMar>
+            <w:vAlign w:val="top"/>
+          </w:tcPr>
+          <w:p>
+            <w:pPr>
+              <w:spacing w:after="0" w:before="0"/>
+            </w:pPr>
+            <w:r>
+              <w:rPr>
+                <w:sz w:val="19"/>
+                <w:szCs w:val="19"/>
+              </w:rPr>
+              <w:t xml:space="preserve">Name of the numbered folders </w:t>
+            </w:r>
+            <w:r>
+              <w:rPr>
+                <w:b/>
+                <w:bCs/>
+                <w:sz w:val="19"/>
+                <w:szCs w:val="19"/>
+              </w:rPr>
+              <w:t xml:space="preserve">without</w:t>
+            </w:r>
+            <w:r>
+              <w:rPr>
+                <w:sz w:val="19"/>
+                <w:szCs w:val="19"/>
+              </w:rPr>
+              <w:t xml:space="preserve"> the number: BulkReg uses mail1, mail2, mail3 …</w:t>
+            </w:r>
+          </w:p>
+        </w:tc>
+      </w:tr>
+      <w:tr>
+        <w:trPr>
+          <w:cantSplit/>
+        </w:trPr>
+        <w:tc>
+          <w:tcPr>
+            <w:tcW w:type="dxa" w:w="2471"/>
+            <w:tcBorders>
+              <w:top w:val="single" w:color="DCE6F0" w:sz="4"/>
+              <w:left w:val="single" w:color="DCE6F0" w:sz="4"/>
+              <w:bottom w:val="single" w:color="DCE6F0" w:sz="4"/>
+              <w:right w:val="single" w:color="DCE6F0" w:sz="4"/>
+            </w:tcBorders>
+            <w:shd w:fill="F7F7FC" w:color="auto" w:val="clear"/>
+            <w:tcMar>
+              <w:top w:type="dxa" w:w="60"/>
+              <w:left w:type="dxa" w:w="100"/>
+              <w:bottom w:type="dxa" w:w="60"/>
+              <w:right w:type="dxa" w:w="100"/>
+            </w:tcMar>
+            <w:vAlign w:val="top"/>
+          </w:tcPr>
+          <w:p>
+            <w:pPr>
+              <w:spacing w:after="0" w:before="0"/>
+            </w:pPr>
+            <w:r>
+              <w:rPr>
+                <w:sz w:val="19"/>
+                <w:szCs w:val="19"/>
+              </w:rPr>
+              <w:t xml:space="preserve">MailFilesPerFolder</w:t>
+            </w:r>
+          </w:p>
+        </w:tc>
+        <w:tc>
+          <w:tcPr>
+            <w:tcW w:type="dxa" w:w="1132"/>
+            <w:tcBorders>
+              <w:top w:val="single" w:color="DCE6F0" w:sz="4"/>
+              <w:left w:val="single" w:color="DCE6F0" w:sz="4"/>
+              <w:bottom w:val="single" w:color="DCE6F0" w:sz="4"/>
+              <w:right w:val="single" w:color="DCE6F0" w:sz="4"/>
+            </w:tcBorders>
+            <w:shd w:fill="F7F7FC" w:color="auto" w:val="clear"/>
+            <w:tcMar>
+              <w:top w:type="dxa" w:w="60"/>
+              <w:left w:type="dxa" w:w="100"/>
+              <w:bottom w:type="dxa" w:w="60"/>
+              <w:right w:type="dxa" w:w="100"/>
+            </w:tcMar>
+            <w:vAlign w:val="top"/>
+          </w:tcPr>
+          <w:p>
+            <w:pPr>
+              <w:spacing w:after="0" w:before="0"/>
+            </w:pPr>
+            <w:r>
+              <w:rPr>
+                <w:sz w:val="19"/>
+                <w:szCs w:val="19"/>
+              </w:rPr>
+              <w:t xml:space="preserve">1000</w:t>
+            </w:r>
+          </w:p>
+        </w:tc>
+        <w:tc>
+          <w:tcPr>
+            <w:tcW w:type="dxa" w:w="6035"/>
+            <w:tcBorders>
+              <w:top w:val="single" w:color="DCE6F0" w:sz="4"/>
+              <w:left w:val="single" w:color="DCE6F0" w:sz="4"/>
+              <w:bottom w:val="single" w:color="DCE6F0" w:sz="4"/>
+              <w:right w:val="single" w:color="DCE6F0" w:sz="4"/>
+            </w:tcBorders>
+            <w:shd w:fill="F7F7FC" w:color="auto" w:val="clear"/>
+            <w:tcMar>
+              <w:top w:type="dxa" w:w="60"/>
+              <w:left w:type="dxa" w:w="100"/>
+              <w:bottom w:type="dxa" w:w="60"/>
+              <w:right w:type="dxa" w:w="100"/>
+            </w:tcMar>
+            <w:vAlign w:val="top"/>
+          </w:tcPr>
+          <w:p>
+            <w:pPr>
+              <w:spacing w:after="0" w:before="0"/>
+            </w:pPr>
+            <w:r>
+              <w:rPr>
+                <w:sz w:val="19"/>
+                <w:szCs w:val="19"/>
+              </w:rPr>
+              <w:t xml:space="preserve">A folder is filled up to 1000 mail files, then the next one is used</w:t>
+            </w:r>
+          </w:p>
+        </w:tc>
+      </w:tr>
+      <w:tr>
+        <w:trPr>
+          <w:cantSplit/>
+        </w:trPr>
+        <w:tc>
+          <w:tcPr>
+            <w:tcW w:type="dxa" w:w="2471"/>
+            <w:tcBorders>
+              <w:top w:val="single" w:color="DCE6F0" w:sz="4"/>
+              <w:left w:val="single" w:color="DCE6F0" w:sz="4"/>
+              <w:bottom w:val="single" w:color="DCE6F0" w:sz="4"/>
+              <w:right w:val="single" w:color="DCE6F0" w:sz="4"/>
+            </w:tcBorders>
+            <w:shd w:fill="FFFFFF" w:color="auto" w:val="clear"/>
+            <w:tcMar>
+              <w:top w:type="dxa" w:w="60"/>
+              <w:left w:type="dxa" w:w="100"/>
+              <w:bottom w:type="dxa" w:w="60"/>
+              <w:right w:type="dxa" w:w="100"/>
+            </w:tcMar>
+            <w:vAlign w:val="top"/>
+          </w:tcPr>
+          <w:p>
+            <w:pPr>
+              <w:spacing w:after="0" w:before="0"/>
+            </w:pPr>
+            <w:r>
+              <w:rPr>
+                <w:sz w:val="19"/>
+                <w:szCs w:val="19"/>
+              </w:rPr>
+              <w:t xml:space="preserve">MailFolderMax</w:t>
+            </w:r>
+          </w:p>
+        </w:tc>
+        <w:tc>
+          <w:tcPr>
+            <w:tcW w:type="dxa" w:w="1132"/>
+            <w:tcBorders>
+              <w:top w:val="single" w:color="DCE6F0" w:sz="4"/>
+              <w:left w:val="single" w:color="DCE6F0" w:sz="4"/>
+              <w:bottom w:val="single" w:color="DCE6F0" w:sz="4"/>
+              <w:right w:val="single" w:color="DCE6F0" w:sz="4"/>
+            </w:tcBorders>
+            <w:shd w:fill="FFFFFF" w:color="auto" w:val="clear"/>
+            <w:tcMar>
+              <w:top w:type="dxa" w:w="60"/>
+              <w:left w:type="dxa" w:w="100"/>
+              <w:bottom w:type="dxa" w:w="60"/>
+              <w:right w:type="dxa" w:w="100"/>
+            </w:tcMar>
+            <w:vAlign w:val="top"/>
+          </w:tcPr>
+          <w:p>
+            <w:pPr>
+              <w:spacing w:after="0" w:before="0"/>
+            </w:pPr>
+            <w:r>
+              <w:rPr>
+                <w:sz w:val="19"/>
+                <w:szCs w:val="19"/>
+              </w:rPr>
+              <w:t xml:space="preserve">5</w:t>
+            </w:r>
+          </w:p>
+        </w:tc>
+        <w:tc>
+          <w:tcPr>
+            <w:tcW w:type="dxa" w:w="6035"/>
+            <w:tcBorders>
+              <w:top w:val="single" w:color="DCE6F0" w:sz="4"/>
+              <w:left w:val="single" w:color="DCE6F0" w:sz="4"/>
+              <w:bottom w:val="single" w:color="DCE6F0" w:sz="4"/>
+              <w:right w:val="single" w:color="DCE6F0" w:sz="4"/>
+            </w:tcBorders>
+            <w:shd w:fill="FFFFFF" w:color="auto" w:val="clear"/>
+            <w:tcMar>
+              <w:top w:type="dxa" w:w="60"/>
+              <w:left w:type="dxa" w:w="100"/>
+              <w:bottom w:type="dxa" w:w="60"/>
+              <w:right w:type="dxa" w:w="100"/>
+            </w:tcMar>
+            <w:vAlign w:val="top"/>
+          </w:tcPr>
+          <w:p>
+            <w:pPr>
+              <w:spacing w:after="0" w:before="0"/>
+            </w:pPr>
+            <w:r>
+              <w:rPr>
+                <w:sz w:val="19"/>
+                <w:szCs w:val="19"/>
+              </w:rPr>
+              <w:t xml:space="preserve">Number of folders you created (B4); nothing goes above mail5</w:t>
+            </w:r>
+          </w:p>
+        </w:tc>
+      </w:tr>
+      <w:tr>
+        <w:trPr>
+          <w:cantSplit/>
+        </w:trPr>
+        <w:tc>
+          <w:tcPr>
+            <w:tcW w:type="dxa" w:w="2471"/>
+            <w:tcBorders>
+              <w:top w:val="single" w:color="DCE6F0" w:sz="4"/>
+              <w:left w:val="single" w:color="DCE6F0" w:sz="4"/>
+              <w:bottom w:val="single" w:color="DCE6F0" w:sz="4"/>
+              <w:right w:val="single" w:color="DCE6F0" w:sz="4"/>
+            </w:tcBorders>
+            <w:shd w:fill="F7F7FC" w:color="auto" w:val="clear"/>
+            <w:tcMar>
+              <w:top w:type="dxa" w:w="60"/>
+              <w:left w:type="dxa" w:w="100"/>
+              <w:bottom w:type="dxa" w:w="60"/>
+              <w:right w:type="dxa" w:w="100"/>
+            </w:tcMar>
+            <w:vAlign w:val="top"/>
+          </w:tcPr>
+          <w:p>
+            <w:pPr>
+              <w:spacing w:after="0" w:before="0"/>
+            </w:pPr>
+            <w:r>
+              <w:rPr>
+                <w:sz w:val="19"/>
+                <w:szCs w:val="19"/>
+              </w:rPr>
+              <w:t xml:space="preserve">MailExistingFolders</w:t>
+            </w:r>
+          </w:p>
+        </w:tc>
+        <w:tc>
+          <w:tcPr>
+            <w:tcW w:type="dxa" w:w="1132"/>
+            <w:tcBorders>
+              <w:top w:val="single" w:color="DCE6F0" w:sz="4"/>
+              <w:left w:val="single" w:color="DCE6F0" w:sz="4"/>
+              <w:bottom w:val="single" w:color="DCE6F0" w:sz="4"/>
+              <w:right w:val="single" w:color="DCE6F0" w:sz="4"/>
+            </w:tcBorders>
+            <w:shd w:fill="F7F7FC" w:color="auto" w:val="clear"/>
+            <w:tcMar>
+              <w:top w:type="dxa" w:w="60"/>
+              <w:left w:type="dxa" w:w="100"/>
+              <w:bottom w:type="dxa" w:w="60"/>
+              <w:right w:type="dxa" w:w="100"/>
+            </w:tcMar>
+            <w:vAlign w:val="top"/>
+          </w:tcPr>
+          <w:p>
+            <w:pPr>
+              <w:spacing w:after="0" w:before="0"/>
+            </w:pPr>
+            <w:r>
+              <w:rPr>
+                <w:sz w:val="19"/>
+                <w:szCs w:val="19"/>
+              </w:rPr>
+              <w:t xml:space="preserve">mail</w:t>
+            </w:r>
+          </w:p>
+        </w:tc>
+        <w:tc>
+          <w:tcPr>
+            <w:tcW w:type="dxa" w:w="6035"/>
+            <w:tcBorders>
+              <w:top w:val="single" w:color="DCE6F0" w:sz="4"/>
+              <w:left w:val="single" w:color="DCE6F0" w:sz="4"/>
+              <w:bottom w:val="single" w:color="DCE6F0" w:sz="4"/>
+              <w:right w:val="single" w:color="DCE6F0" w:sz="4"/>
+            </w:tcBorders>
+            <w:shd w:fill="F7F7FC" w:color="auto" w:val="clear"/>
+            <w:tcMar>
+              <w:top w:type="dxa" w:w="60"/>
+              <w:left w:type="dxa" w:w="100"/>
+              <w:bottom w:type="dxa" w:w="60"/>
+              <w:right w:type="dxa" w:w="100"/>
+            </w:tcMar>
+            <w:vAlign w:val="top"/>
+          </w:tcPr>
+          <w:p>
+            <w:pPr>
+              <w:spacing w:after="0" w:before="0"/>
+            </w:pPr>
+            <w:r>
+              <w:rPr>
+                <w:sz w:val="19"/>
+                <w:szCs w:val="19"/>
+              </w:rPr>
+              <w:t xml:space="preserve">Existing folder whose names are checked for duplicates; BulkReg never writes there</w:t>
+            </w:r>
+          </w:p>
+        </w:tc>
+      </w:tr>
+      <w:tr>
+        <w:trPr>
+          <w:cantSplit/>
+        </w:trPr>
+        <w:tc>
+          <w:tcPr>
+            <w:tcW w:type="dxa" w:w="2471"/>
+            <w:tcBorders>
+              <w:top w:val="single" w:color="DCE6F0" w:sz="4"/>
+              <w:left w:val="single" w:color="DCE6F0" w:sz="4"/>
+              <w:bottom w:val="single" w:color="DCE6F0" w:sz="4"/>
+              <w:right w:val="single" w:color="DCE6F0" w:sz="4"/>
+            </w:tcBorders>
+            <w:shd w:fill="FFFFFF" w:color="auto" w:val="clear"/>
+            <w:tcMar>
+              <w:top w:type="dxa" w:w="60"/>
+              <w:left w:type="dxa" w:w="100"/>
+              <w:bottom w:type="dxa" w:w="60"/>
+              <w:right w:type="dxa" w:w="100"/>
+            </w:tcMar>
+            <w:vAlign w:val="top"/>
+          </w:tcPr>
+          <w:p>
+            <w:pPr>
+              <w:spacing w:after="0" w:before="0"/>
+            </w:pPr>
+            <w:r>
+              <w:rPr>
+                <w:sz w:val="19"/>
+                <w:szCs w:val="19"/>
+              </w:rPr>
+              <w:t xml:space="preserve">MailFileDir</w:t>
+            </w:r>
+          </w:p>
+        </w:tc>
+        <w:tc>
+          <w:tcPr>
+            <w:tcW w:type="dxa" w:w="1132"/>
+            <w:tcBorders>
+              <w:top w:val="single" w:color="DCE6F0" w:sz="4"/>
+              <w:left w:val="single" w:color="DCE6F0" w:sz="4"/>
+              <w:bottom w:val="single" w:color="DCE6F0" w:sz="4"/>
+              <w:right w:val="single" w:color="DCE6F0" w:sz="4"/>
+            </w:tcBorders>
+            <w:shd w:fill="FFFFFF" w:color="auto" w:val="clear"/>
+            <w:tcMar>
+              <w:top w:type="dxa" w:w="60"/>
+              <w:left w:type="dxa" w:w="100"/>
+              <w:bottom w:type="dxa" w:w="60"/>
+              <w:right w:type="dxa" w:w="100"/>
+            </w:tcMar>
+            <w:vAlign w:val="top"/>
+          </w:tcPr>
+          <w:p>
+            <w:pPr>
+              <w:spacing w:after="0" w:before="0"/>
+            </w:pPr>
+            <w:r>
+              <w:rPr>
+                <w:sz w:val="19"/>
+                <w:szCs w:val="19"/>
+              </w:rPr>
+              <w:t xml:space="preserve">mail</w:t>
+            </w:r>
+          </w:p>
+        </w:tc>
+        <w:tc>
+          <w:tcPr>
+            <w:tcW w:type="dxa" w:w="6035"/>
+            <w:tcBorders>
+              <w:top w:val="single" w:color="DCE6F0" w:sz="4"/>
+              <w:left w:val="single" w:color="DCE6F0" w:sz="4"/>
+              <w:bottom w:val="single" w:color="DCE6F0" w:sz="4"/>
+              <w:right w:val="single" w:color="DCE6F0" w:sz="4"/>
+            </w:tcBorders>
+            <w:shd w:fill="FFFFFF" w:color="auto" w:val="clear"/>
+            <w:tcMar>
+              <w:top w:type="dxa" w:w="60"/>
+              <w:left w:type="dxa" w:w="100"/>
+              <w:bottom w:type="dxa" w:w="60"/>
+              <w:right w:type="dxa" w:w="100"/>
+            </w:tcMar>
+            <w:vAlign w:val="top"/>
+          </w:tcPr>
+          <w:p>
+            <w:pPr>
+              <w:spacing w:after="0" w:before="0"/>
+            </w:pPr>
+            <w:r>
+              <w:rPr>
+                <w:sz w:val="19"/>
+                <w:szCs w:val="19"/>
+              </w:rPr>
+              <w:t xml:space="preserve">Only with MailFolderMode=SINGLE (then all new mail files go into this one folder)</w:t>
+            </w:r>
+          </w:p>
+        </w:tc>
+      </w:tr>
+    </w:tbl>
+    <w:p>
+      <w:pPr>
+        <w:spacing w:after="80" w:before="0"/>
+      </w:pPr>
     </w:p>
     <w:p>
       <w:r>
@@ -38032,43 +39994,7 @@
         <w:t xml:space="preserve">MailFolderMode=NUMBERED</w:t>
       </w:r>
       <w:r>
-        <w:t xml:space="preserve"> (default), mail files go into numbered subfolders of the data directory: </w:t>
-      </w:r>
-      <w:r>
-        <w:rPr>
-          <w:rFonts w:ascii="Consolas" w:cs="Consolas" w:eastAsia="Consolas" w:hAnsi="Consolas"/>
-          <w:color w:val="0F5FDC"/>
-          <w:sz w:val="20"/>
-          <w:szCs w:val="20"/>
-        </w:rPr>
-        <w:t xml:space="preserve">mail1</w:t>
-      </w:r>
-      <w:r>
-        <w:t xml:space="preserve">, </w:t>
-      </w:r>
-      <w:r>
-        <w:rPr>
-          <w:rFonts w:ascii="Consolas" w:cs="Consolas" w:eastAsia="Consolas" w:hAnsi="Consolas"/>
-          <w:color w:val="0F5FDC"/>
-          <w:sz w:val="20"/>
-          <w:szCs w:val="20"/>
-        </w:rPr>
-        <w:t xml:space="preserve">mail2</w:t>
-      </w:r>
-      <w:r>
-        <w:t xml:space="preserve">, </w:t>
-      </w:r>
-      <w:r>
-        <w:rPr>
-          <w:rFonts w:ascii="Consolas" w:cs="Consolas" w:eastAsia="Consolas" w:hAnsi="Consolas"/>
-          <w:color w:val="0F5FDC"/>
-          <w:sz w:val="20"/>
-          <w:szCs w:val="20"/>
-        </w:rPr>
-        <w:t xml:space="preserve">mail3</w:t>
-      </w:r>
-      <w:r>
-        <w:t xml:space="preserve"> …. Each holds at most </w:t>
+        <w:t xml:space="preserve"> (default), each numbered folder holds at most </w:t>
       </w:r>
       <w:r>
         <w:rPr>
@@ -44430,7 +46356,7 @@
                 <w:sz w:val="19"/>
                 <w:szCs w:val="19"/>
               </w:rPr>
-              <w:t xml:space="preserve">ERROR: All pre-created mail folders … are full</w:t>
+              <w:t xml:space="preserve">"Mail folder setting error" at start-up</w:t>
             </w:r>
           </w:p>
         </w:tc>
@@ -44461,7 +46387,7 @@
                 <w:sz w:val="19"/>
                 <w:szCs w:val="19"/>
               </w:rPr>
-              <w:t xml:space="preserve">More users than the folders you created can hold</w:t>
+              <w:t xml:space="preserve">MailFolderPrefix written with a number (mail1) or a path (mail\mail)</w:t>
             </w:r>
           </w:p>
         </w:tc>
@@ -44492,7 +46418,7 @@
                 <w:sz w:val="19"/>
                 <w:szCs w:val="19"/>
               </w:rPr>
-              <w:t xml:space="preserve">Create the next folder(s) on that server (B4), raise MailFolderMax, rebuild the batch</w:t>
+              <w:t xml:space="preserve">Set MailFolderPrefix=mail. The folders mail1, mail2 … sit directly in the data directory.</w:t>
             </w:r>
           </w:p>
         </w:tc>
@@ -44528,7 +46454,7 @@
                 <w:sz w:val="19"/>
                 <w:szCs w:val="19"/>
               </w:rPr>
-              <w:t xml:space="preserve">Preflight: MailFolderMax too low</w:t>
+              <w:t xml:space="preserve">ERROR: All pre-created mail folders … are full</w:t>
             </w:r>
           </w:p>
         </w:tc>
@@ -44559,7 +46485,7 @@
                 <w:sz w:val="19"/>
                 <w:szCs w:val="19"/>
               </w:rPr>
-              <w:t xml:space="preserve">The users need more folders than MailFolderMax</w:t>
+              <w:t xml:space="preserve">More users than the folders you created can hold</w:t>
             </w:r>
           </w:p>
         </w:tc>
@@ -44590,7 +46516,7 @@
                 <w:sz w:val="19"/>
                 <w:szCs w:val="19"/>
               </w:rPr>
-              <w:t xml:space="preserve">Create the folders listed in _mailfolders.txt and raise MailFolderMax</w:t>
+              <w:t xml:space="preserve">Create the next folder(s) on that server (B4), raise MailFolderMax, rebuild the batch</w:t>
             </w:r>
           </w:p>
         </w:tc>
@@ -44626,7 +46552,7 @@
                 <w:sz w:val="19"/>
                 <w:szCs w:val="19"/>
               </w:rPr>
-              <w:t xml:space="preserve">WARN: mail file renamed</w:t>
+              <w:t xml:space="preserve">Preflight: MailFolderMax too low</w:t>
             </w:r>
           </w:p>
         </w:tc>
@@ -44657,7 +46583,7 @@
                 <w:sz w:val="19"/>
                 <w:szCs w:val="19"/>
               </w:rPr>
-              <w:t xml:space="preserve">The last-name file already exists on that server, in the directory or in an open batch</w:t>
+              <w:t xml:space="preserve">The users need more folders than MailFolderMax</w:t>
             </w:r>
           </w:p>
         </w:tc>
@@ -44688,7 +46614,7 @@
                 <w:sz w:val="19"/>
                 <w:szCs w:val="19"/>
               </w:rPr>
-              <w:t xml:space="preserve">Normal with SUFFIX. Review the new name, or edit MailFile</w:t>
+              <w:t xml:space="preserve">Create the folders listed in _mailfolders.txt and raise MailFolderMax</w:t>
             </w:r>
           </w:p>
         </w:tc>
@@ -44724,7 +46650,7 @@
                 <w:sz w:val="19"/>
                 <w:szCs w:val="19"/>
               </w:rPr>
-              <w:t xml:space="preserve">"Could not scan &lt;server&gt;" in the debug log</w:t>
+              <w:t xml:space="preserve">WARN: mail file renamed</w:t>
             </w:r>
           </w:p>
         </w:tc>
@@ -44755,7 +46681,7 @@
                 <w:sz w:val="19"/>
                 <w:szCs w:val="19"/>
               </w:rPr>
-              <w:t xml:space="preserve">No access to the server's database list</w:t>
+              <w:t xml:space="preserve">The last-name file already exists on that server, in the directory or in an open batch</w:t>
             </w:r>
           </w:p>
         </w:tc>
@@ -44786,7 +46712,7 @@
                 <w:sz w:val="19"/>
                 <w:szCs w:val="19"/>
               </w:rPr>
-              <w:t xml:space="preserve">Uniqueness then uses the directory and the direct file check. Fix access and rebuild for full checking.</w:t>
+              <w:t xml:space="preserve">Normal with SUFFIX. Review the new name, or edit MailFile</w:t>
             </w:r>
           </w:p>
         </w:tc>
@@ -44822,7 +46748,7 @@
                 <w:sz w:val="19"/>
                 <w:szCs w:val="19"/>
               </w:rPr>
-              <w:t xml:space="preserve">MAILFILE_PENDING / MAILFILE_MISSING</w:t>
+              <w:t xml:space="preserve">"Could not scan &lt;server&gt;" in the debug log</w:t>
             </w:r>
           </w:p>
         </w:tc>
@@ -44853,7 +46779,7 @@
                 <w:sz w:val="19"/>
                 <w:szCs w:val="19"/>
               </w:rPr>
-              <w:t xml:space="preserve">Mail file creation queued (Administration Process) or failed: template missing, no Create databases right, server unreachable</w:t>
+              <w:t xml:space="preserve">No access to the server's database list</w:t>
             </w:r>
           </w:p>
         </w:tc>
@@ -44884,7 +46810,7 @@
                 <w:sz w:val="19"/>
                 <w:szCs w:val="19"/>
               </w:rPr>
-              <w:t xml:space="preserve">Check admin4.nsf on the home server, B4 rights and template; re-run Verify</w:t>
+              <w:t xml:space="preserve">Uniqueness then uses the directory and the direct file check. Fix access and rebuild for full checking.</w:t>
             </w:r>
           </w:p>
         </w:tc>
@@ -44920,6 +46846,104 @@
                 <w:sz w:val="19"/>
                 <w:szCs w:val="19"/>
               </w:rPr>
+              <w:t xml:space="preserve">MAILFILE_PENDING / MAILFILE_MISSING</w:t>
+            </w:r>
+          </w:p>
+        </w:tc>
+        <w:tc>
+          <w:tcPr>
+            <w:tcW w:type="dxa" w:w="3398"/>
+            <w:tcBorders>
+              <w:top w:val="single" w:color="DCE6F0" w:sz="4"/>
+              <w:left w:val="single" w:color="DCE6F0" w:sz="4"/>
+              <w:bottom w:val="single" w:color="DCE6F0" w:sz="4"/>
+              <w:right w:val="single" w:color="DCE6F0" w:sz="4"/>
+            </w:tcBorders>
+            <w:shd w:fill="F7F7FC" w:color="auto" w:val="clear"/>
+            <w:tcMar>
+              <w:top w:type="dxa" w:w="60"/>
+              <w:left w:type="dxa" w:w="100"/>
+              <w:bottom w:type="dxa" w:w="60"/>
+              <w:right w:type="dxa" w:w="100"/>
+            </w:tcMar>
+            <w:vAlign w:val="top"/>
+          </w:tcPr>
+          <w:p>
+            <w:pPr>
+              <w:spacing w:after="0" w:before="0"/>
+            </w:pPr>
+            <w:r>
+              <w:rPr>
+                <w:sz w:val="19"/>
+                <w:szCs w:val="19"/>
+              </w:rPr>
+              <w:t xml:space="preserve">Mail file creation queued (Administration Process) or failed: template missing, no Create databases right, server unreachable</w:t>
+            </w:r>
+          </w:p>
+        </w:tc>
+        <w:tc>
+          <w:tcPr>
+            <w:tcW w:type="dxa" w:w="3254"/>
+            <w:tcBorders>
+              <w:top w:val="single" w:color="DCE6F0" w:sz="4"/>
+              <w:left w:val="single" w:color="DCE6F0" w:sz="4"/>
+              <w:bottom w:val="single" w:color="DCE6F0" w:sz="4"/>
+              <w:right w:val="single" w:color="DCE6F0" w:sz="4"/>
+            </w:tcBorders>
+            <w:shd w:fill="F7F7FC" w:color="auto" w:val="clear"/>
+            <w:tcMar>
+              <w:top w:type="dxa" w:w="60"/>
+              <w:left w:type="dxa" w:w="100"/>
+              <w:bottom w:type="dxa" w:w="60"/>
+              <w:right w:type="dxa" w:w="100"/>
+            </w:tcMar>
+            <w:vAlign w:val="top"/>
+          </w:tcPr>
+          <w:p>
+            <w:pPr>
+              <w:spacing w:after="0" w:before="0"/>
+            </w:pPr>
+            <w:r>
+              <w:rPr>
+                <w:sz w:val="19"/>
+                <w:szCs w:val="19"/>
+              </w:rPr>
+              <w:t xml:space="preserve">Check admin4.nsf on the home server, B4 rights and template; re-run Verify</w:t>
+            </w:r>
+          </w:p>
+        </w:tc>
+      </w:tr>
+      <w:tr>
+        <w:trPr>
+          <w:cantSplit/>
+        </w:trPr>
+        <w:tc>
+          <w:tcPr>
+            <w:tcW w:type="dxa" w:w="2986"/>
+            <w:tcBorders>
+              <w:top w:val="single" w:color="DCE6F0" w:sz="4"/>
+              <w:left w:val="single" w:color="DCE6F0" w:sz="4"/>
+              <w:bottom w:val="single" w:color="DCE6F0" w:sz="4"/>
+              <w:right w:val="single" w:color="DCE6F0" w:sz="4"/>
+            </w:tcBorders>
+            <w:shd w:fill="FFFFFF" w:color="auto" w:val="clear"/>
+            <w:tcMar>
+              <w:top w:type="dxa" w:w="60"/>
+              <w:left w:type="dxa" w:w="100"/>
+              <w:bottom w:type="dxa" w:w="60"/>
+              <w:right w:type="dxa" w:w="100"/>
+            </w:tcMar>
+            <w:vAlign w:val="top"/>
+          </w:tcPr>
+          <w:p>
+            <w:pPr>
+              <w:spacing w:after="0" w:before="0"/>
+            </w:pPr>
+            <w:r>
+              <w:rPr>
+                <w:sz w:val="19"/>
+                <w:szCs w:val="19"/>
+              </w:rPr>
               <w:t xml:space="preserve">Mail fields change after the next DirSync</w:t>
             </w:r>
           </w:p>
@@ -44933,7 +46957,7 @@
               <w:bottom w:val="single" w:color="DCE6F0" w:sz="4"/>
               <w:right w:val="single" w:color="DCE6F0" w:sz="4"/>
             </w:tcBorders>
-            <w:shd w:fill="F7F7FC" w:color="auto" w:val="clear"/>
+            <w:shd w:fill="FFFFFF" w:color="auto" w:val="clear"/>
             <w:tcMar>
               <w:top w:type="dxa" w:w="60"/>
               <w:left w:type="dxa" w:w="100"/>
@@ -44964,7 +46988,7 @@
               <w:bottom w:val="single" w:color="DCE6F0" w:sz="4"/>
               <w:right w:val="single" w:color="DCE6F0" w:sz="4"/>
             </w:tcBorders>
-            <w:shd w:fill="F7F7FC" w:color="auto" w:val="clear"/>
+            <w:shd w:fill="FFFFFF" w:color="auto" w:val="clear"/>
             <w:tcMar>
               <w:top w:type="dxa" w:w="60"/>
               <w:left w:type="dxa" w:w="100"/>
@@ -49337,7 +51361,7 @@
       <w:r>
         <w:t xml:space="preserve">Registering Active Directory users (Directory Sync) – </w:t>
       </w:r>
-      <w:hyperlink w:history="1" r:id="rIdares7p9kl7dm_zsla9nnh">
+      <w:hyperlink w:history="1" r:id="rIdhrkalf8prlpdr6jsh0ab4">
         <w:r>
           <w:rPr>
             <w:rStyle w:val="Hyperlink"/>
@@ -49359,7 +51383,7 @@
       <w:r>
         <w:t xml:space="preserve">ContactNoteID property – </w:t>
       </w:r>
-      <w:hyperlink w:history="1" r:id="rIdm53i8sz8tywbdtowycyaz">
+      <w:hyperlink w:history="1" r:id="rIdwo0ityspd-d86zpwp_0x7">
         <w:r>
           <w:rPr>
             <w:rStyle w:val="Hyperlink"/>
@@ -49381,7 +51405,7 @@
       <w:r>
         <w:t xml:space="preserve">RegisterNewUser method – </w:t>
       </w:r>
-      <w:hyperlink w:history="1" r:id="rId9-3wpv62ehsmrgk9nl9wy">
+      <w:hyperlink w:history="1" r:id="rIdnnvlrb_1x55vxebvxgqqw">
         <w:r>
           <w:rPr>
             <w:rStyle w:val="Hyperlink"/>
@@ -49403,7 +51427,7 @@
       <w:r>
         <w:t xml:space="preserve">Creating an ID vault – </w:t>
       </w:r>
-      <w:hyperlink w:history="1" r:id="rId8fwru8i9acfvhic_jqcjq">
+      <w:hyperlink w:history="1" r:id="rIdfe-c59jf30pdbtbzwhaql">
         <w:r>
           <w:rPr>
             <w:rStyle w:val="Hyperlink"/>
@@ -49425,7 +51449,7 @@
       <w:r>
         <w:t xml:space="preserve">Assigning users to a vault (Security Settings, ID Vault tab) – </w:t>
       </w:r>
-      <w:hyperlink w:history="1" r:id="rIdnmkc3z7d78094jbqhklr5">
+      <w:hyperlink w:history="1" r:id="rId7pcocbf-2zcwpl6nwzm7h">
         <w:r>
           <w:rPr>
             <w:rStyle w:val="Hyperlink"/>
@@ -49447,7 +51471,7 @@
       <w:r>
         <w:t xml:space="preserve">Creating a security policy settings document – </w:t>
       </w:r>
-      <w:hyperlink w:history="1" r:id="rIdqsz6c4vva06swawl237aa">
+      <w:hyperlink w:history="1" r:id="rId-g1k-0dcmasiogyecj4dj">
         <w:r>
           <w:rPr>
             <w:rStyle w:val="Hyperlink"/>
@@ -49469,7 +51493,7 @@
       <w:r>
         <w:t xml:space="preserve">Creating a policy document (explicit policy names */name) – </w:t>
       </w:r>
-      <w:hyperlink w:history="1" r:id="rIdl-dqnyxalpj-4caifli77">
+      <w:hyperlink w:history="1" r:id="rIdjwfgfkkkcei49gas2knnj">
         <w:r>
           <w:rPr>
             <w:rStyle w:val="Hyperlink"/>
@@ -49491,7 +51515,7 @@
       <w:r>
         <w:t xml:space="preserve">Modifying a server-based CA (adding RAs) – </w:t>
       </w:r>
-      <w:hyperlink w:history="1" r:id="rIdacvq8lgo6jc4h6vat9ppv">
+      <w:hyperlink w:history="1" r:id="rIds_wr3w0wckgkdgqjmsmiu">
         <w:r>
           <w:rPr>
             <w:rStyle w:val="Hyperlink"/>
@@ -49513,7 +51537,7 @@
       <w:r>
         <w:t xml:space="preserve">Administration roles in the Domino Directory ACL – </w:t>
       </w:r>
-      <w:hyperlink w:history="1" r:id="rIdabojqrwustbmlexpkfrtp">
+      <w:hyperlink w:history="1" r:id="rIdf4ncb1lddutbawqolw9qx">
         <w:r>
           <w:rPr>
             <w:rStyle w:val="Hyperlink"/>
@@ -49535,7 +51559,7 @@
       <w:r>
         <w:t xml:space="preserve">Configuring a database ACL (Manage ACL) – </w:t>
       </w:r>
-      <w:hyperlink w:history="1" r:id="rIdgwr0g2qt536fd2hthqjuz">
+      <w:hyperlink w:history="1" r:id="rIdh6zxc9ribf3vnzzm90r6f">
         <w:r>
           <w:rPr>
             <w:rStyle w:val="Hyperlink"/>
@@ -49557,7 +51581,7 @@
       <w:r>
         <w:t xml:space="preserve">Creating a database from a template – </w:t>
       </w:r>
-      <w:hyperlink w:history="1" r:id="rIdzdqoekyjbfro3fxx4u3lf">
+      <w:hyperlink w:history="1" r:id="rIdglz_0dbzjwmmqgtjssjgk">
         <w:r>
           <w:rPr>
             <w:rStyle w:val="Hyperlink"/>
@@ -49579,7 +51603,7 @@
       <w:r>
         <w:t xml:space="preserve">Script libraries (Designer) – </w:t>
       </w:r>
-      <w:hyperlink w:history="1" r:id="rIdpl6murqebinf-b_pwrczs">
+      <w:hyperlink w:history="1" r:id="rIdhvsb06dzyxiil9d3yi6ms">
         <w:r>
           <w:rPr>
             <w:rStyle w:val="Hyperlink"/>
@@ -49601,7 +51625,7 @@
       <w:r>
         <w:t xml:space="preserve">Creating an agent (Designer) – </w:t>
       </w:r>
-      <w:hyperlink w:history="1" r:id="rIdc7dz_t2eh7jqwfupwz3p4">
+      <w:hyperlink w:history="1" r:id="rIdvvq50pdll4urlbjdzinqu">
         <w:r>
           <w:rPr>
             <w:rStyle w:val="Hyperlink"/>
@@ -49623,7 +51647,7 @@
       <w:r>
         <w:t xml:space="preserve">Naming agents: aliases '|' and cascading '\' – </w:t>
       </w:r>
-      <w:hyperlink w:history="1" r:id="rIdew-p3eextyytd0wj-uy0u">
+      <w:hyperlink w:history="1" r:id="rId_maolvushr9lf2ct7wt9x">
         <w:r>
           <w:rPr>
             <w:rStyle w:val="Hyperlink"/>
@@ -49645,7 +51669,7 @@
       <w:r>
         <w:t xml:space="preserve">Signing a database – </w:t>
       </w:r>
-      <w:hyperlink w:history="1" r:id="rIdsfi0px57shoemvrrefzrz">
+      <w:hyperlink w:history="1" r:id="rIdldka4asysba5tzd8q0mnn">
         <w:r>
           <w:rPr>
             <w:rStyle w:val="Hyperlink"/>
@@ -49667,7 +51691,7 @@
       <w:r>
         <w:t xml:space="preserve">Checking field values (Document Properties) – </w:t>
       </w:r>
-      <w:hyperlink w:history="1" r:id="rIddliuwbw-mxfwrehl3yjbx">
+      <w:hyperlink w:history="1" r:id="rId1cyn0auvaet5voyy3qsiy">
         <w:r>
           <w:rPr>
             <w:rStyle w:val="Hyperlink"/>
@@ -49689,7 +51713,7 @@
       <w:r>
         <w:t xml:space="preserve">Execution Security Alert (ECL) – </w:t>
       </w:r>
-      <w:hyperlink w:history="1" r:id="rIdathdhvkun5n26gp9hqupz">
+      <w:hyperlink w:history="1" r:id="rIdwq5x_2kzv3guyrzprglm9">
         <w:r>
           <w:rPr>
             <w:rStyle w:val="Hyperlink"/>
@@ -50146,7 +52170,7 @@
         <w:sz w:val="16"/>
         <w:szCs w:val="16"/>
       </w:rPr>
-      <w:t xml:space="preserve">HCL Confidential – Internal Use  |  v2.7</w:t>
+      <w:t xml:space="preserve">HCL Confidential – Internal Use  |  v2.8</w:t>
     </w:r>
     <w:r>
       <w:rPr>

</xml_diff>

<commit_message>
DryRun explained; central log database required (BulkReg 1.8.0)
- Central BulkReg log database (Agent Log template) is mandatory: agents stop before
  reading or changing anything if LogServer/LogDb are missing or cannot be opened
- One AUDIT entry per user per action also written to the log database
- Agent 03: dialog states DRY RUN (nothing changed) vs LIVE; dry run also checks that the
  home server is reachable
- bulkreg.ini: DryRun and log database explained in plain language
- Guide v2.9: B15 required (ACL), B21 checks the log database, D3b DryRun explained,
  D3/D4/D6/D7 and run-order rules; README
</commit_message>
<xml_diff>
--- a/docs/BulkReg_Admin_Guide.docx
+++ b/docs/BulkReg_Admin_Guide.docx
@@ -170,7 +170,7 @@
                 <w:sz w:val="20"/>
                 <w:szCs w:val="20"/>
               </w:rPr>
-              <w:t xml:space="preserve">Version 2.8  |  October 2026  |  Draft for review</w:t>
+              <w:t xml:space="preserve">Version 2.9  |  October 2026  |  Draft for review</w:t>
             </w:r>
           </w:p>
           <w:p>
@@ -482,7 +482,7 @@
                 <w:sz w:val="19"/>
                 <w:szCs w:val="19"/>
               </w:rPr>
-              <w:t xml:space="preserve">2.8 (Draft for review)</w:t>
+              <w:t xml:space="preserve">2.9 (Draft for review)</w:t>
             </w:r>
           </w:p>
         </w:tc>
@@ -766,7 +766,7 @@
                 <w:sz w:val="19"/>
                 <w:szCs w:val="19"/>
               </w:rPr>
-              <w:t xml:space="preserve">BulkReg 1.7.0: BulkRegCommon library, 5 agents, config templates, optional PowerShell helper, Audit Viewer</w:t>
+              <w:t xml:space="preserve">BulkReg 1.8.0: BulkRegCommon library, 5 agents, config templates, optional PowerShell helper, Audit Viewer</w:t>
             </w:r>
           </w:p>
         </w:tc>
@@ -972,7 +972,7 @@
                 <w:sz w:val="19"/>
                 <w:szCs w:val="19"/>
               </w:rPr>
-              <w:t xml:space="preserve">2.8</w:t>
+              <w:t xml:space="preserve">2.9</w:t>
             </w:r>
           </w:p>
         </w:tc>
@@ -998,13 +998,6 @@
             <w:pPr>
               <w:spacing w:after="0" w:before="0"/>
             </w:pPr>
-            <w:r>
-              <w:rPr>
-                <w:sz w:val="19"/>
-                <w:szCs w:val="19"/>
-              </w:rPr>
-              <w:t xml:space="preserve">Mail folder layout made explicit: mail1, mail2 … are created </w:t>
-            </w:r>
             <w:r>
               <w:rPr>
                 <w:b/>
@@ -1012,14 +1005,30 @@
                 <w:sz w:val="19"/>
                 <w:szCs w:val="19"/>
               </w:rPr>
-              <w:t xml:space="preserve">directly under the Domino data directory</w:t>
-            </w:r>
-            <w:r>
-              <w:rPr>
-                <w:sz w:val="19"/>
-                <w:szCs w:val="19"/>
-              </w:rPr>
-              <w:t xml:space="preserve">, next to the existing mail folder, not inside it. Folder diagram, plain explanation of MailFolderPrefix / MailFileDir / new MailExistingFolders. BulkReg rejects a prefix with a number (mail1) or a path (mail\mail) at start-up.</w:t>
+              <w:t xml:space="preserve">DryRun explained</w:t>
+            </w:r>
+            <w:r>
+              <w:rPr>
+                <w:sz w:val="19"/>
+                <w:szCs w:val="19"/>
+              </w:rPr>
+              <w:t xml:space="preserve"> (D3b, bulkreg.ini). </w:t>
+            </w:r>
+            <w:r>
+              <w:rPr>
+                <w:b/>
+                <w:bCs/>
+                <w:sz w:val="19"/>
+                <w:szCs w:val="19"/>
+              </w:rPr>
+              <w:t xml:space="preserve">Central BulkReg log database is now required</w:t>
+            </w:r>
+            <w:r>
+              <w:rPr>
+                <w:sz w:val="19"/>
+                <w:szCs w:val="19"/>
+              </w:rPr>
+              <w:t xml:space="preserve"> (B15): every run, every action and one AUDIT entry per user are written there; agents stop if it cannot be opened.</w:t>
             </w:r>
           </w:p>
         </w:tc>
@@ -1055,7 +1064,7 @@
                 <w:sz w:val="19"/>
                 <w:szCs w:val="19"/>
               </w:rPr>
-              <w:t xml:space="preserve">2.7</w:t>
+              <w:t xml:space="preserve">2.8</w:t>
             </w:r>
           </w:p>
         </w:tc>
@@ -1086,7 +1095,7 @@
                 <w:sz w:val="19"/>
                 <w:szCs w:val="19"/>
               </w:rPr>
-              <w:t xml:space="preserve">New one-page </w:t>
+              <w:t xml:space="preserve">Mail folder layout made explicit: mail1, mail2 … are created </w:t>
             </w:r>
             <w:r>
               <w:rPr>
@@ -1095,14 +1104,14 @@
                 <w:sz w:val="19"/>
                 <w:szCs w:val="19"/>
               </w:rPr>
-              <w:t xml:space="preserve">Agent Run Order</w:t>
-            </w:r>
-            <w:r>
-              <w:rPr>
-                <w:sz w:val="19"/>
-                <w:szCs w:val="19"/>
-              </w:rPr>
-              <w:t xml:space="preserve"> at the front of the guide (flow, step table with DryRun setting, input/output and go/no-go per step, rules).</w:t>
+              <w:t xml:space="preserve">directly under the Domino data directory</w:t>
+            </w:r>
+            <w:r>
+              <w:rPr>
+                <w:sz w:val="19"/>
+                <w:szCs w:val="19"/>
+              </w:rPr>
+              <w:t xml:space="preserve">, next to the existing mail folder, not inside it. Folder diagram, plain explanation of MailFolderPrefix / MailFileDir / new MailExistingFolders. BulkReg rejects a prefix with a number (mail1) or a path (mail\mail) at start-up.</w:t>
             </w:r>
           </w:p>
         </w:tc>
@@ -1138,7 +1147,7 @@
                 <w:sz w:val="19"/>
                 <w:szCs w:val="19"/>
               </w:rPr>
-              <w:t xml:space="preserve">2.6</w:t>
+              <w:t xml:space="preserve">2.7</w:t>
             </w:r>
           </w:p>
         </w:tc>
@@ -1169,7 +1178,7 @@
                 <w:sz w:val="19"/>
                 <w:szCs w:val="19"/>
               </w:rPr>
-              <w:t xml:space="preserve">RegistrationLog corrected: registration is logged to the </w:t>
+              <w:t xml:space="preserve">New one-page </w:t>
             </w:r>
             <w:r>
               <w:rPr>
@@ -1178,14 +1187,14 @@
                 <w:sz w:val="19"/>
                 <w:szCs w:val="19"/>
               </w:rPr>
-              <w:t xml:space="preserve">Certification Log certlog.nsf</w:t>
-            </w:r>
-            <w:r>
-              <w:rPr>
-                <w:sz w:val="19"/>
-                <w:szCs w:val="19"/>
-              </w:rPr>
-              <w:t xml:space="preserve"> on the registration server (HCL: any non-empty value → CERTLOG.NSF; empty = no logging). log.nsf is the server's general log. Prerequisite check for certlog.nsf added (B4).</w:t>
+              <w:t xml:space="preserve">Agent Run Order</w:t>
+            </w:r>
+            <w:r>
+              <w:rPr>
+                <w:sz w:val="19"/>
+                <w:szCs w:val="19"/>
+              </w:rPr>
+              <w:t xml:space="preserve"> at the front of the guide (flow, step table with DryRun setting, input/output and go/no-go per step, rules).</w:t>
             </w:r>
           </w:p>
         </w:tc>
@@ -1221,7 +1230,7 @@
                 <w:sz w:val="19"/>
                 <w:szCs w:val="19"/>
               </w:rPr>
-              <w:t xml:space="preserve">2.5</w:t>
+              <w:t xml:space="preserve">2.6</w:t>
             </w:r>
           </w:p>
         </w:tc>
@@ -1247,6 +1256,13 @@
             <w:pPr>
               <w:spacing w:after="0" w:before="0"/>
             </w:pPr>
+            <w:r>
+              <w:rPr>
+                <w:sz w:val="19"/>
+                <w:szCs w:val="19"/>
+              </w:rPr>
+              <w:t xml:space="preserve">RegistrationLog corrected: registration is logged to the </w:t>
+            </w:r>
             <w:r>
               <w:rPr>
                 <w:b/>
@@ -1254,30 +1270,14 @@
                 <w:sz w:val="19"/>
                 <w:szCs w:val="19"/>
               </w:rPr>
-              <w:t xml:space="preserve">Prerequisite: pre-create the numbered mail folders</w:t>
-            </w:r>
-            <w:r>
-              <w:rPr>
-                <w:sz w:val="19"/>
-                <w:szCs w:val="19"/>
-              </w:rPr>
-              <w:t xml:space="preserve"> (mail1…mailN, one per 1000 users) on every home server (B4). Preflight calculates the folders needed per server and writes the create commands. New </w:t>
-            </w:r>
-            <w:r>
-              <w:rPr>
-                <w:rFonts w:ascii="Consolas" w:cs="Consolas" w:eastAsia="Consolas" w:hAnsi="Consolas"/>
-                <w:color w:val="0F5FDC"/>
-                <w:sz w:val="18"/>
-                <w:szCs w:val="18"/>
-              </w:rPr>
-              <w:t xml:space="preserve">MailFolderMax</w:t>
-            </w:r>
-            <w:r>
-              <w:rPr>
-                <w:sz w:val="19"/>
-                <w:szCs w:val="19"/>
-              </w:rPr>
-              <w:t xml:space="preserve">: Build Batch never assigns a folder above the number you created.</w:t>
+              <w:t xml:space="preserve">Certification Log certlog.nsf</w:t>
+            </w:r>
+            <w:r>
+              <w:rPr>
+                <w:sz w:val="19"/>
+                <w:szCs w:val="19"/>
+              </w:rPr>
+              <w:t xml:space="preserve"> on the registration server (HCL: any non-empty value → CERTLOG.NSF; empty = no logging). log.nsf is the server's general log. Prerequisite check for certlog.nsf added (B4).</w:t>
             </w:r>
           </w:p>
         </w:tc>
@@ -1313,7 +1313,7 @@
                 <w:sz w:val="19"/>
                 <w:szCs w:val="19"/>
               </w:rPr>
-              <w:t xml:space="preserve">2.4</w:t>
+              <w:t xml:space="preserve">2.5</w:t>
             </w:r>
           </w:p>
         </w:tc>
@@ -1339,13 +1339,6 @@
             <w:pPr>
               <w:spacing w:after="0" w:before="0"/>
             </w:pPr>
-            <w:r>
-              <w:rPr>
-                <w:sz w:val="19"/>
-                <w:szCs w:val="19"/>
-              </w:rPr>
-              <w:t xml:space="preserve">Mail file </w:t>
-            </w:r>
             <w:r>
               <w:rPr>
                 <w:b/>
@@ -1353,46 +1346,30 @@
                 <w:sz w:val="19"/>
                 <w:szCs w:val="19"/>
               </w:rPr>
-              <w:t xml:space="preserve">naming = last name</w:t>
-            </w:r>
-            <w:r>
-              <w:rPr>
-                <w:sz w:val="19"/>
-                <w:szCs w:val="19"/>
-              </w:rPr>
-              <w:t xml:space="preserve"> (configurable), </w:t>
-            </w:r>
-            <w:r>
-              <w:rPr>
-                <w:b/>
-                <w:bCs/>
-                <w:sz w:val="19"/>
-                <w:szCs w:val="19"/>
-              </w:rPr>
-              <w:t xml:space="preserve">uniqueness</w:t>
-            </w:r>
-            <w:r>
-              <w:rPr>
-                <w:sz w:val="19"/>
-                <w:szCs w:val="19"/>
-              </w:rPr>
-              <w:t xml:space="preserve"> checked against all mail folders on the home server, Person documents, open batches and the batch itself (clash → smith2.nsf or ERROR), </w:t>
-            </w:r>
-            <w:r>
-              <w:rPr>
-                <w:b/>
-                <w:bCs/>
-                <w:sz w:val="19"/>
-                <w:szCs w:val="19"/>
-              </w:rPr>
-              <w:t xml:space="preserve">numbered folders</w:t>
-            </w:r>
-            <w:r>
-              <w:rPr>
-                <w:sz w:val="19"/>
-                <w:szCs w:val="19"/>
-              </w:rPr>
-              <w:t xml:space="preserve"> mail1, mail2… with max 1000 mail files each. MailFileNote recorded in batch file, summary, results and audit.</w:t>
+              <w:t xml:space="preserve">Prerequisite: pre-create the numbered mail folders</w:t>
+            </w:r>
+            <w:r>
+              <w:rPr>
+                <w:sz w:val="19"/>
+                <w:szCs w:val="19"/>
+              </w:rPr>
+              <w:t xml:space="preserve"> (mail1…mailN, one per 1000 users) on every home server (B4). Preflight calculates the folders needed per server and writes the create commands. New </w:t>
+            </w:r>
+            <w:r>
+              <w:rPr>
+                <w:rFonts w:ascii="Consolas" w:cs="Consolas" w:eastAsia="Consolas" w:hAnsi="Consolas"/>
+                <w:color w:val="0F5FDC"/>
+                <w:sz w:val="18"/>
+                <w:szCs w:val="18"/>
+              </w:rPr>
+              <w:t xml:space="preserve">MailFolderMax</w:t>
+            </w:r>
+            <w:r>
+              <w:rPr>
+                <w:sz w:val="19"/>
+                <w:szCs w:val="19"/>
+              </w:rPr>
+              <w:t xml:space="preserve">: Build Batch never assigns a folder above the number you created.</w:t>
             </w:r>
           </w:p>
         </w:tc>
@@ -1428,7 +1405,7 @@
                 <w:sz w:val="19"/>
                 <w:szCs w:val="19"/>
               </w:rPr>
-              <w:t xml:space="preserve">2.3</w:t>
+              <w:t xml:space="preserve">2.4</w:t>
             </w:r>
           </w:p>
         </w:tc>
@@ -1454,6 +1431,13 @@
             <w:pPr>
               <w:spacing w:after="0" w:before="0"/>
             </w:pPr>
+            <w:r>
+              <w:rPr>
+                <w:sz w:val="19"/>
+                <w:szCs w:val="19"/>
+              </w:rPr>
+              <w:t xml:space="preserve">Mail file </w:t>
+            </w:r>
             <w:r>
               <w:rPr>
                 <w:b/>
@@ -1461,14 +1445,46 @@
                 <w:sz w:val="19"/>
                 <w:szCs w:val="19"/>
               </w:rPr>
-              <w:t xml:space="preserve">Every registered user now gets a Domino mail file</w:t>
-            </w:r>
-            <w:r>
-              <w:rPr>
-                <w:sz w:val="19"/>
-                <w:szCs w:val="19"/>
-              </w:rPr>
-              <w:t xml:space="preserve"> on the home server (MailFile column in the batch, reviewable). CreateMailDb / PreserveMailSystem removed. Mail file settings (folder, template, ACL manager, quota, full-text index), existence checks before and after registration, and mail file status in Verify.</w:t>
+              <w:t xml:space="preserve">naming = last name</w:t>
+            </w:r>
+            <w:r>
+              <w:rPr>
+                <w:sz w:val="19"/>
+                <w:szCs w:val="19"/>
+              </w:rPr>
+              <w:t xml:space="preserve"> (configurable), </w:t>
+            </w:r>
+            <w:r>
+              <w:rPr>
+                <w:b/>
+                <w:bCs/>
+                <w:sz w:val="19"/>
+                <w:szCs w:val="19"/>
+              </w:rPr>
+              <w:t xml:space="preserve">uniqueness</w:t>
+            </w:r>
+            <w:r>
+              <w:rPr>
+                <w:sz w:val="19"/>
+                <w:szCs w:val="19"/>
+              </w:rPr>
+              <w:t xml:space="preserve"> checked against all mail folders on the home server, Person documents, open batches and the batch itself (clash → smith2.nsf or ERROR), </w:t>
+            </w:r>
+            <w:r>
+              <w:rPr>
+                <w:b/>
+                <w:bCs/>
+                <w:sz w:val="19"/>
+                <w:szCs w:val="19"/>
+              </w:rPr>
+              <w:t xml:space="preserve">numbered folders</w:t>
+            </w:r>
+            <w:r>
+              <w:rPr>
+                <w:sz w:val="19"/>
+                <w:szCs w:val="19"/>
+              </w:rPr>
+              <w:t xml:space="preserve"> mail1, mail2… with max 1000 mail files each. MailFileNote recorded in batch file, summary, results and audit.</w:t>
             </w:r>
           </w:p>
         </w:tc>
@@ -1504,7 +1520,7 @@
                 <w:sz w:val="19"/>
                 <w:szCs w:val="19"/>
               </w:rPr>
-              <w:t xml:space="preserve">2.1</w:t>
+              <w:t xml:space="preserve">2.3</w:t>
             </w:r>
           </w:p>
         </w:tc>
@@ -1530,13 +1546,6 @@
             <w:pPr>
               <w:spacing w:after="0" w:before="0"/>
             </w:pPr>
-            <w:r>
-              <w:rPr>
-                <w:sz w:val="19"/>
-                <w:szCs w:val="19"/>
-              </w:rPr>
-              <w:t xml:space="preserve">Name formats: servers in canonical (CN=DominoADMail/O=Demo) or abbreviated (DominoADMail/Demo) form, both accepted by the code. </w:t>
-            </w:r>
             <w:r>
               <w:rPr>
                 <w:b/>
@@ -1544,30 +1553,14 @@
                 <w:sz w:val="19"/>
                 <w:szCs w:val="19"/>
               </w:rPr>
-              <w:t xml:space="preserve">Organizational policies</w:t>
-            </w:r>
-            <w:r>
-              <w:rPr>
-                <w:sz w:val="19"/>
-                <w:szCs w:val="19"/>
-              </w:rPr>
-              <w:t xml:space="preserve"> (</w:t>
-            </w:r>
-            <w:r>
-              <w:rPr>
-                <w:i/>
-                <w:iCs/>
-                <w:sz w:val="19"/>
-                <w:szCs w:val="19"/>
-              </w:rPr>
-              <w:t xml:space="preserve">/Demo, </w:t>
-            </w:r>
-            <w:r>
-              <w:rPr>
-                <w:sz w:val="19"/>
-                <w:szCs w:val="19"/>
-              </w:rPr>
-              <w:t xml:space="preserve">/Sales/Demo) supported alongside explicit policies (B8 Option B, OrgPolicyAssignsVault, '-' in the mapping). Consistent 'Demo' examples.</w:t>
+              <w:t xml:space="preserve">Every registered user now gets a Domino mail file</w:t>
+            </w:r>
+            <w:r>
+              <w:rPr>
+                <w:sz w:val="19"/>
+                <w:szCs w:val="19"/>
+              </w:rPr>
+              <w:t xml:space="preserve"> on the home server (MailFile column in the batch, reviewable). CreateMailDb / PreserveMailSystem removed. Mail file settings (folder, template, ACL manager, quota, full-text index), existence checks before and after registration, and mail file status in Verify.</w:t>
             </w:r>
           </w:p>
         </w:tc>
@@ -1603,6 +1596,105 @@
                 <w:sz w:val="19"/>
                 <w:szCs w:val="19"/>
               </w:rPr>
+              <w:t xml:space="preserve">2.1</w:t>
+            </w:r>
+          </w:p>
+        </w:tc>
+        <w:tc>
+          <w:tcPr>
+            <w:tcW w:type="dxa" w:w="8403"/>
+            <w:tcBorders>
+              <w:top w:val="single" w:color="DCE6F0" w:sz="4"/>
+              <w:left w:val="single" w:color="DCE6F0" w:sz="4"/>
+              <w:bottom w:val="single" w:color="DCE6F0" w:sz="4"/>
+              <w:right w:val="single" w:color="DCE6F0" w:sz="4"/>
+            </w:tcBorders>
+            <w:shd w:fill="FFFFFF" w:color="auto" w:val="clear"/>
+            <w:tcMar>
+              <w:top w:type="dxa" w:w="60"/>
+              <w:left w:type="dxa" w:w="100"/>
+              <w:bottom w:type="dxa" w:w="60"/>
+              <w:right w:type="dxa" w:w="100"/>
+            </w:tcMar>
+            <w:vAlign w:val="top"/>
+          </w:tcPr>
+          <w:p>
+            <w:pPr>
+              <w:spacing w:after="0" w:before="0"/>
+            </w:pPr>
+            <w:r>
+              <w:rPr>
+                <w:sz w:val="19"/>
+                <w:szCs w:val="19"/>
+              </w:rPr>
+              <w:t xml:space="preserve">Name formats: servers in canonical (CN=DominoADMail/O=Demo) or abbreviated (DominoADMail/Demo) form, both accepted by the code. </w:t>
+            </w:r>
+            <w:r>
+              <w:rPr>
+                <w:b/>
+                <w:bCs/>
+                <w:sz w:val="19"/>
+                <w:szCs w:val="19"/>
+              </w:rPr>
+              <w:t xml:space="preserve">Organizational policies</w:t>
+            </w:r>
+            <w:r>
+              <w:rPr>
+                <w:sz w:val="19"/>
+                <w:szCs w:val="19"/>
+              </w:rPr>
+              <w:t xml:space="preserve"> (</w:t>
+            </w:r>
+            <w:r>
+              <w:rPr>
+                <w:i/>
+                <w:iCs/>
+                <w:sz w:val="19"/>
+                <w:szCs w:val="19"/>
+              </w:rPr>
+              <w:t xml:space="preserve">/Demo, </w:t>
+            </w:r>
+            <w:r>
+              <w:rPr>
+                <w:sz w:val="19"/>
+                <w:szCs w:val="19"/>
+              </w:rPr>
+              <w:t xml:space="preserve">/Sales/Demo) supported alongside explicit policies (B8 Option B, OrgPolicyAssignsVault, '-' in the mapping). Consistent 'Demo' examples.</w:t>
+            </w:r>
+          </w:p>
+        </w:tc>
+      </w:tr>
+      <w:tr>
+        <w:trPr>
+          <w:cantSplit/>
+        </w:trPr>
+        <w:tc>
+          <w:tcPr>
+            <w:tcW w:type="dxa" w:w="1235"/>
+            <w:tcBorders>
+              <w:top w:val="single" w:color="DCE6F0" w:sz="4"/>
+              <w:left w:val="single" w:color="DCE6F0" w:sz="4"/>
+              <w:bottom w:val="single" w:color="DCE6F0" w:sz="4"/>
+              <w:right w:val="single" w:color="DCE6F0" w:sz="4"/>
+            </w:tcBorders>
+            <w:shd w:fill="F7F7FC" w:color="auto" w:val="clear"/>
+            <w:tcMar>
+              <w:top w:type="dxa" w:w="60"/>
+              <w:left w:type="dxa" w:w="100"/>
+              <w:bottom w:type="dxa" w:w="60"/>
+              <w:right w:type="dxa" w:w="100"/>
+            </w:tcMar>
+            <w:vAlign w:val="top"/>
+          </w:tcPr>
+          <w:p>
+            <w:pPr>
+              <w:spacing w:after="0" w:before="0"/>
+            </w:pPr>
+            <w:r>
+              <w:rPr>
+                <w:sz w:val="19"/>
+                <w:szCs w:val="19"/>
+              </w:rPr>
               <w:t xml:space="preserve">2.0</w:t>
             </w:r>
           </w:p>
@@ -1616,7 +1708,7 @@
               <w:bottom w:val="single" w:color="DCE6F0" w:sz="4"/>
               <w:right w:val="single" w:color="DCE6F0" w:sz="4"/>
             </w:tcBorders>
-            <w:shd w:fill="FFFFFF" w:color="auto" w:val="clear"/>
+            <w:shd w:fill="F7F7FC" w:color="auto" w:val="clear"/>
             <w:tcMar>
               <w:top w:type="dxa" w:w="60"/>
               <w:left w:type="dxa" w:w="100"/>
@@ -7734,6 +7826,25 @@
     </w:p>
     <w:p>
       <w:pPr>
+        <w:pStyle w:val="ListParagraph"/>
+        <w:numPr>
+          <w:ilvl w:val="0"/>
+          <w:numId w:val="2"/>
+        </w:numPr>
+      </w:pPr>
+      <w:r>
+        <w:rPr>
+          <w:b/>
+          <w:bCs/>
+        </w:rPr>
+        <w:t xml:space="preserve">DryRun only affects 03</w:t>
+      </w:r>
+      <w:r>
+        <w:t xml:space="preserve"> (D3b). Every agent writes to the central log database (B15).</w:t>
+      </w:r>
+    </w:p>
+    <w:p>
+      <w:pPr>
         <w:pStyle w:val="Heading3"/>
       </w:pPr>
       <w:r>
@@ -10427,7 +10538,7 @@
                 <w:sz w:val="19"/>
                 <w:szCs w:val="19"/>
               </w:rPr>
-              <w:t xml:space="preserve">Tool database bulkreg.nsf (+ optional log database)</w:t>
+              <w:t xml:space="preserve">Tool database bulkreg.nsf</w:t>
             </w:r>
           </w:p>
         </w:tc>
@@ -10489,7 +10600,7 @@
                 <w:sz w:val="19"/>
                 <w:szCs w:val="19"/>
               </w:rPr>
-              <w:t xml:space="preserve">B13–B15</w:t>
+              <w:t xml:space="preserve">B13, B14</w:t>
             </w:r>
           </w:p>
         </w:tc>
@@ -10525,6 +10636,104 @@
                 <w:sz w:val="19"/>
                 <w:szCs w:val="19"/>
               </w:rPr>
+              <w:t xml:space="preserve">Central log database bulkreg_log.nsf (required)</w:t>
+            </w:r>
+          </w:p>
+        </w:tc>
+        <w:tc>
+          <w:tcPr>
+            <w:tcW w:type="dxa" w:w="3295"/>
+            <w:tcBorders>
+              <w:top w:val="single" w:color="DCE6F0" w:sz="4"/>
+              <w:left w:val="single" w:color="DCE6F0" w:sz="4"/>
+              <w:bottom w:val="single" w:color="DCE6F0" w:sz="4"/>
+              <w:right w:val="single" w:color="DCE6F0" w:sz="4"/>
+            </w:tcBorders>
+            <w:shd w:fill="FFFFFF" w:color="auto" w:val="clear"/>
+            <w:tcMar>
+              <w:top w:type="dxa" w:w="60"/>
+              <w:left w:type="dxa" w:w="100"/>
+              <w:bottom w:type="dxa" w:w="60"/>
+              <w:right w:type="dxa" w:w="100"/>
+            </w:tcMar>
+            <w:vAlign w:val="top"/>
+          </w:tcPr>
+          <w:p>
+            <w:pPr>
+              <w:spacing w:after="0" w:before="0"/>
+            </w:pPr>
+            <w:r>
+              <w:rPr>
+                <w:sz w:val="19"/>
+                <w:szCs w:val="19"/>
+              </w:rPr>
+              <w:t xml:space="preserve">A Domino server, e.g. the registration server</w:t>
+            </w:r>
+          </w:p>
+        </w:tc>
+        <w:tc>
+          <w:tcPr>
+            <w:tcW w:type="dxa" w:w="1916"/>
+            <w:tcBorders>
+              <w:top w:val="single" w:color="DCE6F0" w:sz="4"/>
+              <w:left w:val="single" w:color="DCE6F0" w:sz="4"/>
+              <w:bottom w:val="single" w:color="DCE6F0" w:sz="4"/>
+              <w:right w:val="single" w:color="DCE6F0" w:sz="4"/>
+            </w:tcBorders>
+            <w:shd w:fill="FFFFFF" w:color="auto" w:val="clear"/>
+            <w:tcMar>
+              <w:top w:type="dxa" w:w="60"/>
+              <w:left w:type="dxa" w:w="100"/>
+              <w:bottom w:type="dxa" w:w="60"/>
+              <w:right w:type="dxa" w:w="100"/>
+            </w:tcMar>
+            <w:vAlign w:val="top"/>
+          </w:tcPr>
+          <w:p>
+            <w:pPr>
+              <w:spacing w:after="0" w:before="0"/>
+            </w:pPr>
+            <w:r>
+              <w:rPr>
+                <w:sz w:val="19"/>
+                <w:szCs w:val="19"/>
+              </w:rPr>
+              <w:t xml:space="preserve">B15</w:t>
+            </w:r>
+          </w:p>
+        </w:tc>
+      </w:tr>
+      <w:tr>
+        <w:trPr>
+          <w:cantSplit/>
+        </w:trPr>
+        <w:tc>
+          <w:tcPr>
+            <w:tcW w:type="dxa" w:w="4427"/>
+            <w:tcBorders>
+              <w:top w:val="single" w:color="DCE6F0" w:sz="4"/>
+              <w:left w:val="single" w:color="DCE6F0" w:sz="4"/>
+              <w:bottom w:val="single" w:color="DCE6F0" w:sz="4"/>
+              <w:right w:val="single" w:color="DCE6F0" w:sz="4"/>
+            </w:tcBorders>
+            <w:shd w:fill="F7F7FC" w:color="auto" w:val="clear"/>
+            <w:tcMar>
+              <w:top w:type="dxa" w:w="60"/>
+              <w:left w:type="dxa" w:w="100"/>
+              <w:bottom w:type="dxa" w:w="60"/>
+              <w:right w:type="dxa" w:w="100"/>
+            </w:tcMar>
+            <w:vAlign w:val="top"/>
+          </w:tcPr>
+          <w:p>
+            <w:pPr>
+              <w:spacing w:after="0" w:before="0"/>
+            </w:pPr>
+            <w:r>
+              <w:rPr>
+                <w:sz w:val="19"/>
+                <w:szCs w:val="19"/>
+              </w:rPr>
               <w:t xml:space="preserve">Script library and 5 agents</w:t>
             </w:r>
           </w:p>
@@ -10538,7 +10747,7 @@
               <w:bottom w:val="single" w:color="DCE6F0" w:sz="4"/>
               <w:right w:val="single" w:color="DCE6F0" w:sz="4"/>
             </w:tcBorders>
-            <w:shd w:fill="FFFFFF" w:color="auto" w:val="clear"/>
+            <w:shd w:fill="F7F7FC" w:color="auto" w:val="clear"/>
             <w:tcMar>
               <w:top w:type="dxa" w:w="60"/>
               <w:left w:type="dxa" w:w="100"/>
@@ -10569,7 +10778,7 @@
               <w:bottom w:val="single" w:color="DCE6F0" w:sz="4"/>
               <w:right w:val="single" w:color="DCE6F0" w:sz="4"/>
             </w:tcBorders>
-            <w:shd w:fill="FFFFFF" w:color="auto" w:val="clear"/>
+            <w:shd w:fill="F7F7FC" w:color="auto" w:val="clear"/>
             <w:tcMar>
               <w:top w:type="dxa" w:w="60"/>
               <w:left w:type="dxa" w:w="100"/>
@@ -22923,10 +23132,44 @@
             </w:pPr>
             <w:r>
               <w:rPr>
-                <w:sz w:val="19"/>
-                <w:szCs w:val="19"/>
-              </w:rPr>
-              <w:t xml:space="preserve">Leave empty unless you create the log database in B15</w:t>
+                <w:b/>
+                <w:bCs/>
+                <w:sz w:val="19"/>
+                <w:szCs w:val="19"/>
+              </w:rPr>
+              <w:t xml:space="preserve">Required.</w:t>
+            </w:r>
+            <w:r>
+              <w:rPr>
+                <w:sz w:val="19"/>
+                <w:szCs w:val="19"/>
+              </w:rPr>
+              <w:t xml:space="preserve"> The server and file of the central log database from B15, e.g. </w:t>
+            </w:r>
+            <w:r>
+              <w:rPr>
+                <w:rFonts w:ascii="Consolas" w:cs="Consolas" w:eastAsia="Consolas" w:hAnsi="Consolas"/>
+                <w:color w:val="0F5FDC"/>
+                <w:sz w:val="18"/>
+                <w:szCs w:val="18"/>
+              </w:rPr>
+              <w:t xml:space="preserve">DominoAdmin/Demo</w:t>
+            </w:r>
+            <w:r>
+              <w:rPr>
+                <w:sz w:val="19"/>
+                <w:szCs w:val="19"/>
+              </w:rPr>
+              <w:t xml:space="preserve"> and </w:t>
+            </w:r>
+            <w:r>
+              <w:rPr>
+                <w:rFonts w:ascii="Consolas" w:cs="Consolas" w:eastAsia="Consolas" w:hAnsi="Consolas"/>
+                <w:color w:val="0F5FDC"/>
+                <w:sz w:val="18"/>
+                <w:szCs w:val="18"/>
+              </w:rPr>
+              <w:t xml:space="preserve">bulkreg_log.nsf</w:t>
             </w:r>
           </w:p>
         </w:tc>
@@ -25380,12 +25623,74 @@
         <w:pStyle w:val="Heading2"/>
       </w:pPr>
       <w:r>
-        <w:t xml:space="preserve">B15 Optional: create a central log database</w:t>
+        <w:t xml:space="preserve">B15 Create the central BulkReg log database (required)</w:t>
       </w:r>
     </w:p>
     <w:p>
       <w:r>
-        <w:t xml:space="preserve">Skip this unless you want BulkReg events in a Notes database as well as in the audit files.</w:t>
+        <w:rPr>
+          <w:b/>
+          <w:bCs/>
+        </w:rPr>
+        <w:t xml:space="preserve">Who:</w:t>
+      </w:r>
+      <w:r>
+        <w:t xml:space="preserve"> Domino administrator   </w:t>
+      </w:r>
+      <w:r>
+        <w:rPr>
+          <w:b/>
+          <w:bCs/>
+        </w:rPr>
+        <w:t xml:space="preserve">Where:</w:t>
+      </w:r>
+      <w:r>
+        <w:t xml:space="preserve"> Domino Administrator   </w:t>
+      </w:r>
+      <w:r>
+        <w:rPr>
+          <w:b/>
+          <w:bCs/>
+        </w:rPr>
+        <w:t xml:space="preserve">Changes:</w:t>
+      </w:r>
+      <w:r>
+        <w:t xml:space="preserve"> creates one database on a server</w:t>
+      </w:r>
+    </w:p>
+    <w:p>
+      <w:r>
+        <w:t xml:space="preserve">This Notes database is the </w:t>
+      </w:r>
+      <w:r>
+        <w:rPr>
+          <w:b/>
+          <w:bCs/>
+        </w:rPr>
+        <w:t xml:space="preserve">shared, permanent record</w:t>
+      </w:r>
+      <w:r>
+        <w:t xml:space="preserve"> of everything BulkReg does. Every run of every agent writes to it: the start and end of the run (agent, operator, batch, DryRun), every action and error, and one </w:t>
+      </w:r>
+      <w:r>
+        <w:rPr>
+          <w:b/>
+          <w:bCs/>
+        </w:rPr>
+        <w:t xml:space="preserve">AUDIT</w:t>
+      </w:r>
+      <w:r>
+        <w:t xml:space="preserve"> entry per user (result, home server, mail file, vault status, batch). The CSV and .log files on the admin PC are local working copies; this database is what other administrators and auditors use. If it cannot be opened, every agent stops </w:t>
+      </w:r>
+      <w:r>
+        <w:rPr>
+          <w:b/>
+          <w:bCs/>
+        </w:rPr>
+        <w:t xml:space="preserve">before</w:t>
+      </w:r>
+      <w:r>
+        <w:t xml:space="preserve"> reading or changing anything.</w:t>
       </w:r>
     </w:p>
     <w:p>
@@ -25407,17 +25712,7 @@
         <w:t xml:space="preserve">File &gt; Application &gt; New</w:t>
       </w:r>
       <w:r>
-        <w:t xml:space="preserve">. In </w:t>
-      </w:r>
-      <w:r>
-        <w:rPr>
-          <w:b/>
-          <w:bCs/>
-        </w:rPr>
-        <w:t xml:space="preserve">Server</w:t>
-      </w:r>
-      <w:r>
-        <w:t xml:space="preserve">, select the server that will hold the log (for example the registration server).</w:t>
+        <w:t xml:space="preserve">.</w:t>
       </w:r>
     </w:p>
     <w:p>
@@ -25436,10 +25731,10 @@
           <w:b/>
           <w:bCs/>
         </w:rPr>
-        <w:t xml:space="preserve">Title</w:t>
-      </w:r>
-      <w:r>
-        <w:t xml:space="preserve">, type </w:t>
+        <w:t xml:space="preserve">Server</w:t>
+      </w:r>
+      <w:r>
+        <w:t xml:space="preserve">, select the server that will hold the log, for example the registration server </w:t>
       </w:r>
       <w:r>
         <w:rPr>
@@ -25448,32 +25743,10 @@
           <w:sz w:val="20"/>
           <w:szCs w:val="20"/>
         </w:rPr>
-        <w:t xml:space="preserve">BulkReg Log</w:t>
-      </w:r>
-      <w:r>
-        <w:t xml:space="preserve">. In </w:t>
-      </w:r>
-      <w:r>
-        <w:rPr>
-          <w:b/>
-          <w:bCs/>
-        </w:rPr>
-        <w:t xml:space="preserve">File Name</w:t>
-      </w:r>
-      <w:r>
-        <w:t xml:space="preserve">, type </w:t>
-      </w:r>
-      <w:r>
-        <w:rPr>
-          <w:rFonts w:ascii="Consolas" w:cs="Consolas" w:eastAsia="Consolas" w:hAnsi="Consolas"/>
-          <w:color w:val="0F5FDC"/>
-          <w:sz w:val="20"/>
-          <w:szCs w:val="20"/>
-        </w:rPr>
-        <w:t xml:space="preserve">bulkreg_log.nsf</w:t>
-      </w:r>
-      <w:r>
-        <w:t xml:space="preserve">.</w:t>
+        <w:t xml:space="preserve">DominoAdmin/Demo</w:t>
+      </w:r>
+      <w:r>
+        <w:t xml:space="preserve">. Do not keep Local.</w:t>
       </w:r>
     </w:p>
     <w:p>
@@ -25485,34 +25758,48 @@
         </w:numPr>
       </w:pPr>
       <w:r>
-        <w:t xml:space="preserve">Tick </w:t>
+        <w:t xml:space="preserve">In </w:t>
       </w:r>
       <w:r>
         <w:rPr>
           <w:b/>
           <w:bCs/>
         </w:rPr>
-        <w:t xml:space="preserve">Show advanced templates</w:t>
-      </w:r>
-      <w:r>
-        <w:t xml:space="preserve"> and select the </w:t>
+        <w:t xml:space="preserve">Title</w:t>
+      </w:r>
+      <w:r>
+        <w:t xml:space="preserve">, type </w:t>
+      </w:r>
+      <w:r>
+        <w:rPr>
+          <w:rFonts w:ascii="Consolas" w:cs="Consolas" w:eastAsia="Consolas" w:hAnsi="Consolas"/>
+          <w:color w:val="0F5FDC"/>
+          <w:sz w:val="20"/>
+          <w:szCs w:val="20"/>
+        </w:rPr>
+        <w:t xml:space="preserve">BulkReg Log</w:t>
+      </w:r>
+      <w:r>
+        <w:t xml:space="preserve">. In </w:t>
       </w:r>
       <w:r>
         <w:rPr>
           <w:b/>
           <w:bCs/>
         </w:rPr>
-        <w:t xml:space="preserve">Agent Log</w:t>
-      </w:r>
-      <w:r>
-        <w:t xml:space="preserve"> template (file alog4.ntf; some releases list alog.ntf). Click </w:t>
-      </w:r>
-      <w:r>
-        <w:rPr>
-          <w:b/>
-          <w:bCs/>
-        </w:rPr>
-        <w:t xml:space="preserve">OK</w:t>
+        <w:t xml:space="preserve">File Name</w:t>
+      </w:r>
+      <w:r>
+        <w:t xml:space="preserve">, type </w:t>
+      </w:r>
+      <w:r>
+        <w:rPr>
+          <w:rFonts w:ascii="Consolas" w:cs="Consolas" w:eastAsia="Consolas" w:hAnsi="Consolas"/>
+          <w:color w:val="0F5FDC"/>
+          <w:sz w:val="20"/>
+          <w:szCs w:val="20"/>
+        </w:rPr>
+        <w:t xml:space="preserve">bulkreg_log.nsf</w:t>
       </w:r>
       <w:r>
         <w:t xml:space="preserve">.</w:t>
@@ -25527,7 +25814,27 @@
         </w:numPr>
       </w:pPr>
       <w:r>
-        <w:t xml:space="preserve">In bulkreg.ini set </w:t>
+        <w:t xml:space="preserve">Tick </w:t>
+      </w:r>
+      <w:r>
+        <w:rPr>
+          <w:b/>
+          <w:bCs/>
+        </w:rPr>
+        <w:t xml:space="preserve">Show advanced templates</w:t>
+      </w:r>
+      <w:r>
+        <w:t xml:space="preserve"> and select the </w:t>
+      </w:r>
+      <w:r>
+        <w:rPr>
+          <w:b/>
+          <w:bCs/>
+        </w:rPr>
+        <w:t xml:space="preserve">Agent Log</w:t>
+      </w:r>
+      <w:r>
+        <w:t xml:space="preserve"> template (file </w:t>
       </w:r>
       <w:r>
         <w:rPr>
@@ -25536,10 +25843,124 @@
           <w:sz w:val="20"/>
           <w:szCs w:val="20"/>
         </w:rPr>
-        <w:t xml:space="preserve">LogServer=&lt;that server&gt;</w:t>
-      </w:r>
-      <w:r>
-        <w:t xml:space="preserve"> and </w:t>
+        <w:t xml:space="preserve">alog4.ntf</w:t>
+      </w:r>
+      <w:r>
+        <w:t xml:space="preserve">; some releases list it as alog.ntf). Click </w:t>
+      </w:r>
+      <w:r>
+        <w:rPr>
+          <w:b/>
+          <w:bCs/>
+        </w:rPr>
+        <w:t xml:space="preserve">OK</w:t>
+      </w:r>
+      <w:r>
+        <w:t xml:space="preserve">. </w:t>
+      </w:r>
+      <w:r>
+        <w:rPr>
+          <w:i/>
+          <w:iCs/>
+        </w:rPr>
+        <w:t xml:space="preserve">Result:</w:t>
+      </w:r>
+      <w:r>
+        <w:t xml:space="preserve"> the empty log database opens.</w:t>
+      </w:r>
+    </w:p>
+    <w:p>
+      <w:pPr>
+        <w:pStyle w:val="ListParagraph"/>
+        <w:numPr>
+          <w:ilvl w:val="0"/>
+          <w:numId w:val="23"/>
+        </w:numPr>
+      </w:pPr>
+      <w:r>
+        <w:t xml:space="preserve">Choose </w:t>
+      </w:r>
+      <w:r>
+        <w:rPr>
+          <w:b/>
+          <w:bCs/>
+        </w:rPr>
+        <w:t xml:space="preserve">File &gt; Application &gt; Access Control</w:t>
+      </w:r>
+      <w:r>
+        <w:t xml:space="preserve"> and set: </w:t>
+      </w:r>
+      <w:r>
+        <w:rPr>
+          <w:b/>
+          <w:bCs/>
+        </w:rPr>
+        <w:t xml:space="preserve">-Default-</w:t>
+      </w:r>
+      <w:r>
+        <w:t xml:space="preserve"> = No Access; </w:t>
+      </w:r>
+      <w:r>
+        <w:rPr>
+          <w:b/>
+          <w:bCs/>
+        </w:rPr>
+        <w:t xml:space="preserve">Anonymous</w:t>
+      </w:r>
+      <w:r>
+        <w:t xml:space="preserve"> = No Access; the BulkReg administrators (your admin ID or group) = </w:t>
+      </w:r>
+      <w:r>
+        <w:rPr>
+          <w:b/>
+          <w:bCs/>
+        </w:rPr>
+        <w:t xml:space="preserve">Author</w:t>
+      </w:r>
+      <w:r>
+        <w:t xml:space="preserve"> with </w:t>
+      </w:r>
+      <w:r>
+        <w:rPr>
+          <w:b/>
+          <w:bCs/>
+        </w:rPr>
+        <w:t xml:space="preserve">Create documents</w:t>
+      </w:r>
+      <w:r>
+        <w:t xml:space="preserve"> ticked (Editor is also fine); auditors = </w:t>
+      </w:r>
+      <w:r>
+        <w:rPr>
+          <w:b/>
+          <w:bCs/>
+        </w:rPr>
+        <w:t xml:space="preserve">Reader</w:t>
+      </w:r>
+      <w:r>
+        <w:t xml:space="preserve">; the server group (e.g. LocalDomainServers) = Manager. Click </w:t>
+      </w:r>
+      <w:r>
+        <w:rPr>
+          <w:b/>
+          <w:bCs/>
+        </w:rPr>
+        <w:t xml:space="preserve">OK</w:t>
+      </w:r>
+      <w:r>
+        <w:t xml:space="preserve">.</w:t>
+      </w:r>
+    </w:p>
+    <w:p>
+      <w:pPr>
+        <w:pStyle w:val="ListParagraph"/>
+        <w:numPr>
+          <w:ilvl w:val="0"/>
+          <w:numId w:val="23"/>
+        </w:numPr>
+      </w:pPr>
+      <w:r>
+        <w:t xml:space="preserve">In bulkreg.ini set </w:t>
       </w:r>
       <w:r>
         <w:rPr>
@@ -25548,10 +25969,34 @@
           <w:sz w:val="20"/>
           <w:szCs w:val="20"/>
         </w:rPr>
+        <w:t xml:space="preserve">LogServer=DominoAdmin/Demo</w:t>
+      </w:r>
+      <w:r>
+        <w:t xml:space="preserve"> (your server) and </w:t>
+      </w:r>
+      <w:r>
+        <w:rPr>
+          <w:rFonts w:ascii="Consolas" w:cs="Consolas" w:eastAsia="Consolas" w:hAnsi="Consolas"/>
+          <w:color w:val="0F5FDC"/>
+          <w:sz w:val="20"/>
+          <w:szCs w:val="20"/>
+        </w:rPr>
         <w:t xml:space="preserve">LogDb=bulkreg_log.nsf</w:t>
       </w:r>
       <w:r>
         <w:t xml:space="preserve">. Save.</w:t>
+      </w:r>
+    </w:p>
+    <w:p>
+      <w:pPr>
+        <w:pStyle w:val="ListParagraph"/>
+        <w:numPr>
+          <w:ilvl w:val="0"/>
+          <w:numId w:val="23"/>
+        </w:numPr>
+      </w:pPr>
+      <w:r>
+        <w:t xml:space="preserve">Optional: replicate the database to a second server for resilience, like any other administrative database.</w:t>
       </w:r>
     </w:p>
     <w:tbl>
@@ -25600,7 +26045,7 @@
               <w:t xml:space="preserve">Done when: </w:t>
             </w:r>
             <w:r>
-              <w:t xml:space="preserve">bulkreg_log.nsf exists and bulkreg.ini points to it, or LogDb is empty.</w:t>
+              <w:t xml:space="preserve">bulkreg_log.nsf exists on the server, its ACL is set, and bulkreg.ini names it. The smoke test (B21) creates its first entries.</w:t>
             </w:r>
           </w:p>
         </w:tc>
@@ -28059,6 +28504,50 @@
         </w:numPr>
       </w:pPr>
       <w:r>
+        <w:t xml:space="preserve">Open </w:t>
+      </w:r>
+      <w:r>
+        <w:rPr>
+          <w:b/>
+          <w:bCs/>
+        </w:rPr>
+        <w:t xml:space="preserve">bulkreg_log.nsf</w:t>
+      </w:r>
+      <w:r>
+        <w:t xml:space="preserve"> on the log server. </w:t>
+      </w:r>
+      <w:r>
+        <w:rPr>
+          <w:i/>
+          <w:iCs/>
+        </w:rPr>
+        <w:t xml:space="preserve">Result:</w:t>
+      </w:r>
+      <w:r>
+        <w:t xml:space="preserve"> a new entry for </w:t>
+      </w:r>
+      <w:r>
+        <w:rPr>
+          <w:rFonts w:ascii="Consolas" w:cs="Consolas" w:eastAsia="Consolas" w:hAnsi="Consolas"/>
+          <w:color w:val="0F5FDC"/>
+          <w:sz w:val="20"/>
+          <w:szCs w:val="20"/>
+        </w:rPr>
+        <w:t xml:space="preserve">BulkReg Preflight &lt;date-time&gt; by &lt;your name&gt;</w:t>
+      </w:r>
+      <w:r>
+        <w:t xml:space="preserve"> containing the run's actions.</w:t>
+      </w:r>
+    </w:p>
+    <w:p>
+      <w:pPr>
+        <w:pStyle w:val="ListParagraph"/>
+        <w:numPr>
+          <w:ilvl w:val="0"/>
+          <w:numId w:val="29"/>
+        </w:numPr>
+      </w:pPr>
+      <w:r>
         <w:t xml:space="preserve">If Environment errors is not 0, open the debug log, find the lines marked </w:t>
       </w:r>
       <w:r>
@@ -38055,7 +38544,7 @@
                 <w:sz w:val="19"/>
                 <w:szCs w:val="19"/>
               </w:rPr>
-              <w:t xml:space="preserve">LogLevel / LogServer / LogDb</w:t>
+              <w:t xml:space="preserve">LogServer / LogDb</w:t>
             </w:r>
           </w:p>
         </w:tc>
@@ -38086,7 +38575,7 @@
                 <w:sz w:val="19"/>
                 <w:szCs w:val="19"/>
               </w:rPr>
-              <w:t xml:space="preserve">INFO / – / –</w:t>
+              <w:t xml:space="preserve">– / bulkreg_log.nsf</w:t>
             </w:r>
           </w:p>
         </w:tc>
@@ -38114,10 +38603,117 @@
             </w:pPr>
             <w:r>
               <w:rPr>
-                <w:sz w:val="19"/>
-                <w:szCs w:val="19"/>
-              </w:rPr>
-              <w:t xml:space="preserve">Log detail; optional log database</w:t>
+                <w:b/>
+                <w:bCs/>
+                <w:sz w:val="19"/>
+                <w:szCs w:val="19"/>
+              </w:rPr>
+              <w:t xml:space="preserve">Required</w:t>
+            </w:r>
+            <w:r>
+              <w:rPr>
+                <w:sz w:val="19"/>
+                <w:szCs w:val="19"/>
+              </w:rPr>
+              <w:t xml:space="preserve"> central log database (B15). Agents stop if it cannot be opened.</w:t>
+            </w:r>
+          </w:p>
+        </w:tc>
+      </w:tr>
+      <w:tr>
+        <w:trPr>
+          <w:cantSplit/>
+        </w:trPr>
+        <w:tc>
+          <w:tcPr>
+            <w:tcW w:type="dxa" w:w="4015"/>
+            <w:tcBorders>
+              <w:top w:val="single" w:color="DCE6F0" w:sz="4"/>
+              <w:left w:val="single" w:color="DCE6F0" w:sz="4"/>
+              <w:bottom w:val="single" w:color="DCE6F0" w:sz="4"/>
+              <w:right w:val="single" w:color="DCE6F0" w:sz="4"/>
+            </w:tcBorders>
+            <w:shd w:fill="F7F7FC" w:color="auto" w:val="clear"/>
+            <w:tcMar>
+              <w:top w:type="dxa" w:w="60"/>
+              <w:left w:type="dxa" w:w="100"/>
+              <w:bottom w:type="dxa" w:w="60"/>
+              <w:right w:type="dxa" w:w="100"/>
+            </w:tcMar>
+            <w:vAlign w:val="top"/>
+          </w:tcPr>
+          <w:p>
+            <w:pPr>
+              <w:spacing w:after="0" w:before="0"/>
+            </w:pPr>
+            <w:r>
+              <w:rPr>
+                <w:sz w:val="19"/>
+                <w:szCs w:val="19"/>
+              </w:rPr>
+              <w:t xml:space="preserve">LogLevel</w:t>
+            </w:r>
+          </w:p>
+        </w:tc>
+        <w:tc>
+          <w:tcPr>
+            <w:tcW w:type="dxa" w:w="2265"/>
+            <w:tcBorders>
+              <w:top w:val="single" w:color="DCE6F0" w:sz="4"/>
+              <w:left w:val="single" w:color="DCE6F0" w:sz="4"/>
+              <w:bottom w:val="single" w:color="DCE6F0" w:sz="4"/>
+              <w:right w:val="single" w:color="DCE6F0" w:sz="4"/>
+            </w:tcBorders>
+            <w:shd w:fill="F7F7FC" w:color="auto" w:val="clear"/>
+            <w:tcMar>
+              <w:top w:type="dxa" w:w="60"/>
+              <w:left w:type="dxa" w:w="100"/>
+              <w:bottom w:type="dxa" w:w="60"/>
+              <w:right w:type="dxa" w:w="100"/>
+            </w:tcMar>
+            <w:vAlign w:val="top"/>
+          </w:tcPr>
+          <w:p>
+            <w:pPr>
+              <w:spacing w:after="0" w:before="0"/>
+            </w:pPr>
+            <w:r>
+              <w:rPr>
+                <w:sz w:val="19"/>
+                <w:szCs w:val="19"/>
+              </w:rPr>
+              <w:t xml:space="preserve">INFO</w:t>
+            </w:r>
+          </w:p>
+        </w:tc>
+        <w:tc>
+          <w:tcPr>
+            <w:tcW w:type="dxa" w:w="3358"/>
+            <w:tcBorders>
+              <w:top w:val="single" w:color="DCE6F0" w:sz="4"/>
+              <w:left w:val="single" w:color="DCE6F0" w:sz="4"/>
+              <w:bottom w:val="single" w:color="DCE6F0" w:sz="4"/>
+              <w:right w:val="single" w:color="DCE6F0" w:sz="4"/>
+            </w:tcBorders>
+            <w:shd w:fill="F7F7FC" w:color="auto" w:val="clear"/>
+            <w:tcMar>
+              <w:top w:type="dxa" w:w="60"/>
+              <w:left w:type="dxa" w:w="100"/>
+              <w:bottom w:type="dxa" w:w="60"/>
+              <w:right w:type="dxa" w:w="100"/>
+            </w:tcMar>
+            <w:vAlign w:val="top"/>
+          </w:tcPr>
+          <w:p>
+            <w:pPr>
+              <w:spacing w:after="0" w:before="0"/>
+            </w:pPr>
+            <w:r>
+              <w:rPr>
+                <w:sz w:val="19"/>
+                <w:szCs w:val="19"/>
+              </w:rPr>
+              <w:t xml:space="preserve">Detail written to the debug log and the log database (DEBUG / INFO / WARN / ERROR)</w:t>
             </w:r>
           </w:p>
         </w:tc>
@@ -38127,6 +38723,843 @@
       <w:pPr>
         <w:spacing w:after="80" w:before="0"/>
       </w:pPr>
+    </w:p>
+    <w:p>
+      <w:pPr>
+        <w:pStyle w:val="Heading2"/>
+      </w:pPr>
+      <w:r>
+        <w:t xml:space="preserve">D3b DryRun explained</w:t>
+      </w:r>
+    </w:p>
+    <w:p>
+      <w:r>
+        <w:rPr>
+          <w:rFonts w:ascii="Consolas" w:cs="Consolas" w:eastAsia="Consolas" w:hAnsi="Consolas"/>
+          <w:color w:val="0F5FDC"/>
+          <w:sz w:val="20"/>
+          <w:szCs w:val="20"/>
+        </w:rPr>
+        <w:t xml:space="preserve">DryRun</w:t>
+      </w:r>
+      <w:r>
+        <w:t xml:space="preserve"> in bulkreg.ini decides whether </w:t>
+      </w:r>
+      <w:r>
+        <w:rPr>
+          <w:b/>
+          <w:bCs/>
+        </w:rPr>
+        <w:t xml:space="preserve">03 - Register Batch</w:t>
+      </w:r>
+      <w:r>
+        <w:t xml:space="preserve"> really registers users or only simulates. It is the safety switch between </w:t>
+      </w:r>
+      <w:r>
+        <w:rPr>
+          <w:i/>
+          <w:iCs/>
+        </w:rPr>
+        <w:t xml:space="preserve">checking a batch</w:t>
+      </w:r>
+      <w:r>
+        <w:t xml:space="preserve"> and </w:t>
+      </w:r>
+      <w:r>
+        <w:rPr>
+          <w:i/>
+          <w:iCs/>
+        </w:rPr>
+        <w:t xml:space="preserve">changing Domino</w:t>
+      </w:r>
+      <w:r>
+        <w:t xml:space="preserve">.</w:t>
+      </w:r>
+    </w:p>
+    <w:tbl>
+      <w:tblPr>
+        <w:tblW w:type="dxa" w:w="9638"/>
+        <w:tblBorders>
+          <w:top w:val="single" w:color="auto" w:sz="4"/>
+          <w:left w:val="single" w:color="auto" w:sz="4"/>
+          <w:bottom w:val="single" w:color="auto" w:sz="4"/>
+          <w:right w:val="single" w:color="auto" w:sz="4"/>
+          <w:insideH w:val="single" w:color="auto" w:sz="4"/>
+          <w:insideV w:val="single" w:color="auto" w:sz="4"/>
+        </w:tblBorders>
+      </w:tblPr>
+      <w:tblGrid>
+        <w:gridCol w:w="2059"/>
+        <w:gridCol w:w="3809"/>
+        <w:gridCol w:w="3770"/>
+      </w:tblGrid>
+      <w:tr>
+        <w:trPr>
+          <w:tblHeader/>
+        </w:trPr>
+        <w:tc>
+          <w:tcPr>
+            <w:tcW w:type="dxa" w:w="2059"/>
+            <w:tcBorders>
+              <w:top w:val="single" w:color="DCE6F0" w:sz="4"/>
+              <w:left w:val="single" w:color="DCE6F0" w:sz="4"/>
+              <w:bottom w:val="single" w:color="DCE6F0" w:sz="4"/>
+              <w:right w:val="single" w:color="DCE6F0" w:sz="4"/>
+            </w:tcBorders>
+            <w:shd w:fill="17707F" w:color="auto" w:val="clear"/>
+            <w:tcMar>
+              <w:top w:type="dxa" w:w="60"/>
+              <w:left w:type="dxa" w:w="100"/>
+              <w:bottom w:type="dxa" w:w="60"/>
+              <w:right w:type="dxa" w:w="100"/>
+            </w:tcMar>
+            <w:vAlign w:val="top"/>
+          </w:tcPr>
+          <w:p>
+            <w:pPr>
+              <w:spacing w:after="0" w:before="0"/>
+            </w:pPr>
+          </w:p>
+        </w:tc>
+        <w:tc>
+          <w:tcPr>
+            <w:tcW w:type="dxa" w:w="3809"/>
+            <w:tcBorders>
+              <w:top w:val="single" w:color="DCE6F0" w:sz="4"/>
+              <w:left w:val="single" w:color="DCE6F0" w:sz="4"/>
+              <w:bottom w:val="single" w:color="DCE6F0" w:sz="4"/>
+              <w:right w:val="single" w:color="DCE6F0" w:sz="4"/>
+            </w:tcBorders>
+            <w:shd w:fill="17707F" w:color="auto" w:val="clear"/>
+            <w:tcMar>
+              <w:top w:type="dxa" w:w="60"/>
+              <w:left w:type="dxa" w:w="100"/>
+              <w:bottom w:type="dxa" w:w="60"/>
+              <w:right w:type="dxa" w:w="100"/>
+            </w:tcMar>
+            <w:vAlign w:val="top"/>
+          </w:tcPr>
+          <w:p>
+            <w:pPr>
+              <w:spacing w:after="0" w:before="0"/>
+            </w:pPr>
+            <w:r>
+              <w:rPr>
+                <w:b/>
+                <w:bCs/>
+                <w:color w:val="FFFFFF"/>
+                <w:sz w:val="19"/>
+                <w:szCs w:val="19"/>
+              </w:rPr>
+              <w:t xml:space="preserve">DryRun=1 (DRY RUN, default)</w:t>
+            </w:r>
+          </w:p>
+        </w:tc>
+        <w:tc>
+          <w:tcPr>
+            <w:tcW w:type="dxa" w:w="3770"/>
+            <w:tcBorders>
+              <w:top w:val="single" w:color="DCE6F0" w:sz="4"/>
+              <w:left w:val="single" w:color="DCE6F0" w:sz="4"/>
+              <w:bottom w:val="single" w:color="DCE6F0" w:sz="4"/>
+              <w:right w:val="single" w:color="DCE6F0" w:sz="4"/>
+            </w:tcBorders>
+            <w:shd w:fill="17707F" w:color="auto" w:val="clear"/>
+            <w:tcMar>
+              <w:top w:type="dxa" w:w="60"/>
+              <w:left w:type="dxa" w:w="100"/>
+              <w:bottom w:type="dxa" w:w="60"/>
+              <w:right w:type="dxa" w:w="100"/>
+            </w:tcMar>
+            <w:vAlign w:val="top"/>
+          </w:tcPr>
+          <w:p>
+            <w:pPr>
+              <w:spacing w:after="0" w:before="0"/>
+            </w:pPr>
+            <w:r>
+              <w:rPr>
+                <w:b/>
+                <w:bCs/>
+                <w:color w:val="FFFFFF"/>
+                <w:sz w:val="19"/>
+                <w:szCs w:val="19"/>
+              </w:rPr>
+              <w:t xml:space="preserve">DryRun=0 (LIVE)</w:t>
+            </w:r>
+          </w:p>
+        </w:tc>
+      </w:tr>
+      <w:tr>
+        <w:trPr>
+          <w:cantSplit/>
+        </w:trPr>
+        <w:tc>
+          <w:tcPr>
+            <w:tcW w:type="dxa" w:w="2059"/>
+            <w:tcBorders>
+              <w:top w:val="single" w:color="DCE6F0" w:sz="4"/>
+              <w:left w:val="single" w:color="DCE6F0" w:sz="4"/>
+              <w:bottom w:val="single" w:color="DCE6F0" w:sz="4"/>
+              <w:right w:val="single" w:color="DCE6F0" w:sz="4"/>
+            </w:tcBorders>
+            <w:shd w:fill="FFFFFF" w:color="auto" w:val="clear"/>
+            <w:tcMar>
+              <w:top w:type="dxa" w:w="60"/>
+              <w:left w:type="dxa" w:w="100"/>
+              <w:bottom w:type="dxa" w:w="60"/>
+              <w:right w:type="dxa" w:w="100"/>
+            </w:tcMar>
+            <w:vAlign w:val="top"/>
+          </w:tcPr>
+          <w:p>
+            <w:pPr>
+              <w:spacing w:after="0" w:before="0"/>
+            </w:pPr>
+            <w:r>
+              <w:rPr>
+                <w:sz w:val="19"/>
+                <w:szCs w:val="19"/>
+              </w:rPr>
+              <w:t xml:space="preserve">What 03 does</w:t>
+            </w:r>
+          </w:p>
+        </w:tc>
+        <w:tc>
+          <w:tcPr>
+            <w:tcW w:type="dxa" w:w="3809"/>
+            <w:tcBorders>
+              <w:top w:val="single" w:color="DCE6F0" w:sz="4"/>
+              <w:left w:val="single" w:color="DCE6F0" w:sz="4"/>
+              <w:bottom w:val="single" w:color="DCE6F0" w:sz="4"/>
+              <w:right w:val="single" w:color="DCE6F0" w:sz="4"/>
+            </w:tcBorders>
+            <w:shd w:fill="FFFFFF" w:color="auto" w:val="clear"/>
+            <w:tcMar>
+              <w:top w:type="dxa" w:w="60"/>
+              <w:left w:type="dxa" w:w="100"/>
+              <w:bottom w:type="dxa" w:w="60"/>
+              <w:right w:type="dxa" w:w="100"/>
+            </w:tcMar>
+            <w:vAlign w:val="top"/>
+          </w:tcPr>
+          <w:p>
+            <w:pPr>
+              <w:spacing w:after="0" w:before="0"/>
+            </w:pPr>
+            <w:r>
+              <w:rPr>
+                <w:sz w:val="19"/>
+                <w:szCs w:val="19"/>
+              </w:rPr>
+              <w:t xml:space="preserve">Goes through every approved row and checks it exactly as for a real run: Person document found, objectGUID matches, data valid, mail file name free, folder available, home server reachable</w:t>
+            </w:r>
+          </w:p>
+        </w:tc>
+        <w:tc>
+          <w:tcPr>
+            <w:tcW w:type="dxa" w:w="3770"/>
+            <w:tcBorders>
+              <w:top w:val="single" w:color="DCE6F0" w:sz="4"/>
+              <w:left w:val="single" w:color="DCE6F0" w:sz="4"/>
+              <w:bottom w:val="single" w:color="DCE6F0" w:sz="4"/>
+              <w:right w:val="single" w:color="DCE6F0" w:sz="4"/>
+            </w:tcBorders>
+            <w:shd w:fill="FFFFFF" w:color="auto" w:val="clear"/>
+            <w:tcMar>
+              <w:top w:type="dxa" w:w="60"/>
+              <w:left w:type="dxa" w:w="100"/>
+              <w:bottom w:type="dxa" w:w="60"/>
+              <w:right w:type="dxa" w:w="100"/>
+            </w:tcMar>
+            <w:vAlign w:val="top"/>
+          </w:tcPr>
+          <w:p>
+            <w:pPr>
+              <w:spacing w:after="0" w:before="0"/>
+            </w:pPr>
+            <w:r>
+              <w:rPr>
+                <w:sz w:val="19"/>
+                <w:szCs w:val="19"/>
+              </w:rPr>
+              <w:t xml:space="preserve">The same checks, then </w:t>
+            </w:r>
+            <w:r>
+              <w:rPr>
+                <w:b/>
+                <w:bCs/>
+                <w:sz w:val="19"/>
+                <w:szCs w:val="19"/>
+              </w:rPr>
+              <w:t xml:space="preserve">registers</w:t>
+            </w:r>
+            <w:r>
+              <w:rPr>
+                <w:sz w:val="19"/>
+                <w:szCs w:val="19"/>
+              </w:rPr>
+              <w:t xml:space="preserve"> each user: Notes ID, mail file on the home server, ID Vault deposit, Person document updated</w:t>
+            </w:r>
+          </w:p>
+        </w:tc>
+      </w:tr>
+      <w:tr>
+        <w:trPr>
+          <w:cantSplit/>
+        </w:trPr>
+        <w:tc>
+          <w:tcPr>
+            <w:tcW w:type="dxa" w:w="2059"/>
+            <w:tcBorders>
+              <w:top w:val="single" w:color="DCE6F0" w:sz="4"/>
+              <w:left w:val="single" w:color="DCE6F0" w:sz="4"/>
+              <w:bottom w:val="single" w:color="DCE6F0" w:sz="4"/>
+              <w:right w:val="single" w:color="DCE6F0" w:sz="4"/>
+            </w:tcBorders>
+            <w:shd w:fill="F7F7FC" w:color="auto" w:val="clear"/>
+            <w:tcMar>
+              <w:top w:type="dxa" w:w="60"/>
+              <w:left w:type="dxa" w:w="100"/>
+              <w:bottom w:type="dxa" w:w="60"/>
+              <w:right w:type="dxa" w:w="100"/>
+            </w:tcMar>
+            <w:vAlign w:val="top"/>
+          </w:tcPr>
+          <w:p>
+            <w:pPr>
+              <w:spacing w:after="0" w:before="0"/>
+            </w:pPr>
+            <w:r>
+              <w:rPr>
+                <w:sz w:val="19"/>
+                <w:szCs w:val="19"/>
+              </w:rPr>
+              <w:t xml:space="preserve">Changes in Domino</w:t>
+            </w:r>
+          </w:p>
+        </w:tc>
+        <w:tc>
+          <w:tcPr>
+            <w:tcW w:type="dxa" w:w="3809"/>
+            <w:tcBorders>
+              <w:top w:val="single" w:color="DCE6F0" w:sz="4"/>
+              <w:left w:val="single" w:color="DCE6F0" w:sz="4"/>
+              <w:bottom w:val="single" w:color="DCE6F0" w:sz="4"/>
+              <w:right w:val="single" w:color="DCE6F0" w:sz="4"/>
+            </w:tcBorders>
+            <w:shd w:fill="F7F7FC" w:color="auto" w:val="clear"/>
+            <w:tcMar>
+              <w:top w:type="dxa" w:w="60"/>
+              <w:left w:type="dxa" w:w="100"/>
+              <w:bottom w:type="dxa" w:w="60"/>
+              <w:right w:type="dxa" w:w="100"/>
+            </w:tcMar>
+            <w:vAlign w:val="top"/>
+          </w:tcPr>
+          <w:p>
+            <w:pPr>
+              <w:spacing w:after="0" w:before="0"/>
+            </w:pPr>
+            <w:r>
+              <w:rPr>
+                <w:b/>
+                <w:bCs/>
+                <w:sz w:val="19"/>
+                <w:szCs w:val="19"/>
+              </w:rPr>
+              <w:t xml:space="preserve">None.</w:t>
+            </w:r>
+            <w:r>
+              <w:rPr>
+                <w:sz w:val="19"/>
+                <w:szCs w:val="19"/>
+              </w:rPr>
+              <w:t xml:space="preserve"> No ID, no mail file, no change in names.nsf, nothing in the vault</w:t>
+            </w:r>
+          </w:p>
+        </w:tc>
+        <w:tc>
+          <w:tcPr>
+            <w:tcW w:type="dxa" w:w="3770"/>
+            <w:tcBorders>
+              <w:top w:val="single" w:color="DCE6F0" w:sz="4"/>
+              <w:left w:val="single" w:color="DCE6F0" w:sz="4"/>
+              <w:bottom w:val="single" w:color="DCE6F0" w:sz="4"/>
+              <w:right w:val="single" w:color="DCE6F0" w:sz="4"/>
+            </w:tcBorders>
+            <w:shd w:fill="F7F7FC" w:color="auto" w:val="clear"/>
+            <w:tcMar>
+              <w:top w:type="dxa" w:w="60"/>
+              <w:left w:type="dxa" w:w="100"/>
+              <w:bottom w:type="dxa" w:w="60"/>
+              <w:right w:type="dxa" w:w="100"/>
+            </w:tcMar>
+            <w:vAlign w:val="top"/>
+          </w:tcPr>
+          <w:p>
+            <w:pPr>
+              <w:spacing w:after="0" w:before="0"/>
+            </w:pPr>
+            <w:r>
+              <w:rPr>
+                <w:sz w:val="19"/>
+                <w:szCs w:val="19"/>
+              </w:rPr>
+              <w:t xml:space="preserve">Yes: names.nsf, mail files, ID Vault, certlog.nsf</w:t>
+            </w:r>
+          </w:p>
+        </w:tc>
+      </w:tr>
+      <w:tr>
+        <w:trPr>
+          <w:cantSplit/>
+        </w:trPr>
+        <w:tc>
+          <w:tcPr>
+            <w:tcW w:type="dxa" w:w="2059"/>
+            <w:tcBorders>
+              <w:top w:val="single" w:color="DCE6F0" w:sz="4"/>
+              <w:left w:val="single" w:color="DCE6F0" w:sz="4"/>
+              <w:bottom w:val="single" w:color="DCE6F0" w:sz="4"/>
+              <w:right w:val="single" w:color="DCE6F0" w:sz="4"/>
+            </w:tcBorders>
+            <w:shd w:fill="FFFFFF" w:color="auto" w:val="clear"/>
+            <w:tcMar>
+              <w:top w:type="dxa" w:w="60"/>
+              <w:left w:type="dxa" w:w="100"/>
+              <w:bottom w:type="dxa" w:w="60"/>
+              <w:right w:type="dxa" w:w="100"/>
+            </w:tcMar>
+            <w:vAlign w:val="top"/>
+          </w:tcPr>
+          <w:p>
+            <w:pPr>
+              <w:spacing w:after="0" w:before="0"/>
+            </w:pPr>
+            <w:r>
+              <w:rPr>
+                <w:sz w:val="19"/>
+                <w:szCs w:val="19"/>
+              </w:rPr>
+              <w:t xml:space="preserve">Files written</w:t>
+            </w:r>
+          </w:p>
+        </w:tc>
+        <w:tc>
+          <w:tcPr>
+            <w:tcW w:type="dxa" w:w="3809"/>
+            <w:tcBorders>
+              <w:top w:val="single" w:color="DCE6F0" w:sz="4"/>
+              <w:left w:val="single" w:color="DCE6F0" w:sz="4"/>
+              <w:bottom w:val="single" w:color="DCE6F0" w:sz="4"/>
+              <w:right w:val="single" w:color="DCE6F0" w:sz="4"/>
+            </w:tcBorders>
+            <w:shd w:fill="FFFFFF" w:color="auto" w:val="clear"/>
+            <w:tcMar>
+              <w:top w:type="dxa" w:w="60"/>
+              <w:left w:type="dxa" w:w="100"/>
+              <w:bottom w:type="dxa" w:w="60"/>
+              <w:right w:type="dxa" w:w="100"/>
+            </w:tcMar>
+            <w:vAlign w:val="top"/>
+          </w:tcPr>
+          <w:p>
+            <w:pPr>
+              <w:spacing w:after="0" w:before="0"/>
+            </w:pPr>
+            <w:r>
+              <w:rPr>
+                <w:sz w:val="19"/>
+                <w:szCs w:val="19"/>
+              </w:rPr>
+              <w:t xml:space="preserve">BATCH-&lt;id&gt;_dryrun_&lt;run&gt;.csv (every row WOULD_REGISTER, SKIPPED or FAILED_VALIDATION), audit CSV, debug log, log database</w:t>
+            </w:r>
+          </w:p>
+        </w:tc>
+        <w:tc>
+          <w:tcPr>
+            <w:tcW w:type="dxa" w:w="3770"/>
+            <w:tcBorders>
+              <w:top w:val="single" w:color="DCE6F0" w:sz="4"/>
+              <w:left w:val="single" w:color="DCE6F0" w:sz="4"/>
+              <w:bottom w:val="single" w:color="DCE6F0" w:sz="4"/>
+              <w:right w:val="single" w:color="DCE6F0" w:sz="4"/>
+            </w:tcBorders>
+            <w:shd w:fill="FFFFFF" w:color="auto" w:val="clear"/>
+            <w:tcMar>
+              <w:top w:type="dxa" w:w="60"/>
+              <w:left w:type="dxa" w:w="100"/>
+              <w:bottom w:type="dxa" w:w="60"/>
+              <w:right w:type="dxa" w:w="100"/>
+            </w:tcMar>
+            <w:vAlign w:val="top"/>
+          </w:tcPr>
+          <w:p>
+            <w:pPr>
+              <w:spacing w:after="0" w:before="0"/>
+            </w:pPr>
+            <w:r>
+              <w:rPr>
+                <w:sz w:val="19"/>
+                <w:szCs w:val="19"/>
+              </w:rPr>
+              <w:t xml:space="preserve">BATCH-&lt;id&gt;_results.csv, password file, ID files, audit CSV, debug log, log database</w:t>
+            </w:r>
+          </w:p>
+        </w:tc>
+      </w:tr>
+      <w:tr>
+        <w:trPr>
+          <w:cantSplit/>
+        </w:trPr>
+        <w:tc>
+          <w:tcPr>
+            <w:tcW w:type="dxa" w:w="2059"/>
+            <w:tcBorders>
+              <w:top w:val="single" w:color="DCE6F0" w:sz="4"/>
+              <w:left w:val="single" w:color="DCE6F0" w:sz="4"/>
+              <w:bottom w:val="single" w:color="DCE6F0" w:sz="4"/>
+              <w:right w:val="single" w:color="DCE6F0" w:sz="4"/>
+            </w:tcBorders>
+            <w:shd w:fill="F7F7FC" w:color="auto" w:val="clear"/>
+            <w:tcMar>
+              <w:top w:type="dxa" w:w="60"/>
+              <w:left w:type="dxa" w:w="100"/>
+              <w:bottom w:type="dxa" w:w="60"/>
+              <w:right w:type="dxa" w:w="100"/>
+            </w:tcMar>
+            <w:vAlign w:val="top"/>
+          </w:tcPr>
+          <w:p>
+            <w:pPr>
+              <w:spacing w:after="0" w:before="0"/>
+            </w:pPr>
+            <w:r>
+              <w:rPr>
+                <w:sz w:val="19"/>
+                <w:szCs w:val="19"/>
+              </w:rPr>
+              <w:t xml:space="preserve">Confirmation</w:t>
+            </w:r>
+          </w:p>
+        </w:tc>
+        <w:tc>
+          <w:tcPr>
+            <w:tcW w:type="dxa" w:w="3809"/>
+            <w:tcBorders>
+              <w:top w:val="single" w:color="DCE6F0" w:sz="4"/>
+              <w:left w:val="single" w:color="DCE6F0" w:sz="4"/>
+              <w:bottom w:val="single" w:color="DCE6F0" w:sz="4"/>
+              <w:right w:val="single" w:color="DCE6F0" w:sz="4"/>
+            </w:tcBorders>
+            <w:shd w:fill="F7F7FC" w:color="auto" w:val="clear"/>
+            <w:tcMar>
+              <w:top w:type="dxa" w:w="60"/>
+              <w:left w:type="dxa" w:w="100"/>
+              <w:bottom w:type="dxa" w:w="60"/>
+              <w:right w:type="dxa" w:w="100"/>
+            </w:tcMar>
+            <w:vAlign w:val="top"/>
+          </w:tcPr>
+          <w:p>
+            <w:pPr>
+              <w:spacing w:after="0" w:before="0"/>
+            </w:pPr>
+            <w:r>
+              <w:rPr>
+                <w:sz w:val="19"/>
+                <w:szCs w:val="19"/>
+              </w:rPr>
+              <w:t xml:space="preserve">Yes/No summary</w:t>
+            </w:r>
+          </w:p>
+        </w:tc>
+        <w:tc>
+          <w:tcPr>
+            <w:tcW w:type="dxa" w:w="3770"/>
+            <w:tcBorders>
+              <w:top w:val="single" w:color="DCE6F0" w:sz="4"/>
+              <w:left w:val="single" w:color="DCE6F0" w:sz="4"/>
+              <w:bottom w:val="single" w:color="DCE6F0" w:sz="4"/>
+              <w:right w:val="single" w:color="DCE6F0" w:sz="4"/>
+            </w:tcBorders>
+            <w:shd w:fill="F7F7FC" w:color="auto" w:val="clear"/>
+            <w:tcMar>
+              <w:top w:type="dxa" w:w="60"/>
+              <w:left w:type="dxa" w:w="100"/>
+              <w:bottom w:type="dxa" w:w="60"/>
+              <w:right w:type="dxa" w:w="100"/>
+            </w:tcMar>
+            <w:vAlign w:val="top"/>
+          </w:tcPr>
+          <w:p>
+            <w:pPr>
+              <w:spacing w:after="0" w:before="0"/>
+            </w:pPr>
+            <w:r>
+              <w:rPr>
+                <w:sz w:val="19"/>
+                <w:szCs w:val="19"/>
+              </w:rPr>
+              <w:t xml:space="preserve">Yes/No summary, then </w:t>
+            </w:r>
+            <w:r>
+              <w:rPr>
+                <w:b/>
+                <w:bCs/>
+                <w:sz w:val="19"/>
+                <w:szCs w:val="19"/>
+              </w:rPr>
+              <w:t xml:space="preserve">type the batch ID</w:t>
+            </w:r>
+          </w:p>
+        </w:tc>
+      </w:tr>
+      <w:tr>
+        <w:trPr>
+          <w:cantSplit/>
+        </w:trPr>
+        <w:tc>
+          <w:tcPr>
+            <w:tcW w:type="dxa" w:w="2059"/>
+            <w:tcBorders>
+              <w:top w:val="single" w:color="DCE6F0" w:sz="4"/>
+              <w:left w:val="single" w:color="DCE6F0" w:sz="4"/>
+              <w:bottom w:val="single" w:color="DCE6F0" w:sz="4"/>
+              <w:right w:val="single" w:color="DCE6F0" w:sz="4"/>
+            </w:tcBorders>
+            <w:shd w:fill="FFFFFF" w:color="auto" w:val="clear"/>
+            <w:tcMar>
+              <w:top w:type="dxa" w:w="60"/>
+              <w:left w:type="dxa" w:w="100"/>
+              <w:bottom w:type="dxa" w:w="60"/>
+              <w:right w:type="dxa" w:w="100"/>
+            </w:tcMar>
+            <w:vAlign w:val="top"/>
+          </w:tcPr>
+          <w:p>
+            <w:pPr>
+              <w:spacing w:after="0" w:before="0"/>
+            </w:pPr>
+            <w:r>
+              <w:rPr>
+                <w:sz w:val="19"/>
+                <w:szCs w:val="19"/>
+              </w:rPr>
+              <w:t xml:space="preserve">Batch state after the run</w:t>
+            </w:r>
+          </w:p>
+        </w:tc>
+        <w:tc>
+          <w:tcPr>
+            <w:tcW w:type="dxa" w:w="3809"/>
+            <w:tcBorders>
+              <w:top w:val="single" w:color="DCE6F0" w:sz="4"/>
+              <w:left w:val="single" w:color="DCE6F0" w:sz="4"/>
+              <w:bottom w:val="single" w:color="DCE6F0" w:sz="4"/>
+              <w:right w:val="single" w:color="DCE6F0" w:sz="4"/>
+            </w:tcBorders>
+            <w:shd w:fill="FFFFFF" w:color="auto" w:val="clear"/>
+            <w:tcMar>
+              <w:top w:type="dxa" w:w="60"/>
+              <w:left w:type="dxa" w:w="100"/>
+              <w:bottom w:type="dxa" w:w="60"/>
+              <w:right w:type="dxa" w:w="100"/>
+            </w:tcMar>
+            <w:vAlign w:val="top"/>
+          </w:tcPr>
+          <w:p>
+            <w:pPr>
+              <w:spacing w:after="0" w:before="0"/>
+            </w:pPr>
+            <w:r>
+              <w:rPr>
+                <w:sz w:val="19"/>
+                <w:szCs w:val="19"/>
+              </w:rPr>
+              <w:t xml:space="preserve">Stays </w:t>
+            </w:r>
+            <w:r>
+              <w:rPr>
+                <w:b/>
+                <w:bCs/>
+                <w:sz w:val="19"/>
+                <w:szCs w:val="19"/>
+              </w:rPr>
+              <w:t xml:space="preserve">OPEN</w:t>
+            </w:r>
+            <w:r>
+              <w:rPr>
+                <w:sz w:val="19"/>
+                <w:szCs w:val="19"/>
+              </w:rPr>
+              <w:t xml:space="preserve">: you can dry-run it again, as often as you like</w:t>
+            </w:r>
+          </w:p>
+        </w:tc>
+        <w:tc>
+          <w:tcPr>
+            <w:tcW w:type="dxa" w:w="3770"/>
+            <w:tcBorders>
+              <w:top w:val="single" w:color="DCE6F0" w:sz="4"/>
+              <w:left w:val="single" w:color="DCE6F0" w:sz="4"/>
+              <w:bottom w:val="single" w:color="DCE6F0" w:sz="4"/>
+              <w:right w:val="single" w:color="DCE6F0" w:sz="4"/>
+            </w:tcBorders>
+            <w:shd w:fill="FFFFFF" w:color="auto" w:val="clear"/>
+            <w:tcMar>
+              <w:top w:type="dxa" w:w="60"/>
+              <w:left w:type="dxa" w:w="100"/>
+              <w:bottom w:type="dxa" w:w="60"/>
+              <w:right w:type="dxa" w:w="100"/>
+            </w:tcMar>
+            <w:vAlign w:val="top"/>
+          </w:tcPr>
+          <w:p>
+            <w:pPr>
+              <w:spacing w:after="0" w:before="0"/>
+            </w:pPr>
+            <w:r>
+              <w:rPr>
+                <w:b/>
+                <w:bCs/>
+                <w:sz w:val="19"/>
+                <w:szCs w:val="19"/>
+              </w:rPr>
+              <w:t xml:space="preserve">DONE</w:t>
+            </w:r>
+            <w:r>
+              <w:rPr>
+                <w:sz w:val="19"/>
+                <w:szCs w:val="19"/>
+              </w:rPr>
+              <w:t xml:space="preserve">: it cannot be run again</w:t>
+            </w:r>
+          </w:p>
+        </w:tc>
+      </w:tr>
+    </w:tbl>
+    <w:p>
+      <w:pPr>
+        <w:spacing w:after="80" w:before="0"/>
+      </w:pPr>
+    </w:p>
+    <w:p>
+      <w:pPr>
+        <w:pStyle w:val="ListParagraph"/>
+        <w:numPr>
+          <w:ilvl w:val="0"/>
+          <w:numId w:val="2"/>
+        </w:numPr>
+      </w:pPr>
+      <w:r>
+        <w:rPr>
+          <w:b/>
+          <w:bCs/>
+        </w:rPr>
+        <w:t xml:space="preserve">Only agent 03 uses DryRun.</w:t>
+      </w:r>
+      <w:r>
+        <w:t xml:space="preserve"> Agents 01, 02, 04 and 05 never change Domino, whatever DryRun is set to.</w:t>
+      </w:r>
+    </w:p>
+    <w:p>
+      <w:pPr>
+        <w:pStyle w:val="ListParagraph"/>
+        <w:numPr>
+          <w:ilvl w:val="0"/>
+          <w:numId w:val="2"/>
+        </w:numPr>
+      </w:pPr>
+      <w:r>
+        <w:rPr>
+          <w:b/>
+          <w:bCs/>
+        </w:rPr>
+        <w:t xml:space="preserve">Normal cycle:</w:t>
+      </w:r>
+      <w:r>
+        <w:t xml:space="preserve"> DryRun=1 → run 03 → check the _dryrun file → DryRun=0 → run 03 on the </w:t>
+      </w:r>
+      <w:r>
+        <w:rPr>
+          <w:b/>
+          <w:bCs/>
+        </w:rPr>
+        <w:t xml:space="preserve">same</w:t>
+      </w:r>
+      <w:r>
+        <w:t xml:space="preserve"> batch file → DryRun=1 again.</w:t>
+      </w:r>
+    </w:p>
+    <w:p>
+      <w:pPr>
+        <w:pStyle w:val="ListParagraph"/>
+        <w:numPr>
+          <w:ilvl w:val="0"/>
+          <w:numId w:val="2"/>
+        </w:numPr>
+      </w:pPr>
+      <w:r>
+        <w:rPr>
+          <w:b/>
+          <w:bCs/>
+        </w:rPr>
+        <w:t xml:space="preserve">Why it matters:</w:t>
+      </w:r>
+      <w:r>
+        <w:t xml:space="preserve"> a dry run catches problems (missing data, a mail file name taken in the meantime, an unreachable server) </w:t>
+      </w:r>
+      <w:r>
+        <w:rPr>
+          <w:b/>
+          <w:bCs/>
+        </w:rPr>
+        <w:t xml:space="preserve">before</w:t>
+      </w:r>
+      <w:r>
+        <w:t xml:space="preserve"> anything is created, so the live run is predictable.</w:t>
+      </w:r>
+    </w:p>
+    <w:p>
+      <w:pPr>
+        <w:pStyle w:val="ListParagraph"/>
+        <w:numPr>
+          <w:ilvl w:val="0"/>
+          <w:numId w:val="2"/>
+        </w:numPr>
+      </w:pPr>
+      <w:r>
+        <w:rPr>
+          <w:b/>
+          <w:bCs/>
+        </w:rPr>
+        <w:t xml:space="preserve">Where to see the mode:</w:t>
+      </w:r>
+      <w:r>
+        <w:t xml:space="preserve"> the 03 dialog says </w:t>
+      </w:r>
+      <w:r>
+        <w:rPr>
+          <w:i/>
+          <w:iCs/>
+        </w:rPr>
+        <w:t xml:space="preserve">DRY RUN – nothing will be changed</w:t>
+      </w:r>
+      <w:r>
+        <w:t xml:space="preserve"> or </w:t>
+      </w:r>
+      <w:r>
+        <w:rPr>
+          <w:i/>
+          <w:iCs/>
+        </w:rPr>
+        <w:t xml:space="preserve">LIVE – users WILL be registered</w:t>
+      </w:r>
+      <w:r>
+        <w:t xml:space="preserve">, and every audit row has Mode = DRYRUN or LIVE.</w:t>
+      </w:r>
     </w:p>
     <w:p>
       <w:pPr>
@@ -42221,10 +43654,12 @@
             </w:pPr>
             <w:r>
               <w:rPr>
-                <w:sz w:val="19"/>
-                <w:szCs w:val="19"/>
-              </w:rPr>
-              <w:t xml:space="preserve">Batch files</w:t>
+                <w:b/>
+                <w:bCs/>
+                <w:sz w:val="19"/>
+                <w:szCs w:val="19"/>
+              </w:rPr>
+              <w:t xml:space="preserve">Central log database (required)</w:t>
             </w:r>
           </w:p>
         </w:tc>
@@ -42255,7 +43690,7 @@
                 <w:sz w:val="19"/>
                 <w:szCs w:val="19"/>
               </w:rPr>
-              <w:t xml:space="preserve">C:\BulkReg\batches\</w:t>
+              <w:t xml:space="preserve">LogServer!!bulkreg_log.nsf</w:t>
             </w:r>
           </w:p>
         </w:tc>
@@ -42286,7 +43721,7 @@
                 <w:sz w:val="19"/>
                 <w:szCs w:val="19"/>
               </w:rPr>
-              <w:t xml:space="preserve">D2</w:t>
+              <w:t xml:space="preserve">One entry per run: start/end, every action and error, and an AUDIT line per user (result, home server, mail file, vault, batch). The shared record for administrators and auditors.</w:t>
             </w:r>
           </w:p>
         </w:tc>
@@ -42322,7 +43757,7 @@
                 <w:sz w:val="19"/>
                 <w:szCs w:val="19"/>
               </w:rPr>
-              <w:t xml:space="preserve">Audit CSV</w:t>
+              <w:t xml:space="preserve">Batch files</w:t>
             </w:r>
           </w:p>
         </w:tc>
@@ -42353,7 +43788,7 @@
                 <w:sz w:val="19"/>
                 <w:szCs w:val="19"/>
               </w:rPr>
-              <w:t xml:space="preserve">C:\BulkReg\audit\BulkReg_&lt;Tool&gt;_&lt;run&gt;_audit.csv</w:t>
+              <w:t xml:space="preserve">C:\BulkReg\batches\</w:t>
             </w:r>
           </w:p>
         </w:tc>
@@ -42384,16 +43819,7 @@
                 <w:sz w:val="19"/>
                 <w:szCs w:val="19"/>
               </w:rPr>
-              <w:t xml:space="preserve">One row per user per action, including BatchID, MailFile, MailFileStatus and MailFileNote. </w:t>
-            </w:r>
-            <w:r>
-              <w:rPr>
-                <w:b/>
-                <w:bCs/>
-                <w:sz w:val="19"/>
-                <w:szCs w:val="19"/>
-              </w:rPr>
-              <w:t xml:space="preserve">No passwords.</w:t>
+              <w:t xml:space="preserve">D2</w:t>
             </w:r>
           </w:p>
         </w:tc>
@@ -42429,7 +43855,7 @@
                 <w:sz w:val="19"/>
                 <w:szCs w:val="19"/>
               </w:rPr>
-              <w:t xml:space="preserve">Debug log</w:t>
+              <w:t xml:space="preserve">Audit CSV</w:t>
             </w:r>
           </w:p>
         </w:tc>
@@ -42460,7 +43886,7 @@
                 <w:sz w:val="19"/>
                 <w:szCs w:val="19"/>
               </w:rPr>
-              <w:t xml:space="preserve">C:\BulkReg\audit\BulkReg_&lt;Tool&gt;_&lt;run&gt;_debug.log</w:t>
+              <w:t xml:space="preserve">C:\BulkReg\audit\BulkReg_&lt;Tool&gt;_&lt;run&gt;_audit.csv</w:t>
             </w:r>
           </w:p>
         </w:tc>
@@ -42491,7 +43917,16 @@
                 <w:sz w:val="19"/>
                 <w:szCs w:val="19"/>
               </w:rPr>
-              <w:t xml:space="preserve">Every step, the approval line, and the batch file size and time</w:t>
+              <w:t xml:space="preserve">One row per user per action, including BatchID, MailFile, MailFileStatus and MailFileNote. </w:t>
+            </w:r>
+            <w:r>
+              <w:rPr>
+                <w:b/>
+                <w:bCs/>
+                <w:sz w:val="19"/>
+                <w:szCs w:val="19"/>
+              </w:rPr>
+              <w:t xml:space="preserve">No passwords.</w:t>
             </w:r>
           </w:p>
         </w:tc>
@@ -42527,7 +43962,7 @@
                 <w:sz w:val="19"/>
                 <w:szCs w:val="19"/>
               </w:rPr>
-              <w:t xml:space="preserve">Password file</w:t>
+              <w:t xml:space="preserve">Debug log</w:t>
             </w:r>
           </w:p>
         </w:tc>
@@ -42558,7 +43993,7 @@
                 <w:sz w:val="19"/>
                 <w:szCs w:val="19"/>
               </w:rPr>
-              <w:t xml:space="preserve">C:\BulkReg\secure\BulkReg_InitialPasswords_&lt;batch&gt;_&lt;run&gt;.csv</w:t>
+              <w:t xml:space="preserve">C:\BulkReg\audit\BulkReg_&lt;Tool&gt;_&lt;run&gt;_debug.log</w:t>
             </w:r>
           </w:p>
         </w:tc>
@@ -42589,7 +44024,7 @@
                 <w:sz w:val="19"/>
                 <w:szCs w:val="19"/>
               </w:rPr>
-              <w:t xml:space="preserve">Initial passwords (delete in C8)</w:t>
+              <w:t xml:space="preserve">Every step, the approval line, and the batch file size and time</w:t>
             </w:r>
           </w:p>
         </w:tc>
@@ -42625,7 +44060,7 @@
                 <w:sz w:val="19"/>
                 <w:szCs w:val="19"/>
               </w:rPr>
-              <w:t xml:space="preserve">Certification Log</w:t>
+              <w:t xml:space="preserve">Password file</w:t>
             </w:r>
           </w:p>
         </w:tc>
@@ -42656,7 +44091,7 @@
                 <w:sz w:val="19"/>
                 <w:szCs w:val="19"/>
               </w:rPr>
-              <w:t xml:space="preserve">certlog.nsf on the registration server</w:t>
+              <w:t xml:space="preserve">C:\BulkReg\secure\BulkReg_InitialPasswords_&lt;batch&gt;_&lt;run&gt;.csv</w:t>
             </w:r>
           </w:p>
         </w:tc>
@@ -42687,7 +44122,7 @@
                 <w:sz w:val="19"/>
                 <w:szCs w:val="19"/>
               </w:rPr>
-              <w:t xml:space="preserve">Domino's record of every certification and registration (written because RegistrationLog is not empty)</w:t>
+              <w:t xml:space="preserve">Initial passwords (delete in C8)</w:t>
             </w:r>
           </w:p>
         </w:tc>
@@ -42723,7 +44158,7 @@
                 <w:sz w:val="19"/>
                 <w:szCs w:val="19"/>
               </w:rPr>
-              <w:t xml:space="preserve">Domino server log</w:t>
+              <w:t xml:space="preserve">Certification Log</w:t>
             </w:r>
           </w:p>
         </w:tc>
@@ -42754,7 +44189,7 @@
                 <w:sz w:val="19"/>
                 <w:szCs w:val="19"/>
               </w:rPr>
-              <w:t xml:space="preserve">log.nsf on the registration and home servers</w:t>
+              <w:t xml:space="preserve">certlog.nsf on the registration server</w:t>
             </w:r>
           </w:p>
         </w:tc>
@@ -42785,7 +44220,7 @@
                 <w:sz w:val="19"/>
                 <w:szCs w:val="19"/>
               </w:rPr>
-              <w:t xml:space="preserve">General server events, e.g. mail file creation and Administration Process messages; useful for troubleshooting</w:t>
+              <w:t xml:space="preserve">Domino's record of every certification and registration (written because RegistrationLog is not empty)</w:t>
             </w:r>
           </w:p>
         </w:tc>
@@ -42821,6 +44256,104 @@
                 <w:sz w:val="19"/>
                 <w:szCs w:val="19"/>
               </w:rPr>
+              <w:t xml:space="preserve">Domino server log</w:t>
+            </w:r>
+          </w:p>
+        </w:tc>
+        <w:tc>
+          <w:tcPr>
+            <w:tcW w:type="dxa" w:w="4427"/>
+            <w:tcBorders>
+              <w:top w:val="single" w:color="DCE6F0" w:sz="4"/>
+              <w:left w:val="single" w:color="DCE6F0" w:sz="4"/>
+              <w:bottom w:val="single" w:color="DCE6F0" w:sz="4"/>
+              <w:right w:val="single" w:color="DCE6F0" w:sz="4"/>
+            </w:tcBorders>
+            <w:shd w:fill="FFFFFF" w:color="auto" w:val="clear"/>
+            <w:tcMar>
+              <w:top w:type="dxa" w:w="60"/>
+              <w:left w:type="dxa" w:w="100"/>
+              <w:bottom w:type="dxa" w:w="60"/>
+              <w:right w:type="dxa" w:w="100"/>
+            </w:tcMar>
+            <w:vAlign w:val="top"/>
+          </w:tcPr>
+          <w:p>
+            <w:pPr>
+              <w:spacing w:after="0" w:before="0"/>
+            </w:pPr>
+            <w:r>
+              <w:rPr>
+                <w:sz w:val="19"/>
+                <w:szCs w:val="19"/>
+              </w:rPr>
+              <w:t xml:space="preserve">log.nsf on the registration and home servers</w:t>
+            </w:r>
+          </w:p>
+        </w:tc>
+        <w:tc>
+          <w:tcPr>
+            <w:tcW w:type="dxa" w:w="3152"/>
+            <w:tcBorders>
+              <w:top w:val="single" w:color="DCE6F0" w:sz="4"/>
+              <w:left w:val="single" w:color="DCE6F0" w:sz="4"/>
+              <w:bottom w:val="single" w:color="DCE6F0" w:sz="4"/>
+              <w:right w:val="single" w:color="DCE6F0" w:sz="4"/>
+            </w:tcBorders>
+            <w:shd w:fill="FFFFFF" w:color="auto" w:val="clear"/>
+            <w:tcMar>
+              <w:top w:type="dxa" w:w="60"/>
+              <w:left w:type="dxa" w:w="100"/>
+              <w:bottom w:type="dxa" w:w="60"/>
+              <w:right w:type="dxa" w:w="100"/>
+            </w:tcMar>
+            <w:vAlign w:val="top"/>
+          </w:tcPr>
+          <w:p>
+            <w:pPr>
+              <w:spacing w:after="0" w:before="0"/>
+            </w:pPr>
+            <w:r>
+              <w:rPr>
+                <w:sz w:val="19"/>
+                <w:szCs w:val="19"/>
+              </w:rPr>
+              <w:t xml:space="preserve">General server events, e.g. mail file creation and Administration Process messages; useful for troubleshooting</w:t>
+            </w:r>
+          </w:p>
+        </w:tc>
+      </w:tr>
+      <w:tr>
+        <w:trPr>
+          <w:cantSplit/>
+        </w:trPr>
+        <w:tc>
+          <w:tcPr>
+            <w:tcW w:type="dxa" w:w="2059"/>
+            <w:tcBorders>
+              <w:top w:val="single" w:color="DCE6F0" w:sz="4"/>
+              <w:left w:val="single" w:color="DCE6F0" w:sz="4"/>
+              <w:bottom w:val="single" w:color="DCE6F0" w:sz="4"/>
+              <w:right w:val="single" w:color="DCE6F0" w:sz="4"/>
+            </w:tcBorders>
+            <w:shd w:fill="F7F7FC" w:color="auto" w:val="clear"/>
+            <w:tcMar>
+              <w:top w:type="dxa" w:w="60"/>
+              <w:left w:type="dxa" w:w="100"/>
+              <w:bottom w:type="dxa" w:w="60"/>
+              <w:right w:type="dxa" w:w="100"/>
+            </w:tcMar>
+            <w:vAlign w:val="top"/>
+          </w:tcPr>
+          <w:p>
+            <w:pPr>
+              <w:spacing w:after="0" w:before="0"/>
+            </w:pPr>
+            <w:r>
+              <w:rPr>
+                <w:sz w:val="19"/>
+                <w:szCs w:val="19"/>
+              </w:rPr>
               <w:t xml:space="preserve">Helper actions log</w:t>
             </w:r>
           </w:p>
@@ -42834,7 +44367,7 @@
               <w:bottom w:val="single" w:color="DCE6F0" w:sz="4"/>
               <w:right w:val="single" w:color="DCE6F0" w:sz="4"/>
             </w:tcBorders>
-            <w:shd w:fill="FFFFFF" w:color="auto" w:val="clear"/>
+            <w:shd w:fill="F7F7FC" w:color="auto" w:val="clear"/>
             <w:tcMar>
               <w:top w:type="dxa" w:w="60"/>
               <w:left w:type="dxa" w:w="100"/>
@@ -42865,7 +44398,7 @@
               <w:bottom w:val="single" w:color="DCE6F0" w:sz="4"/>
               <w:right w:val="single" w:color="DCE6F0" w:sz="4"/>
             </w:tcBorders>
-            <w:shd w:fill="FFFFFF" w:color="auto" w:val="clear"/>
+            <w:shd w:fill="F7F7FC" w:color="auto" w:val="clear"/>
             <w:tcMar>
               <w:top w:type="dxa" w:w="60"/>
               <w:left w:type="dxa" w:w="100"/>
@@ -46356,6 +47889,202 @@
                 <w:sz w:val="19"/>
                 <w:szCs w:val="19"/>
               </w:rPr>
+              <w:t xml:space="preserve">"LogServer and LogDb are required"</w:t>
+            </w:r>
+          </w:p>
+        </w:tc>
+        <w:tc>
+          <w:tcPr>
+            <w:tcW w:type="dxa" w:w="3398"/>
+            <w:tcBorders>
+              <w:top w:val="single" w:color="DCE6F0" w:sz="4"/>
+              <w:left w:val="single" w:color="DCE6F0" w:sz="4"/>
+              <w:bottom w:val="single" w:color="DCE6F0" w:sz="4"/>
+              <w:right w:val="single" w:color="DCE6F0" w:sz="4"/>
+            </w:tcBorders>
+            <w:shd w:fill="FFFFFF" w:color="auto" w:val="clear"/>
+            <w:tcMar>
+              <w:top w:type="dxa" w:w="60"/>
+              <w:left w:type="dxa" w:w="100"/>
+              <w:bottom w:type="dxa" w:w="60"/>
+              <w:right w:type="dxa" w:w="100"/>
+            </w:tcMar>
+            <w:vAlign w:val="top"/>
+          </w:tcPr>
+          <w:p>
+            <w:pPr>
+              <w:spacing w:after="0" w:before="0"/>
+            </w:pPr>
+            <w:r>
+              <w:rPr>
+                <w:sz w:val="19"/>
+                <w:szCs w:val="19"/>
+              </w:rPr>
+              <w:t xml:space="preserve">Log database not configured</w:t>
+            </w:r>
+          </w:p>
+        </w:tc>
+        <w:tc>
+          <w:tcPr>
+            <w:tcW w:type="dxa" w:w="3254"/>
+            <w:tcBorders>
+              <w:top w:val="single" w:color="DCE6F0" w:sz="4"/>
+              <w:left w:val="single" w:color="DCE6F0" w:sz="4"/>
+              <w:bottom w:val="single" w:color="DCE6F0" w:sz="4"/>
+              <w:right w:val="single" w:color="DCE6F0" w:sz="4"/>
+            </w:tcBorders>
+            <w:shd w:fill="FFFFFF" w:color="auto" w:val="clear"/>
+            <w:tcMar>
+              <w:top w:type="dxa" w:w="60"/>
+              <w:left w:type="dxa" w:w="100"/>
+              <w:bottom w:type="dxa" w:w="60"/>
+              <w:right w:type="dxa" w:w="100"/>
+            </w:tcMar>
+            <w:vAlign w:val="top"/>
+          </w:tcPr>
+          <w:p>
+            <w:pPr>
+              <w:spacing w:after="0" w:before="0"/>
+            </w:pPr>
+            <w:r>
+              <w:rPr>
+                <w:sz w:val="19"/>
+                <w:szCs w:val="19"/>
+              </w:rPr>
+              <w:t xml:space="preserve">Do B15 and set LogServer / LogDb</w:t>
+            </w:r>
+          </w:p>
+        </w:tc>
+      </w:tr>
+      <w:tr>
+        <w:trPr>
+          <w:cantSplit/>
+        </w:trPr>
+        <w:tc>
+          <w:tcPr>
+            <w:tcW w:type="dxa" w:w="2986"/>
+            <w:tcBorders>
+              <w:top w:val="single" w:color="DCE6F0" w:sz="4"/>
+              <w:left w:val="single" w:color="DCE6F0" w:sz="4"/>
+              <w:bottom w:val="single" w:color="DCE6F0" w:sz="4"/>
+              <w:right w:val="single" w:color="DCE6F0" w:sz="4"/>
+            </w:tcBorders>
+            <w:shd w:fill="F7F7FC" w:color="auto" w:val="clear"/>
+            <w:tcMar>
+              <w:top w:type="dxa" w:w="60"/>
+              <w:left w:type="dxa" w:w="100"/>
+              <w:bottom w:type="dxa" w:w="60"/>
+              <w:right w:type="dxa" w:w="100"/>
+            </w:tcMar>
+            <w:vAlign w:val="top"/>
+          </w:tcPr>
+          <w:p>
+            <w:pPr>
+              <w:spacing w:after="0" w:before="0"/>
+            </w:pPr>
+            <w:r>
+              <w:rPr>
+                <w:sz w:val="19"/>
+                <w:szCs w:val="19"/>
+              </w:rPr>
+              <w:t xml:space="preserve">"Cannot open the BulkReg log database"</w:t>
+            </w:r>
+          </w:p>
+        </w:tc>
+        <w:tc>
+          <w:tcPr>
+            <w:tcW w:type="dxa" w:w="3398"/>
+            <w:tcBorders>
+              <w:top w:val="single" w:color="DCE6F0" w:sz="4"/>
+              <w:left w:val="single" w:color="DCE6F0" w:sz="4"/>
+              <w:bottom w:val="single" w:color="DCE6F0" w:sz="4"/>
+              <w:right w:val="single" w:color="DCE6F0" w:sz="4"/>
+            </w:tcBorders>
+            <w:shd w:fill="F7F7FC" w:color="auto" w:val="clear"/>
+            <w:tcMar>
+              <w:top w:type="dxa" w:w="60"/>
+              <w:left w:type="dxa" w:w="100"/>
+              <w:bottom w:type="dxa" w:w="60"/>
+              <w:right w:type="dxa" w:w="100"/>
+            </w:tcMar>
+            <w:vAlign w:val="top"/>
+          </w:tcPr>
+          <w:p>
+            <w:pPr>
+              <w:spacing w:after="0" w:before="0"/>
+            </w:pPr>
+            <w:r>
+              <w:rPr>
+                <w:sz w:val="19"/>
+                <w:szCs w:val="19"/>
+              </w:rPr>
+              <w:t xml:space="preserve">Wrong server or file name, database missing, or no Author/Create documents access</w:t>
+            </w:r>
+          </w:p>
+        </w:tc>
+        <w:tc>
+          <w:tcPr>
+            <w:tcW w:type="dxa" w:w="3254"/>
+            <w:tcBorders>
+              <w:top w:val="single" w:color="DCE6F0" w:sz="4"/>
+              <w:left w:val="single" w:color="DCE6F0" w:sz="4"/>
+              <w:bottom w:val="single" w:color="DCE6F0" w:sz="4"/>
+              <w:right w:val="single" w:color="DCE6F0" w:sz="4"/>
+            </w:tcBorders>
+            <w:shd w:fill="F7F7FC" w:color="auto" w:val="clear"/>
+            <w:tcMar>
+              <w:top w:type="dxa" w:w="60"/>
+              <w:left w:type="dxa" w:w="100"/>
+              <w:bottom w:type="dxa" w:w="60"/>
+              <w:right w:type="dxa" w:w="100"/>
+            </w:tcMar>
+            <w:vAlign w:val="top"/>
+          </w:tcPr>
+          <w:p>
+            <w:pPr>
+              <w:spacing w:after="0" w:before="0"/>
+            </w:pPr>
+            <w:r>
+              <w:rPr>
+                <w:sz w:val="19"/>
+                <w:szCs w:val="19"/>
+              </w:rPr>
+              <w:t xml:space="preserve">Check B15 (ACL) and bulkreg.ini; nothing was changed</w:t>
+            </w:r>
+          </w:p>
+        </w:tc>
+      </w:tr>
+      <w:tr>
+        <w:trPr>
+          <w:cantSplit/>
+        </w:trPr>
+        <w:tc>
+          <w:tcPr>
+            <w:tcW w:type="dxa" w:w="2986"/>
+            <w:tcBorders>
+              <w:top w:val="single" w:color="DCE6F0" w:sz="4"/>
+              <w:left w:val="single" w:color="DCE6F0" w:sz="4"/>
+              <w:bottom w:val="single" w:color="DCE6F0" w:sz="4"/>
+              <w:right w:val="single" w:color="DCE6F0" w:sz="4"/>
+            </w:tcBorders>
+            <w:shd w:fill="FFFFFF" w:color="auto" w:val="clear"/>
+            <w:tcMar>
+              <w:top w:type="dxa" w:w="60"/>
+              <w:left w:type="dxa" w:w="100"/>
+              <w:bottom w:type="dxa" w:w="60"/>
+              <w:right w:type="dxa" w:w="100"/>
+            </w:tcMar>
+            <w:vAlign w:val="top"/>
+          </w:tcPr>
+          <w:p>
+            <w:pPr>
+              <w:spacing w:after="0" w:before="0"/>
+            </w:pPr>
+            <w:r>
+              <w:rPr>
+                <w:sz w:val="19"/>
+                <w:szCs w:val="19"/>
+              </w:rPr>
               <w:t xml:space="preserve">"Mail folder setting error" at start-up</w:t>
             </w:r>
           </w:p>
@@ -47934,6 +49663,104 @@
                 <w:szCs w:val="19"/>
               </w:rPr>
               <w:t xml:space="preserve">B14, B19</w:t>
+            </w:r>
+          </w:p>
+        </w:tc>
+      </w:tr>
+      <w:tr>
+        <w:trPr>
+          <w:cantSplit/>
+        </w:trPr>
+        <w:tc>
+          <w:tcPr>
+            <w:tcW w:type="dxa" w:w="2368"/>
+            <w:tcBorders>
+              <w:top w:val="single" w:color="DCE6F0" w:sz="4"/>
+              <w:left w:val="single" w:color="DCE6F0" w:sz="4"/>
+              <w:bottom w:val="single" w:color="DCE6F0" w:sz="4"/>
+              <w:right w:val="single" w:color="DCE6F0" w:sz="4"/>
+            </w:tcBorders>
+            <w:shd w:fill="FFFFFF" w:color="auto" w:val="clear"/>
+            <w:tcMar>
+              <w:top w:type="dxa" w:w="60"/>
+              <w:left w:type="dxa" w:w="100"/>
+              <w:bottom w:type="dxa" w:w="60"/>
+              <w:right w:type="dxa" w:w="100"/>
+            </w:tcMar>
+            <w:vAlign w:val="top"/>
+          </w:tcPr>
+          <w:p>
+            <w:pPr>
+              <w:spacing w:after="0" w:before="0"/>
+            </w:pPr>
+            <w:r>
+              <w:rPr>
+                <w:sz w:val="19"/>
+                <w:szCs w:val="19"/>
+              </w:rPr>
+              <w:t xml:space="preserve">Missing audit trail</w:t>
+            </w:r>
+          </w:p>
+        </w:tc>
+        <w:tc>
+          <w:tcPr>
+            <w:tcW w:type="dxa" w:w="4736"/>
+            <w:tcBorders>
+              <w:top w:val="single" w:color="DCE6F0" w:sz="4"/>
+              <w:left w:val="single" w:color="DCE6F0" w:sz="4"/>
+              <w:bottom w:val="single" w:color="DCE6F0" w:sz="4"/>
+              <w:right w:val="single" w:color="DCE6F0" w:sz="4"/>
+            </w:tcBorders>
+            <w:shd w:fill="FFFFFF" w:color="auto" w:val="clear"/>
+            <w:tcMar>
+              <w:top w:type="dxa" w:w="60"/>
+              <w:left w:type="dxa" w:w="100"/>
+              <w:bottom w:type="dxa" w:w="60"/>
+              <w:right w:type="dxa" w:w="100"/>
+            </w:tcMar>
+            <w:vAlign w:val="top"/>
+          </w:tcPr>
+          <w:p>
+            <w:pPr>
+              <w:spacing w:after="0" w:before="0"/>
+            </w:pPr>
+            <w:r>
+              <w:rPr>
+                <w:sz w:val="19"/>
+                <w:szCs w:val="19"/>
+              </w:rPr>
+              <w:t xml:space="preserve">Central log database is mandatory; agents refuse to run without it; one AUDIT entry per user</w:t>
+            </w:r>
+          </w:p>
+        </w:tc>
+        <w:tc>
+          <w:tcPr>
+            <w:tcW w:type="dxa" w:w="2534"/>
+            <w:tcBorders>
+              <w:top w:val="single" w:color="DCE6F0" w:sz="4"/>
+              <w:left w:val="single" w:color="DCE6F0" w:sz="4"/>
+              <w:bottom w:val="single" w:color="DCE6F0" w:sz="4"/>
+              <w:right w:val="single" w:color="DCE6F0" w:sz="4"/>
+            </w:tcBorders>
+            <w:shd w:fill="FFFFFF" w:color="auto" w:val="clear"/>
+            <w:tcMar>
+              <w:top w:type="dxa" w:w="60"/>
+              <w:left w:type="dxa" w:w="100"/>
+              <w:bottom w:type="dxa" w:w="60"/>
+              <w:right w:type="dxa" w:w="100"/>
+            </w:tcMar>
+            <w:vAlign w:val="top"/>
+          </w:tcPr>
+          <w:p>
+            <w:pPr>
+              <w:spacing w:after="0" w:before="0"/>
+            </w:pPr>
+            <w:r>
+              <w:rPr>
+                <w:sz w:val="19"/>
+                <w:szCs w:val="19"/>
+              </w:rPr>
+              <w:t xml:space="preserve">bulkreg_log.nsf (B15)</w:t>
             </w:r>
           </w:p>
         </w:tc>
@@ -51361,7 +53188,7 @@
       <w:r>
         <w:t xml:space="preserve">Registering Active Directory users (Directory Sync) – </w:t>
       </w:r>
-      <w:hyperlink w:history="1" r:id="rIdhrkalf8prlpdr6jsh0ab4">
+      <w:hyperlink w:history="1" r:id="rIdnluveqlbpuvmscr5t-gx0">
         <w:r>
           <w:rPr>
             <w:rStyle w:val="Hyperlink"/>
@@ -51383,7 +53210,7 @@
       <w:r>
         <w:t xml:space="preserve">ContactNoteID property – </w:t>
       </w:r>
-      <w:hyperlink w:history="1" r:id="rIdwo0ityspd-d86zpwp_0x7">
+      <w:hyperlink w:history="1" r:id="rIddbowogh2hk7tpslbwwd-6">
         <w:r>
           <w:rPr>
             <w:rStyle w:val="Hyperlink"/>
@@ -51405,7 +53232,7 @@
       <w:r>
         <w:t xml:space="preserve">RegisterNewUser method – </w:t>
       </w:r>
-      <w:hyperlink w:history="1" r:id="rIdnnvlrb_1x55vxebvxgqqw">
+      <w:hyperlink w:history="1" r:id="rId-aoil2xszichqdizl5cjc">
         <w:r>
           <w:rPr>
             <w:rStyle w:val="Hyperlink"/>
@@ -51427,7 +53254,7 @@
       <w:r>
         <w:t xml:space="preserve">Creating an ID vault – </w:t>
       </w:r>
-      <w:hyperlink w:history="1" r:id="rIdfe-c59jf30pdbtbzwhaql">
+      <w:hyperlink w:history="1" r:id="rIdra1awt3bfmkafycpe7t39">
         <w:r>
           <w:rPr>
             <w:rStyle w:val="Hyperlink"/>
@@ -51449,7 +53276,7 @@
       <w:r>
         <w:t xml:space="preserve">Assigning users to a vault (Security Settings, ID Vault tab) – </w:t>
       </w:r>
-      <w:hyperlink w:history="1" r:id="rId7pcocbf-2zcwpl6nwzm7h">
+      <w:hyperlink w:history="1" r:id="rIdobkpmnfcp_qjldojp_91c">
         <w:r>
           <w:rPr>
             <w:rStyle w:val="Hyperlink"/>
@@ -51471,7 +53298,7 @@
       <w:r>
         <w:t xml:space="preserve">Creating a security policy settings document – </w:t>
       </w:r>
-      <w:hyperlink w:history="1" r:id="rId-g1k-0dcmasiogyecj4dj">
+      <w:hyperlink w:history="1" r:id="rIdc6qwy_zhek0hisltgsnwy">
         <w:r>
           <w:rPr>
             <w:rStyle w:val="Hyperlink"/>
@@ -51493,7 +53320,7 @@
       <w:r>
         <w:t xml:space="preserve">Creating a policy document (explicit policy names */name) – </w:t>
       </w:r>
-      <w:hyperlink w:history="1" r:id="rIdjwfgfkkkcei49gas2knnj">
+      <w:hyperlink w:history="1" r:id="rIdj_md3sqtu4ego5j-k_hkg">
         <w:r>
           <w:rPr>
             <w:rStyle w:val="Hyperlink"/>
@@ -51515,7 +53342,7 @@
       <w:r>
         <w:t xml:space="preserve">Modifying a server-based CA (adding RAs) – </w:t>
       </w:r>
-      <w:hyperlink w:history="1" r:id="rIds_wr3w0wckgkdgqjmsmiu">
+      <w:hyperlink w:history="1" r:id="rIdy5jjgzihb0twga_-3s8gf">
         <w:r>
           <w:rPr>
             <w:rStyle w:val="Hyperlink"/>
@@ -51537,7 +53364,7 @@
       <w:r>
         <w:t xml:space="preserve">Administration roles in the Domino Directory ACL – </w:t>
       </w:r>
-      <w:hyperlink w:history="1" r:id="rIdf4ncb1lddutbawqolw9qx">
+      <w:hyperlink w:history="1" r:id="rIdl19xridfd89eq_sewq9pv">
         <w:r>
           <w:rPr>
             <w:rStyle w:val="Hyperlink"/>
@@ -51559,7 +53386,7 @@
       <w:r>
         <w:t xml:space="preserve">Configuring a database ACL (Manage ACL) – </w:t>
       </w:r>
-      <w:hyperlink w:history="1" r:id="rIdh6zxc9ribf3vnzzm90r6f">
+      <w:hyperlink w:history="1" r:id="rId0udecwsbo9utnizjexbng">
         <w:r>
           <w:rPr>
             <w:rStyle w:val="Hyperlink"/>
@@ -51581,7 +53408,7 @@
       <w:r>
         <w:t xml:space="preserve">Creating a database from a template – </w:t>
       </w:r>
-      <w:hyperlink w:history="1" r:id="rIdglz_0dbzjwmmqgtjssjgk">
+      <w:hyperlink w:history="1" r:id="rIdijl9jlhv6exxdczg87hpd">
         <w:r>
           <w:rPr>
             <w:rStyle w:val="Hyperlink"/>
@@ -51603,7 +53430,7 @@
       <w:r>
         <w:t xml:space="preserve">Script libraries (Designer) – </w:t>
       </w:r>
-      <w:hyperlink w:history="1" r:id="rIdhvsb06dzyxiil9d3yi6ms">
+      <w:hyperlink w:history="1" r:id="rIdfgzbi2gdgrcns68s__-5l">
         <w:r>
           <w:rPr>
             <w:rStyle w:val="Hyperlink"/>
@@ -51625,7 +53452,7 @@
       <w:r>
         <w:t xml:space="preserve">Creating an agent (Designer) – </w:t>
       </w:r>
-      <w:hyperlink w:history="1" r:id="rIdvvq50pdll4urlbjdzinqu">
+      <w:hyperlink w:history="1" r:id="rId5-4ltcnnsuqcsxmakqa3z">
         <w:r>
           <w:rPr>
             <w:rStyle w:val="Hyperlink"/>
@@ -51647,7 +53474,7 @@
       <w:r>
         <w:t xml:space="preserve">Naming agents: aliases '|' and cascading '\' – </w:t>
       </w:r>
-      <w:hyperlink w:history="1" r:id="rId_maolvushr9lf2ct7wt9x">
+      <w:hyperlink w:history="1" r:id="rIdskmlgsuh1p6gsc1lyjrql">
         <w:r>
           <w:rPr>
             <w:rStyle w:val="Hyperlink"/>
@@ -51669,7 +53496,7 @@
       <w:r>
         <w:t xml:space="preserve">Signing a database – </w:t>
       </w:r>
-      <w:hyperlink w:history="1" r:id="rIdldka4asysba5tzd8q0mnn">
+      <w:hyperlink w:history="1" r:id="rIduu6ulgbc3hyuwzfo3frcv">
         <w:r>
           <w:rPr>
             <w:rStyle w:val="Hyperlink"/>
@@ -51691,7 +53518,7 @@
       <w:r>
         <w:t xml:space="preserve">Checking field values (Document Properties) – </w:t>
       </w:r>
-      <w:hyperlink w:history="1" r:id="rId1cyn0auvaet5voyy3qsiy">
+      <w:hyperlink w:history="1" r:id="rIddrkbi3uvomlmh_u5a2jkd">
         <w:r>
           <w:rPr>
             <w:rStyle w:val="Hyperlink"/>
@@ -51713,7 +53540,7 @@
       <w:r>
         <w:t xml:space="preserve">Execution Security Alert (ECL) – </w:t>
       </w:r>
-      <w:hyperlink w:history="1" r:id="rIdwq5x_2kzv3guyrzprglm9">
+      <w:hyperlink w:history="1" r:id="rIdavl87_xjyoviqszywigyn">
         <w:r>
           <w:rPr>
             <w:rStyle w:val="Hyperlink"/>
@@ -52170,7 +53997,7 @@
         <w:sz w:val="16"/>
         <w:szCs w:val="16"/>
       </w:rPr>
-      <w:t xml:space="preserve">HCL Confidential – Internal Use  |  v2.8</w:t>
+      <w:t xml:space="preserve">HCL Confidential – Internal Use  |  v2.9</w:t>
     </w:r>
     <w:r>
       <w:rPr>

</xml_diff>

<commit_message>
Release 3.0.0: one version number across the kit
- Library and all agents 3.0.0 (agent headers carry the version), bulkreg.ini,
  server_mapping.csv, PowerShell helper and launcher, Audit Viewer, README
- Guide 3.0 (document control and footer), VERSION file and CHANGELOG.md
</commit_message>
<xml_diff>
--- a/docs/BulkReg_Admin_Guide.docx
+++ b/docs/BulkReg_Admin_Guide.docx
@@ -170,7 +170,7 @@
                 <w:sz w:val="20"/>
                 <w:szCs w:val="20"/>
               </w:rPr>
-              <w:t xml:space="preserve">Version 2.9  |  October 2026  |  Draft for review</w:t>
+              <w:t xml:space="preserve">Version 3.0  |  October 2026  |  Draft for review</w:t>
             </w:r>
           </w:p>
           <w:p>
@@ -482,7 +482,7 @@
                 <w:sz w:val="19"/>
                 <w:szCs w:val="19"/>
               </w:rPr>
-              <w:t xml:space="preserve">2.9 (Draft for review)</w:t>
+              <w:t xml:space="preserve">3.0 (Draft for review)</w:t>
             </w:r>
           </w:p>
         </w:tc>
@@ -766,7 +766,7 @@
                 <w:sz w:val="19"/>
                 <w:szCs w:val="19"/>
               </w:rPr>
-              <w:t xml:space="preserve">BulkReg 1.8.0: BulkRegCommon library, 5 agents, config templates, optional PowerShell helper, Audit Viewer</w:t>
+              <w:t xml:space="preserve">BulkReg 3.0.0: BulkRegCommon library, 5 agents, config templates, optional PowerShell helper, Audit Viewer</w:t>
             </w:r>
           </w:p>
         </w:tc>
@@ -972,7 +972,7 @@
                 <w:sz w:val="19"/>
                 <w:szCs w:val="19"/>
               </w:rPr>
-              <w:t xml:space="preserve">2.9</w:t>
+              <w:t xml:space="preserve">3.0</w:t>
             </w:r>
           </w:p>
         </w:tc>
@@ -1005,30 +1005,14 @@
                 <w:sz w:val="19"/>
                 <w:szCs w:val="19"/>
               </w:rPr>
-              <w:t xml:space="preserve">DryRun explained</w:t>
-            </w:r>
-            <w:r>
-              <w:rPr>
-                <w:sz w:val="19"/>
-                <w:szCs w:val="19"/>
-              </w:rPr>
-              <w:t xml:space="preserve"> (D3b, bulkreg.ini). </w:t>
-            </w:r>
-            <w:r>
-              <w:rPr>
-                <w:b/>
-                <w:bCs/>
-                <w:sz w:val="19"/>
-                <w:szCs w:val="19"/>
-              </w:rPr>
-              <w:t xml:space="preserve">Central BulkReg log database is now required</w:t>
-            </w:r>
-            <w:r>
-              <w:rPr>
-                <w:sz w:val="19"/>
-                <w:szCs w:val="19"/>
-              </w:rPr>
-              <w:t xml:space="preserve"> (B15): every run, every action and one AUDIT entry per user are written there; agents stop if it cannot be opened.</w:t>
+              <w:t xml:space="preserve">Release 3.0.0.</w:t>
+            </w:r>
+            <w:r>
+              <w:rPr>
+                <w:sz w:val="19"/>
+                <w:szCs w:val="19"/>
+              </w:rPr>
+              <w:t xml:space="preserve"> One version number across the whole kit: guide 3.0, library and all agents 3.0.0, bulkreg.ini, server_mapping.csv, PowerShell helper, Audit Viewer, README, VERSION and CHANGELOG.md. Content as in 2.9.</w:t>
             </w:r>
           </w:p>
         </w:tc>
@@ -1064,7 +1048,7 @@
                 <w:sz w:val="19"/>
                 <w:szCs w:val="19"/>
               </w:rPr>
-              <w:t xml:space="preserve">2.8</w:t>
+              <w:t xml:space="preserve">2.9</w:t>
             </w:r>
           </w:p>
         </w:tc>
@@ -1090,13 +1074,6 @@
             <w:pPr>
               <w:spacing w:after="0" w:before="0"/>
             </w:pPr>
-            <w:r>
-              <w:rPr>
-                <w:sz w:val="19"/>
-                <w:szCs w:val="19"/>
-              </w:rPr>
-              <w:t xml:space="preserve">Mail folder layout made explicit: mail1, mail2 … are created </w:t>
-            </w:r>
             <w:r>
               <w:rPr>
                 <w:b/>
@@ -1104,14 +1081,30 @@
                 <w:sz w:val="19"/>
                 <w:szCs w:val="19"/>
               </w:rPr>
-              <w:t xml:space="preserve">directly under the Domino data directory</w:t>
-            </w:r>
-            <w:r>
-              <w:rPr>
-                <w:sz w:val="19"/>
-                <w:szCs w:val="19"/>
-              </w:rPr>
-              <w:t xml:space="preserve">, next to the existing mail folder, not inside it. Folder diagram, plain explanation of MailFolderPrefix / MailFileDir / new MailExistingFolders. BulkReg rejects a prefix with a number (mail1) or a path (mail\mail) at start-up.</w:t>
+              <w:t xml:space="preserve">DryRun explained</w:t>
+            </w:r>
+            <w:r>
+              <w:rPr>
+                <w:sz w:val="19"/>
+                <w:szCs w:val="19"/>
+              </w:rPr>
+              <w:t xml:space="preserve"> (D3b, bulkreg.ini). </w:t>
+            </w:r>
+            <w:r>
+              <w:rPr>
+                <w:b/>
+                <w:bCs/>
+                <w:sz w:val="19"/>
+                <w:szCs w:val="19"/>
+              </w:rPr>
+              <w:t xml:space="preserve">Central BulkReg log database is now required</w:t>
+            </w:r>
+            <w:r>
+              <w:rPr>
+                <w:sz w:val="19"/>
+                <w:szCs w:val="19"/>
+              </w:rPr>
+              <w:t xml:space="preserve"> (B15): every run, every action and one AUDIT entry per user are written there; agents stop if it cannot be opened.</w:t>
             </w:r>
           </w:p>
         </w:tc>
@@ -1147,7 +1140,7 @@
                 <w:sz w:val="19"/>
                 <w:szCs w:val="19"/>
               </w:rPr>
-              <w:t xml:space="preserve">2.7</w:t>
+              <w:t xml:space="preserve">2.8</w:t>
             </w:r>
           </w:p>
         </w:tc>
@@ -1178,7 +1171,7 @@
                 <w:sz w:val="19"/>
                 <w:szCs w:val="19"/>
               </w:rPr>
-              <w:t xml:space="preserve">New one-page </w:t>
+              <w:t xml:space="preserve">Mail folder layout made explicit: mail1, mail2 … are created </w:t>
             </w:r>
             <w:r>
               <w:rPr>
@@ -1187,14 +1180,14 @@
                 <w:sz w:val="19"/>
                 <w:szCs w:val="19"/>
               </w:rPr>
-              <w:t xml:space="preserve">Agent Run Order</w:t>
-            </w:r>
-            <w:r>
-              <w:rPr>
-                <w:sz w:val="19"/>
-                <w:szCs w:val="19"/>
-              </w:rPr>
-              <w:t xml:space="preserve"> at the front of the guide (flow, step table with DryRun setting, input/output and go/no-go per step, rules).</w:t>
+              <w:t xml:space="preserve">directly under the Domino data directory</w:t>
+            </w:r>
+            <w:r>
+              <w:rPr>
+                <w:sz w:val="19"/>
+                <w:szCs w:val="19"/>
+              </w:rPr>
+              <w:t xml:space="preserve">, next to the existing mail folder, not inside it. Folder diagram, plain explanation of MailFolderPrefix / MailFileDir / new MailExistingFolders. BulkReg rejects a prefix with a number (mail1) or a path (mail\mail) at start-up.</w:t>
             </w:r>
           </w:p>
         </w:tc>
@@ -1230,7 +1223,7 @@
                 <w:sz w:val="19"/>
                 <w:szCs w:val="19"/>
               </w:rPr>
-              <w:t xml:space="preserve">2.6</w:t>
+              <w:t xml:space="preserve">2.7</w:t>
             </w:r>
           </w:p>
         </w:tc>
@@ -1261,7 +1254,7 @@
                 <w:sz w:val="19"/>
                 <w:szCs w:val="19"/>
               </w:rPr>
-              <w:t xml:space="preserve">RegistrationLog corrected: registration is logged to the </w:t>
+              <w:t xml:space="preserve">New one-page </w:t>
             </w:r>
             <w:r>
               <w:rPr>
@@ -1270,14 +1263,14 @@
                 <w:sz w:val="19"/>
                 <w:szCs w:val="19"/>
               </w:rPr>
-              <w:t xml:space="preserve">Certification Log certlog.nsf</w:t>
-            </w:r>
-            <w:r>
-              <w:rPr>
-                <w:sz w:val="19"/>
-                <w:szCs w:val="19"/>
-              </w:rPr>
-              <w:t xml:space="preserve"> on the registration server (HCL: any non-empty value → CERTLOG.NSF; empty = no logging). log.nsf is the server's general log. Prerequisite check for certlog.nsf added (B4).</w:t>
+              <w:t xml:space="preserve">Agent Run Order</w:t>
+            </w:r>
+            <w:r>
+              <w:rPr>
+                <w:sz w:val="19"/>
+                <w:szCs w:val="19"/>
+              </w:rPr>
+              <w:t xml:space="preserve"> at the front of the guide (flow, step table with DryRun setting, input/output and go/no-go per step, rules).</w:t>
             </w:r>
           </w:p>
         </w:tc>
@@ -1313,7 +1306,7 @@
                 <w:sz w:val="19"/>
                 <w:szCs w:val="19"/>
               </w:rPr>
-              <w:t xml:space="preserve">2.5</w:t>
+              <w:t xml:space="preserve">2.6</w:t>
             </w:r>
           </w:p>
         </w:tc>
@@ -1339,6 +1332,13 @@
             <w:pPr>
               <w:spacing w:after="0" w:before="0"/>
             </w:pPr>
+            <w:r>
+              <w:rPr>
+                <w:sz w:val="19"/>
+                <w:szCs w:val="19"/>
+              </w:rPr>
+              <w:t xml:space="preserve">RegistrationLog corrected: registration is logged to the </w:t>
+            </w:r>
             <w:r>
               <w:rPr>
                 <w:b/>
@@ -1346,30 +1346,14 @@
                 <w:sz w:val="19"/>
                 <w:szCs w:val="19"/>
               </w:rPr>
-              <w:t xml:space="preserve">Prerequisite: pre-create the numbered mail folders</w:t>
-            </w:r>
-            <w:r>
-              <w:rPr>
-                <w:sz w:val="19"/>
-                <w:szCs w:val="19"/>
-              </w:rPr>
-              <w:t xml:space="preserve"> (mail1…mailN, one per 1000 users) on every home server (B4). Preflight calculates the folders needed per server and writes the create commands. New </w:t>
-            </w:r>
-            <w:r>
-              <w:rPr>
-                <w:rFonts w:ascii="Consolas" w:cs="Consolas" w:eastAsia="Consolas" w:hAnsi="Consolas"/>
-                <w:color w:val="0F5FDC"/>
-                <w:sz w:val="18"/>
-                <w:szCs w:val="18"/>
-              </w:rPr>
-              <w:t xml:space="preserve">MailFolderMax</w:t>
-            </w:r>
-            <w:r>
-              <w:rPr>
-                <w:sz w:val="19"/>
-                <w:szCs w:val="19"/>
-              </w:rPr>
-              <w:t xml:space="preserve">: Build Batch never assigns a folder above the number you created.</w:t>
+              <w:t xml:space="preserve">Certification Log certlog.nsf</w:t>
+            </w:r>
+            <w:r>
+              <w:rPr>
+                <w:sz w:val="19"/>
+                <w:szCs w:val="19"/>
+              </w:rPr>
+              <w:t xml:space="preserve"> on the registration server (HCL: any non-empty value → CERTLOG.NSF; empty = no logging). log.nsf is the server's general log. Prerequisite check for certlog.nsf added (B4).</w:t>
             </w:r>
           </w:p>
         </w:tc>
@@ -1405,7 +1389,7 @@
                 <w:sz w:val="19"/>
                 <w:szCs w:val="19"/>
               </w:rPr>
-              <w:t xml:space="preserve">2.4</w:t>
+              <w:t xml:space="preserve">2.5</w:t>
             </w:r>
           </w:p>
         </w:tc>
@@ -1431,13 +1415,6 @@
             <w:pPr>
               <w:spacing w:after="0" w:before="0"/>
             </w:pPr>
-            <w:r>
-              <w:rPr>
-                <w:sz w:val="19"/>
-                <w:szCs w:val="19"/>
-              </w:rPr>
-              <w:t xml:space="preserve">Mail file </w:t>
-            </w:r>
             <w:r>
               <w:rPr>
                 <w:b/>
@@ -1445,46 +1422,30 @@
                 <w:sz w:val="19"/>
                 <w:szCs w:val="19"/>
               </w:rPr>
-              <w:t xml:space="preserve">naming = last name</w:t>
-            </w:r>
-            <w:r>
-              <w:rPr>
-                <w:sz w:val="19"/>
-                <w:szCs w:val="19"/>
-              </w:rPr>
-              <w:t xml:space="preserve"> (configurable), </w:t>
-            </w:r>
-            <w:r>
-              <w:rPr>
-                <w:b/>
-                <w:bCs/>
-                <w:sz w:val="19"/>
-                <w:szCs w:val="19"/>
-              </w:rPr>
-              <w:t xml:space="preserve">uniqueness</w:t>
-            </w:r>
-            <w:r>
-              <w:rPr>
-                <w:sz w:val="19"/>
-                <w:szCs w:val="19"/>
-              </w:rPr>
-              <w:t xml:space="preserve"> checked against all mail folders on the home server, Person documents, open batches and the batch itself (clash → smith2.nsf or ERROR), </w:t>
-            </w:r>
-            <w:r>
-              <w:rPr>
-                <w:b/>
-                <w:bCs/>
-                <w:sz w:val="19"/>
-                <w:szCs w:val="19"/>
-              </w:rPr>
-              <w:t xml:space="preserve">numbered folders</w:t>
-            </w:r>
-            <w:r>
-              <w:rPr>
-                <w:sz w:val="19"/>
-                <w:szCs w:val="19"/>
-              </w:rPr>
-              <w:t xml:space="preserve"> mail1, mail2… with max 1000 mail files each. MailFileNote recorded in batch file, summary, results and audit.</w:t>
+              <w:t xml:space="preserve">Prerequisite: pre-create the numbered mail folders</w:t>
+            </w:r>
+            <w:r>
+              <w:rPr>
+                <w:sz w:val="19"/>
+                <w:szCs w:val="19"/>
+              </w:rPr>
+              <w:t xml:space="preserve"> (mail1…mailN, one per 1000 users) on every home server (B4). Preflight calculates the folders needed per server and writes the create commands. New </w:t>
+            </w:r>
+            <w:r>
+              <w:rPr>
+                <w:rFonts w:ascii="Consolas" w:cs="Consolas" w:eastAsia="Consolas" w:hAnsi="Consolas"/>
+                <w:color w:val="0F5FDC"/>
+                <w:sz w:val="18"/>
+                <w:szCs w:val="18"/>
+              </w:rPr>
+              <w:t xml:space="preserve">MailFolderMax</w:t>
+            </w:r>
+            <w:r>
+              <w:rPr>
+                <w:sz w:val="19"/>
+                <w:szCs w:val="19"/>
+              </w:rPr>
+              <w:t xml:space="preserve">: Build Batch never assigns a folder above the number you created.</w:t>
             </w:r>
           </w:p>
         </w:tc>
@@ -1520,7 +1481,7 @@
                 <w:sz w:val="19"/>
                 <w:szCs w:val="19"/>
               </w:rPr>
-              <w:t xml:space="preserve">2.3</w:t>
+              <w:t xml:space="preserve">2.4</w:t>
             </w:r>
           </w:p>
         </w:tc>
@@ -1546,6 +1507,13 @@
             <w:pPr>
               <w:spacing w:after="0" w:before="0"/>
             </w:pPr>
+            <w:r>
+              <w:rPr>
+                <w:sz w:val="19"/>
+                <w:szCs w:val="19"/>
+              </w:rPr>
+              <w:t xml:space="preserve">Mail file </w:t>
+            </w:r>
             <w:r>
               <w:rPr>
                 <w:b/>
@@ -1553,14 +1521,46 @@
                 <w:sz w:val="19"/>
                 <w:szCs w:val="19"/>
               </w:rPr>
-              <w:t xml:space="preserve">Every registered user now gets a Domino mail file</w:t>
-            </w:r>
-            <w:r>
-              <w:rPr>
-                <w:sz w:val="19"/>
-                <w:szCs w:val="19"/>
-              </w:rPr>
-              <w:t xml:space="preserve"> on the home server (MailFile column in the batch, reviewable). CreateMailDb / PreserveMailSystem removed. Mail file settings (folder, template, ACL manager, quota, full-text index), existence checks before and after registration, and mail file status in Verify.</w:t>
+              <w:t xml:space="preserve">naming = last name</w:t>
+            </w:r>
+            <w:r>
+              <w:rPr>
+                <w:sz w:val="19"/>
+                <w:szCs w:val="19"/>
+              </w:rPr>
+              <w:t xml:space="preserve"> (configurable), </w:t>
+            </w:r>
+            <w:r>
+              <w:rPr>
+                <w:b/>
+                <w:bCs/>
+                <w:sz w:val="19"/>
+                <w:szCs w:val="19"/>
+              </w:rPr>
+              <w:t xml:space="preserve">uniqueness</w:t>
+            </w:r>
+            <w:r>
+              <w:rPr>
+                <w:sz w:val="19"/>
+                <w:szCs w:val="19"/>
+              </w:rPr>
+              <w:t xml:space="preserve"> checked against all mail folders on the home server, Person documents, open batches and the batch itself (clash → smith2.nsf or ERROR), </w:t>
+            </w:r>
+            <w:r>
+              <w:rPr>
+                <w:b/>
+                <w:bCs/>
+                <w:sz w:val="19"/>
+                <w:szCs w:val="19"/>
+              </w:rPr>
+              <w:t xml:space="preserve">numbered folders</w:t>
+            </w:r>
+            <w:r>
+              <w:rPr>
+                <w:sz w:val="19"/>
+                <w:szCs w:val="19"/>
+              </w:rPr>
+              <w:t xml:space="preserve"> mail1, mail2… with max 1000 mail files each. MailFileNote recorded in batch file, summary, results and audit.</w:t>
             </w:r>
           </w:p>
         </w:tc>
@@ -1596,7 +1596,7 @@
                 <w:sz w:val="19"/>
                 <w:szCs w:val="19"/>
               </w:rPr>
-              <w:t xml:space="preserve">2.1</w:t>
+              <w:t xml:space="preserve">2.3</w:t>
             </w:r>
           </w:p>
         </w:tc>
@@ -1622,13 +1622,6 @@
             <w:pPr>
               <w:spacing w:after="0" w:before="0"/>
             </w:pPr>
-            <w:r>
-              <w:rPr>
-                <w:sz w:val="19"/>
-                <w:szCs w:val="19"/>
-              </w:rPr>
-              <w:t xml:space="preserve">Name formats: servers in canonical (CN=DominoADMail/O=Demo) or abbreviated (DominoADMail/Demo) form, both accepted by the code. </w:t>
-            </w:r>
             <w:r>
               <w:rPr>
                 <w:b/>
@@ -1636,30 +1629,14 @@
                 <w:sz w:val="19"/>
                 <w:szCs w:val="19"/>
               </w:rPr>
-              <w:t xml:space="preserve">Organizational policies</w:t>
-            </w:r>
-            <w:r>
-              <w:rPr>
-                <w:sz w:val="19"/>
-                <w:szCs w:val="19"/>
-              </w:rPr>
-              <w:t xml:space="preserve"> (</w:t>
-            </w:r>
-            <w:r>
-              <w:rPr>
-                <w:i/>
-                <w:iCs/>
-                <w:sz w:val="19"/>
-                <w:szCs w:val="19"/>
-              </w:rPr>
-              <w:t xml:space="preserve">/Demo, </w:t>
-            </w:r>
-            <w:r>
-              <w:rPr>
-                <w:sz w:val="19"/>
-                <w:szCs w:val="19"/>
-              </w:rPr>
-              <w:t xml:space="preserve">/Sales/Demo) supported alongside explicit policies (B8 Option B, OrgPolicyAssignsVault, '-' in the mapping). Consistent 'Demo' examples.</w:t>
+              <w:t xml:space="preserve">Every registered user now gets a Domino mail file</w:t>
+            </w:r>
+            <w:r>
+              <w:rPr>
+                <w:sz w:val="19"/>
+                <w:szCs w:val="19"/>
+              </w:rPr>
+              <w:t xml:space="preserve"> on the home server (MailFile column in the batch, reviewable). CreateMailDb / PreserveMailSystem removed. Mail file settings (folder, template, ACL manager, quota, full-text index), existence checks before and after registration, and mail file status in Verify.</w:t>
             </w:r>
           </w:p>
         </w:tc>
@@ -1695,6 +1672,105 @@
                 <w:sz w:val="19"/>
                 <w:szCs w:val="19"/>
               </w:rPr>
+              <w:t xml:space="preserve">2.1</w:t>
+            </w:r>
+          </w:p>
+        </w:tc>
+        <w:tc>
+          <w:tcPr>
+            <w:tcW w:type="dxa" w:w="8403"/>
+            <w:tcBorders>
+              <w:top w:val="single" w:color="DCE6F0" w:sz="4"/>
+              <w:left w:val="single" w:color="DCE6F0" w:sz="4"/>
+              <w:bottom w:val="single" w:color="DCE6F0" w:sz="4"/>
+              <w:right w:val="single" w:color="DCE6F0" w:sz="4"/>
+            </w:tcBorders>
+            <w:shd w:fill="F7F7FC" w:color="auto" w:val="clear"/>
+            <w:tcMar>
+              <w:top w:type="dxa" w:w="60"/>
+              <w:left w:type="dxa" w:w="100"/>
+              <w:bottom w:type="dxa" w:w="60"/>
+              <w:right w:type="dxa" w:w="100"/>
+            </w:tcMar>
+            <w:vAlign w:val="top"/>
+          </w:tcPr>
+          <w:p>
+            <w:pPr>
+              <w:spacing w:after="0" w:before="0"/>
+            </w:pPr>
+            <w:r>
+              <w:rPr>
+                <w:sz w:val="19"/>
+                <w:szCs w:val="19"/>
+              </w:rPr>
+              <w:t xml:space="preserve">Name formats: servers in canonical (CN=DominoADMail/O=Demo) or abbreviated (DominoADMail/Demo) form, both accepted by the code. </w:t>
+            </w:r>
+            <w:r>
+              <w:rPr>
+                <w:b/>
+                <w:bCs/>
+                <w:sz w:val="19"/>
+                <w:szCs w:val="19"/>
+              </w:rPr>
+              <w:t xml:space="preserve">Organizational policies</w:t>
+            </w:r>
+            <w:r>
+              <w:rPr>
+                <w:sz w:val="19"/>
+                <w:szCs w:val="19"/>
+              </w:rPr>
+              <w:t xml:space="preserve"> (</w:t>
+            </w:r>
+            <w:r>
+              <w:rPr>
+                <w:i/>
+                <w:iCs/>
+                <w:sz w:val="19"/>
+                <w:szCs w:val="19"/>
+              </w:rPr>
+              <w:t xml:space="preserve">/Demo, </w:t>
+            </w:r>
+            <w:r>
+              <w:rPr>
+                <w:sz w:val="19"/>
+                <w:szCs w:val="19"/>
+              </w:rPr>
+              <w:t xml:space="preserve">/Sales/Demo) supported alongside explicit policies (B8 Option B, OrgPolicyAssignsVault, '-' in the mapping). Consistent 'Demo' examples.</w:t>
+            </w:r>
+          </w:p>
+        </w:tc>
+      </w:tr>
+      <w:tr>
+        <w:trPr>
+          <w:cantSplit/>
+        </w:trPr>
+        <w:tc>
+          <w:tcPr>
+            <w:tcW w:type="dxa" w:w="1235"/>
+            <w:tcBorders>
+              <w:top w:val="single" w:color="DCE6F0" w:sz="4"/>
+              <w:left w:val="single" w:color="DCE6F0" w:sz="4"/>
+              <w:bottom w:val="single" w:color="DCE6F0" w:sz="4"/>
+              <w:right w:val="single" w:color="DCE6F0" w:sz="4"/>
+            </w:tcBorders>
+            <w:shd w:fill="FFFFFF" w:color="auto" w:val="clear"/>
+            <w:tcMar>
+              <w:top w:type="dxa" w:w="60"/>
+              <w:left w:type="dxa" w:w="100"/>
+              <w:bottom w:type="dxa" w:w="60"/>
+              <w:right w:type="dxa" w:w="100"/>
+            </w:tcMar>
+            <w:vAlign w:val="top"/>
+          </w:tcPr>
+          <w:p>
+            <w:pPr>
+              <w:spacing w:after="0" w:before="0"/>
+            </w:pPr>
+            <w:r>
+              <w:rPr>
+                <w:sz w:val="19"/>
+                <w:szCs w:val="19"/>
+              </w:rPr>
               <w:t xml:space="preserve">2.0</w:t>
             </w:r>
           </w:p>
@@ -1708,7 +1784,7 @@
               <w:bottom w:val="single" w:color="DCE6F0" w:sz="4"/>
               <w:right w:val="single" w:color="DCE6F0" w:sz="4"/>
             </w:tcBorders>
-            <w:shd w:fill="F7F7FC" w:color="auto" w:val="clear"/>
+            <w:shd w:fill="FFFFFF" w:color="auto" w:val="clear"/>
             <w:tcMar>
               <w:top w:type="dxa" w:w="60"/>
               <w:left w:type="dxa" w:w="100"/>
@@ -53188,7 +53264,7 @@
       <w:r>
         <w:t xml:space="preserve">Registering Active Directory users (Directory Sync) – </w:t>
       </w:r>
-      <w:hyperlink w:history="1" r:id="rIdnluveqlbpuvmscr5t-gx0">
+      <w:hyperlink w:history="1" r:id="rIdbibm-kk2zkmqj8rhxo-fw">
         <w:r>
           <w:rPr>
             <w:rStyle w:val="Hyperlink"/>
@@ -53210,7 +53286,7 @@
       <w:r>
         <w:t xml:space="preserve">ContactNoteID property – </w:t>
       </w:r>
-      <w:hyperlink w:history="1" r:id="rIddbowogh2hk7tpslbwwd-6">
+      <w:hyperlink w:history="1" r:id="rId2prcixoxfpg1kaub3rnnq">
         <w:r>
           <w:rPr>
             <w:rStyle w:val="Hyperlink"/>
@@ -53232,7 +53308,7 @@
       <w:r>
         <w:t xml:space="preserve">RegisterNewUser method – </w:t>
       </w:r>
-      <w:hyperlink w:history="1" r:id="rId-aoil2xszichqdizl5cjc">
+      <w:hyperlink w:history="1" r:id="rIdts5w7vio2e-4j1z0uezte">
         <w:r>
           <w:rPr>
             <w:rStyle w:val="Hyperlink"/>
@@ -53254,7 +53330,7 @@
       <w:r>
         <w:t xml:space="preserve">Creating an ID vault – </w:t>
       </w:r>
-      <w:hyperlink w:history="1" r:id="rIdra1awt3bfmkafycpe7t39">
+      <w:hyperlink w:history="1" r:id="rId4pbr8uu4enmbkofdd_dn0">
         <w:r>
           <w:rPr>
             <w:rStyle w:val="Hyperlink"/>
@@ -53276,7 +53352,7 @@
       <w:r>
         <w:t xml:space="preserve">Assigning users to a vault (Security Settings, ID Vault tab) – </w:t>
       </w:r>
-      <w:hyperlink w:history="1" r:id="rIdobkpmnfcp_qjldojp_91c">
+      <w:hyperlink w:history="1" r:id="rIdrgtxqlmnmod-13mi0oopm">
         <w:r>
           <w:rPr>
             <w:rStyle w:val="Hyperlink"/>
@@ -53298,7 +53374,7 @@
       <w:r>
         <w:t xml:space="preserve">Creating a security policy settings document – </w:t>
       </w:r>
-      <w:hyperlink w:history="1" r:id="rIdc6qwy_zhek0hisltgsnwy">
+      <w:hyperlink w:history="1" r:id="rIdyno6nuub_ntawj7ey9uiw">
         <w:r>
           <w:rPr>
             <w:rStyle w:val="Hyperlink"/>
@@ -53320,7 +53396,7 @@
       <w:r>
         <w:t xml:space="preserve">Creating a policy document (explicit policy names */name) – </w:t>
       </w:r>
-      <w:hyperlink w:history="1" r:id="rIdj_md3sqtu4ego5j-k_hkg">
+      <w:hyperlink w:history="1" r:id="rIdrgg7g8m4iflz-1urqbjkl">
         <w:r>
           <w:rPr>
             <w:rStyle w:val="Hyperlink"/>
@@ -53342,7 +53418,7 @@
       <w:r>
         <w:t xml:space="preserve">Modifying a server-based CA (adding RAs) – </w:t>
       </w:r>
-      <w:hyperlink w:history="1" r:id="rIdy5jjgzihb0twga_-3s8gf">
+      <w:hyperlink w:history="1" r:id="rIdyyvy5hy-roktig0r6pfs3">
         <w:r>
           <w:rPr>
             <w:rStyle w:val="Hyperlink"/>
@@ -53364,7 +53440,7 @@
       <w:r>
         <w:t xml:space="preserve">Administration roles in the Domino Directory ACL – </w:t>
       </w:r>
-      <w:hyperlink w:history="1" r:id="rIdl19xridfd89eq_sewq9pv">
+      <w:hyperlink w:history="1" r:id="rIdcrzluyljh1wdqdom7u2-t">
         <w:r>
           <w:rPr>
             <w:rStyle w:val="Hyperlink"/>
@@ -53386,7 +53462,7 @@
       <w:r>
         <w:t xml:space="preserve">Configuring a database ACL (Manage ACL) – </w:t>
       </w:r>
-      <w:hyperlink w:history="1" r:id="rId0udecwsbo9utnizjexbng">
+      <w:hyperlink w:history="1" r:id="rIdoy7idxfbunzfhkfvol3ul">
         <w:r>
           <w:rPr>
             <w:rStyle w:val="Hyperlink"/>
@@ -53408,7 +53484,7 @@
       <w:r>
         <w:t xml:space="preserve">Creating a database from a template – </w:t>
       </w:r>
-      <w:hyperlink w:history="1" r:id="rIdijl9jlhv6exxdczg87hpd">
+      <w:hyperlink w:history="1" r:id="rId7ukygexe2jn2efjcmaqcf">
         <w:r>
           <w:rPr>
             <w:rStyle w:val="Hyperlink"/>
@@ -53430,7 +53506,7 @@
       <w:r>
         <w:t xml:space="preserve">Script libraries (Designer) – </w:t>
       </w:r>
-      <w:hyperlink w:history="1" r:id="rIdfgzbi2gdgrcns68s__-5l">
+      <w:hyperlink w:history="1" r:id="rId1clmsy7znsguhrnnfu220">
         <w:r>
           <w:rPr>
             <w:rStyle w:val="Hyperlink"/>
@@ -53452,7 +53528,7 @@
       <w:r>
         <w:t xml:space="preserve">Creating an agent (Designer) – </w:t>
       </w:r>
-      <w:hyperlink w:history="1" r:id="rId5-4ltcnnsuqcsxmakqa3z">
+      <w:hyperlink w:history="1" r:id="rIdquqt_z5t_2sy2qju5pjx_">
         <w:r>
           <w:rPr>
             <w:rStyle w:val="Hyperlink"/>
@@ -53474,7 +53550,7 @@
       <w:r>
         <w:t xml:space="preserve">Naming agents: aliases '|' and cascading '\' – </w:t>
       </w:r>
-      <w:hyperlink w:history="1" r:id="rIdskmlgsuh1p6gsc1lyjrql">
+      <w:hyperlink w:history="1" r:id="rIdgtulz2s9v_umo05sesyje">
         <w:r>
           <w:rPr>
             <w:rStyle w:val="Hyperlink"/>
@@ -53496,7 +53572,7 @@
       <w:r>
         <w:t xml:space="preserve">Signing a database – </w:t>
       </w:r>
-      <w:hyperlink w:history="1" r:id="rIduu6ulgbc3hyuwzfo3frcv">
+      <w:hyperlink w:history="1" r:id="rId_pvkthgk-puohnnsbwky9">
         <w:r>
           <w:rPr>
             <w:rStyle w:val="Hyperlink"/>
@@ -53518,7 +53594,7 @@
       <w:r>
         <w:t xml:space="preserve">Checking field values (Document Properties) – </w:t>
       </w:r>
-      <w:hyperlink w:history="1" r:id="rIddrkbi3uvomlmh_u5a2jkd">
+      <w:hyperlink w:history="1" r:id="rIduqjhnlqah5oo89ezmkx6_">
         <w:r>
           <w:rPr>
             <w:rStyle w:val="Hyperlink"/>
@@ -53540,7 +53616,7 @@
       <w:r>
         <w:t xml:space="preserve">Execution Security Alert (ECL) – </w:t>
       </w:r>
-      <w:hyperlink w:history="1" r:id="rIdavl87_xjyoviqszywigyn">
+      <w:hyperlink w:history="1" r:id="rIduqhcf0aghewrr_v4huzij">
         <w:r>
           <w:rPr>
             <w:rStyle w:val="Hyperlink"/>
@@ -53997,7 +54073,7 @@
         <w:sz w:val="16"/>
         <w:szCs w:val="16"/>
       </w:rPr>
-      <w:t xml:space="preserve">HCL Confidential – Internal Use  |  v2.9</w:t>
+      <w:t xml:space="preserve">HCL Confidential – Internal Use  |  v3.0</w:t>
     </w:r>
     <w:r>
       <w:rPr>

</xml_diff>